<commit_message>
Fix House 3 owner trailing behind the thief; adopt House 4 place as V5.0
The owner chased a position sampled ten times a second and only checked the catch at that rate, so a thief near his speed was never reached.
He now follows the live thief position every frame, catches on live distance each frame, keeps full speed and server control after the door scene, and no longer backtracks on new paths.
Place file renamed to place/SpookySteal-V5.0.rbxl.

Co-Authored-By: Claude Sonnet 5.5 <noreply@anthropic.com>
Claude-Session: https://claude.ai/code/session_013ivEnYiZGofRBeqQFKAVhJ
</commit_message>
<xml_diff>
--- a/docs/Spooky-Steal-Design-and-Plan.docx
+++ b/docs/Spooky-Steal-Design-and-Plan.docx
@@ -63,13 +63,13 @@
           <w:b/>
           <w:bCs/>
         </w:rPr>
-        <w:t xml:space="preserve">Version 5</w:t>
-      </w:r>
-      <w:r>
-        <w:rPr>
-          <w:rFonts w:ascii="Calibri" w:cs="Calibri" w:eastAsia="Calibri" w:hAnsi="Calibri"/>
-        </w:rPr>
-        <w:t xml:space="preserve">, updated 3 October 2026 to match the place file </w:t>
+        <w:t xml:space="preserve">Version 5.0</w:t>
+      </w:r>
+      <w:r>
+        <w:rPr>
+          <w:rFonts w:ascii="Calibri" w:cs="Calibri" w:eastAsia="Calibri" w:hAnsi="Calibri"/>
+        </w:rPr>
+        <w:t xml:space="preserve">, updated 3 October 2026 (place file </w:t>
       </w:r>
       <w:r>
         <w:rPr>
@@ -77,13 +77,13 @@
           <w:b/>
           <w:bCs/>
         </w:rPr>
-        <w:t xml:space="preserve">SpookySteal-House V4.2</w:t>
-      </w:r>
-      <w:r>
-        <w:rPr>
-          <w:rFonts w:ascii="Calibri" w:cs="Calibri" w:eastAsia="Calibri" w:hAnsi="Calibri"/>
-        </w:rPr>
-        <w:t xml:space="preserve"> and the rework of Candy, costumes, treadmills, base upgrades and the first-time tutorial.</w:t>
+        <w:t xml:space="preserve">SpookySteal-V5.0</w:t>
+      </w:r>
+      <w:r>
+        <w:rPr>
+          <w:rFonts w:ascii="Calibri" w:cs="Calibri" w:eastAsia="Calibri" w:hAnsi="Calibri"/>
+        </w:rPr>
+        <w:t xml:space="preserve">, built on SpookySteal-House V4.2 / House 4), with the rework of Candy, costumes, treadmills, base upgrades and the first-time tutorial.</w:t>
       </w:r>
     </w:p>
     <w:p>
@@ -627,6 +627,65 @@
                 <w:szCs w:val="19"/>
               </w:rPr>
               <w:t xml:space="preserve">Speed grows by the same amount every level (20 at level 0, 170 at level 100); a Custom speed panel lets you run slower; houses 1 to 3 drop only their own "level" eggs and pets; owner speeds were raised for the new speed scale; a DEV03 code.</w:t>
+            </w:r>
+          </w:p>
+        </w:tc>
+      </w:tr>
+      <w:tr>
+        <w:trPr>
+          <w:cantSplit/>
+        </w:trPr>
+        <w:tc>
+          <w:tcPr>
+            <w:tcW w:type="dxa" w:w="3746"/>
+            <w:tcBorders>
+              <w:top w:val="single" w:color="BFBFBF" w:sz="4"/>
+              <w:left w:val="single" w:color="BFBFBF" w:sz="4"/>
+              <w:bottom w:val="single" w:color="BFBFBF" w:sz="4"/>
+              <w:right w:val="single" w:color="BFBFBF" w:sz="4"/>
+            </w:tcBorders>
+            <w:tcMar>
+              <w:top w:type="dxa" w:w="60"/>
+              <w:left w:type="dxa" w:w="100"/>
+              <w:bottom w:type="dxa" w:w="60"/>
+              <w:right w:type="dxa" w:w="100"/>
+            </w:tcMar>
+          </w:tcPr>
+          <w:p>
+            <w:r>
+              <w:rPr>
+                <w:rFonts w:ascii="Calibri" w:cs="Calibri" w:eastAsia="Calibri" w:hAnsi="Calibri"/>
+                <w:sz w:val="19"/>
+                <w:szCs w:val="19"/>
+              </w:rPr>
+              <w:t xml:space="preserve">Chase fix (5.0)</w:t>
+            </w:r>
+          </w:p>
+        </w:tc>
+        <w:tc>
+          <w:tcPr>
+            <w:tcW w:type="dxa" w:w="5614"/>
+            <w:tcBorders>
+              <w:top w:val="single" w:color="BFBFBF" w:sz="4"/>
+              <w:left w:val="single" w:color="BFBFBF" w:sz="4"/>
+              <w:bottom w:val="single" w:color="BFBFBF" w:sz="4"/>
+              <w:right w:val="single" w:color="BFBFBF" w:sz="4"/>
+            </w:tcBorders>
+            <w:tcMar>
+              <w:top w:type="dxa" w:w="60"/>
+              <w:left w:type="dxa" w:w="100"/>
+              <w:bottom w:type="dxa" w:w="60"/>
+              <w:right w:type="dxa" w:w="100"/>
+            </w:tcMar>
+          </w:tcPr>
+          <w:p>
+            <w:r>
+              <w:rPr>
+                <w:rFonts w:ascii="Calibri" w:cs="Calibri" w:eastAsia="Calibri" w:hAnsi="Calibri"/>
+                <w:sz w:val="19"/>
+                <w:szCs w:val="19"/>
+              </w:rPr>
+              <w:t xml:space="preserve">The owner now chases the thief's live position every frame and catches on live distance every frame (before, both were sampled ten times a second, so a thief close to the owner's speed was never reached). His speed is enforced every frame, the server keeps control of his movement after the door scene, and new paths no longer make him double back.</w:t>
             </w:r>
           </w:p>
         </w:tc>
@@ -5622,6 +5681,30 @@
           <w:b/>
           <w:bCs/>
         </w:rPr>
+        <w:t xml:space="preserve">A faster owner always catches a moving thief</w:t>
+      </w:r>
+      <w:r>
+        <w:rPr>
+          <w:rFonts w:ascii="Calibri" w:cs="Calibri" w:eastAsia="Calibri" w:hAnsi="Calibri"/>
+        </w:rPr>
+        <w:t xml:space="preserve"> (House 3 bug fixed in 5.0): he runs at his full speed straight at your live position, so he gains on you whenever he is faster.</w:t>
+      </w:r>
+    </w:p>
+    <w:p>
+      <w:pPr>
+        <w:pStyle w:val="ListParagraph"/>
+        <w:numPr>
+          <w:ilvl w:val="0"/>
+          <w:numId w:val="2"/>
+        </w:numPr>
+        <w:spacing w:after="60"/>
+      </w:pPr>
+      <w:r>
+        <w:rPr>
+          <w:rFonts w:ascii="Calibri" w:cs="Calibri" w:eastAsia="Calibri" w:hAnsi="Calibri"/>
+          <w:b/>
+          <w:bCs/>
+        </w:rPr>
         <w:t xml:space="preserve">After the chase</w:t>
       </w:r>
       <w:r>
@@ -20123,7 +20206,7 @@
         <w:sz w:val="18"/>
         <w:szCs w:val="18"/>
       </w:rPr>
-      <w:t xml:space="preserve">Spooky Steal design, version 4  |  page </w:t>
+      <w:t xml:space="preserve">Spooky Steal design, version 5.0  |  page </w:t>
     </w:r>
     <w:r>
       <w:rPr>

</xml_diff>

<commit_message>
Speed balance: treadmills x1-x21, trails x1.5-x5, costume XP ladder, steeper XP curve
Houses 3 and 4 now open at about 20 and 35 minutes in the simulation. Zombie Chef 72, Gravedigger 84. Trails reduced to five.

Co-Authored-By: Claude Sonnet 5.5 <noreply@anthropic.com>
Claude-Session: https://claude.ai/code/session_013ivEnYiZGofRBeqQFKAVhJ
</commit_message>
<xml_diff>
--- a/docs/Spooky-Steal-Design-and-Plan.docx
+++ b/docs/Spooky-Steal-Design-and-Plan.docx
@@ -358,7 +358,7 @@
                 <w:sz w:val="19"/>
                 <w:szCs w:val="19"/>
               </w:rPr>
-              <w:t xml:space="preserve">A treadmill no longer gives XP by itself. It multiplies the XP rate of the costume you wear (x1 to x4).</w:t>
+              <w:t xml:space="preserve">A treadmill no longer gives XP by itself. It multiplies the XP rate of the costume you wear (x1 to x21).</w:t>
             </w:r>
           </w:p>
         </w:tc>
@@ -627,6 +627,65 @@
                 <w:szCs w:val="19"/>
               </w:rPr>
               <w:t xml:space="preserve">Speed grows by the same amount every level (20 at level 0, 170 at level 100); a Custom speed panel lets you run slower; houses 1 to 3 drop only their own "level" eggs and pets; owner speeds were raised for the new speed scale; a DEV03 code.</w:t>
+            </w:r>
+          </w:p>
+        </w:tc>
+      </w:tr>
+      <w:tr>
+        <w:trPr>
+          <w:cantSplit/>
+        </w:trPr>
+        <w:tc>
+          <w:tcPr>
+            <w:tcW w:type="dxa" w:w="3746"/>
+            <w:tcBorders>
+              <w:top w:val="single" w:color="BFBFBF" w:sz="4"/>
+              <w:left w:val="single" w:color="BFBFBF" w:sz="4"/>
+              <w:bottom w:val="single" w:color="BFBFBF" w:sz="4"/>
+              <w:right w:val="single" w:color="BFBFBF" w:sz="4"/>
+            </w:tcBorders>
+            <w:tcMar>
+              <w:top w:type="dxa" w:w="60"/>
+              <w:left w:type="dxa" w:w="100"/>
+              <w:bottom w:type="dxa" w:w="60"/>
+              <w:right w:type="dxa" w:w="100"/>
+            </w:tcMar>
+          </w:tcPr>
+          <w:p>
+            <w:r>
+              <w:rPr>
+                <w:rFonts w:ascii="Calibri" w:cs="Calibri" w:eastAsia="Calibri" w:hAnsi="Calibri"/>
+                <w:sz w:val="19"/>
+                <w:szCs w:val="19"/>
+              </w:rPr>
+              <w:t xml:space="preserve">Speed balance (5.0)</w:t>
+            </w:r>
+          </w:p>
+        </w:tc>
+        <w:tc>
+          <w:tcPr>
+            <w:tcW w:type="dxa" w:w="5614"/>
+            <w:tcBorders>
+              <w:top w:val="single" w:color="BFBFBF" w:sz="4"/>
+              <w:left w:val="single" w:color="BFBFBF" w:sz="4"/>
+              <w:bottom w:val="single" w:color="BFBFBF" w:sz="4"/>
+              <w:right w:val="single" w:color="BFBFBF" w:sz="4"/>
+            </w:tcBorders>
+            <w:tcMar>
+              <w:top w:type="dxa" w:w="60"/>
+              <w:left w:type="dxa" w:w="100"/>
+              <w:bottom w:type="dxa" w:w="60"/>
+              <w:right w:type="dxa" w:w="100"/>
+            </w:tcMar>
+          </w:tcPr>
+          <w:p>
+            <w:r>
+              <w:rPr>
+                <w:rFonts w:ascii="Calibri" w:cs="Calibri" w:eastAsia="Calibri" w:hAnsi="Calibri"/>
+                <w:sz w:val="19"/>
+                <w:szCs w:val="19"/>
+              </w:rPr>
+              <w:t xml:space="preserve">Treadmills are x1, x2, x3, x5, x8, x13, x21; trails x1.5, x2, x3, x4, x5 (5 trails); costume Speed XP per second grows 1, 1.5, 2.5, 4, 7, 12, 20, 35, 60, 100, 170. Speed Levels cost much more XP (20% more per level up to level 30, then 8%, then 4%) so house 3 comes at about 20 min and house 4 at about 35 min. The Zombie Chef now runs at 72 and the Gravedigger at 84 so house 4 is not reachable right after house 3.</w:t>
             </w:r>
           </w:p>
         </w:tc>
@@ -3939,7 +3998,7 @@
                 <w:sz w:val="19"/>
                 <w:szCs w:val="19"/>
               </w:rPr>
-              <w:t xml:space="preserve">55</w:t>
+              <w:t xml:space="preserve">72</w:t>
             </w:r>
           </w:p>
         </w:tc>
@@ -4187,7 +4246,7 @@
                 <w:sz w:val="19"/>
                 <w:szCs w:val="19"/>
               </w:rPr>
-              <w:t xml:space="preserve">70</w:t>
+              <w:t xml:space="preserve">84</w:t>
             </w:r>
           </w:p>
         </w:tc>
@@ -12687,7 +12746,7 @@
                 <w:sz w:val="19"/>
                 <w:szCs w:val="19"/>
               </w:rPr>
-              <w:t xml:space="preserve">x1.25</w:t>
+              <w:t xml:space="preserve">x2</w:t>
             </w:r>
           </w:p>
         </w:tc>
@@ -12773,7 +12832,7 @@
                 <w:sz w:val="19"/>
                 <w:szCs w:val="19"/>
               </w:rPr>
-              <w:t xml:space="preserve">x1.5</w:t>
+              <w:t xml:space="preserve">x3</w:t>
             </w:r>
           </w:p>
         </w:tc>
@@ -12859,7 +12918,7 @@
                 <w:sz w:val="19"/>
                 <w:szCs w:val="19"/>
               </w:rPr>
-              <w:t xml:space="preserve">x2</w:t>
+              <w:t xml:space="preserve">x5</w:t>
             </w:r>
           </w:p>
         </w:tc>
@@ -12886,7 +12945,7 @@
                 <w:sz w:val="19"/>
                 <w:szCs w:val="19"/>
               </w:rPr>
-              <w:t xml:space="preserve">$20,000</w:t>
+              <w:t xml:space="preserve">$15,000</w:t>
             </w:r>
           </w:p>
         </w:tc>
@@ -12945,7 +13004,7 @@
                 <w:sz w:val="19"/>
                 <w:szCs w:val="19"/>
               </w:rPr>
-              <w:t xml:space="preserve">x2.5</w:t>
+              <w:t xml:space="preserve">x8</w:t>
             </w:r>
           </w:p>
         </w:tc>
@@ -12972,7 +13031,7 @@
                 <w:sz w:val="19"/>
                 <w:szCs w:val="19"/>
               </w:rPr>
-              <w:t xml:space="preserve">$120,000</w:t>
+              <w:t xml:space="preserve">$80,000</w:t>
             </w:r>
           </w:p>
         </w:tc>
@@ -13031,7 +13090,7 @@
                 <w:sz w:val="19"/>
                 <w:szCs w:val="19"/>
               </w:rPr>
-              <w:t xml:space="preserve">x3</w:t>
+              <w:t xml:space="preserve">x13</w:t>
             </w:r>
           </w:p>
         </w:tc>
@@ -13058,7 +13117,7 @@
                 <w:sz w:val="19"/>
                 <w:szCs w:val="19"/>
               </w:rPr>
-              <w:t xml:space="preserve">$800,000</w:t>
+              <w:t xml:space="preserve">$500,000</w:t>
             </w:r>
           </w:p>
         </w:tc>
@@ -13117,7 +13176,7 @@
                 <w:sz w:val="19"/>
                 <w:szCs w:val="19"/>
               </w:rPr>
-              <w:t xml:space="preserve">x4</w:t>
+              <w:t xml:space="preserve">x21</w:t>
             </w:r>
           </w:p>
         </w:tc>
@@ -13144,7 +13203,7 @@
                 <w:sz w:val="19"/>
                 <w:szCs w:val="19"/>
               </w:rPr>
-              <w:t xml:space="preserve">$5,000,000</w:t>
+              <w:t xml:space="preserve">$3,000,000</w:t>
             </w:r>
           </w:p>
         </w:tc>
@@ -13176,7 +13235,7 @@
         <w:rPr>
           <w:rFonts w:ascii="Calibri" w:cs="Calibri" w:eastAsia="Calibri" w:hAnsi="Calibri"/>
         </w:rPr>
-        <w:t xml:space="preserve"> sold in the Trails tab of the Speed Shop. A trail multiplies your Speed XP everywhere (a costume rate of 30 XP/s with a 1.5x trail gives 45 XP/s). You keep every trail you buy and equip one at a time; it shows as a visible trail behind your character.</w:t>
+        <w:t xml:space="preserve"> sold in the Trails tab of the Speed Shop. A trail multiplies your Speed XP everywhere (a costume rate of 30 XP/s with a 2x trail gives 60 XP/s). You keep every trail you buy and equip one at a time; it shows as a visible trail behind your character.</w:t>
       </w:r>
     </w:p>
     <w:p>
@@ -13200,7 +13259,7 @@
         <w:rPr>
           <w:rFonts w:ascii="Calibri" w:cs="Calibri" w:eastAsia="Calibri" w:hAnsi="Calibri"/>
         </w:rPr>
-        <w:t xml:space="preserve"> speed grows by the same amount every level: 20 at level 0, +1.5 per level, 170 at level 100. Each level costs 12% more XP than the last up to level 70 (6 XP for level 1, about 15,000 for level 70), then 5% more (about 65,000 for level 100).</w:t>
+        <w:t xml:space="preserve"> speed grows by the same amount every level: 20 at level 0, +1.5 per level, 170 at level 100. Each level costs 20% more XP than the last up to level 30 (20 XP for level 1, about 3,956 for level 30), then 8% more up to level 70 (about 85,948), then 4% more (about 278,764 for level 100). The steep start is what puts houses 3 and 4 at about 20 and 35 minutes; the big multipliers keep the later levels moving.</w:t>
       </w:r>
     </w:p>
     <w:p>
@@ -13259,7 +13318,7 @@
         <w:rPr>
           <w:rFonts w:ascii="Calibri" w:cs="Calibri" w:eastAsia="Calibri" w:hAnsi="Calibri"/>
         </w:rPr>
-        <w:t xml:space="preserve">Suggested trail ladder (the build in Studio may tune these):</w:t>
+        <w:t xml:space="preserve">Trail ladder (5 trails, the last one is x5):</w:t>
       </w:r>
     </w:p>
     <w:tbl>
@@ -13428,7 +13487,7 @@
                 <w:sz w:val="19"/>
                 <w:szCs w:val="19"/>
               </w:rPr>
-              <w:t xml:space="preserve">1.25x</w:t>
+              <w:t xml:space="preserve">1.5x</w:t>
             </w:r>
           </w:p>
         </w:tc>
@@ -13455,7 +13514,7 @@
                 <w:sz w:val="19"/>
                 <w:szCs w:val="19"/>
               </w:rPr>
-              <w:t xml:space="preserve">1,800</w:t>
+              <w:t xml:space="preserve">1,500</w:t>
             </w:r>
           </w:p>
         </w:tc>
@@ -13514,7 +13573,7 @@
                 <w:sz w:val="19"/>
                 <w:szCs w:val="19"/>
               </w:rPr>
-              <w:t xml:space="preserve">1.5x</w:t>
+              <w:t xml:space="preserve">2x</w:t>
             </w:r>
           </w:p>
         </w:tc>
@@ -13541,7 +13600,7 @@
                 <w:sz w:val="19"/>
                 <w:szCs w:val="19"/>
               </w:rPr>
-              <w:t xml:space="preserve">18,000</w:t>
+              <w:t xml:space="preserve">15,000</w:t>
             </w:r>
           </w:p>
         </w:tc>
@@ -13600,7 +13659,7 @@
                 <w:sz w:val="19"/>
                 <w:szCs w:val="19"/>
               </w:rPr>
-              <w:t xml:space="preserve">2x</w:t>
+              <w:t xml:space="preserve">3x</w:t>
             </w:r>
           </w:p>
         </w:tc>
@@ -13627,7 +13686,7 @@
                 <w:sz w:val="19"/>
                 <w:szCs w:val="19"/>
               </w:rPr>
-              <w:t xml:space="preserve">135,000</w:t>
+              <w:t xml:space="preserve">120,000</w:t>
             </w:r>
           </w:p>
         </w:tc>
@@ -13659,7 +13718,7 @@
                 <w:sz w:val="19"/>
                 <w:szCs w:val="19"/>
               </w:rPr>
-              <w:t xml:space="preserve">Ghost Wisp</w:t>
+              <w:t xml:space="preserve">Blood Moon</w:t>
             </w:r>
           </w:p>
         </w:tc>
@@ -13686,7 +13745,7 @@
                 <w:sz w:val="19"/>
                 <w:szCs w:val="19"/>
               </w:rPr>
-              <w:t xml:space="preserve">2.5x</w:t>
+              <w:t xml:space="preserve">4x</w:t>
             </w:r>
           </w:p>
         </w:tc>
@@ -13713,7 +13772,7 @@
                 <w:sz w:val="19"/>
                 <w:szCs w:val="19"/>
               </w:rPr>
-              <w:t xml:space="preserve">1,050,000</w:t>
+              <w:t xml:space="preserve">900,000</w:t>
             </w:r>
           </w:p>
         </w:tc>
@@ -13745,7 +13804,7 @@
                 <w:sz w:val="19"/>
                 <w:szCs w:val="19"/>
               </w:rPr>
-              <w:t xml:space="preserve">Pumpkin Fire</w:t>
+              <w:t xml:space="preserve">Nightmare Shadow</w:t>
             </w:r>
           </w:p>
         </w:tc>
@@ -13772,7 +13831,7 @@
                 <w:sz w:val="19"/>
                 <w:szCs w:val="19"/>
               </w:rPr>
-              <w:t xml:space="preserve">3x</w:t>
+              <w:t xml:space="preserve">5x</w:t>
             </w:r>
           </w:p>
         </w:tc>
@@ -13799,179 +13858,7 @@
                 <w:sz w:val="19"/>
                 <w:szCs w:val="19"/>
               </w:rPr>
-              <w:t xml:space="preserve">6,600,000</w:t>
-            </w:r>
-          </w:p>
-        </w:tc>
-      </w:tr>
-      <w:tr>
-        <w:trPr>
-          <w:cantSplit/>
-        </w:trPr>
-        <w:tc>
-          <w:tcPr>
-            <w:tcW w:type="dxa" w:w="3819"/>
-            <w:tcBorders>
-              <w:top w:val="single" w:color="BFBFBF" w:sz="4"/>
-              <w:left w:val="single" w:color="BFBFBF" w:sz="4"/>
-              <w:bottom w:val="single" w:color="BFBFBF" w:sz="4"/>
-              <w:right w:val="single" w:color="BFBFBF" w:sz="4"/>
-            </w:tcBorders>
-            <w:tcMar>
-              <w:top w:type="dxa" w:w="60"/>
-              <w:left w:type="dxa" w:w="100"/>
-              <w:bottom w:type="dxa" w:w="60"/>
-              <w:right w:type="dxa" w:w="100"/>
-            </w:tcMar>
-          </w:tcPr>
-          <w:p>
-            <w:r>
-              <w:rPr>
-                <w:rFonts w:ascii="Calibri" w:cs="Calibri" w:eastAsia="Calibri" w:hAnsi="Calibri"/>
-                <w:sz w:val="19"/>
-                <w:szCs w:val="19"/>
-              </w:rPr>
-              <w:t xml:space="preserve">Blood Moon</w:t>
-            </w:r>
-          </w:p>
-        </w:tc>
-        <w:tc>
-          <w:tcPr>
-            <w:tcW w:type="dxa" w:w="2271"/>
-            <w:tcBorders>
-              <w:top w:val="single" w:color="BFBFBF" w:sz="4"/>
-              <w:left w:val="single" w:color="BFBFBF" w:sz="4"/>
-              <w:bottom w:val="single" w:color="BFBFBF" w:sz="4"/>
-              <w:right w:val="single" w:color="BFBFBF" w:sz="4"/>
-            </w:tcBorders>
-            <w:tcMar>
-              <w:top w:type="dxa" w:w="60"/>
-              <w:left w:type="dxa" w:w="100"/>
-              <w:bottom w:type="dxa" w:w="60"/>
-              <w:right w:type="dxa" w:w="100"/>
-            </w:tcMar>
-          </w:tcPr>
-          <w:p>
-            <w:r>
-              <w:rPr>
-                <w:rFonts w:ascii="Calibri" w:cs="Calibri" w:eastAsia="Calibri" w:hAnsi="Calibri"/>
-                <w:sz w:val="19"/>
-                <w:szCs w:val="19"/>
-              </w:rPr>
-              <w:t xml:space="preserve">4x</w:t>
-            </w:r>
-          </w:p>
-        </w:tc>
-        <w:tc>
-          <w:tcPr>
-            <w:tcW w:type="dxa" w:w="3270"/>
-            <w:tcBorders>
-              <w:top w:val="single" w:color="BFBFBF" w:sz="4"/>
-              <w:left w:val="single" w:color="BFBFBF" w:sz="4"/>
-              <w:bottom w:val="single" w:color="BFBFBF" w:sz="4"/>
-              <w:right w:val="single" w:color="BFBFBF" w:sz="4"/>
-            </w:tcBorders>
-            <w:tcMar>
-              <w:top w:type="dxa" w:w="60"/>
-              <w:left w:type="dxa" w:w="100"/>
-              <w:bottom w:type="dxa" w:w="60"/>
-              <w:right w:type="dxa" w:w="100"/>
-            </w:tcMar>
-          </w:tcPr>
-          <w:p>
-            <w:r>
-              <w:rPr>
-                <w:rFonts w:ascii="Calibri" w:cs="Calibri" w:eastAsia="Calibri" w:hAnsi="Calibri"/>
-                <w:sz w:val="19"/>
-                <w:szCs w:val="19"/>
-              </w:rPr>
-              <w:t xml:space="preserve">42,000,000</w:t>
-            </w:r>
-          </w:p>
-        </w:tc>
-      </w:tr>
-      <w:tr>
-        <w:trPr>
-          <w:cantSplit/>
-        </w:trPr>
-        <w:tc>
-          <w:tcPr>
-            <w:tcW w:type="dxa" w:w="3819"/>
-            <w:tcBorders>
-              <w:top w:val="single" w:color="BFBFBF" w:sz="4"/>
-              <w:left w:val="single" w:color="BFBFBF" w:sz="4"/>
-              <w:bottom w:val="single" w:color="BFBFBF" w:sz="4"/>
-              <w:right w:val="single" w:color="BFBFBF" w:sz="4"/>
-            </w:tcBorders>
-            <w:tcMar>
-              <w:top w:type="dxa" w:w="60"/>
-              <w:left w:type="dxa" w:w="100"/>
-              <w:bottom w:type="dxa" w:w="60"/>
-              <w:right w:type="dxa" w:w="100"/>
-            </w:tcMar>
-          </w:tcPr>
-          <w:p>
-            <w:r>
-              <w:rPr>
-                <w:rFonts w:ascii="Calibri" w:cs="Calibri" w:eastAsia="Calibri" w:hAnsi="Calibri"/>
-                <w:sz w:val="19"/>
-                <w:szCs w:val="19"/>
-              </w:rPr>
-              <w:t xml:space="preserve">Nightmare Shadow</w:t>
-            </w:r>
-          </w:p>
-        </w:tc>
-        <w:tc>
-          <w:tcPr>
-            <w:tcW w:type="dxa" w:w="2271"/>
-            <w:tcBorders>
-              <w:top w:val="single" w:color="BFBFBF" w:sz="4"/>
-              <w:left w:val="single" w:color="BFBFBF" w:sz="4"/>
-              <w:bottom w:val="single" w:color="BFBFBF" w:sz="4"/>
-              <w:right w:val="single" w:color="BFBFBF" w:sz="4"/>
-            </w:tcBorders>
-            <w:tcMar>
-              <w:top w:type="dxa" w:w="60"/>
-              <w:left w:type="dxa" w:w="100"/>
-              <w:bottom w:type="dxa" w:w="60"/>
-              <w:right w:type="dxa" w:w="100"/>
-            </w:tcMar>
-          </w:tcPr>
-          <w:p>
-            <w:r>
-              <w:rPr>
-                <w:rFonts w:ascii="Calibri" w:cs="Calibri" w:eastAsia="Calibri" w:hAnsi="Calibri"/>
-                <w:sz w:val="19"/>
-                <w:szCs w:val="19"/>
-              </w:rPr>
-              <w:t xml:space="preserve">5x</w:t>
-            </w:r>
-          </w:p>
-        </w:tc>
-        <w:tc>
-          <w:tcPr>
-            <w:tcW w:type="dxa" w:w="3270"/>
-            <w:tcBorders>
-              <w:top w:val="single" w:color="BFBFBF" w:sz="4"/>
-              <w:left w:val="single" w:color="BFBFBF" w:sz="4"/>
-              <w:bottom w:val="single" w:color="BFBFBF" w:sz="4"/>
-              <w:right w:val="single" w:color="BFBFBF" w:sz="4"/>
-            </w:tcBorders>
-            <w:tcMar>
-              <w:top w:type="dxa" w:w="60"/>
-              <w:left w:type="dxa" w:w="100"/>
-              <w:bottom w:type="dxa" w:w="60"/>
-              <w:right w:type="dxa" w:w="100"/>
-            </w:tcMar>
-          </w:tcPr>
-          <w:p>
-            <w:r>
-              <w:rPr>
-                <w:rFonts w:ascii="Calibri" w:cs="Calibri" w:eastAsia="Calibri" w:hAnsi="Calibri"/>
-                <w:sz w:val="19"/>
-                <w:szCs w:val="19"/>
-              </w:rPr>
-              <w:t xml:space="preserve">225,000,000</w:t>
+              <w:t xml:space="preserve">6,000,000</w:t>
             </w:r>
           </w:p>
         </w:tc>
@@ -14102,7 +13989,7 @@
         <w:rPr>
           <w:rFonts w:ascii="Calibri" w:cs="Calibri" w:eastAsia="Calibri" w:hAnsi="Calibri"/>
         </w:rPr>
-        <w:t xml:space="preserve">A new player wears no costume (x1 Candy, 0.7 XP/s) and starts with 100 Candy, exactly the price of the cheapest costume.</w:t>
+        <w:t xml:space="preserve">A new player wears no costume (x1 Candy, 1 XP/s) and starts with 100 Candy, exactly the price of the cheapest costume.</w:t>
       </w:r>
     </w:p>
     <w:tbl>
@@ -14414,7 +14301,7 @@
                 <w:sz w:val="19"/>
                 <w:szCs w:val="19"/>
               </w:rPr>
-              <w:t xml:space="preserve">0.7</w:t>
+              <w:t xml:space="preserve">1</w:t>
             </w:r>
           </w:p>
         </w:tc>
@@ -14554,7 +14441,7 @@
                 <w:sz w:val="19"/>
                 <w:szCs w:val="19"/>
               </w:rPr>
-              <w:t xml:space="preserve">1</w:t>
+              <w:t xml:space="preserve">1.5</w:t>
             </w:r>
           </w:p>
         </w:tc>
@@ -14640,7 +14527,7 @@
                 <w:sz w:val="19"/>
                 <w:szCs w:val="19"/>
               </w:rPr>
-              <w:t xml:space="preserve">250</w:t>
+              <w:t xml:space="preserve">400</w:t>
             </w:r>
           </w:p>
         </w:tc>
@@ -14694,7 +14581,7 @@
                 <w:sz w:val="19"/>
                 <w:szCs w:val="19"/>
               </w:rPr>
-              <w:t xml:space="preserve">1.5</w:t>
+              <w:t xml:space="preserve">2.5</w:t>
             </w:r>
           </w:p>
         </w:tc>
@@ -14780,7 +14667,7 @@
                 <w:sz w:val="19"/>
                 <w:szCs w:val="19"/>
               </w:rPr>
-              <w:t xml:space="preserve">1,000</w:t>
+              <w:t xml:space="preserve">1,500</w:t>
             </w:r>
           </w:p>
         </w:tc>
@@ -14834,7 +14721,7 @@
                 <w:sz w:val="19"/>
                 <w:szCs w:val="19"/>
               </w:rPr>
-              <w:t xml:space="preserve">2.2</w:t>
+              <w:t xml:space="preserve">4</w:t>
             </w:r>
           </w:p>
         </w:tc>
@@ -14920,7 +14807,7 @@
                 <w:sz w:val="19"/>
                 <w:szCs w:val="19"/>
               </w:rPr>
-              <w:t xml:space="preserve">4,500</w:t>
+              <w:t xml:space="preserve">6,000</w:t>
             </w:r>
           </w:p>
         </w:tc>
@@ -14974,7 +14861,7 @@
                 <w:sz w:val="19"/>
                 <w:szCs w:val="19"/>
               </w:rPr>
-              <w:t xml:space="preserve">3.2</w:t>
+              <w:t xml:space="preserve">7</w:t>
             </w:r>
           </w:p>
         </w:tc>
@@ -15060,7 +14947,7 @@
                 <w:sz w:val="19"/>
                 <w:szCs w:val="19"/>
               </w:rPr>
-              <w:t xml:space="preserve">18,000</w:t>
+              <w:t xml:space="preserve">24,000</w:t>
             </w:r>
           </w:p>
         </w:tc>
@@ -15114,7 +15001,7 @@
                 <w:sz w:val="19"/>
                 <w:szCs w:val="19"/>
               </w:rPr>
-              <w:t xml:space="preserve">4.5</w:t>
+              <w:t xml:space="preserve">12</w:t>
             </w:r>
           </w:p>
         </w:tc>
@@ -15200,7 +15087,7 @@
                 <w:sz w:val="19"/>
                 <w:szCs w:val="19"/>
               </w:rPr>
-              <w:t xml:space="preserve">70,000</w:t>
+              <w:t xml:space="preserve">90,000</w:t>
             </w:r>
           </w:p>
         </w:tc>
@@ -15254,7 +15141,7 @@
                 <w:sz w:val="19"/>
                 <w:szCs w:val="19"/>
               </w:rPr>
-              <w:t xml:space="preserve">6.5</w:t>
+              <w:t xml:space="preserve">20</w:t>
             </w:r>
           </w:p>
         </w:tc>
@@ -15340,7 +15227,7 @@
                 <w:sz w:val="19"/>
                 <w:szCs w:val="19"/>
               </w:rPr>
-              <w:t xml:space="preserve">280,000</w:t>
+              <w:t xml:space="preserve">300,000</w:t>
             </w:r>
           </w:p>
         </w:tc>
@@ -15394,7 +15281,7 @@
                 <w:sz w:val="19"/>
                 <w:szCs w:val="19"/>
               </w:rPr>
-              <w:t xml:space="preserve">9</w:t>
+              <w:t xml:space="preserve">35</w:t>
             </w:r>
           </w:p>
         </w:tc>
@@ -15534,7 +15421,7 @@
                 <w:sz w:val="19"/>
                 <w:szCs w:val="19"/>
               </w:rPr>
-              <w:t xml:space="preserve">12</w:t>
+              <w:t xml:space="preserve">60</w:t>
             </w:r>
           </w:p>
         </w:tc>
@@ -15674,7 +15561,7 @@
                 <w:sz w:val="19"/>
                 <w:szCs w:val="19"/>
               </w:rPr>
-              <w:t xml:space="preserve">16</w:t>
+              <w:t xml:space="preserve">100</w:t>
             </w:r>
           </w:p>
         </w:tc>
@@ -15760,7 +15647,7 @@
                 <w:sz w:val="19"/>
                 <w:szCs w:val="19"/>
               </w:rPr>
-              <w:t xml:space="preserve">4,000,000</w:t>
+              <w:t xml:space="preserve">5,000,000</w:t>
             </w:r>
           </w:p>
         </w:tc>
@@ -15814,7 +15701,7 @@
                 <w:sz w:val="19"/>
                 <w:szCs w:val="19"/>
               </w:rPr>
-              <w:t xml:space="preserve">22</w:t>
+              <w:t xml:space="preserve">170</w:t>
             </w:r>
           </w:p>
         </w:tc>
@@ -15885,9 +15772,9 @@
         </w:tblBorders>
       </w:tblPr>
       <w:tblGrid>
-        <w:gridCol w:w="4839"/>
-        <w:gridCol w:w="2201"/>
-        <w:gridCol w:w="2320"/>
+        <w:gridCol w:w="4331"/>
+        <w:gridCol w:w="2952"/>
+        <w:gridCol w:w="2077"/>
       </w:tblGrid>
       <w:tr>
         <w:trPr>
@@ -15895,7 +15782,7 @@
         </w:trPr>
         <w:tc>
           <w:tcPr>
-            <w:tcW w:type="dxa" w:w="4839"/>
+            <w:tcW w:type="dxa" w:w="4331"/>
             <w:tcBorders>
               <w:top w:val="single" w:color="BFBFBF" w:sz="4"/>
               <w:left w:val="single" w:color="BFBFBF" w:sz="4"/>
@@ -15925,7 +15812,7 @@
         </w:tc>
         <w:tc>
           <w:tcPr>
-            <w:tcW w:type="dxa" w:w="2201"/>
+            <w:tcW w:type="dxa" w:w="2952"/>
             <w:tcBorders>
               <w:top w:val="single" w:color="BFBFBF" w:sz="4"/>
               <w:left w:val="single" w:color="BFBFBF" w:sz="4"/>
@@ -15955,7 +15842,7 @@
         </w:tc>
         <w:tc>
           <w:tcPr>
-            <w:tcW w:type="dxa" w:w="2320"/>
+            <w:tcW w:type="dxa" w:w="2077"/>
             <w:tcBorders>
               <w:top w:val="single" w:color="BFBFBF" w:sz="4"/>
               <w:left w:val="single" w:color="BFBFBF" w:sz="4"/>
@@ -15990,7 +15877,7 @@
         </w:trPr>
         <w:tc>
           <w:tcPr>
-            <w:tcW w:type="dxa" w:w="4839"/>
+            <w:tcW w:type="dxa" w:w="4331"/>
             <w:tcBorders>
               <w:top w:val="single" w:color="BFBFBF" w:sz="4"/>
               <w:left w:val="single" w:color="BFBFBF" w:sz="4"/>
@@ -16017,7 +15904,7 @@
         </w:tc>
         <w:tc>
           <w:tcPr>
-            <w:tcW w:type="dxa" w:w="2201"/>
+            <w:tcW w:type="dxa" w:w="2952"/>
             <w:tcBorders>
               <w:top w:val="single" w:color="BFBFBF" w:sz="4"/>
               <w:left w:val="single" w:color="BFBFBF" w:sz="4"/>
@@ -16044,7 +15931,7 @@
         </w:tc>
         <w:tc>
           <w:tcPr>
-            <w:tcW w:type="dxa" w:w="2320"/>
+            <w:tcW w:type="dxa" w:w="2077"/>
             <w:tcBorders>
               <w:top w:val="single" w:color="BFBFBF" w:sz="4"/>
               <w:left w:val="single" w:color="BFBFBF" w:sz="4"/>
@@ -16076,61 +15963,34 @@
         </w:trPr>
         <w:tc>
           <w:tcPr>
-            <w:tcW w:type="dxa" w:w="4839"/>
-            <w:tcBorders>
-              <w:top w:val="single" w:color="BFBFBF" w:sz="4"/>
-              <w:left w:val="single" w:color="BFBFBF" w:sz="4"/>
-              <w:bottom w:val="single" w:color="BFBFBF" w:sz="4"/>
-              <w:right w:val="single" w:color="BFBFBF" w:sz="4"/>
-            </w:tcBorders>
-            <w:tcMar>
-              <w:top w:type="dxa" w:w="60"/>
-              <w:left w:type="dxa" w:w="100"/>
-              <w:bottom w:type="dxa" w:w="60"/>
-              <w:right w:type="dxa" w:w="100"/>
-            </w:tcMar>
-          </w:tcPr>
-          <w:p>
-            <w:r>
-              <w:rPr>
-                <w:rFonts w:ascii="Calibri" w:cs="Calibri" w:eastAsia="Calibri" w:hAnsi="Calibri"/>
-                <w:sz w:val="19"/>
-                <w:szCs w:val="19"/>
-              </w:rPr>
-              <w:t xml:space="preserve">Second costume (Pumpkin Head, 250 Candy)</w:t>
-            </w:r>
-          </w:p>
-        </w:tc>
-        <w:tc>
-          <w:tcPr>
-            <w:tcW w:type="dxa" w:w="2201"/>
-            <w:tcBorders>
-              <w:top w:val="single" w:color="BFBFBF" w:sz="4"/>
-              <w:left w:val="single" w:color="BFBFBF" w:sz="4"/>
-              <w:bottom w:val="single" w:color="BFBFBF" w:sz="4"/>
-              <w:right w:val="single" w:color="BFBFBF" w:sz="4"/>
-            </w:tcBorders>
-            <w:tcMar>
-              <w:top w:type="dxa" w:w="60"/>
-              <w:left w:type="dxa" w:w="100"/>
-              <w:bottom w:type="dxa" w:w="60"/>
-              <w:right w:type="dxa" w:w="100"/>
-            </w:tcMar>
-          </w:tcPr>
-          <w:p>
-            <w:r>
-              <w:rPr>
-                <w:rFonts w:ascii="Calibri" w:cs="Calibri" w:eastAsia="Calibri" w:hAnsi="Calibri"/>
-                <w:sz w:val="19"/>
-                <w:szCs w:val="19"/>
-              </w:rPr>
-              <w:t xml:space="preserve">7 min</w:t>
-            </w:r>
-          </w:p>
-        </w:tc>
-        <w:tc>
-          <w:tcPr>
-            <w:tcW w:type="dxa" w:w="2320"/>
+            <w:tcW w:type="dxa" w:w="4331"/>
+            <w:tcBorders>
+              <w:top w:val="single" w:color="BFBFBF" w:sz="4"/>
+              <w:left w:val="single" w:color="BFBFBF" w:sz="4"/>
+              <w:bottom w:val="single" w:color="BFBFBF" w:sz="4"/>
+              <w:right w:val="single" w:color="BFBFBF" w:sz="4"/>
+            </w:tcBorders>
+            <w:tcMar>
+              <w:top w:type="dxa" w:w="60"/>
+              <w:left w:type="dxa" w:w="100"/>
+              <w:bottom w:type="dxa" w:w="60"/>
+              <w:right w:type="dxa" w:w="100"/>
+            </w:tcMar>
+          </w:tcPr>
+          <w:p>
+            <w:r>
+              <w:rPr>
+                <w:rFonts w:ascii="Calibri" w:cs="Calibri" w:eastAsia="Calibri" w:hAnsi="Calibri"/>
+                <w:sz w:val="19"/>
+                <w:szCs w:val="19"/>
+              </w:rPr>
+              <w:t xml:space="preserve">Second costume (Pumpkin Head, 400 Candy)</w:t>
+            </w:r>
+          </w:p>
+        </w:tc>
+        <w:tc>
+          <w:tcPr>
+            <w:tcW w:type="dxa" w:w="2952"/>
             <w:tcBorders>
               <w:top w:val="single" w:color="BFBFBF" w:sz="4"/>
               <w:left w:val="single" w:color="BFBFBF" w:sz="4"/>
@@ -16152,6 +16012,33 @@
                 <w:szCs w:val="19"/>
               </w:rPr>
               <w:t xml:space="preserve">11 min</w:t>
+            </w:r>
+          </w:p>
+        </w:tc>
+        <w:tc>
+          <w:tcPr>
+            <w:tcW w:type="dxa" w:w="2077"/>
+            <w:tcBorders>
+              <w:top w:val="single" w:color="BFBFBF" w:sz="4"/>
+              <w:left w:val="single" w:color="BFBFBF" w:sz="4"/>
+              <w:bottom w:val="single" w:color="BFBFBF" w:sz="4"/>
+              <w:right w:val="single" w:color="BFBFBF" w:sz="4"/>
+            </w:tcBorders>
+            <w:tcMar>
+              <w:top w:type="dxa" w:w="60"/>
+              <w:left w:type="dxa" w:w="100"/>
+              <w:bottom w:type="dxa" w:w="60"/>
+              <w:right w:type="dxa" w:w="100"/>
+            </w:tcMar>
+          </w:tcPr>
+          <w:p>
+            <w:r>
+              <w:rPr>
+                <w:rFonts w:ascii="Calibri" w:cs="Calibri" w:eastAsia="Calibri" w:hAnsi="Calibri"/>
+                <w:sz w:val="19"/>
+                <w:szCs w:val="19"/>
+              </w:rPr>
+              <w:t xml:space="preserve">18 min</w:t>
             </w:r>
           </w:p>
         </w:tc>
@@ -16162,7 +16049,7 @@
         </w:trPr>
         <w:tc>
           <w:tcPr>
-            <w:tcW w:type="dxa" w:w="4839"/>
+            <w:tcW w:type="dxa" w:w="4331"/>
             <w:tcBorders>
               <w:top w:val="single" w:color="BFBFBF" w:sz="4"/>
               <w:left w:val="single" w:color="BFBFBF" w:sz="4"/>
@@ -16189,55 +16076,55 @@
         </w:tc>
         <w:tc>
           <w:tcPr>
-            <w:tcW w:type="dxa" w:w="2201"/>
-            <w:tcBorders>
-              <w:top w:val="single" w:color="BFBFBF" w:sz="4"/>
-              <w:left w:val="single" w:color="BFBFBF" w:sz="4"/>
-              <w:bottom w:val="single" w:color="BFBFBF" w:sz="4"/>
-              <w:right w:val="single" w:color="BFBFBF" w:sz="4"/>
-            </w:tcBorders>
-            <w:tcMar>
-              <w:top w:type="dxa" w:w="60"/>
-              <w:left w:type="dxa" w:w="100"/>
-              <w:bottom w:type="dxa" w:w="60"/>
-              <w:right w:type="dxa" w:w="100"/>
-            </w:tcMar>
-          </w:tcPr>
-          <w:p>
-            <w:r>
-              <w:rPr>
-                <w:rFonts w:ascii="Calibri" w:cs="Calibri" w:eastAsia="Calibri" w:hAnsi="Calibri"/>
-                <w:sz w:val="19"/>
-                <w:szCs w:val="19"/>
-              </w:rPr>
-              <w:t xml:space="preserve">4 min</w:t>
-            </w:r>
-          </w:p>
-        </w:tc>
-        <w:tc>
-          <w:tcPr>
-            <w:tcW w:type="dxa" w:w="2320"/>
-            <w:tcBorders>
-              <w:top w:val="single" w:color="BFBFBF" w:sz="4"/>
-              <w:left w:val="single" w:color="BFBFBF" w:sz="4"/>
-              <w:bottom w:val="single" w:color="BFBFBF" w:sz="4"/>
-              <w:right w:val="single" w:color="BFBFBF" w:sz="4"/>
-            </w:tcBorders>
-            <w:tcMar>
-              <w:top w:type="dxa" w:w="60"/>
-              <w:left w:type="dxa" w:w="100"/>
-              <w:bottom w:type="dxa" w:w="60"/>
-              <w:right w:type="dxa" w:w="100"/>
-            </w:tcMar>
-          </w:tcPr>
-          <w:p>
-            <w:r>
-              <w:rPr>
-                <w:rFonts w:ascii="Calibri" w:cs="Calibri" w:eastAsia="Calibri" w:hAnsi="Calibri"/>
-                <w:sz w:val="19"/>
-                <w:szCs w:val="19"/>
-              </w:rPr>
-              <w:t xml:space="preserve">7 min</w:t>
+            <w:tcW w:type="dxa" w:w="2952"/>
+            <w:tcBorders>
+              <w:top w:val="single" w:color="BFBFBF" w:sz="4"/>
+              <w:left w:val="single" w:color="BFBFBF" w:sz="4"/>
+              <w:bottom w:val="single" w:color="BFBFBF" w:sz="4"/>
+              <w:right w:val="single" w:color="BFBFBF" w:sz="4"/>
+            </w:tcBorders>
+            <w:tcMar>
+              <w:top w:type="dxa" w:w="60"/>
+              <w:left w:type="dxa" w:w="100"/>
+              <w:bottom w:type="dxa" w:w="60"/>
+              <w:right w:type="dxa" w:w="100"/>
+            </w:tcMar>
+          </w:tcPr>
+          <w:p>
+            <w:r>
+              <w:rPr>
+                <w:rFonts w:ascii="Calibri" w:cs="Calibri" w:eastAsia="Calibri" w:hAnsi="Calibri"/>
+                <w:sz w:val="19"/>
+                <w:szCs w:val="19"/>
+              </w:rPr>
+              <w:t xml:space="preserve">8 min</w:t>
+            </w:r>
+          </w:p>
+        </w:tc>
+        <w:tc>
+          <w:tcPr>
+            <w:tcW w:type="dxa" w:w="2077"/>
+            <w:tcBorders>
+              <w:top w:val="single" w:color="BFBFBF" w:sz="4"/>
+              <w:left w:val="single" w:color="BFBFBF" w:sz="4"/>
+              <w:bottom w:val="single" w:color="BFBFBF" w:sz="4"/>
+              <w:right w:val="single" w:color="BFBFBF" w:sz="4"/>
+            </w:tcBorders>
+            <w:tcMar>
+              <w:top w:type="dxa" w:w="60"/>
+              <w:left w:type="dxa" w:w="100"/>
+              <w:bottom w:type="dxa" w:w="60"/>
+              <w:right w:type="dxa" w:w="100"/>
+            </w:tcMar>
+          </w:tcPr>
+          <w:p>
+            <w:r>
+              <w:rPr>
+                <w:rFonts w:ascii="Calibri" w:cs="Calibri" w:eastAsia="Calibri" w:hAnsi="Calibri"/>
+                <w:sz w:val="19"/>
+                <w:szCs w:val="19"/>
+              </w:rPr>
+              <w:t xml:space="preserve">13 min</w:t>
             </w:r>
           </w:p>
         </w:tc>
@@ -16248,82 +16135,82 @@
         </w:trPr>
         <w:tc>
           <w:tcPr>
-            <w:tcW w:type="dxa" w:w="4839"/>
-            <w:tcBorders>
-              <w:top w:val="single" w:color="BFBFBF" w:sz="4"/>
-              <w:left w:val="single" w:color="BFBFBF" w:sz="4"/>
-              <w:bottom w:val="single" w:color="BFBFBF" w:sz="4"/>
-              <w:right w:val="single" w:color="BFBFBF" w:sz="4"/>
-            </w:tcBorders>
-            <w:tcMar>
-              <w:top w:type="dxa" w:w="60"/>
-              <w:left w:type="dxa" w:w="100"/>
-              <w:bottom w:type="dxa" w:w="60"/>
-              <w:right w:type="dxa" w:w="100"/>
-            </w:tcMar>
-          </w:tcPr>
-          <w:p>
-            <w:r>
-              <w:rPr>
-                <w:rFonts w:ascii="Calibri" w:cs="Calibri" w:eastAsia="Calibri" w:hAnsi="Calibri"/>
-                <w:sz w:val="19"/>
-                <w:szCs w:val="19"/>
-              </w:rPr>
-              <w:t xml:space="preserve">Steal from house 4</w:t>
-            </w:r>
-          </w:p>
-        </w:tc>
-        <w:tc>
-          <w:tcPr>
-            <w:tcW w:type="dxa" w:w="2201"/>
-            <w:tcBorders>
-              <w:top w:val="single" w:color="BFBFBF" w:sz="4"/>
-              <w:left w:val="single" w:color="BFBFBF" w:sz="4"/>
-              <w:bottom w:val="single" w:color="BFBFBF" w:sz="4"/>
-              <w:right w:val="single" w:color="BFBFBF" w:sz="4"/>
-            </w:tcBorders>
-            <w:tcMar>
-              <w:top w:type="dxa" w:w="60"/>
-              <w:left w:type="dxa" w:w="100"/>
-              <w:bottom w:type="dxa" w:w="60"/>
-              <w:right w:type="dxa" w:w="100"/>
-            </w:tcMar>
-          </w:tcPr>
-          <w:p>
-            <w:r>
-              <w:rPr>
-                <w:rFonts w:ascii="Calibri" w:cs="Calibri" w:eastAsia="Calibri" w:hAnsi="Calibri"/>
-                <w:sz w:val="19"/>
-                <w:szCs w:val="19"/>
-              </w:rPr>
-              <w:t xml:space="preserve">17 min</w:t>
-            </w:r>
-          </w:p>
-        </w:tc>
-        <w:tc>
-          <w:tcPr>
-            <w:tcW w:type="dxa" w:w="2320"/>
-            <w:tcBorders>
-              <w:top w:val="single" w:color="BFBFBF" w:sz="4"/>
-              <w:left w:val="single" w:color="BFBFBF" w:sz="4"/>
-              <w:bottom w:val="single" w:color="BFBFBF" w:sz="4"/>
-              <w:right w:val="single" w:color="BFBFBF" w:sz="4"/>
-            </w:tcBorders>
-            <w:tcMar>
-              <w:top w:type="dxa" w:w="60"/>
-              <w:left w:type="dxa" w:w="100"/>
-              <w:bottom w:type="dxa" w:w="60"/>
-              <w:right w:type="dxa" w:w="100"/>
-            </w:tcMar>
-          </w:tcPr>
-          <w:p>
-            <w:r>
-              <w:rPr>
-                <w:rFonts w:ascii="Calibri" w:cs="Calibri" w:eastAsia="Calibri" w:hAnsi="Calibri"/>
-                <w:sz w:val="19"/>
-                <w:szCs w:val="19"/>
-              </w:rPr>
-              <w:t xml:space="preserve">27 min</w:t>
+            <w:tcW w:type="dxa" w:w="4331"/>
+            <w:tcBorders>
+              <w:top w:val="single" w:color="BFBFBF" w:sz="4"/>
+              <w:left w:val="single" w:color="BFBFBF" w:sz="4"/>
+              <w:bottom w:val="single" w:color="BFBFBF" w:sz="4"/>
+              <w:right w:val="single" w:color="BFBFBF" w:sz="4"/>
+            </w:tcBorders>
+            <w:tcMar>
+              <w:top w:type="dxa" w:w="60"/>
+              <w:left w:type="dxa" w:w="100"/>
+              <w:bottom w:type="dxa" w:w="60"/>
+              <w:right w:type="dxa" w:w="100"/>
+            </w:tcMar>
+          </w:tcPr>
+          <w:p>
+            <w:r>
+              <w:rPr>
+                <w:rFonts w:ascii="Calibri" w:cs="Calibri" w:eastAsia="Calibri" w:hAnsi="Calibri"/>
+                <w:sz w:val="19"/>
+                <w:szCs w:val="19"/>
+              </w:rPr>
+              <w:t xml:space="preserve">Steal from house 3</w:t>
+            </w:r>
+          </w:p>
+        </w:tc>
+        <w:tc>
+          <w:tcPr>
+            <w:tcW w:type="dxa" w:w="2952"/>
+            <w:tcBorders>
+              <w:top w:val="single" w:color="BFBFBF" w:sz="4"/>
+              <w:left w:val="single" w:color="BFBFBF" w:sz="4"/>
+              <w:bottom w:val="single" w:color="BFBFBF" w:sz="4"/>
+              <w:right w:val="single" w:color="BFBFBF" w:sz="4"/>
+            </w:tcBorders>
+            <w:tcMar>
+              <w:top w:type="dxa" w:w="60"/>
+              <w:left w:type="dxa" w:w="100"/>
+              <w:bottom w:type="dxa" w:w="60"/>
+              <w:right w:type="dxa" w:w="100"/>
+            </w:tcMar>
+          </w:tcPr>
+          <w:p>
+            <w:r>
+              <w:rPr>
+                <w:rFonts w:ascii="Calibri" w:cs="Calibri" w:eastAsia="Calibri" w:hAnsi="Calibri"/>
+                <w:sz w:val="19"/>
+                <w:szCs w:val="19"/>
+              </w:rPr>
+              <w:t xml:space="preserve">18 min (target about 20)</w:t>
+            </w:r>
+          </w:p>
+        </w:tc>
+        <w:tc>
+          <w:tcPr>
+            <w:tcW w:type="dxa" w:w="2077"/>
+            <w:tcBorders>
+              <w:top w:val="single" w:color="BFBFBF" w:sz="4"/>
+              <w:left w:val="single" w:color="BFBFBF" w:sz="4"/>
+              <w:bottom w:val="single" w:color="BFBFBF" w:sz="4"/>
+              <w:right w:val="single" w:color="BFBFBF" w:sz="4"/>
+            </w:tcBorders>
+            <w:tcMar>
+              <w:top w:type="dxa" w:w="60"/>
+              <w:left w:type="dxa" w:w="100"/>
+              <w:bottom w:type="dxa" w:w="60"/>
+              <w:right w:type="dxa" w:w="100"/>
+            </w:tcMar>
+          </w:tcPr>
+          <w:p>
+            <w:r>
+              <w:rPr>
+                <w:rFonts w:ascii="Calibri" w:cs="Calibri" w:eastAsia="Calibri" w:hAnsi="Calibri"/>
+                <w:sz w:val="19"/>
+                <w:szCs w:val="19"/>
+              </w:rPr>
+              <w:t xml:space="preserve">29 min</w:t>
             </w:r>
           </w:p>
         </w:tc>
@@ -16334,82 +16221,82 @@
         </w:trPr>
         <w:tc>
           <w:tcPr>
-            <w:tcW w:type="dxa" w:w="4839"/>
-            <w:tcBorders>
-              <w:top w:val="single" w:color="BFBFBF" w:sz="4"/>
-              <w:left w:val="single" w:color="BFBFBF" w:sz="4"/>
-              <w:bottom w:val="single" w:color="BFBFBF" w:sz="4"/>
-              <w:right w:val="single" w:color="BFBFBF" w:sz="4"/>
-            </w:tcBorders>
-            <w:tcMar>
-              <w:top w:type="dxa" w:w="60"/>
-              <w:left w:type="dxa" w:w="100"/>
-              <w:bottom w:type="dxa" w:w="60"/>
-              <w:right w:type="dxa" w:w="100"/>
-            </w:tcMar>
-          </w:tcPr>
-          <w:p>
-            <w:r>
-              <w:rPr>
-                <w:rFonts w:ascii="Calibri" w:cs="Calibri" w:eastAsia="Calibri" w:hAnsi="Calibri"/>
-                <w:sz w:val="19"/>
-                <w:szCs w:val="19"/>
-              </w:rPr>
-              <w:t xml:space="preserve">Costume 5 (Skeleton)</w:t>
-            </w:r>
-          </w:p>
-        </w:tc>
-        <w:tc>
-          <w:tcPr>
-            <w:tcW w:type="dxa" w:w="2201"/>
-            <w:tcBorders>
-              <w:top w:val="single" w:color="BFBFBF" w:sz="4"/>
-              <w:left w:val="single" w:color="BFBFBF" w:sz="4"/>
-              <w:bottom w:val="single" w:color="BFBFBF" w:sz="4"/>
-              <w:right w:val="single" w:color="BFBFBF" w:sz="4"/>
-            </w:tcBorders>
-            <w:tcMar>
-              <w:top w:type="dxa" w:w="60"/>
-              <w:left w:type="dxa" w:w="100"/>
-              <w:bottom w:type="dxa" w:w="60"/>
-              <w:right w:type="dxa" w:w="100"/>
-            </w:tcMar>
-          </w:tcPr>
-          <w:p>
-            <w:r>
-              <w:rPr>
-                <w:rFonts w:ascii="Calibri" w:cs="Calibri" w:eastAsia="Calibri" w:hAnsi="Calibri"/>
-                <w:sz w:val="19"/>
-                <w:szCs w:val="19"/>
-              </w:rPr>
-              <w:t xml:space="preserve">37 min</w:t>
-            </w:r>
-          </w:p>
-        </w:tc>
-        <w:tc>
-          <w:tcPr>
-            <w:tcW w:type="dxa" w:w="2320"/>
-            <w:tcBorders>
-              <w:top w:val="single" w:color="BFBFBF" w:sz="4"/>
-              <w:left w:val="single" w:color="BFBFBF" w:sz="4"/>
-              <w:bottom w:val="single" w:color="BFBFBF" w:sz="4"/>
-              <w:right w:val="single" w:color="BFBFBF" w:sz="4"/>
-            </w:tcBorders>
-            <w:tcMar>
-              <w:top w:type="dxa" w:w="60"/>
-              <w:left w:type="dxa" w:w="100"/>
-              <w:bottom w:type="dxa" w:w="60"/>
-              <w:right w:type="dxa" w:w="100"/>
-            </w:tcMar>
-          </w:tcPr>
-          <w:p>
-            <w:r>
-              <w:rPr>
-                <w:rFonts w:ascii="Calibri" w:cs="Calibri" w:eastAsia="Calibri" w:hAnsi="Calibri"/>
-                <w:sz w:val="19"/>
-                <w:szCs w:val="19"/>
-              </w:rPr>
-              <w:t xml:space="preserve">1 h</w:t>
+            <w:tcW w:type="dxa" w:w="4331"/>
+            <w:tcBorders>
+              <w:top w:val="single" w:color="BFBFBF" w:sz="4"/>
+              <w:left w:val="single" w:color="BFBFBF" w:sz="4"/>
+              <w:bottom w:val="single" w:color="BFBFBF" w:sz="4"/>
+              <w:right w:val="single" w:color="BFBFBF" w:sz="4"/>
+            </w:tcBorders>
+            <w:tcMar>
+              <w:top w:type="dxa" w:w="60"/>
+              <w:left w:type="dxa" w:w="100"/>
+              <w:bottom w:type="dxa" w:w="60"/>
+              <w:right w:type="dxa" w:w="100"/>
+            </w:tcMar>
+          </w:tcPr>
+          <w:p>
+            <w:r>
+              <w:rPr>
+                <w:rFonts w:ascii="Calibri" w:cs="Calibri" w:eastAsia="Calibri" w:hAnsi="Calibri"/>
+                <w:sz w:val="19"/>
+                <w:szCs w:val="19"/>
+              </w:rPr>
+              <w:t xml:space="preserve">Steal from house 4</w:t>
+            </w:r>
+          </w:p>
+        </w:tc>
+        <w:tc>
+          <w:tcPr>
+            <w:tcW w:type="dxa" w:w="2952"/>
+            <w:tcBorders>
+              <w:top w:val="single" w:color="BFBFBF" w:sz="4"/>
+              <w:left w:val="single" w:color="BFBFBF" w:sz="4"/>
+              <w:bottom w:val="single" w:color="BFBFBF" w:sz="4"/>
+              <w:right w:val="single" w:color="BFBFBF" w:sz="4"/>
+            </w:tcBorders>
+            <w:tcMar>
+              <w:top w:type="dxa" w:w="60"/>
+              <w:left w:type="dxa" w:w="100"/>
+              <w:bottom w:type="dxa" w:w="60"/>
+              <w:right w:type="dxa" w:w="100"/>
+            </w:tcMar>
+          </w:tcPr>
+          <w:p>
+            <w:r>
+              <w:rPr>
+                <w:rFonts w:ascii="Calibri" w:cs="Calibri" w:eastAsia="Calibri" w:hAnsi="Calibri"/>
+                <w:sz w:val="19"/>
+                <w:szCs w:val="19"/>
+              </w:rPr>
+              <w:t xml:space="preserve">36 min (target about 35)</w:t>
+            </w:r>
+          </w:p>
+        </w:tc>
+        <w:tc>
+          <w:tcPr>
+            <w:tcW w:type="dxa" w:w="2077"/>
+            <w:tcBorders>
+              <w:top w:val="single" w:color="BFBFBF" w:sz="4"/>
+              <w:left w:val="single" w:color="BFBFBF" w:sz="4"/>
+              <w:bottom w:val="single" w:color="BFBFBF" w:sz="4"/>
+              <w:right w:val="single" w:color="BFBFBF" w:sz="4"/>
+            </w:tcBorders>
+            <w:tcMar>
+              <w:top w:type="dxa" w:w="60"/>
+              <w:left w:type="dxa" w:w="100"/>
+              <w:bottom w:type="dxa" w:w="60"/>
+              <w:right w:type="dxa" w:w="100"/>
+            </w:tcMar>
+          </w:tcPr>
+          <w:p>
+            <w:r>
+              <w:rPr>
+                <w:rFonts w:ascii="Calibri" w:cs="Calibri" w:eastAsia="Calibri" w:hAnsi="Calibri"/>
+                <w:sz w:val="19"/>
+                <w:szCs w:val="19"/>
+              </w:rPr>
+              <w:t xml:space="preserve">58 min</w:t>
             </w:r>
           </w:p>
         </w:tc>
@@ -16420,34 +16307,34 @@
         </w:trPr>
         <w:tc>
           <w:tcPr>
-            <w:tcW w:type="dxa" w:w="4839"/>
-            <w:tcBorders>
-              <w:top w:val="single" w:color="BFBFBF" w:sz="4"/>
-              <w:left w:val="single" w:color="BFBFBF" w:sz="4"/>
-              <w:bottom w:val="single" w:color="BFBFBF" w:sz="4"/>
-              <w:right w:val="single" w:color="BFBFBF" w:sz="4"/>
-            </w:tcBorders>
-            <w:tcMar>
-              <w:top w:type="dxa" w:w="60"/>
-              <w:left w:type="dxa" w:w="100"/>
-              <w:bottom w:type="dxa" w:w="60"/>
-              <w:right w:type="dxa" w:w="100"/>
-            </w:tcMar>
-          </w:tcPr>
-          <w:p>
-            <w:r>
-              <w:rPr>
-                <w:rFonts w:ascii="Calibri" w:cs="Calibri" w:eastAsia="Calibri" w:hAnsi="Calibri"/>
-                <w:sz w:val="19"/>
-                <w:szCs w:val="19"/>
-              </w:rPr>
-              <w:t xml:space="preserve">Steal from house 6</w:t>
-            </w:r>
-          </w:p>
-        </w:tc>
-        <w:tc>
-          <w:tcPr>
-            <w:tcW w:type="dxa" w:w="2201"/>
+            <w:tcW w:type="dxa" w:w="4331"/>
+            <w:tcBorders>
+              <w:top w:val="single" w:color="BFBFBF" w:sz="4"/>
+              <w:left w:val="single" w:color="BFBFBF" w:sz="4"/>
+              <w:bottom w:val="single" w:color="BFBFBF" w:sz="4"/>
+              <w:right w:val="single" w:color="BFBFBF" w:sz="4"/>
+            </w:tcBorders>
+            <w:tcMar>
+              <w:top w:type="dxa" w:w="60"/>
+              <w:left w:type="dxa" w:w="100"/>
+              <w:bottom w:type="dxa" w:w="60"/>
+              <w:right w:type="dxa" w:w="100"/>
+            </w:tcMar>
+          </w:tcPr>
+          <w:p>
+            <w:r>
+              <w:rPr>
+                <w:rFonts w:ascii="Calibri" w:cs="Calibri" w:eastAsia="Calibri" w:hAnsi="Calibri"/>
+                <w:sz w:val="19"/>
+                <w:szCs w:val="19"/>
+              </w:rPr>
+              <w:t xml:space="preserve">Costume 5 (Skeleton)</w:t>
+            </w:r>
+          </w:p>
+        </w:tc>
+        <w:tc>
+          <w:tcPr>
+            <w:tcW w:type="dxa" w:w="2952"/>
             <w:tcBorders>
               <w:top w:val="single" w:color="BFBFBF" w:sz="4"/>
               <w:left w:val="single" w:color="BFBFBF" w:sz="4"/>
@@ -16474,28 +16361,28 @@
         </w:tc>
         <w:tc>
           <w:tcPr>
-            <w:tcW w:type="dxa" w:w="2320"/>
-            <w:tcBorders>
-              <w:top w:val="single" w:color="BFBFBF" w:sz="4"/>
-              <w:left w:val="single" w:color="BFBFBF" w:sz="4"/>
-              <w:bottom w:val="single" w:color="BFBFBF" w:sz="4"/>
-              <w:right w:val="single" w:color="BFBFBF" w:sz="4"/>
-            </w:tcBorders>
-            <w:tcMar>
-              <w:top w:type="dxa" w:w="60"/>
-              <w:left w:type="dxa" w:w="100"/>
-              <w:bottom w:type="dxa" w:w="60"/>
-              <w:right w:type="dxa" w:w="100"/>
-            </w:tcMar>
-          </w:tcPr>
-          <w:p>
-            <w:r>
-              <w:rPr>
-                <w:rFonts w:ascii="Calibri" w:cs="Calibri" w:eastAsia="Calibri" w:hAnsi="Calibri"/>
-                <w:sz w:val="19"/>
-                <w:szCs w:val="19"/>
-              </w:rPr>
-              <w:t xml:space="preserve">1.2 h</w:t>
+            <w:tcW w:type="dxa" w:w="2077"/>
+            <w:tcBorders>
+              <w:top w:val="single" w:color="BFBFBF" w:sz="4"/>
+              <w:left w:val="single" w:color="BFBFBF" w:sz="4"/>
+              <w:bottom w:val="single" w:color="BFBFBF" w:sz="4"/>
+              <w:right w:val="single" w:color="BFBFBF" w:sz="4"/>
+            </w:tcBorders>
+            <w:tcMar>
+              <w:top w:type="dxa" w:w="60"/>
+              <w:left w:type="dxa" w:w="100"/>
+              <w:bottom w:type="dxa" w:w="60"/>
+              <w:right w:type="dxa" w:w="100"/>
+            </w:tcMar>
+          </w:tcPr>
+          <w:p>
+            <w:r>
+              <w:rPr>
+                <w:rFonts w:ascii="Calibri" w:cs="Calibri" w:eastAsia="Calibri" w:hAnsi="Calibri"/>
+                <w:sz w:val="19"/>
+                <w:szCs w:val="19"/>
+              </w:rPr>
+              <w:t xml:space="preserve">1.4 h</w:t>
             </w:r>
           </w:p>
         </w:tc>
@@ -16506,82 +16393,82 @@
         </w:trPr>
         <w:tc>
           <w:tcPr>
-            <w:tcW w:type="dxa" w:w="4839"/>
-            <w:tcBorders>
-              <w:top w:val="single" w:color="BFBFBF" w:sz="4"/>
-              <w:left w:val="single" w:color="BFBFBF" w:sz="4"/>
-              <w:bottom w:val="single" w:color="BFBFBF" w:sz="4"/>
-              <w:right w:val="single" w:color="BFBFBF" w:sz="4"/>
-            </w:tcBorders>
-            <w:tcMar>
-              <w:top w:type="dxa" w:w="60"/>
-              <w:left w:type="dxa" w:w="100"/>
-              <w:bottom w:type="dxa" w:w="60"/>
-              <w:right w:type="dxa" w:w="100"/>
-            </w:tcMar>
-          </w:tcPr>
-          <w:p>
-            <w:r>
-              <w:rPr>
-                <w:rFonts w:ascii="Calibri" w:cs="Calibri" w:eastAsia="Calibri" w:hAnsi="Calibri"/>
-                <w:sz w:val="19"/>
-                <w:szCs w:val="19"/>
-              </w:rPr>
-              <w:t xml:space="preserve">Steal from house 9</w:t>
-            </w:r>
-          </w:p>
-        </w:tc>
-        <w:tc>
-          <w:tcPr>
-            <w:tcW w:type="dxa" w:w="2201"/>
-            <w:tcBorders>
-              <w:top w:val="single" w:color="BFBFBF" w:sz="4"/>
-              <w:left w:val="single" w:color="BFBFBF" w:sz="4"/>
-              <w:bottom w:val="single" w:color="BFBFBF" w:sz="4"/>
-              <w:right w:val="single" w:color="BFBFBF" w:sz="4"/>
-            </w:tcBorders>
-            <w:tcMar>
-              <w:top w:type="dxa" w:w="60"/>
-              <w:left w:type="dxa" w:w="100"/>
-              <w:bottom w:type="dxa" w:w="60"/>
-              <w:right w:type="dxa" w:w="100"/>
-            </w:tcMar>
-          </w:tcPr>
-          <w:p>
-            <w:r>
-              <w:rPr>
-                <w:rFonts w:ascii="Calibri" w:cs="Calibri" w:eastAsia="Calibri" w:hAnsi="Calibri"/>
-                <w:sz w:val="19"/>
-                <w:szCs w:val="19"/>
-              </w:rPr>
-              <w:t xml:space="preserve">about 2 h</w:t>
-            </w:r>
-          </w:p>
-        </w:tc>
-        <w:tc>
-          <w:tcPr>
-            <w:tcW w:type="dxa" w:w="2320"/>
-            <w:tcBorders>
-              <w:top w:val="single" w:color="BFBFBF" w:sz="4"/>
-              <w:left w:val="single" w:color="BFBFBF" w:sz="4"/>
-              <w:bottom w:val="single" w:color="BFBFBF" w:sz="4"/>
-              <w:right w:val="single" w:color="BFBFBF" w:sz="4"/>
-            </w:tcBorders>
-            <w:tcMar>
-              <w:top w:type="dxa" w:w="60"/>
-              <w:left w:type="dxa" w:w="100"/>
-              <w:bottom w:type="dxa" w:w="60"/>
-              <w:right w:type="dxa" w:w="100"/>
-            </w:tcMar>
-          </w:tcPr>
-          <w:p>
-            <w:r>
-              <w:rPr>
-                <w:rFonts w:ascii="Calibri" w:cs="Calibri" w:eastAsia="Calibri" w:hAnsi="Calibri"/>
-                <w:sz w:val="19"/>
-                <w:szCs w:val="19"/>
-              </w:rPr>
-              <w:t xml:space="preserve">3.3 h</w:t>
+            <w:tcW w:type="dxa" w:w="4331"/>
+            <w:tcBorders>
+              <w:top w:val="single" w:color="BFBFBF" w:sz="4"/>
+              <w:left w:val="single" w:color="BFBFBF" w:sz="4"/>
+              <w:bottom w:val="single" w:color="BFBFBF" w:sz="4"/>
+              <w:right w:val="single" w:color="BFBFBF" w:sz="4"/>
+            </w:tcBorders>
+            <w:tcMar>
+              <w:top w:type="dxa" w:w="60"/>
+              <w:left w:type="dxa" w:w="100"/>
+              <w:bottom w:type="dxa" w:w="60"/>
+              <w:right w:type="dxa" w:w="100"/>
+            </w:tcMar>
+          </w:tcPr>
+          <w:p>
+            <w:r>
+              <w:rPr>
+                <w:rFonts w:ascii="Calibri" w:cs="Calibri" w:eastAsia="Calibri" w:hAnsi="Calibri"/>
+                <w:sz w:val="19"/>
+                <w:szCs w:val="19"/>
+              </w:rPr>
+              <w:t xml:space="preserve">Steal from house 6</w:t>
+            </w:r>
+          </w:p>
+        </w:tc>
+        <w:tc>
+          <w:tcPr>
+            <w:tcW w:type="dxa" w:w="2952"/>
+            <w:tcBorders>
+              <w:top w:val="single" w:color="BFBFBF" w:sz="4"/>
+              <w:left w:val="single" w:color="BFBFBF" w:sz="4"/>
+              <w:bottom w:val="single" w:color="BFBFBF" w:sz="4"/>
+              <w:right w:val="single" w:color="BFBFBF" w:sz="4"/>
+            </w:tcBorders>
+            <w:tcMar>
+              <w:top w:type="dxa" w:w="60"/>
+              <w:left w:type="dxa" w:w="100"/>
+              <w:bottom w:type="dxa" w:w="60"/>
+              <w:right w:type="dxa" w:w="100"/>
+            </w:tcMar>
+          </w:tcPr>
+          <w:p>
+            <w:r>
+              <w:rPr>
+                <w:rFonts w:ascii="Calibri" w:cs="Calibri" w:eastAsia="Calibri" w:hAnsi="Calibri"/>
+                <w:sz w:val="19"/>
+                <w:szCs w:val="19"/>
+              </w:rPr>
+              <w:t xml:space="preserve">41 min</w:t>
+            </w:r>
+          </w:p>
+        </w:tc>
+        <w:tc>
+          <w:tcPr>
+            <w:tcW w:type="dxa" w:w="2077"/>
+            <w:tcBorders>
+              <w:top w:val="single" w:color="BFBFBF" w:sz="4"/>
+              <w:left w:val="single" w:color="BFBFBF" w:sz="4"/>
+              <w:bottom w:val="single" w:color="BFBFBF" w:sz="4"/>
+              <w:right w:val="single" w:color="BFBFBF" w:sz="4"/>
+            </w:tcBorders>
+            <w:tcMar>
+              <w:top w:type="dxa" w:w="60"/>
+              <w:left w:type="dxa" w:w="100"/>
+              <w:bottom w:type="dxa" w:w="60"/>
+              <w:right w:type="dxa" w:w="100"/>
+            </w:tcMar>
+          </w:tcPr>
+          <w:p>
+            <w:r>
+              <w:rPr>
+                <w:rFonts w:ascii="Calibri" w:cs="Calibri" w:eastAsia="Calibri" w:hAnsi="Calibri"/>
+                <w:sz w:val="19"/>
+                <w:szCs w:val="19"/>
+              </w:rPr>
+              <w:t xml:space="preserve">1.1 h</w:t>
             </w:r>
           </w:p>
         </w:tc>
@@ -16592,82 +16479,82 @@
         </w:trPr>
         <w:tc>
           <w:tcPr>
-            <w:tcW w:type="dxa" w:w="4839"/>
-            <w:tcBorders>
-              <w:top w:val="single" w:color="BFBFBF" w:sz="4"/>
-              <w:left w:val="single" w:color="BFBFBF" w:sz="4"/>
-              <w:bottom w:val="single" w:color="BFBFBF" w:sz="4"/>
-              <w:right w:val="single" w:color="BFBFBF" w:sz="4"/>
-            </w:tcBorders>
-            <w:tcMar>
-              <w:top w:type="dxa" w:w="60"/>
-              <w:left w:type="dxa" w:w="100"/>
-              <w:bottom w:type="dxa" w:w="60"/>
-              <w:right w:type="dxa" w:w="100"/>
-            </w:tcMar>
-          </w:tcPr>
-          <w:p>
-            <w:r>
-              <w:rPr>
-                <w:rFonts w:ascii="Calibri" w:cs="Calibri" w:eastAsia="Calibri" w:hAnsi="Calibri"/>
-                <w:sz w:val="19"/>
-                <w:szCs w:val="19"/>
-              </w:rPr>
-              <w:t xml:space="preserve">Treadmills 2 to 7</w:t>
-            </w:r>
-          </w:p>
-        </w:tc>
-        <w:tc>
-          <w:tcPr>
-            <w:tcW w:type="dxa" w:w="2201"/>
-            <w:tcBorders>
-              <w:top w:val="single" w:color="BFBFBF" w:sz="4"/>
-              <w:left w:val="single" w:color="BFBFBF" w:sz="4"/>
-              <w:bottom w:val="single" w:color="BFBFBF" w:sz="4"/>
-              <w:right w:val="single" w:color="BFBFBF" w:sz="4"/>
-            </w:tcBorders>
-            <w:tcMar>
-              <w:top w:type="dxa" w:w="60"/>
-              <w:left w:type="dxa" w:w="100"/>
-              <w:bottom w:type="dxa" w:w="60"/>
-              <w:right w:type="dxa" w:w="100"/>
-            </w:tcMar>
-          </w:tcPr>
-          <w:p>
-            <w:r>
-              <w:rPr>
-                <w:rFonts w:ascii="Calibri" w:cs="Calibri" w:eastAsia="Calibri" w:hAnsi="Calibri"/>
-                <w:sz w:val="19"/>
-                <w:szCs w:val="19"/>
-              </w:rPr>
-              <w:t xml:space="preserve">7 min to 1.3 h</w:t>
-            </w:r>
-          </w:p>
-        </w:tc>
-        <w:tc>
-          <w:tcPr>
-            <w:tcW w:type="dxa" w:w="2320"/>
-            <w:tcBorders>
-              <w:top w:val="single" w:color="BFBFBF" w:sz="4"/>
-              <w:left w:val="single" w:color="BFBFBF" w:sz="4"/>
-              <w:bottom w:val="single" w:color="BFBFBF" w:sz="4"/>
-              <w:right w:val="single" w:color="BFBFBF" w:sz="4"/>
-            </w:tcBorders>
-            <w:tcMar>
-              <w:top w:type="dxa" w:w="60"/>
-              <w:left w:type="dxa" w:w="100"/>
-              <w:bottom w:type="dxa" w:w="60"/>
-              <w:right w:type="dxa" w:w="100"/>
-            </w:tcMar>
-          </w:tcPr>
-          <w:p>
-            <w:r>
-              <w:rPr>
-                <w:rFonts w:ascii="Calibri" w:cs="Calibri" w:eastAsia="Calibri" w:hAnsi="Calibri"/>
-                <w:sz w:val="19"/>
-                <w:szCs w:val="19"/>
-              </w:rPr>
-              <w:t xml:space="preserve">12 min to 1.4 h</w:t>
+            <w:tcW w:type="dxa" w:w="4331"/>
+            <w:tcBorders>
+              <w:top w:val="single" w:color="BFBFBF" w:sz="4"/>
+              <w:left w:val="single" w:color="BFBFBF" w:sz="4"/>
+              <w:bottom w:val="single" w:color="BFBFBF" w:sz="4"/>
+              <w:right w:val="single" w:color="BFBFBF" w:sz="4"/>
+            </w:tcBorders>
+            <w:tcMar>
+              <w:top w:type="dxa" w:w="60"/>
+              <w:left w:type="dxa" w:w="100"/>
+              <w:bottom w:type="dxa" w:w="60"/>
+              <w:right w:type="dxa" w:w="100"/>
+            </w:tcMar>
+          </w:tcPr>
+          <w:p>
+            <w:r>
+              <w:rPr>
+                <w:rFonts w:ascii="Calibri" w:cs="Calibri" w:eastAsia="Calibri" w:hAnsi="Calibri"/>
+                <w:sz w:val="19"/>
+                <w:szCs w:val="19"/>
+              </w:rPr>
+              <w:t xml:space="preserve">Steal from house 9</w:t>
+            </w:r>
+          </w:p>
+        </w:tc>
+        <w:tc>
+          <w:tcPr>
+            <w:tcW w:type="dxa" w:w="2952"/>
+            <w:tcBorders>
+              <w:top w:val="single" w:color="BFBFBF" w:sz="4"/>
+              <w:left w:val="single" w:color="BFBFBF" w:sz="4"/>
+              <w:bottom w:val="single" w:color="BFBFBF" w:sz="4"/>
+              <w:right w:val="single" w:color="BFBFBF" w:sz="4"/>
+            </w:tcBorders>
+            <w:tcMar>
+              <w:top w:type="dxa" w:w="60"/>
+              <w:left w:type="dxa" w:w="100"/>
+              <w:bottom w:type="dxa" w:w="60"/>
+              <w:right w:type="dxa" w:w="100"/>
+            </w:tcMar>
+          </w:tcPr>
+          <w:p>
+            <w:r>
+              <w:rPr>
+                <w:rFonts w:ascii="Calibri" w:cs="Calibri" w:eastAsia="Calibri" w:hAnsi="Calibri"/>
+                <w:sz w:val="19"/>
+                <w:szCs w:val="19"/>
+              </w:rPr>
+              <w:t xml:space="preserve">about 1.5 h</w:t>
+            </w:r>
+          </w:p>
+        </w:tc>
+        <w:tc>
+          <w:tcPr>
+            <w:tcW w:type="dxa" w:w="2077"/>
+            <w:tcBorders>
+              <w:top w:val="single" w:color="BFBFBF" w:sz="4"/>
+              <w:left w:val="single" w:color="BFBFBF" w:sz="4"/>
+              <w:bottom w:val="single" w:color="BFBFBF" w:sz="4"/>
+              <w:right w:val="single" w:color="BFBFBF" w:sz="4"/>
+            </w:tcBorders>
+            <w:tcMar>
+              <w:top w:type="dxa" w:w="60"/>
+              <w:left w:type="dxa" w:w="100"/>
+              <w:bottom w:type="dxa" w:w="60"/>
+              <w:right w:type="dxa" w:w="100"/>
+            </w:tcMar>
+          </w:tcPr>
+          <w:p>
+            <w:r>
+              <w:rPr>
+                <w:rFonts w:ascii="Calibri" w:cs="Calibri" w:eastAsia="Calibri" w:hAnsi="Calibri"/>
+                <w:sz w:val="19"/>
+                <w:szCs w:val="19"/>
+              </w:rPr>
+              <w:t xml:space="preserve">2.4 h</w:t>
             </w:r>
           </w:p>
         </w:tc>
@@ -16678,82 +16565,82 @@
         </w:trPr>
         <w:tc>
           <w:tcPr>
-            <w:tcW w:type="dxa" w:w="4839"/>
-            <w:tcBorders>
-              <w:top w:val="single" w:color="BFBFBF" w:sz="4"/>
-              <w:left w:val="single" w:color="BFBFBF" w:sz="4"/>
-              <w:bottom w:val="single" w:color="BFBFBF" w:sz="4"/>
-              <w:right w:val="single" w:color="BFBFBF" w:sz="4"/>
-            </w:tcBorders>
-            <w:tcMar>
-              <w:top w:type="dxa" w:w="60"/>
-              <w:left w:type="dxa" w:w="100"/>
-              <w:bottom w:type="dxa" w:w="60"/>
-              <w:right w:type="dxa" w:w="100"/>
-            </w:tcMar>
-          </w:tcPr>
-          <w:p>
-            <w:r>
-              <w:rPr>
-                <w:rFonts w:ascii="Calibri" w:cs="Calibri" w:eastAsia="Calibri" w:hAnsi="Calibri"/>
-                <w:sz w:val="19"/>
-                <w:szCs w:val="19"/>
-              </w:rPr>
-              <w:t xml:space="preserve">Pet Capacity 1 to 4</w:t>
-            </w:r>
-          </w:p>
-        </w:tc>
-        <w:tc>
-          <w:tcPr>
-            <w:tcW w:type="dxa" w:w="2201"/>
-            <w:tcBorders>
-              <w:top w:val="single" w:color="BFBFBF" w:sz="4"/>
-              <w:left w:val="single" w:color="BFBFBF" w:sz="4"/>
-              <w:bottom w:val="single" w:color="BFBFBF" w:sz="4"/>
-              <w:right w:val="single" w:color="BFBFBF" w:sz="4"/>
-            </w:tcBorders>
-            <w:tcMar>
-              <w:top w:type="dxa" w:w="60"/>
-              <w:left w:type="dxa" w:w="100"/>
-              <w:bottom w:type="dxa" w:w="60"/>
-              <w:right w:type="dxa" w:w="100"/>
-            </w:tcMar>
-          </w:tcPr>
-          <w:p>
-            <w:r>
-              <w:rPr>
-                <w:rFonts w:ascii="Calibri" w:cs="Calibri" w:eastAsia="Calibri" w:hAnsi="Calibri"/>
-                <w:sz w:val="19"/>
-                <w:szCs w:val="19"/>
-              </w:rPr>
-              <w:t xml:space="preserve">5 min to 1.5 h</w:t>
-            </w:r>
-          </w:p>
-        </w:tc>
-        <w:tc>
-          <w:tcPr>
-            <w:tcW w:type="dxa" w:w="2320"/>
-            <w:tcBorders>
-              <w:top w:val="single" w:color="BFBFBF" w:sz="4"/>
-              <w:left w:val="single" w:color="BFBFBF" w:sz="4"/>
-              <w:bottom w:val="single" w:color="BFBFBF" w:sz="4"/>
-              <w:right w:val="single" w:color="BFBFBF" w:sz="4"/>
-            </w:tcBorders>
-            <w:tcMar>
-              <w:top w:type="dxa" w:w="60"/>
-              <w:left w:type="dxa" w:w="100"/>
-              <w:bottom w:type="dxa" w:w="60"/>
-              <w:right w:type="dxa" w:w="100"/>
-            </w:tcMar>
-          </w:tcPr>
-          <w:p>
-            <w:r>
-              <w:rPr>
-                <w:rFonts w:ascii="Calibri" w:cs="Calibri" w:eastAsia="Calibri" w:hAnsi="Calibri"/>
-                <w:sz w:val="19"/>
-                <w:szCs w:val="19"/>
-              </w:rPr>
-              <w:t xml:space="preserve">8 min to 1.6 h</w:t>
+            <w:tcW w:type="dxa" w:w="4331"/>
+            <w:tcBorders>
+              <w:top w:val="single" w:color="BFBFBF" w:sz="4"/>
+              <w:left w:val="single" w:color="BFBFBF" w:sz="4"/>
+              <w:bottom w:val="single" w:color="BFBFBF" w:sz="4"/>
+              <w:right w:val="single" w:color="BFBFBF" w:sz="4"/>
+            </w:tcBorders>
+            <w:tcMar>
+              <w:top w:type="dxa" w:w="60"/>
+              <w:left w:type="dxa" w:w="100"/>
+              <w:bottom w:type="dxa" w:w="60"/>
+              <w:right w:type="dxa" w:w="100"/>
+            </w:tcMar>
+          </w:tcPr>
+          <w:p>
+            <w:r>
+              <w:rPr>
+                <w:rFonts w:ascii="Calibri" w:cs="Calibri" w:eastAsia="Calibri" w:hAnsi="Calibri"/>
+                <w:sz w:val="19"/>
+                <w:szCs w:val="19"/>
+              </w:rPr>
+              <w:t xml:space="preserve">Treadmills 2 to 7</w:t>
+            </w:r>
+          </w:p>
+        </w:tc>
+        <w:tc>
+          <w:tcPr>
+            <w:tcW w:type="dxa" w:w="2952"/>
+            <w:tcBorders>
+              <w:top w:val="single" w:color="BFBFBF" w:sz="4"/>
+              <w:left w:val="single" w:color="BFBFBF" w:sz="4"/>
+              <w:bottom w:val="single" w:color="BFBFBF" w:sz="4"/>
+              <w:right w:val="single" w:color="BFBFBF" w:sz="4"/>
+            </w:tcBorders>
+            <w:tcMar>
+              <w:top w:type="dxa" w:w="60"/>
+              <w:left w:type="dxa" w:w="100"/>
+              <w:bottom w:type="dxa" w:w="60"/>
+              <w:right w:type="dxa" w:w="100"/>
+            </w:tcMar>
+          </w:tcPr>
+          <w:p>
+            <w:r>
+              <w:rPr>
+                <w:rFonts w:ascii="Calibri" w:cs="Calibri" w:eastAsia="Calibri" w:hAnsi="Calibri"/>
+                <w:sz w:val="19"/>
+                <w:szCs w:val="19"/>
+              </w:rPr>
+              <w:t xml:space="preserve">2 min to 57 min</w:t>
+            </w:r>
+          </w:p>
+        </w:tc>
+        <w:tc>
+          <w:tcPr>
+            <w:tcW w:type="dxa" w:w="2077"/>
+            <w:tcBorders>
+              <w:top w:val="single" w:color="BFBFBF" w:sz="4"/>
+              <w:left w:val="single" w:color="BFBFBF" w:sz="4"/>
+              <w:bottom w:val="single" w:color="BFBFBF" w:sz="4"/>
+              <w:right w:val="single" w:color="BFBFBF" w:sz="4"/>
+            </w:tcBorders>
+            <w:tcMar>
+              <w:top w:type="dxa" w:w="60"/>
+              <w:left w:type="dxa" w:w="100"/>
+              <w:bottom w:type="dxa" w:w="60"/>
+              <w:right w:type="dxa" w:w="100"/>
+            </w:tcMar>
+          </w:tcPr>
+          <w:p>
+            <w:r>
+              <w:rPr>
+                <w:rFonts w:ascii="Calibri" w:cs="Calibri" w:eastAsia="Calibri" w:hAnsi="Calibri"/>
+                <w:sz w:val="19"/>
+                <w:szCs w:val="19"/>
+              </w:rPr>
+              <w:t xml:space="preserve">3 min to 1.5 h</w:t>
             </w:r>
           </w:p>
         </w:tc>
@@ -16764,82 +16651,82 @@
         </w:trPr>
         <w:tc>
           <w:tcPr>
-            <w:tcW w:type="dxa" w:w="4839"/>
-            <w:tcBorders>
-              <w:top w:val="single" w:color="BFBFBF" w:sz="4"/>
-              <w:left w:val="single" w:color="BFBFBF" w:sz="4"/>
-              <w:bottom w:val="single" w:color="BFBFBF" w:sz="4"/>
-              <w:right w:val="single" w:color="BFBFBF" w:sz="4"/>
-            </w:tcBorders>
-            <w:tcMar>
-              <w:top w:type="dxa" w:w="60"/>
-              <w:left w:type="dxa" w:w="100"/>
-              <w:bottom w:type="dxa" w:w="60"/>
-              <w:right w:type="dxa" w:w="100"/>
-            </w:tcMar>
-          </w:tcPr>
-          <w:p>
-            <w:r>
-              <w:rPr>
-                <w:rFonts w:ascii="Calibri" w:cs="Calibri" w:eastAsia="Calibri" w:hAnsi="Calibri"/>
-                <w:sz w:val="19"/>
-                <w:szCs w:val="19"/>
-              </w:rPr>
-              <w:t xml:space="preserve">Hatching Pads 1 to 5</w:t>
-            </w:r>
-          </w:p>
-        </w:tc>
-        <w:tc>
-          <w:tcPr>
-            <w:tcW w:type="dxa" w:w="2201"/>
-            <w:tcBorders>
-              <w:top w:val="single" w:color="BFBFBF" w:sz="4"/>
-              <w:left w:val="single" w:color="BFBFBF" w:sz="4"/>
-              <w:bottom w:val="single" w:color="BFBFBF" w:sz="4"/>
-              <w:right w:val="single" w:color="BFBFBF" w:sz="4"/>
-            </w:tcBorders>
-            <w:tcMar>
-              <w:top w:type="dxa" w:w="60"/>
-              <w:left w:type="dxa" w:w="100"/>
-              <w:bottom w:type="dxa" w:w="60"/>
-              <w:right w:type="dxa" w:w="100"/>
-            </w:tcMar>
-          </w:tcPr>
-          <w:p>
-            <w:r>
-              <w:rPr>
-                <w:rFonts w:ascii="Calibri" w:cs="Calibri" w:eastAsia="Calibri" w:hAnsi="Calibri"/>
-                <w:sz w:val="19"/>
-                <w:szCs w:val="19"/>
-              </w:rPr>
-              <w:t xml:space="preserve">8 min to 2.5 h</w:t>
-            </w:r>
-          </w:p>
-        </w:tc>
-        <w:tc>
-          <w:tcPr>
-            <w:tcW w:type="dxa" w:w="2320"/>
-            <w:tcBorders>
-              <w:top w:val="single" w:color="BFBFBF" w:sz="4"/>
-              <w:left w:val="single" w:color="BFBFBF" w:sz="4"/>
-              <w:bottom w:val="single" w:color="BFBFBF" w:sz="4"/>
-              <w:right w:val="single" w:color="BFBFBF" w:sz="4"/>
-            </w:tcBorders>
-            <w:tcMar>
-              <w:top w:type="dxa" w:w="60"/>
-              <w:left w:type="dxa" w:w="100"/>
-              <w:bottom w:type="dxa" w:w="60"/>
-              <w:right w:type="dxa" w:w="100"/>
-            </w:tcMar>
-          </w:tcPr>
-          <w:p>
-            <w:r>
-              <w:rPr>
-                <w:rFonts w:ascii="Calibri" w:cs="Calibri" w:eastAsia="Calibri" w:hAnsi="Calibri"/>
-                <w:sz w:val="19"/>
-                <w:szCs w:val="19"/>
-              </w:rPr>
-              <w:t xml:space="preserve">14 min to 3 h</w:t>
+            <w:tcW w:type="dxa" w:w="4331"/>
+            <w:tcBorders>
+              <w:top w:val="single" w:color="BFBFBF" w:sz="4"/>
+              <w:left w:val="single" w:color="BFBFBF" w:sz="4"/>
+              <w:bottom w:val="single" w:color="BFBFBF" w:sz="4"/>
+              <w:right w:val="single" w:color="BFBFBF" w:sz="4"/>
+            </w:tcBorders>
+            <w:tcMar>
+              <w:top w:type="dxa" w:w="60"/>
+              <w:left w:type="dxa" w:w="100"/>
+              <w:bottom w:type="dxa" w:w="60"/>
+              <w:right w:type="dxa" w:w="100"/>
+            </w:tcMar>
+          </w:tcPr>
+          <w:p>
+            <w:r>
+              <w:rPr>
+                <w:rFonts w:ascii="Calibri" w:cs="Calibri" w:eastAsia="Calibri" w:hAnsi="Calibri"/>
+                <w:sz w:val="19"/>
+                <w:szCs w:val="19"/>
+              </w:rPr>
+              <w:t xml:space="preserve">Pet Capacity 1 to 4</w:t>
+            </w:r>
+          </w:p>
+        </w:tc>
+        <w:tc>
+          <w:tcPr>
+            <w:tcW w:type="dxa" w:w="2952"/>
+            <w:tcBorders>
+              <w:top w:val="single" w:color="BFBFBF" w:sz="4"/>
+              <w:left w:val="single" w:color="BFBFBF" w:sz="4"/>
+              <w:bottom w:val="single" w:color="BFBFBF" w:sz="4"/>
+              <w:right w:val="single" w:color="BFBFBF" w:sz="4"/>
+            </w:tcBorders>
+            <w:tcMar>
+              <w:top w:type="dxa" w:w="60"/>
+              <w:left w:type="dxa" w:w="100"/>
+              <w:bottom w:type="dxa" w:w="60"/>
+              <w:right w:type="dxa" w:w="100"/>
+            </w:tcMar>
+          </w:tcPr>
+          <w:p>
+            <w:r>
+              <w:rPr>
+                <w:rFonts w:ascii="Calibri" w:cs="Calibri" w:eastAsia="Calibri" w:hAnsi="Calibri"/>
+                <w:sz w:val="19"/>
+                <w:szCs w:val="19"/>
+              </w:rPr>
+              <w:t xml:space="preserve">3 min to 1.1 h</w:t>
+            </w:r>
+          </w:p>
+        </w:tc>
+        <w:tc>
+          <w:tcPr>
+            <w:tcW w:type="dxa" w:w="2077"/>
+            <w:tcBorders>
+              <w:top w:val="single" w:color="BFBFBF" w:sz="4"/>
+              <w:left w:val="single" w:color="BFBFBF" w:sz="4"/>
+              <w:bottom w:val="single" w:color="BFBFBF" w:sz="4"/>
+              <w:right w:val="single" w:color="BFBFBF" w:sz="4"/>
+            </w:tcBorders>
+            <w:tcMar>
+              <w:top w:type="dxa" w:w="60"/>
+              <w:left w:type="dxa" w:w="100"/>
+              <w:bottom w:type="dxa" w:w="60"/>
+              <w:right w:type="dxa" w:w="100"/>
+            </w:tcMar>
+          </w:tcPr>
+          <w:p>
+            <w:r>
+              <w:rPr>
+                <w:rFonts w:ascii="Calibri" w:cs="Calibri" w:eastAsia="Calibri" w:hAnsi="Calibri"/>
+                <w:sz w:val="19"/>
+                <w:szCs w:val="19"/>
+              </w:rPr>
+              <w:t xml:space="preserve">5 min to 1.7 h</w:t>
             </w:r>
           </w:p>
         </w:tc>
@@ -16850,7 +16737,93 @@
         </w:trPr>
         <w:tc>
           <w:tcPr>
-            <w:tcW w:type="dxa" w:w="4839"/>
+            <w:tcW w:type="dxa" w:w="4331"/>
+            <w:tcBorders>
+              <w:top w:val="single" w:color="BFBFBF" w:sz="4"/>
+              <w:left w:val="single" w:color="BFBFBF" w:sz="4"/>
+              <w:bottom w:val="single" w:color="BFBFBF" w:sz="4"/>
+              <w:right w:val="single" w:color="BFBFBF" w:sz="4"/>
+            </w:tcBorders>
+            <w:tcMar>
+              <w:top w:type="dxa" w:w="60"/>
+              <w:left w:type="dxa" w:w="100"/>
+              <w:bottom w:type="dxa" w:w="60"/>
+              <w:right w:type="dxa" w:w="100"/>
+            </w:tcMar>
+          </w:tcPr>
+          <w:p>
+            <w:r>
+              <w:rPr>
+                <w:rFonts w:ascii="Calibri" w:cs="Calibri" w:eastAsia="Calibri" w:hAnsi="Calibri"/>
+                <w:sz w:val="19"/>
+                <w:szCs w:val="19"/>
+              </w:rPr>
+              <w:t xml:space="preserve">Hatching Pads 1 to 5</w:t>
+            </w:r>
+          </w:p>
+        </w:tc>
+        <w:tc>
+          <w:tcPr>
+            <w:tcW w:type="dxa" w:w="2952"/>
+            <w:tcBorders>
+              <w:top w:val="single" w:color="BFBFBF" w:sz="4"/>
+              <w:left w:val="single" w:color="BFBFBF" w:sz="4"/>
+              <w:bottom w:val="single" w:color="BFBFBF" w:sz="4"/>
+              <w:right w:val="single" w:color="BFBFBF" w:sz="4"/>
+            </w:tcBorders>
+            <w:tcMar>
+              <w:top w:type="dxa" w:w="60"/>
+              <w:left w:type="dxa" w:w="100"/>
+              <w:bottom w:type="dxa" w:w="60"/>
+              <w:right w:type="dxa" w:w="100"/>
+            </w:tcMar>
+          </w:tcPr>
+          <w:p>
+            <w:r>
+              <w:rPr>
+                <w:rFonts w:ascii="Calibri" w:cs="Calibri" w:eastAsia="Calibri" w:hAnsi="Calibri"/>
+                <w:sz w:val="19"/>
+                <w:szCs w:val="19"/>
+              </w:rPr>
+              <w:t xml:space="preserve">8 min to 1.8 h</w:t>
+            </w:r>
+          </w:p>
+        </w:tc>
+        <w:tc>
+          <w:tcPr>
+            <w:tcW w:type="dxa" w:w="2077"/>
+            <w:tcBorders>
+              <w:top w:val="single" w:color="BFBFBF" w:sz="4"/>
+              <w:left w:val="single" w:color="BFBFBF" w:sz="4"/>
+              <w:bottom w:val="single" w:color="BFBFBF" w:sz="4"/>
+              <w:right w:val="single" w:color="BFBFBF" w:sz="4"/>
+            </w:tcBorders>
+            <w:tcMar>
+              <w:top w:type="dxa" w:w="60"/>
+              <w:left w:type="dxa" w:w="100"/>
+              <w:bottom w:type="dxa" w:w="60"/>
+              <w:right w:type="dxa" w:w="100"/>
+            </w:tcMar>
+          </w:tcPr>
+          <w:p>
+            <w:r>
+              <w:rPr>
+                <w:rFonts w:ascii="Calibri" w:cs="Calibri" w:eastAsia="Calibri" w:hAnsi="Calibri"/>
+                <w:sz w:val="19"/>
+                <w:szCs w:val="19"/>
+              </w:rPr>
+              <w:t xml:space="preserve">13 min to 2.9 h</w:t>
+            </w:r>
+          </w:p>
+        </w:tc>
+      </w:tr>
+      <w:tr>
+        <w:trPr>
+          <w:cantSplit/>
+        </w:trPr>
+        <w:tc>
+          <w:tcPr>
+            <w:tcW w:type="dxa" w:w="4331"/>
             <w:tcBorders>
               <w:top w:val="single" w:color="BFBFBF" w:sz="4"/>
               <w:left w:val="single" w:color="BFBFBF" w:sz="4"/>
@@ -16877,55 +16850,55 @@
         </w:tc>
         <w:tc>
           <w:tcPr>
-            <w:tcW w:type="dxa" w:w="2201"/>
-            <w:tcBorders>
-              <w:top w:val="single" w:color="BFBFBF" w:sz="4"/>
-              <w:left w:val="single" w:color="BFBFBF" w:sz="4"/>
-              <w:bottom w:val="single" w:color="BFBFBF" w:sz="4"/>
-              <w:right w:val="single" w:color="BFBFBF" w:sz="4"/>
-            </w:tcBorders>
-            <w:tcMar>
-              <w:top w:type="dxa" w:w="60"/>
-              <w:left w:type="dxa" w:w="100"/>
-              <w:bottom w:type="dxa" w:w="60"/>
-              <w:right w:type="dxa" w:w="100"/>
-            </w:tcMar>
-          </w:tcPr>
-          <w:p>
-            <w:r>
-              <w:rPr>
-                <w:rFonts w:ascii="Calibri" w:cs="Calibri" w:eastAsia="Calibri" w:hAnsi="Calibri"/>
-                <w:sz w:val="19"/>
-                <w:szCs w:val="19"/>
-              </w:rPr>
-              <w:t xml:space="preserve">3.9 h</w:t>
-            </w:r>
-          </w:p>
-        </w:tc>
-        <w:tc>
-          <w:tcPr>
-            <w:tcW w:type="dxa" w:w="2320"/>
-            <w:tcBorders>
-              <w:top w:val="single" w:color="BFBFBF" w:sz="4"/>
-              <w:left w:val="single" w:color="BFBFBF" w:sz="4"/>
-              <w:bottom w:val="single" w:color="BFBFBF" w:sz="4"/>
-              <w:right w:val="single" w:color="BFBFBF" w:sz="4"/>
-            </w:tcBorders>
-            <w:tcMar>
-              <w:top w:type="dxa" w:w="60"/>
-              <w:left w:type="dxa" w:w="100"/>
-              <w:bottom w:type="dxa" w:w="60"/>
-              <w:right w:type="dxa" w:w="100"/>
-            </w:tcMar>
-          </w:tcPr>
-          <w:p>
-            <w:r>
-              <w:rPr>
-                <w:rFonts w:ascii="Calibri" w:cs="Calibri" w:eastAsia="Calibri" w:hAnsi="Calibri"/>
-                <w:sz w:val="19"/>
-                <w:szCs w:val="19"/>
-              </w:rPr>
-              <w:t xml:space="preserve">6.5 h</w:t>
+            <w:tcW w:type="dxa" w:w="2952"/>
+            <w:tcBorders>
+              <w:top w:val="single" w:color="BFBFBF" w:sz="4"/>
+              <w:left w:val="single" w:color="BFBFBF" w:sz="4"/>
+              <w:bottom w:val="single" w:color="BFBFBF" w:sz="4"/>
+              <w:right w:val="single" w:color="BFBFBF" w:sz="4"/>
+            </w:tcBorders>
+            <w:tcMar>
+              <w:top w:type="dxa" w:w="60"/>
+              <w:left w:type="dxa" w:w="100"/>
+              <w:bottom w:type="dxa" w:w="60"/>
+              <w:right w:type="dxa" w:w="100"/>
+            </w:tcMar>
+          </w:tcPr>
+          <w:p>
+            <w:r>
+              <w:rPr>
+                <w:rFonts w:ascii="Calibri" w:cs="Calibri" w:eastAsia="Calibri" w:hAnsi="Calibri"/>
+                <w:sz w:val="19"/>
+                <w:szCs w:val="19"/>
+              </w:rPr>
+              <w:t xml:space="preserve">4.6 h</w:t>
+            </w:r>
+          </w:p>
+        </w:tc>
+        <w:tc>
+          <w:tcPr>
+            <w:tcW w:type="dxa" w:w="2077"/>
+            <w:tcBorders>
+              <w:top w:val="single" w:color="BFBFBF" w:sz="4"/>
+              <w:left w:val="single" w:color="BFBFBF" w:sz="4"/>
+              <w:bottom w:val="single" w:color="BFBFBF" w:sz="4"/>
+              <w:right w:val="single" w:color="BFBFBF" w:sz="4"/>
+            </w:tcBorders>
+            <w:tcMar>
+              <w:top w:type="dxa" w:w="60"/>
+              <w:left w:type="dxa" w:w="100"/>
+              <w:bottom w:type="dxa" w:w="60"/>
+              <w:right w:type="dxa" w:w="100"/>
+            </w:tcMar>
+          </w:tcPr>
+          <w:p>
+            <w:r>
+              <w:rPr>
+                <w:rFonts w:ascii="Calibri" w:cs="Calibri" w:eastAsia="Calibri" w:hAnsi="Calibri"/>
+                <w:sz w:val="19"/>
+                <w:szCs w:val="19"/>
+              </w:rPr>
+              <w:t xml:space="preserve">7.4 h</w:t>
             </w:r>
           </w:p>
         </w:tc>
@@ -18509,19 +18482,6 @@
     </w:p>
     <w:p>
       <w:pPr>
-        <w:spacing w:after="140"/>
-      </w:pPr>
-      <w:r>
-        <w:rPr>
-          <w:rFonts w:ascii="Calibri" w:cs="Calibri" w:eastAsia="Calibri" w:hAnsi="Calibri"/>
-          <w:b/>
-          <w:bCs/>
-        </w:rPr>
-        <w:t xml:space="preserve">Safety (added 1 October 2026)</w:t>
-      </w:r>
-    </w:p>
-    <w:p>
-      <w:pPr>
         <w:pStyle w:val="ListParagraph"/>
         <w:numPr>
           <w:ilvl w:val="0"/>
@@ -18532,16 +18492,21 @@
       <w:r>
         <w:rPr>
           <w:rFonts w:ascii="Calibri" w:cs="Calibri" w:eastAsia="Calibri" w:hAnsi="Calibri"/>
+        </w:rPr>
+        <w:t xml:space="preserve">Speed balance (5.0): new treadmill, trail and costume XP ladders, a steeper XP curve, five trails (Ghost Wisp and Pumpkin Fire removed; saved trails above number 5 are dropped and an equipped one is unequipped), Zombie Chef 72 and Gravedigger 84.</w:t>
+      </w:r>
+    </w:p>
+    <w:p>
+      <w:pPr>
+        <w:spacing w:after="140"/>
+      </w:pPr>
+      <w:r>
+        <w:rPr>
+          <w:rFonts w:ascii="Calibri" w:cs="Calibri" w:eastAsia="Calibri" w:hAnsi="Calibri"/>
           <w:b/>
           <w:bCs/>
         </w:rPr>
-        <w:t xml:space="preserve">Save lock:</w:t>
-      </w:r>
-      <w:r>
-        <w:rPr>
-          <w:rFonts w:ascii="Calibri" w:cs="Calibri" w:eastAsia="Calibri" w:hAnsi="Calibri"/>
-        </w:rPr>
-        <w:t xml:space="preserve"> a player's save is stamped with the server that has it open, so two servers can't both load it (no duplicating items by rejoining quickly). A crashed server blocks a player for at most 4 minutes. A loaded save is repaired (NaN or negative numbers, unknown pets, eggs or costumes are fixed or removed) so one bad value can't break the game.</w:t>
+        <w:t xml:space="preserve">Safety (added 1 October 2026)</w:t>
       </w:r>
     </w:p>
     <w:p>
@@ -18559,41 +18524,13 @@
           <w:b/>
           <w:bCs/>
         </w:rPr>
-        <w:t xml:space="preserve">Codes:</w:t>
-      </w:r>
-      <w:r>
-        <w:rPr>
-          <w:rFonts w:ascii="Calibri" w:cs="Calibri" w:eastAsia="Calibri" w:hAnsi="Calibri"/>
-        </w:rPr>
-        <w:t xml:space="preserve"> each code can be used once per player and is not case sensitive. They live in </w:t>
-      </w:r>
-      <w:r>
-        <w:rPr>
-          <w:rFonts w:ascii="Courier New" w:cs="Courier New" w:eastAsia="Courier New" w:hAnsi="Courier New"/>
-          <w:sz w:val="20"/>
-          <w:szCs w:val="20"/>
-        </w:rPr>
-        <w:t xml:space="preserve">CODES</w:t>
-      </w:r>
-      <w:r>
-        <w:rPr>
-          <w:rFonts w:ascii="Calibri" w:cs="Calibri" w:eastAsia="Calibri" w:hAnsi="Calibri"/>
-        </w:rPr>
-        <w:t xml:space="preserve"> at the top of </w:t>
-      </w:r>
-      <w:r>
-        <w:rPr>
-          <w:rFonts w:ascii="Courier New" w:cs="Courier New" w:eastAsia="Courier New" w:hAnsi="Courier New"/>
-          <w:sz w:val="20"/>
-          <w:szCs w:val="20"/>
-        </w:rPr>
-        <w:t xml:space="preserve">ShopService.luau</w:t>
-      </w:r>
-      <w:r>
-        <w:rPr>
-          <w:rFonts w:ascii="Calibri" w:cs="Calibri" w:eastAsia="Calibri" w:hAnsi="Calibri"/>
-        </w:rPr>
-        <w:t xml:space="preserve"> (server only, so players can't read them). Current codes: DEV01 gives $100,000, DEV02 gives 10,000 Candy and DEV03 gives $100,000,000. Five wrong codes in a minute lock the box for a minute. Remove the dev codes before a public release.</w:t>
+        <w:t xml:space="preserve">Save lock:</w:t>
+      </w:r>
+      <w:r>
+        <w:rPr>
+          <w:rFonts w:ascii="Calibri" w:cs="Calibri" w:eastAsia="Calibri" w:hAnsi="Calibri"/>
+        </w:rPr>
+        <w:t xml:space="preserve"> a player's save is stamped with the server that has it open, so two servers can't both load it (no duplicating items by rejoining quickly). A crashed server blocks a player for at most 4 minutes. A loaded save is repaired (NaN or negative numbers, unknown pets, eggs or costumes are fixed or removed) so one bad value can't break the game.</w:t>
       </w:r>
     </w:p>
     <w:p>
@@ -18611,13 +18548,41 @@
           <w:b/>
           <w:bCs/>
         </w:rPr>
-        <w:t xml:space="preserve">Prompt range checks:</w:t>
-      </w:r>
-      <w:r>
-        <w:rPr>
-          <w:rFonts w:ascii="Calibri" w:cs="Calibri" w:eastAsia="Calibri" w:hAnsi="Calibri"/>
-        </w:rPr>
-        <w:t xml:space="preserve"> doors, eggs, mannequins and the upgrade sign check that the player is really standing next to them, because cheats can fire prompts from anywhere.</w:t>
+        <w:t xml:space="preserve">Codes:</w:t>
+      </w:r>
+      <w:r>
+        <w:rPr>
+          <w:rFonts w:ascii="Calibri" w:cs="Calibri" w:eastAsia="Calibri" w:hAnsi="Calibri"/>
+        </w:rPr>
+        <w:t xml:space="preserve"> each code can be used once per player and is not case sensitive. They live in </w:t>
+      </w:r>
+      <w:r>
+        <w:rPr>
+          <w:rFonts w:ascii="Courier New" w:cs="Courier New" w:eastAsia="Courier New" w:hAnsi="Courier New"/>
+          <w:sz w:val="20"/>
+          <w:szCs w:val="20"/>
+        </w:rPr>
+        <w:t xml:space="preserve">CODES</w:t>
+      </w:r>
+      <w:r>
+        <w:rPr>
+          <w:rFonts w:ascii="Calibri" w:cs="Calibri" w:eastAsia="Calibri" w:hAnsi="Calibri"/>
+        </w:rPr>
+        <w:t xml:space="preserve"> at the top of </w:t>
+      </w:r>
+      <w:r>
+        <w:rPr>
+          <w:rFonts w:ascii="Courier New" w:cs="Courier New" w:eastAsia="Courier New" w:hAnsi="Courier New"/>
+          <w:sz w:val="20"/>
+          <w:szCs w:val="20"/>
+        </w:rPr>
+        <w:t xml:space="preserve">ShopService.luau</w:t>
+      </w:r>
+      <w:r>
+        <w:rPr>
+          <w:rFonts w:ascii="Calibri" w:cs="Calibri" w:eastAsia="Calibri" w:hAnsi="Calibri"/>
+        </w:rPr>
+        <w:t xml:space="preserve"> (server only, so players can't read them). Current codes: DEV01 gives $100,000, DEV02 gives 10,000 Candy and DEV03 gives $100,000,000. Five wrong codes in a minute lock the box for a minute. Remove the dev codes before a public release.</w:t>
       </w:r>
     </w:p>
     <w:p>
@@ -18635,13 +18600,13 @@
           <w:b/>
           <w:bCs/>
         </w:rPr>
-        <w:t xml:space="preserve">Movement check:</w:t>
-      </w:r>
-      <w:r>
-        <w:rPr>
-          <w:rFonts w:ascii="Calibri" w:cs="Calibri" w:eastAsia="Calibri" w:hAnsi="Calibri"/>
-        </w:rPr>
-        <w:t xml:space="preserve"> if a player keeps moving much faster than the speed the server gave them for 2 seconds, they are put back where they were last fine.</w:t>
+        <w:t xml:space="preserve">Prompt range checks:</w:t>
+      </w:r>
+      <w:r>
+        <w:rPr>
+          <w:rFonts w:ascii="Calibri" w:cs="Calibri" w:eastAsia="Calibri" w:hAnsi="Calibri"/>
+        </w:rPr>
+        <w:t xml:space="preserve"> doors, eggs, mannequins and the upgrade sign check that the player is really standing next to them, because cheats can fire prompts from anywhere.</w:t>
       </w:r>
     </w:p>
     <w:p>
@@ -18656,60 +18621,16 @@
       <w:r>
         <w:rPr>
           <w:rFonts w:ascii="Calibri" w:cs="Calibri" w:eastAsia="Calibri" w:hAnsi="Calibri"/>
-        </w:rPr>
-        <w:t xml:space="preserve">Every purchase and menu action already goes through one server function that re-checks costs, ownership and rate.</w:t>
-      </w:r>
-    </w:p>
-    <w:p>
-      <w:pPr>
-        <w:spacing w:after="140"/>
-      </w:pPr>
-      <w:r>
-        <w:rPr>
-          <w:rFonts w:ascii="Calibri" w:cs="Calibri" w:eastAsia="Calibri" w:hAnsi="Calibri"/>
           <w:b/>
           <w:bCs/>
         </w:rPr>
-        <w:t xml:space="preserve">Written but not yet checked in a playtest</w:t>
-      </w:r>
-      <w:r>
-        <w:rPr>
-          <w:rFonts w:ascii="Calibri" w:cs="Calibri" w:eastAsia="Calibri" w:hAnsi="Calibri"/>
-        </w:rPr>
-        <w:t xml:space="preserve"> (the assistant could not run Studio): the owner path navigation and the "falls through the floor" fallback, the glow and sparkles of Golden, Diamond and Rainbow, the size of Gigantic eggs in their nests and of Gigantic pets on a base, the movement check (false alarms), and the session lock with two servers.</w:t>
-      </w:r>
-    </w:p>
-    <w:p>
-      <w:pPr>
-        <w:pStyle w:val="Heading1"/>
-      </w:pPr>
-      <w:r>
-        <w:rPr>
-          <w:rFonts w:ascii="Calibri" w:cs="Calibri" w:eastAsia="Calibri" w:hAnsi="Calibri"/>
-        </w:rPr>
-        <w:t xml:space="preserve">4. Execution plan</w:t>
-      </w:r>
-    </w:p>
-    <w:p>
-      <w:pPr>
-        <w:spacing w:after="140"/>
-      </w:pPr>
-      <w:r>
-        <w:rPr>
-          <w:rFonts w:ascii="Calibri" w:cs="Calibri" w:eastAsia="Calibri" w:hAnsi="Calibri"/>
-        </w:rPr>
-        <w:t xml:space="preserve">Each phase ends with a playtest in Studio. ✓ done, ◐ in progress, ○ not started.</w:t>
-      </w:r>
-    </w:p>
-    <w:p>
-      <w:pPr>
-        <w:pStyle w:val="Heading2"/>
-      </w:pPr>
-      <w:r>
-        <w:rPr>
-          <w:rFonts w:ascii="Calibri" w:cs="Calibri" w:eastAsia="Calibri" w:hAnsi="Calibri"/>
-        </w:rPr>
-        <w:t xml:space="preserve">Phase 1: Core game</w:t>
+        <w:t xml:space="preserve">Movement check:</w:t>
+      </w:r>
+      <w:r>
+        <w:rPr>
+          <w:rFonts w:ascii="Calibri" w:cs="Calibri" w:eastAsia="Calibri" w:hAnsi="Calibri"/>
+        </w:rPr>
+        <w:t xml:space="preserve"> if a player keeps moving much faster than the speed the server gave them for 2 seconds, they are put back where they were last fine.</w:t>
       </w:r>
     </w:p>
     <w:p>
@@ -18725,7 +18646,59 @@
         <w:rPr>
           <w:rFonts w:ascii="Calibri" w:cs="Calibri" w:eastAsia="Calibri" w:hAnsi="Calibri"/>
         </w:rPr>
-        <w:t xml:space="preserve">✓ Core loop scripted end to end</w:t>
+        <w:t xml:space="preserve">Every purchase and menu action already goes through one server function that re-checks costs, ownership and rate.</w:t>
+      </w:r>
+    </w:p>
+    <w:p>
+      <w:pPr>
+        <w:spacing w:after="140"/>
+      </w:pPr>
+      <w:r>
+        <w:rPr>
+          <w:rFonts w:ascii="Calibri" w:cs="Calibri" w:eastAsia="Calibri" w:hAnsi="Calibri"/>
+          <w:b/>
+          <w:bCs/>
+        </w:rPr>
+        <w:t xml:space="preserve">Written but not yet checked in a playtest</w:t>
+      </w:r>
+      <w:r>
+        <w:rPr>
+          <w:rFonts w:ascii="Calibri" w:cs="Calibri" w:eastAsia="Calibri" w:hAnsi="Calibri"/>
+        </w:rPr>
+        <w:t xml:space="preserve"> (the assistant could not run Studio): the owner path navigation and the "falls through the floor" fallback, the glow and sparkles of Golden, Diamond and Rainbow, the size of Gigantic eggs in their nests and of Gigantic pets on a base, the movement check (false alarms), and the session lock with two servers.</w:t>
+      </w:r>
+    </w:p>
+    <w:p>
+      <w:pPr>
+        <w:pStyle w:val="Heading1"/>
+      </w:pPr>
+      <w:r>
+        <w:rPr>
+          <w:rFonts w:ascii="Calibri" w:cs="Calibri" w:eastAsia="Calibri" w:hAnsi="Calibri"/>
+        </w:rPr>
+        <w:t xml:space="preserve">4. Execution plan</w:t>
+      </w:r>
+    </w:p>
+    <w:p>
+      <w:pPr>
+        <w:spacing w:after="140"/>
+      </w:pPr>
+      <w:r>
+        <w:rPr>
+          <w:rFonts w:ascii="Calibri" w:cs="Calibri" w:eastAsia="Calibri" w:hAnsi="Calibri"/>
+        </w:rPr>
+        <w:t xml:space="preserve">Each phase ends with a playtest in Studio. ✓ done, ◐ in progress, ○ not started.</w:t>
+      </w:r>
+    </w:p>
+    <w:p>
+      <w:pPr>
+        <w:pStyle w:val="Heading2"/>
+      </w:pPr>
+      <w:r>
+        <w:rPr>
+          <w:rFonts w:ascii="Calibri" w:cs="Calibri" w:eastAsia="Calibri" w:hAnsi="Calibri"/>
+        </w:rPr>
+        <w:t xml:space="preserve">Phase 1: Core game</w:t>
       </w:r>
     </w:p>
     <w:p>
@@ -18741,7 +18714,7 @@
         <w:rPr>
           <w:rFonts w:ascii="Calibri" w:cs="Calibri" w:eastAsia="Calibri" w:hAnsi="Calibri"/>
         </w:rPr>
-        <w:t xml:space="preserve">✓ 9-house street, hub, day/night, owners and chases</w:t>
+        <w:t xml:space="preserve">✓ Core loop scripted end to end</w:t>
       </w:r>
     </w:p>
     <w:p>
@@ -18757,7 +18730,7 @@
         <w:rPr>
           <w:rFonts w:ascii="Calibri" w:cs="Calibri" w:eastAsia="Calibri" w:hAnsi="Calibri"/>
         </w:rPr>
-        <w:t xml:space="preserve">✓ Treadmills, speed levels, rebirth</w:t>
+        <w:t xml:space="preserve">✓ 9-house street, hub, day/night, owners and chases</w:t>
       </w:r>
     </w:p>
     <w:p>
@@ -18773,7 +18746,7 @@
         <w:rPr>
           <w:rFonts w:ascii="Calibri" w:cs="Calibri" w:eastAsia="Calibri" w:hAnsi="Calibri"/>
         </w:rPr>
-        <w:t xml:space="preserve">✓ Eggs, incubators, pets, income</w:t>
+        <w:t xml:space="preserve">✓ Treadmills, speed levels, rebirth</w:t>
       </w:r>
     </w:p>
     <w:p>
@@ -18789,18 +18762,7 @@
         <w:rPr>
           <w:rFonts w:ascii="Calibri" w:cs="Calibri" w:eastAsia="Calibri" w:hAnsi="Calibri"/>
         </w:rPr>
-        <w:t xml:space="preserve">✓ Costumes and Trick-or-Treat gating</w:t>
-      </w:r>
-    </w:p>
-    <w:p>
-      <w:pPr>
-        <w:pStyle w:val="Heading2"/>
-      </w:pPr>
-      <w:r>
-        <w:rPr>
-          <w:rFonts w:ascii="Calibri" w:cs="Calibri" w:eastAsia="Calibri" w:hAnsi="Calibri"/>
-        </w:rPr>
-        <w:t xml:space="preserve">Phase 2: Version 2 changes (Studio rebuild)</w:t>
+        <w:t xml:space="preserve">✓ Eggs, incubators, pets, income</w:t>
       </w:r>
     </w:p>
     <w:p>
@@ -18816,7 +18778,18 @@
         <w:rPr>
           <w:rFonts w:ascii="Calibri" w:cs="Calibri" w:eastAsia="Calibri" w:hAnsi="Calibri"/>
         </w:rPr>
-        <w:t xml:space="preserve">✓ Blank tattersall map with level themes, models on the side</w:t>
+        <w:t xml:space="preserve">✓ Costumes and Trick-or-Treat gating</w:t>
+      </w:r>
+    </w:p>
+    <w:p>
+      <w:pPr>
+        <w:pStyle w:val="Heading2"/>
+      </w:pPr>
+      <w:r>
+        <w:rPr>
+          <w:rFonts w:ascii="Calibri" w:cs="Calibri" w:eastAsia="Calibri" w:hAnsi="Calibri"/>
+        </w:rPr>
+        <w:t xml:space="preserve">Phase 2: Version 2 changes (Studio rebuild)</w:t>
       </w:r>
     </w:p>
     <w:p>
@@ -18832,7 +18805,7 @@
         <w:rPr>
           <w:rFonts w:ascii="Calibri" w:cs="Calibri" w:eastAsia="Calibri" w:hAnsi="Calibri"/>
         </w:rPr>
-        <w:t xml:space="preserve">✓ Trails: Trails tab, XP multiplier, visible trail effect</w:t>
+        <w:t xml:space="preserve">✓ Blank tattersall map with level themes, models on the side</w:t>
       </w:r>
     </w:p>
     <w:p>
@@ -18848,7 +18821,7 @@
         <w:rPr>
           <w:rFonts w:ascii="Calibri" w:cs="Calibri" w:eastAsia="Calibri" w:hAnsi="Calibri"/>
         </w:rPr>
-        <w:t xml:space="preserve">✓ 20 egg designs, pet chosen at spawn, no rarity signs</w:t>
+        <w:t xml:space="preserve">✓ Trails: Trails tab, XP multiplier, visible trail effect</w:t>
       </w:r>
     </w:p>
     <w:p>
@@ -18864,7 +18837,7 @@
         <w:rPr>
           <w:rFonts w:ascii="Calibri" w:cs="Calibri" w:eastAsia="Calibri" w:hAnsi="Calibri"/>
         </w:rPr>
-        <w:t xml:space="preserve">✓ Pets wander around the base</w:t>
+        <w:t xml:space="preserve">✓ 20 egg designs, pet chosen at spawn, no rarity signs</w:t>
       </w:r>
     </w:p>
     <w:p>
@@ -18880,18 +18853,7 @@
         <w:rPr>
           <w:rFonts w:ascii="Calibri" w:cs="Calibri" w:eastAsia="Calibri" w:hAnsi="Calibri"/>
         </w:rPr>
-        <w:t xml:space="preserve">✓ Day shortened to 10 s</w:t>
-      </w:r>
-    </w:p>
-    <w:p>
-      <w:pPr>
-        <w:pStyle w:val="Heading2"/>
-      </w:pPr>
-      <w:r>
-        <w:rPr>
-          <w:rFonts w:ascii="Calibri" w:cs="Calibri" w:eastAsia="Calibri" w:hAnsi="Calibri"/>
-        </w:rPr>
-        <w:t xml:space="preserve">Phase 2b: Version 3 UI and pets</w:t>
+        <w:t xml:space="preserve">✓ Pets wander around the base</w:t>
       </w:r>
     </w:p>
     <w:p>
@@ -18907,7 +18869,18 @@
         <w:rPr>
           <w:rFonts w:ascii="Calibri" w:cs="Calibri" w:eastAsia="Calibri" w:hAnsi="Calibri"/>
         </w:rPr>
-        <w:t xml:space="preserve">✓ Cartoon UI: studded menus, HUD, Rebirth menu, Speed Level bar</w:t>
+        <w:t xml:space="preserve">✓ Day shortened to 10 s</w:t>
+      </w:r>
+    </w:p>
+    <w:p>
+      <w:pPr>
+        <w:pStyle w:val="Heading2"/>
+      </w:pPr>
+      <w:r>
+        <w:rPr>
+          <w:rFonts w:ascii="Calibri" w:cs="Calibri" w:eastAsia="Calibri" w:hAnsi="Calibri"/>
+        </w:rPr>
+        <w:t xml:space="preserve">Phase 2b: Version 3 UI and pets</w:t>
       </w:r>
     </w:p>
     <w:p>
@@ -18923,7 +18896,7 @@
         <w:rPr>
           <w:rFonts w:ascii="Calibri" w:cs="Calibri" w:eastAsia="Calibri" w:hAnsi="Calibri"/>
         </w:rPr>
-        <w:t xml:space="preserve">✓ Pets inventory, Equip Best, Pets and Eggs window, Hatch Best</w:t>
+        <w:t xml:space="preserve">✓ Cartoon UI: studded menus, HUD, Rebirth menu, Speed Level bar</w:t>
       </w:r>
     </w:p>
     <w:p>
@@ -18939,7 +18912,7 @@
         <w:rPr>
           <w:rFonts w:ascii="Calibri" w:cs="Calibri" w:eastAsia="Calibri" w:hAnsi="Calibri"/>
         </w:rPr>
-        <w:t xml:space="preserve">✓ Friend boost (+10% Money per friend)</w:t>
+        <w:t xml:space="preserve">✓ Pets inventory, Equip Best, Pets and Eggs window, Hatch Best</w:t>
       </w:r>
     </w:p>
     <w:p>
@@ -18955,18 +18928,7 @@
         <w:rPr>
           <w:rFonts w:ascii="Calibri" w:cs="Calibri" w:eastAsia="Calibri" w:hAnsi="Calibri"/>
         </w:rPr>
-        <w:t xml:space="preserve">◐ Playtest the new UI in Studio on PC and phone; swap the drawn Money/Candy icons for uploaded pictures</w:t>
-      </w:r>
-    </w:p>
-    <w:p>
-      <w:pPr>
-        <w:pStyle w:val="Heading2"/>
-      </w:pPr>
-      <w:r>
-        <w:rPr>
-          <w:rFonts w:ascii="Calibri" w:cs="Calibri" w:eastAsia="Calibri" w:hAnsi="Calibri"/>
-        </w:rPr>
-        <w:t xml:space="preserve">Phase 2c: Version 5 rework</w:t>
+        <w:t xml:space="preserve">✓ Friend boost (+10% Money per friend)</w:t>
       </w:r>
     </w:p>
     <w:p>
@@ -18982,7 +18944,18 @@
         <w:rPr>
           <w:rFonts w:ascii="Calibri" w:cs="Calibri" w:eastAsia="Calibri" w:hAnsi="Calibri"/>
         </w:rPr>
-        <w:t xml:space="preserve">✓ Costumes bought with Candy (Candy multiplier and XP rate), treadmills bought with Money (XP multiplier)</w:t>
+        <w:t xml:space="preserve">◐ Playtest the new UI in Studio on PC and phone; swap the drawn Money/Candy icons for uploaded pictures</w:t>
+      </w:r>
+    </w:p>
+    <w:p>
+      <w:pPr>
+        <w:pStyle w:val="Heading2"/>
+      </w:pPr>
+      <w:r>
+        <w:rPr>
+          <w:rFonts w:ascii="Calibri" w:cs="Calibri" w:eastAsia="Calibri" w:hAnsi="Calibri"/>
+        </w:rPr>
+        <w:t xml:space="preserve">Phase 2c: Version 5 rework</w:t>
       </w:r>
     </w:p>
     <w:p>
@@ -18998,7 +18971,7 @@
         <w:rPr>
           <w:rFonts w:ascii="Calibri" w:cs="Calibri" w:eastAsia="Calibri" w:hAnsi="Calibri"/>
         </w:rPr>
-        <w:t xml:space="preserve">✓ Speed XP while running anywhere; treadmill running in place still counts</w:t>
+        <w:t xml:space="preserve">✓ Costumes bought with Candy (Candy multiplier and XP rate), treadmills bought with Money (XP multiplier)</w:t>
       </w:r>
     </w:p>
     <w:p>
@@ -19014,7 +18987,7 @@
         <w:rPr>
           <w:rFonts w:ascii="Calibri" w:cs="Calibri" w:eastAsia="Calibri" w:hAnsi="Calibri"/>
         </w:rPr>
-        <w:t xml:space="preserve">✓ Separate Pet Capacity and Hatching Pad upgrades with their own signs and base visuals</w:t>
+        <w:t xml:space="preserve">✓ Speed XP while running anywhere; treadmill running in place still counts</w:t>
       </w:r>
     </w:p>
     <w:p>
@@ -19030,7 +19003,7 @@
         <w:rPr>
           <w:rFonts w:ascii="Calibri" w:cs="Calibri" w:eastAsia="Calibri" w:hAnsi="Calibri"/>
         </w:rPr>
-        <w:t xml:space="preserve">✓ First-time tutorial with arrows and a "Buy a Costume!" message</w:t>
+        <w:t xml:space="preserve">✓ Separate Pet Capacity and Hatching Pad upgrades with their own signs and base visuals</w:t>
       </w:r>
     </w:p>
     <w:p>
@@ -19046,18 +19019,7 @@
         <w:rPr>
           <w:rFonts w:ascii="Calibri" w:cs="Calibri" w:eastAsia="Calibri" w:hAnsi="Calibri"/>
         </w:rPr>
-        <w:t xml:space="preserve">○ Playtest the new flow in Studio: spawn at the shop, arrows, the two signs, the base look at every level</w:t>
-      </w:r>
-    </w:p>
-    <w:p>
-      <w:pPr>
-        <w:pStyle w:val="Heading2"/>
-      </w:pPr>
-      <w:r>
-        <w:rPr>
-          <w:rFonts w:ascii="Calibri" w:cs="Calibri" w:eastAsia="Calibri" w:hAnsi="Calibri"/>
-        </w:rPr>
-        <w:t xml:space="preserve">Phase 3: World building (Viktor, by hand)</w:t>
+        <w:t xml:space="preserve">✓ First-time tutorial with arrows and a "Buy a Costume!" message</w:t>
       </w:r>
     </w:p>
     <w:p>
@@ -19073,7 +19035,18 @@
         <w:rPr>
           <w:rFonts w:ascii="Calibri" w:cs="Calibri" w:eastAsia="Calibri" w:hAnsi="Calibri"/>
         </w:rPr>
-        <w:t xml:space="preserve">✓ House 1 (Old Witch swamp cottage) and House 2 (Mummy tomb) built and placed on the street</w:t>
+        <w:t xml:space="preserve">○ Playtest the new flow in Studio: spawn at the shop, arrows, the two signs, the base look at every level</w:t>
+      </w:r>
+    </w:p>
+    <w:p>
+      <w:pPr>
+        <w:pStyle w:val="Heading2"/>
+      </w:pPr>
+      <w:r>
+        <w:rPr>
+          <w:rFonts w:ascii="Calibri" w:cs="Calibri" w:eastAsia="Calibri" w:hAnsi="Calibri"/>
+        </w:rPr>
+        <w:t xml:space="preserve">Phase 3: World building (Viktor, by hand)</w:t>
       </w:r>
     </w:p>
     <w:p>
@@ -19089,7 +19062,7 @@
         <w:rPr>
           <w:rFonts w:ascii="Calibri" w:cs="Calibri" w:eastAsia="Calibri" w:hAnsi="Calibri"/>
         </w:rPr>
-        <w:t xml:space="preserve">○ Place houses 3 to 9 on their lots and dress each lot to its theme</w:t>
+        <w:t xml:space="preserve">✓ House 1 (Old Witch swamp cottage) and House 2 (Mummy tomb) built and placed on the street</w:t>
       </w:r>
     </w:p>
     <w:p>
@@ -19105,7 +19078,7 @@
         <w:rPr>
           <w:rFonts w:ascii="Calibri" w:cs="Calibri" w:eastAsia="Calibri" w:hAnsi="Calibri"/>
         </w:rPr>
-        <w:t xml:space="preserve">○ Upgrade houses 3 to 9 to the same quality as the witch house and the tomb</w:t>
+        <w:t xml:space="preserve">○ Place houses 3 to 9 on their lots and dress each lot to its theme</w:t>
       </w:r>
     </w:p>
     <w:p>
@@ -19121,7 +19094,7 @@
         <w:rPr>
           <w:rFonts w:ascii="Calibri" w:cs="Calibri" w:eastAsia="Calibri" w:hAnsi="Calibri"/>
         </w:rPr>
-        <w:t xml:space="preserve">○ Interiors of houses 3 to 9: furniture, hiding spots and room layouts that make the chase interesting (the owner now finds his way around them)</w:t>
+        <w:t xml:space="preserve">○ Upgrade houses 3 to 9 to the same quality as the witch house and the tomb</w:t>
       </w:r>
     </w:p>
     <w:p>
@@ -19137,7 +19110,7 @@
         <w:rPr>
           <w:rFonts w:ascii="Calibri" w:cs="Calibri" w:eastAsia="Calibri" w:hAnsi="Calibri"/>
         </w:rPr>
-        <w:t xml:space="preserve">○ Real treadmill model per tier</w:t>
+        <w:t xml:space="preserve">○ Interiors of houses 3 to 9: furniture, hiding spots and room layouts that make the chase interesting (the owner now finds his way around them)</w:t>
       </w:r>
     </w:p>
     <w:p>
@@ -19153,18 +19126,7 @@
         <w:rPr>
           <w:rFonts w:ascii="Calibri" w:cs="Calibri" w:eastAsia="Calibri" w:hAnsi="Calibri"/>
         </w:rPr>
-        <w:t xml:space="preserve">○ Check every door, egg spot and owner spawn still works after placing houses</w:t>
-      </w:r>
-    </w:p>
-    <w:p>
-      <w:pPr>
-        <w:pStyle w:val="Heading2"/>
-      </w:pPr>
-      <w:r>
-        <w:rPr>
-          <w:rFonts w:ascii="Calibri" w:cs="Calibri" w:eastAsia="Calibri" w:hAnsi="Calibri"/>
-        </w:rPr>
-        <w:t xml:space="preserve">Phase 4: Game feel</w:t>
+        <w:t xml:space="preserve">○ Real treadmill model per tier</w:t>
       </w:r>
     </w:p>
     <w:p>
@@ -19180,7 +19142,18 @@
         <w:rPr>
           <w:rFonts w:ascii="Calibri" w:cs="Calibri" w:eastAsia="Calibri" w:hAnsi="Calibri"/>
         </w:rPr>
-        <w:t xml:space="preserve">✓ Door scene: door opens, owner talks in a speech bubble, candy flies or a roast and a slam</w:t>
+        <w:t xml:space="preserve">○ Check every door, egg spot and owner spawn still works after placing houses</w:t>
+      </w:r>
+    </w:p>
+    <w:p>
+      <w:pPr>
+        <w:pStyle w:val="Heading2"/>
+      </w:pPr>
+      <w:r>
+        <w:rPr>
+          <w:rFonts w:ascii="Calibri" w:cs="Calibri" w:eastAsia="Calibri" w:hAnsi="Calibri"/>
+        </w:rPr>
+        <w:t xml:space="preserve">Phase 4: Game feel</w:t>
       </w:r>
     </w:p>
     <w:p>
@@ -19196,7 +19169,7 @@
         <w:rPr>
           <w:rFonts w:ascii="Calibri" w:cs="Calibri" w:eastAsia="Calibri" w:hAnsi="Calibri"/>
         </w:rPr>
-        <w:t xml:space="preserve">✓ Owner reaction ("!"), head start by egg rarity, walk home after the chase</w:t>
+        <w:t xml:space="preserve">✓ Door scene: door opens, owner talks in a speech bubble, candy flies or a roast and a slam</w:t>
       </w:r>
     </w:p>
     <w:p>
@@ -19212,7 +19185,7 @@
         <w:rPr>
           <w:rFonts w:ascii="Calibri" w:cs="Calibri" w:eastAsia="Calibri" w:hAnsi="Calibri"/>
         </w:rPr>
-        <w:t xml:space="preserve">○ Animations: owner run and grab, pet walk and idle, hatch reveal, costume change, a real "carrying" pose</w:t>
+        <w:t xml:space="preserve">✓ Owner reaction ("!"), head start by egg rarity, walk home after the chase</w:t>
       </w:r>
     </w:p>
     <w:p>
@@ -19228,7 +19201,7 @@
         <w:rPr>
           <w:rFonts w:ascii="Calibri" w:cs="Calibri" w:eastAsia="Calibri" w:hAnsi="Calibri"/>
         </w:rPr>
-        <w:t xml:space="preserve">○ Sounds and music: night ambience, door knock, alarm when an owner spots you, chase music, hatch fanfare</w:t>
+        <w:t xml:space="preserve">○ Animations: owner run and grab, pet walk and idle, hatch reveal, costume change, a real "carrying" pose</w:t>
       </w:r>
     </w:p>
     <w:p>
@@ -19244,7 +19217,7 @@
         <w:rPr>
           <w:rFonts w:ascii="Calibri" w:cs="Calibri" w:eastAsia="Calibri" w:hAnsi="Calibri"/>
         </w:rPr>
-        <w:t xml:space="preserve">○ Feedback: "RUN!" banner, screen shake on catch, Candy and Money flying to the HUD</w:t>
+        <w:t xml:space="preserve">○ Sounds and music: night ambience, door knock, alarm when an owner spots you, chase music, hatch fanfare</w:t>
       </w:r>
     </w:p>
     <w:p>
@@ -19260,7 +19233,7 @@
         <w:rPr>
           <w:rFonts w:ascii="Calibri" w:cs="Calibri" w:eastAsia="Calibri" w:hAnsi="Calibri"/>
         </w:rPr>
-        <w:t xml:space="preserve">◐ Owner pathfinding through rooms, doors, windows and stairs (written, needs a playtest in the real houses)</w:t>
+        <w:t xml:space="preserve">○ Feedback: "RUN!" banner, screen shake on catch, Candy and Money flying to the HUD</w:t>
       </w:r>
     </w:p>
     <w:p>
@@ -19276,18 +19249,7 @@
         <w:rPr>
           <w:rFonts w:ascii="Calibri" w:cs="Calibri" w:eastAsia="Calibri" w:hAnsi="Calibri"/>
         </w:rPr>
-        <w:t xml:space="preserve">◐ UI polish and a mobile-friendly layout (new UI done, phone layout still to test)</w:t>
-      </w:r>
-    </w:p>
-    <w:p>
-      <w:pPr>
-        <w:pStyle w:val="Heading2"/>
-      </w:pPr>
-      <w:r>
-        <w:rPr>
-          <w:rFonts w:ascii="Calibri" w:cs="Calibri" w:eastAsia="Calibri" w:hAnsi="Calibri"/>
-        </w:rPr>
-        <w:t xml:space="preserve">Phase 5: Balance</w:t>
+        <w:t xml:space="preserve">◐ Owner pathfinding through rooms, doors, windows and stairs (written, needs a playtest in the real houses)</w:t>
       </w:r>
     </w:p>
     <w:p>
@@ -19303,7 +19265,18 @@
         <w:rPr>
           <w:rFonts w:ascii="Calibri" w:cs="Calibri" w:eastAsia="Calibri" w:hAnsi="Calibri"/>
         </w:rPr>
-        <w:t xml:space="preserve">✓ Simulation of the full progression (Candy per night, Money per hour, time to each costume, trail and speed level), see 2.11</w:t>
+        <w:t xml:space="preserve">◐ UI polish and a mobile-friendly layout (new UI done, phone layout still to test)</w:t>
+      </w:r>
+    </w:p>
+    <w:p>
+      <w:pPr>
+        <w:pStyle w:val="Heading2"/>
+      </w:pPr>
+      <w:r>
+        <w:rPr>
+          <w:rFonts w:ascii="Calibri" w:cs="Calibri" w:eastAsia="Calibri" w:hAnsi="Calibri"/>
+        </w:rPr>
+        <w:t xml:space="preserve">Phase 5: Balance</w:t>
       </w:r>
     </w:p>
     <w:p>
@@ -19319,7 +19292,7 @@
         <w:rPr>
           <w:rFonts w:ascii="Calibri" w:cs="Calibri" w:eastAsia="Calibri" w:hAnsi="Calibri"/>
         </w:rPr>
-        <w:t xml:space="preserve">✓ Speed XP curve, prices and the first two owners tuned; Money prices x3 for the egg variants</w:t>
+        <w:t xml:space="preserve">✓ Simulation of the full progression (Candy per night, Money per hour, time to each costume, trail and speed level), see 2.11</w:t>
       </w:r>
     </w:p>
     <w:p>
@@ -19335,21 +19308,7 @@
         <w:rPr>
           <w:rFonts w:ascii="Calibri" w:cs="Calibri" w:eastAsia="Calibri" w:hAnsi="Calibri"/>
         </w:rPr>
-        <w:t xml:space="preserve">○ Playtest the pacing with real players and adjust (all numbers are in </w:t>
-      </w:r>
-      <w:r>
-        <w:rPr>
-          <w:rFonts w:ascii="Courier New" w:cs="Courier New" w:eastAsia="Courier New" w:hAnsi="Courier New"/>
-          <w:sz w:val="20"/>
-          <w:szCs w:val="20"/>
-        </w:rPr>
-        <w:t xml:space="preserve">Config.luau</w:t>
-      </w:r>
-      <w:r>
-        <w:rPr>
-          <w:rFonts w:ascii="Calibri" w:cs="Calibri" w:eastAsia="Calibri" w:hAnsi="Calibri"/>
-        </w:rPr>
-        <w:t xml:space="preserve">)</w:t>
+        <w:t xml:space="preserve">✓ Speed XP curve, prices and the first two owners tuned; Money prices x3 for the egg variants</w:t>
       </w:r>
     </w:p>
     <w:p>
@@ -19365,7 +19324,21 @@
         <w:rPr>
           <w:rFonts w:ascii="Calibri" w:cs="Calibri" w:eastAsia="Calibri" w:hAnsi="Calibri"/>
         </w:rPr>
-        <w:t xml:space="preserve">○ Give Candy something to buy after the Cursed Treadmill</w:t>
+        <w:t xml:space="preserve">○ Playtest the pacing with real players and adjust (all numbers are in </w:t>
+      </w:r>
+      <w:r>
+        <w:rPr>
+          <w:rFonts w:ascii="Courier New" w:cs="Courier New" w:eastAsia="Courier New" w:hAnsi="Courier New"/>
+          <w:sz w:val="20"/>
+          <w:szCs w:val="20"/>
+        </w:rPr>
+        <w:t xml:space="preserve">Config.luau</w:t>
+      </w:r>
+      <w:r>
+        <w:rPr>
+          <w:rFonts w:ascii="Calibri" w:cs="Calibri" w:eastAsia="Calibri" w:hAnsi="Calibri"/>
+        </w:rPr>
+        <w:t xml:space="preserve">)</w:t>
       </w:r>
     </w:p>
     <w:p>
@@ -19381,18 +19354,7 @@
         <w:rPr>
           <w:rFonts w:ascii="Calibri" w:cs="Calibri" w:eastAsia="Calibri" w:hAnsi="Calibri"/>
         </w:rPr>
-        <w:t xml:space="preserve">○ Tune house rarity odds and hatch times for houses 3 to 9 once they are built</w:t>
-      </w:r>
-    </w:p>
-    <w:p>
-      <w:pPr>
-        <w:pStyle w:val="Heading2"/>
-      </w:pPr>
-      <w:r>
-        <w:rPr>
-          <w:rFonts w:ascii="Calibri" w:cs="Calibri" w:eastAsia="Calibri" w:hAnsi="Calibri"/>
-        </w:rPr>
-        <w:t xml:space="preserve">Phase 6: Retention and social</w:t>
+        <w:t xml:space="preserve">○ Give Candy something to buy after the Cursed Treadmill</w:t>
       </w:r>
     </w:p>
     <w:p>
@@ -19408,7 +19370,18 @@
         <w:rPr>
           <w:rFonts w:ascii="Calibri" w:cs="Calibri" w:eastAsia="Calibri" w:hAnsi="Calibri"/>
         </w:rPr>
-        <w:t xml:space="preserve">○ Tutorial for the first night, including how to read egg designs</w:t>
+        <w:t xml:space="preserve">○ Tune house rarity odds and hatch times for houses 3 to 9 once they are built</w:t>
+      </w:r>
+    </w:p>
+    <w:p>
+      <w:pPr>
+        <w:pStyle w:val="Heading2"/>
+      </w:pPr>
+      <w:r>
+        <w:rPr>
+          <w:rFonts w:ascii="Calibri" w:cs="Calibri" w:eastAsia="Calibri" w:hAnsi="Calibri"/>
+        </w:rPr>
+        <w:t xml:space="preserve">Phase 6: Retention and social</w:t>
       </w:r>
     </w:p>
     <w:p>
@@ -19424,7 +19397,7 @@
         <w:rPr>
           <w:rFonts w:ascii="Calibri" w:cs="Calibri" w:eastAsia="Calibri" w:hAnsi="Calibri"/>
         </w:rPr>
-        <w:t xml:space="preserve">○ Pet index that shows each pet's egg design once discovered</w:t>
+        <w:t xml:space="preserve">○ Tutorial for the first night, including how to read egg designs</w:t>
       </w:r>
     </w:p>
     <w:p>
@@ -19440,7 +19413,7 @@
         <w:rPr>
           <w:rFonts w:ascii="Calibri" w:cs="Calibri" w:eastAsia="Calibri" w:hAnsi="Calibri"/>
         </w:rPr>
-        <w:t xml:space="preserve">○ Offline earnings, daily rewards, quests</w:t>
+        <w:t xml:space="preserve">○ Pet index that shows each pet's egg design once discovered</w:t>
       </w:r>
     </w:p>
     <w:p>
@@ -19456,18 +19429,7 @@
         <w:rPr>
           <w:rFonts w:ascii="Calibri" w:cs="Calibri" w:eastAsia="Calibri" w:hAnsi="Calibri"/>
         </w:rPr>
-        <w:t xml:space="preserve">○ Leaderboards (Money, Speed Level, rebirths)</w:t>
-      </w:r>
-    </w:p>
-    <w:p>
-      <w:pPr>
-        <w:pStyle w:val="Heading2"/>
-      </w:pPr>
-      <w:r>
-        <w:rPr>
-          <w:rFonts w:ascii="Calibri" w:cs="Calibri" w:eastAsia="Calibri" w:hAnsi="Calibri"/>
-        </w:rPr>
-        <w:t xml:space="preserve">Phase 7: Launch prep</w:t>
+        <w:t xml:space="preserve">○ Offline earnings, daily rewards, quests</w:t>
       </w:r>
     </w:p>
     <w:p>
@@ -19483,7 +19445,18 @@
         <w:rPr>
           <w:rFonts w:ascii="Calibri" w:cs="Calibri" w:eastAsia="Calibri" w:hAnsi="Calibri"/>
         </w:rPr>
-        <w:t xml:space="preserve">○ Delete the old backups from ServerStorage (about 60,000 objects) and the DEV01/DEV02 codes</w:t>
+        <w:t xml:space="preserve">○ Leaderboards (Money, Speed Level, rebirths)</w:t>
+      </w:r>
+    </w:p>
+    <w:p>
+      <w:pPr>
+        <w:pStyle w:val="Heading2"/>
+      </w:pPr>
+      <w:r>
+        <w:rPr>
+          <w:rFonts w:ascii="Calibri" w:cs="Calibri" w:eastAsia="Calibri" w:hAnsi="Calibri"/>
+        </w:rPr>
+        <w:t xml:space="preserve">Phase 7: Launch prep</w:t>
       </w:r>
     </w:p>
     <w:p>
@@ -19499,7 +19472,7 @@
         <w:rPr>
           <w:rFonts w:ascii="Calibri" w:cs="Calibri" w:eastAsia="Calibri" w:hAnsi="Calibri"/>
         </w:rPr>
-        <w:t xml:space="preserve">○ Publish privately, turn on API access, test saving</w:t>
+        <w:t xml:space="preserve">○ Delete the old backups from ServerStorage (about 60,000 objects) and the DEV01/DEV02 codes</w:t>
       </w:r>
     </w:p>
     <w:p>
@@ -19515,7 +19488,7 @@
         <w:rPr>
           <w:rFonts w:ascii="Calibri" w:cs="Calibri" w:eastAsia="Calibri" w:hAnsi="Calibri"/>
         </w:rPr>
-        <w:t xml:space="preserve">◐ Anti-exploit checks on the server (done: save lock, prompt range, movement check, one validated entry point for every action; to do: a real test with an exploit tool, ProfileStore)</w:t>
+        <w:t xml:space="preserve">○ Publish privately, turn on API access, test saving</w:t>
       </w:r>
     </w:p>
     <w:p>
@@ -19531,7 +19504,7 @@
         <w:rPr>
           <w:rFonts w:ascii="Calibri" w:cs="Calibri" w:eastAsia="Calibri" w:hAnsi="Calibri"/>
         </w:rPr>
-        <w:t xml:space="preserve">○ Monetisation (see section 5)</w:t>
+        <w:t xml:space="preserve">◐ Anti-exploit checks on the server (done: save lock, prompt range, movement check, one validated entry point for every action; to do: a real test with an exploit tool, ProfileStore)</w:t>
       </w:r>
     </w:p>
     <w:p>
@@ -19547,7 +19520,7 @@
         <w:rPr>
           <w:rFonts w:ascii="Calibri" w:cs="Calibri" w:eastAsia="Calibri" w:hAnsi="Calibri"/>
         </w:rPr>
-        <w:t xml:space="preserve">○ Game icon, thumbnails, description, max players set to 5</w:t>
+        <w:t xml:space="preserve">○ Monetisation (see section 5)</w:t>
       </w:r>
     </w:p>
     <w:p>
@@ -19563,6 +19536,22 @@
         <w:rPr>
           <w:rFonts w:ascii="Calibri" w:cs="Calibri" w:eastAsia="Calibri" w:hAnsi="Calibri"/>
         </w:rPr>
+        <w:t xml:space="preserve">○ Game icon, thumbnails, description, max players set to 5</w:t>
+      </w:r>
+    </w:p>
+    <w:p>
+      <w:pPr>
+        <w:pStyle w:val="ListParagraph"/>
+        <w:numPr>
+          <w:ilvl w:val="0"/>
+          <w:numId w:val="2"/>
+        </w:numPr>
+        <w:spacing w:after="60"/>
+      </w:pPr>
+      <w:r>
+        <w:rPr>
+          <w:rFonts w:ascii="Calibri" w:cs="Calibri" w:eastAsia="Calibri" w:hAnsi="Calibri"/>
+        </w:rPr>
         <w:t xml:space="preserve">○ Friends-only test, fix bugs, then public release around Halloween</w:t>
       </w:r>
     </w:p>
@@ -19669,6 +19658,25 @@
           <w:rFonts w:ascii="Calibri" w:cs="Calibri" w:eastAsia="Calibri" w:hAnsi="Calibri"/>
         </w:rPr>
         <w:t xml:space="preserve"> A new player carrying the smallest egg runs at about 15, so house 1 can always be escaped. Check in Studio that the owner starting inside the house still feels fair.</w:t>
+      </w:r>
+    </w:p>
+    <w:p>
+      <w:pPr>
+        <w:spacing w:after="140"/>
+      </w:pPr>
+      <w:r>
+        <w:rPr>
+          <w:rFonts w:ascii="Calibri" w:cs="Calibri" w:eastAsia="Calibri" w:hAnsi="Calibri"/>
+          <w:b/>
+          <w:bCs/>
+        </w:rPr>
+        <w:t xml:space="preserve">3b. Houses 4 to 6 come close together.</w:t>
+      </w:r>
+      <w:r>
+        <w:rPr>
+          <w:rFonts w:ascii="Calibri" w:cs="Calibri" w:eastAsia="Calibri" w:hAnsi="Calibri"/>
+        </w:rPr>
+        <w:t xml:space="preserve"> In the simulation houses 4, 5 and 6 open at about 36, 39 and 41 minutes because the owner speeds (72, 84, 88) are close and the big multipliers add speed fast. Spread the speeds of houses 5 to 8 if you want a longer gap between them.</w:t>
       </w:r>
     </w:p>
     <w:p>

</xml_diff>

<commit_message>
Kick mechanic: a caught thief is kicked about 100 studs away with a kick sound
Co-Authored-By: Claude Sonnet 5.5 <noreply@anthropic.com>
Claude-Session: https://claude.ai/code/session_013ivEnYiZGofRBeqQFKAVhJ
</commit_message>
<xml_diff>
--- a/docs/Spooky-Steal-Design-and-Plan.docx
+++ b/docs/Spooky-Steal-Design-and-Plan.docx
@@ -686,6 +686,113 @@
                 <w:szCs w:val="19"/>
               </w:rPr>
               <w:t xml:space="preserve">Treadmills are x1, x2, x3, x5, x8, x13, x21; trails x1.5, x2, x3, x4, x5 (5 trails); costume Speed XP per second grows 1, 1.5, 2.5, 4, 7, 12, 20, 35, 60, 100, 170. Speed Levels cost much more XP (20% more per level up to level 30, then 8%, then 4%) so house 3 comes at about 20 min and house 4 at about 35 min. The Zombie Chef now runs at 72 and the Gravedigger at 84 so house 4 is not reachable right after house 3.</w:t>
+            </w:r>
+          </w:p>
+        </w:tc>
+      </w:tr>
+      <w:tr>
+        <w:trPr>
+          <w:cantSplit/>
+        </w:trPr>
+        <w:tc>
+          <w:tcPr>
+            <w:tcW w:type="dxa" w:w="3746"/>
+            <w:tcBorders>
+              <w:top w:val="single" w:color="BFBFBF" w:sz="4"/>
+              <w:left w:val="single" w:color="BFBFBF" w:sz="4"/>
+              <w:bottom w:val="single" w:color="BFBFBF" w:sz="4"/>
+              <w:right w:val="single" w:color="BFBFBF" w:sz="4"/>
+            </w:tcBorders>
+            <w:tcMar>
+              <w:top w:type="dxa" w:w="60"/>
+              <w:left w:type="dxa" w:w="100"/>
+              <w:bottom w:type="dxa" w:w="60"/>
+              <w:right w:type="dxa" w:w="100"/>
+            </w:tcMar>
+          </w:tcPr>
+          <w:p>
+            <w:r>
+              <w:rPr>
+                <w:rFonts w:ascii="Calibri" w:cs="Calibri" w:eastAsia="Calibri" w:hAnsi="Calibri"/>
+                <w:sz w:val="19"/>
+                <w:szCs w:val="19"/>
+              </w:rPr>
+              <w:t xml:space="preserve">Kick (5.0)</w:t>
+            </w:r>
+          </w:p>
+        </w:tc>
+        <w:tc>
+          <w:tcPr>
+            <w:tcW w:type="dxa" w:w="5614"/>
+            <w:tcBorders>
+              <w:top w:val="single" w:color="BFBFBF" w:sz="4"/>
+              <w:left w:val="single" w:color="BFBFBF" w:sz="4"/>
+              <w:bottom w:val="single" w:color="BFBFBF" w:sz="4"/>
+              <w:right w:val="single" w:color="BFBFBF" w:sz="4"/>
+            </w:tcBorders>
+            <w:tcMar>
+              <w:top w:type="dxa" w:w="60"/>
+              <w:left w:type="dxa" w:w="100"/>
+              <w:bottom w:type="dxa" w:w="60"/>
+              <w:right w:type="dxa" w:w="100"/>
+            </w:tcMar>
+          </w:tcPr>
+          <w:p>
+            <w:r>
+              <w:rPr>
+                <w:rFonts w:ascii="Calibri" w:cs="Calibri" w:eastAsia="Calibri" w:hAnsi="Calibri"/>
+                <w:sz w:val="19"/>
+                <w:szCs w:val="19"/>
+              </w:rPr>
+              <w:t xml:space="preserve">A caught thief is kicked about 100 studs away from the owner with a kick sound. </w:t>
+            </w:r>
+            <w:r>
+              <w:rPr>
+                <w:rFonts w:ascii="Courier New" w:cs="Courier New" w:eastAsia="Courier New" w:hAnsi="Courier New"/>
+                <w:sz w:val="19"/>
+                <w:szCs w:val="19"/>
+              </w:rPr>
+              <w:t xml:space="preserve">Config.KickDistance</w:t>
+            </w:r>
+            <w:r>
+              <w:rPr>
+                <w:rFonts w:ascii="Calibri" w:cs="Calibri" w:eastAsia="Calibri" w:hAnsi="Calibri"/>
+                <w:sz w:val="19"/>
+                <w:szCs w:val="19"/>
+              </w:rPr>
+              <w:t xml:space="preserve">, </w:t>
+            </w:r>
+            <w:r>
+              <w:rPr>
+                <w:rFonts w:ascii="Courier New" w:cs="Courier New" w:eastAsia="Courier New" w:hAnsi="Courier New"/>
+                <w:sz w:val="19"/>
+                <w:szCs w:val="19"/>
+              </w:rPr>
+              <w:t xml:space="preserve">KickAngle</w:t>
+            </w:r>
+            <w:r>
+              <w:rPr>
+                <w:rFonts w:ascii="Calibri" w:cs="Calibri" w:eastAsia="Calibri" w:hAnsi="Calibri"/>
+                <w:sz w:val="19"/>
+                <w:szCs w:val="19"/>
+              </w:rPr>
+              <w:t xml:space="preserve"> and </w:t>
+            </w:r>
+            <w:r>
+              <w:rPr>
+                <w:rFonts w:ascii="Courier New" w:cs="Courier New" w:eastAsia="Courier New" w:hAnsi="Courier New"/>
+                <w:sz w:val="19"/>
+                <w:szCs w:val="19"/>
+              </w:rPr>
+              <w:t xml:space="preserve">KickSounds</w:t>
+            </w:r>
+            <w:r>
+              <w:rPr>
+                <w:rFonts w:ascii="Calibri" w:cs="Calibri" w:eastAsia="Calibri" w:hAnsi="Calibri"/>
+                <w:sz w:val="19"/>
+                <w:szCs w:val="19"/>
+              </w:rPr>
+              <w:t xml:space="preserve"> tune it; the movement anti-cheat ignores the flight.</w:t>
             </w:r>
           </w:p>
         </w:tc>
@@ -5722,7 +5829,21 @@
         <w:rPr>
           <w:rFonts w:ascii="Calibri" w:cs="Calibri" w:eastAsia="Calibri" w:hAnsi="Calibri"/>
         </w:rPr>
-        <w:t xml:space="preserve">, they take the egg back and you are stunned for 1.5 s. The egg goes back to the nest it came from, with the same pet, size and material, so another player can steal it. The same happens if you die or leave while carrying.</w:t>
+        <w:t xml:space="preserve">, they take the egg back, </w:t>
+      </w:r>
+      <w:r>
+        <w:rPr>
+          <w:rFonts w:ascii="Calibri" w:cs="Calibri" w:eastAsia="Calibri" w:hAnsi="Calibri"/>
+          <w:b/>
+          <w:bCs/>
+        </w:rPr>
+        <w:t xml:space="preserve">kick you</w:t>
+      </w:r>
+      <w:r>
+        <w:rPr>
+          <w:rFonts w:ascii="Calibri" w:cs="Calibri" w:eastAsia="Calibri" w:hAnsi="Calibri"/>
+        </w:rPr>
+        <w:t xml:space="preserve"> (a kick sound and a flight of about 100 studs away from the owner, your character flops until it lands) and you are slowed for 1.5 s. The egg goes back to the nest it came from, with the same pet, size and material, so another player can steal it. The same happens if you die or leave while carrying.</w:t>
       </w:r>
     </w:p>
     <w:p>

</xml_diff>

<commit_message>
Add music, chase music, UI and event sound effects with generated audio files
Co-Authored-By: Claude Sonnet 5.5 <noreply@anthropic.com>
Claude-Session: https://claude.ai/code/session_013ivEnYiZGofRBeqQFKAVhJ
</commit_message>
<xml_diff>
--- a/docs/Spooky-Steal-Design-and-Plan.docx
+++ b/docs/Spooky-Steal-Design-and-Plan.docx
@@ -686,6 +686,81 @@
                 <w:szCs w:val="19"/>
               </w:rPr>
               <w:t xml:space="preserve">Treadmills are x1, x2, x3, x5, x8, x13, x21; trails x1.5, x2, x3, x4, x5 (5 trails); costume Speed XP per second grows 1, 1.5, 2.5, 4, 7, 12, 20, 35, 60, 100, 170. Speed Levels cost much more XP (20% more per level up to level 30, then 8%, then 4%) so house 3 comes at about 20 min and house 4 at about 35 min. The Zombie Chef now runs at 72 and the Gravedigger at 84 so house 4 is not reachable right after house 3.</w:t>
+            </w:r>
+          </w:p>
+        </w:tc>
+      </w:tr>
+      <w:tr>
+        <w:trPr>
+          <w:cantSplit/>
+        </w:trPr>
+        <w:tc>
+          <w:tcPr>
+            <w:tcW w:type="dxa" w:w="3746"/>
+            <w:tcBorders>
+              <w:top w:val="single" w:color="BFBFBF" w:sz="4"/>
+              <w:left w:val="single" w:color="BFBFBF" w:sz="4"/>
+              <w:bottom w:val="single" w:color="BFBFBF" w:sz="4"/>
+              <w:right w:val="single" w:color="BFBFBF" w:sz="4"/>
+            </w:tcBorders>
+            <w:tcMar>
+              <w:top w:type="dxa" w:w="60"/>
+              <w:left w:type="dxa" w:w="100"/>
+              <w:bottom w:type="dxa" w:w="60"/>
+              <w:right w:type="dxa" w:w="100"/>
+            </w:tcMar>
+          </w:tcPr>
+          <w:p>
+            <w:r>
+              <w:rPr>
+                <w:rFonts w:ascii="Calibri" w:cs="Calibri" w:eastAsia="Calibri" w:hAnsi="Calibri"/>
+                <w:sz w:val="19"/>
+                <w:szCs w:val="19"/>
+              </w:rPr>
+              <w:t xml:space="preserve">Audio (5.0)</w:t>
+            </w:r>
+          </w:p>
+        </w:tc>
+        <w:tc>
+          <w:tcPr>
+            <w:tcW w:type="dxa" w:w="5614"/>
+            <w:tcBorders>
+              <w:top w:val="single" w:color="BFBFBF" w:sz="4"/>
+              <w:left w:val="single" w:color="BFBFBF" w:sz="4"/>
+              <w:bottom w:val="single" w:color="BFBFBF" w:sz="4"/>
+              <w:right w:val="single" w:color="BFBFBF" w:sz="4"/>
+            </w:tcBorders>
+            <w:tcMar>
+              <w:top w:type="dxa" w:w="60"/>
+              <w:left w:type="dxa" w:w="100"/>
+              <w:bottom w:type="dxa" w:w="60"/>
+              <w:right w:type="dxa" w:w="100"/>
+            </w:tcMar>
+          </w:tcPr>
+          <w:p>
+            <w:r>
+              <w:rPr>
+                <w:rFonts w:ascii="Calibri" w:cs="Calibri" w:eastAsia="Calibri" w:hAnsi="Calibri"/>
+                <w:sz w:val="19"/>
+                <w:szCs w:val="19"/>
+              </w:rPr>
+              <w:t xml:space="preserve">Chill Halloween theme, intense chase music, UI and moment sound effects, Music/Sound toggles in the Store. Files are generated by </w:t>
+            </w:r>
+            <w:r>
+              <w:rPr>
+                <w:rFonts w:ascii="Courier New" w:cs="Courier New" w:eastAsia="Courier New" w:hAnsi="Courier New"/>
+                <w:sz w:val="19"/>
+                <w:szCs w:val="19"/>
+              </w:rPr>
+              <w:t xml:space="preserve">tools/make_audio.py</w:t>
+            </w:r>
+            <w:r>
+              <w:rPr>
+                <w:rFonts w:ascii="Calibri" w:cs="Calibri" w:eastAsia="Calibri" w:hAnsi="Calibri"/>
+                <w:sz w:val="19"/>
+                <w:szCs w:val="19"/>
+              </w:rPr>
+              <w:t xml:space="preserve"> and need to be uploaded once.</w:t>
             </w:r>
           </w:p>
         </w:tc>
@@ -17347,6 +17422,217 @@
           <w:rFonts w:ascii="Calibri" w:cs="Calibri" w:eastAsia="Calibri" w:hAnsi="Calibri"/>
         </w:rPr>
         <w:t xml:space="preserve"> attribute; the server finds the spawn point in front of the shop automatically.</w:t>
+      </w:r>
+    </w:p>
+    <w:p>
+      <w:pPr>
+        <w:pStyle w:val="Heading2"/>
+      </w:pPr>
+      <w:r>
+        <w:rPr>
+          <w:rFonts w:ascii="Calibri" w:cs="Calibri" w:eastAsia="Calibri" w:hAnsi="Calibri"/>
+        </w:rPr>
+        <w:t xml:space="preserve">2.14 Audio</w:t>
+      </w:r>
+    </w:p>
+    <w:p>
+      <w:pPr>
+        <w:pStyle w:val="ListParagraph"/>
+        <w:numPr>
+          <w:ilvl w:val="0"/>
+          <w:numId w:val="2"/>
+        </w:numPr>
+        <w:spacing w:after="60"/>
+      </w:pPr>
+      <w:r>
+        <w:rPr>
+          <w:rFonts w:ascii="Calibri" w:cs="Calibri" w:eastAsia="Calibri" w:hAnsi="Calibri"/>
+          <w:b/>
+          <w:bCs/>
+        </w:rPr>
+        <w:t xml:space="preserve">Chill theme:</w:t>
+      </w:r>
+      <w:r>
+        <w:rPr>
+          <w:rFonts w:ascii="Calibri" w:cs="Calibri" w:eastAsia="Calibri" w:hAnsi="Calibri"/>
+        </w:rPr>
+        <w:t xml:space="preserve"> a slow spooky waltz (music box, warm pads, soft bass, a ghostly voice) loops all the time at low volume.</w:t>
+      </w:r>
+    </w:p>
+    <w:p>
+      <w:pPr>
+        <w:pStyle w:val="ListParagraph"/>
+        <w:numPr>
+          <w:ilvl w:val="0"/>
+          <w:numId w:val="2"/>
+        </w:numPr>
+        <w:spacing w:after="60"/>
+      </w:pPr>
+      <w:r>
+        <w:rPr>
+          <w:rFonts w:ascii="Calibri" w:cs="Calibri" w:eastAsia="Calibri" w:hAnsi="Calibri"/>
+          <w:b/>
+          <w:bCs/>
+        </w:rPr>
+        <w:t xml:space="preserve">Chase music:</w:t>
+      </w:r>
+      <w:r>
+        <w:rPr>
+          <w:rFonts w:ascii="Calibri" w:cs="Calibri" w:eastAsia="Calibri" w:hAnsi="Calibri"/>
+        </w:rPr>
+        <w:t xml:space="preserve"> when an owner starts chasing you, a stinger plays and the chill theme fades out for a fast, tense track (driving bass, drums, tremolo strings, stabbing lead). When the chase ends or you are caught, the chill theme fades back in where it left off.</w:t>
+      </w:r>
+    </w:p>
+    <w:p>
+      <w:pPr>
+        <w:pStyle w:val="ListParagraph"/>
+        <w:numPr>
+          <w:ilvl w:val="0"/>
+          <w:numId w:val="2"/>
+        </w:numPr>
+        <w:spacing w:after="60"/>
+      </w:pPr>
+      <w:r>
+        <w:rPr>
+          <w:rFonts w:ascii="Calibri" w:cs="Calibri" w:eastAsia="Calibri" w:hAnsi="Calibri"/>
+          <w:b/>
+          <w:bCs/>
+        </w:rPr>
+        <w:t xml:space="preserve">UI sounds:</w:t>
+      </w:r>
+      <w:r>
+        <w:rPr>
+          <w:rFonts w:ascii="Calibri" w:cs="Calibri" w:eastAsia="Calibri" w:hAnsi="Calibri"/>
+        </w:rPr>
+        <w:t xml:space="preserve"> every button clicks and ticks on hover, menus whoosh open and shut, purchases chime, failed actions buzz, Candy tinkles, level-ups arpeggio up, rebirth has a fanfare.</w:t>
+      </w:r>
+    </w:p>
+    <w:p>
+      <w:pPr>
+        <w:pStyle w:val="ListParagraph"/>
+        <w:numPr>
+          <w:ilvl w:val="0"/>
+          <w:numId w:val="2"/>
+        </w:numPr>
+        <w:spacing w:after="60"/>
+      </w:pPr>
+      <w:r>
+        <w:rPr>
+          <w:rFonts w:ascii="Calibri" w:cs="Calibri" w:eastAsia="Calibri" w:hAnsi="Calibri"/>
+          <w:b/>
+          <w:bCs/>
+        </w:rPr>
+        <w:t xml:space="preserve">Moments:</w:t>
+      </w:r>
+      <w:r>
+        <w:rPr>
+          <w:rFonts w:ascii="Calibri" w:cs="Calibri" w:eastAsia="Calibri" w:hAnsi="Calibri"/>
+        </w:rPr>
+        <w:t xml:space="preserve"> egg pick-up sting, egg on a pad, hatch pop with sparkles, escape jingle, caught thump, the kick (heard by nearby players), three door knocks then a creak when you Trick-or-Treat.</w:t>
+      </w:r>
+    </w:p>
+    <w:p>
+      <w:pPr>
+        <w:pStyle w:val="ListParagraph"/>
+        <w:numPr>
+          <w:ilvl w:val="0"/>
+          <w:numId w:val="2"/>
+        </w:numPr>
+        <w:spacing w:after="60"/>
+      </w:pPr>
+      <w:r>
+        <w:rPr>
+          <w:rFonts w:ascii="Calibri" w:cs="Calibri" w:eastAsia="Calibri" w:hAnsi="Calibri"/>
+          <w:b/>
+          <w:bCs/>
+        </w:rPr>
+        <w:t xml:space="preserve">Settings:</w:t>
+      </w:r>
+      <w:r>
+        <w:rPr>
+          <w:rFonts w:ascii="Calibri" w:cs="Calibri" w:eastAsia="Calibri" w:hAnsi="Calibri"/>
+        </w:rPr>
+        <w:t xml:space="preserve"> Music and Sound effects can be switched off in the Store menu (kept until you leave).</w:t>
+      </w:r>
+    </w:p>
+    <w:p>
+      <w:pPr>
+        <w:pStyle w:val="ListParagraph"/>
+        <w:numPr>
+          <w:ilvl w:val="0"/>
+          <w:numId w:val="2"/>
+        </w:numPr>
+        <w:spacing w:after="60"/>
+      </w:pPr>
+      <w:r>
+        <w:rPr>
+          <w:rFonts w:ascii="Calibri" w:cs="Calibri" w:eastAsia="Calibri" w:hAnsi="Calibri"/>
+          <w:b/>
+          <w:bCs/>
+        </w:rPr>
+        <w:t xml:space="preserve">How it is made:</w:t>
+      </w:r>
+      <w:r>
+        <w:rPr>
+          <w:rFonts w:ascii="Calibri" w:cs="Calibri" w:eastAsia="Calibri" w:hAnsi="Calibri"/>
+        </w:rPr>
+        <w:t xml:space="preserve"> </w:t>
+      </w:r>
+      <w:r>
+        <w:rPr>
+          <w:rFonts w:ascii="Courier New" w:cs="Courier New" w:eastAsia="Courier New" w:hAnsi="Courier New"/>
+          <w:sz w:val="20"/>
+          <w:szCs w:val="20"/>
+        </w:rPr>
+        <w:t xml:space="preserve">tools/make_audio.py</w:t>
+      </w:r>
+      <w:r>
+        <w:rPr>
+          <w:rFonts w:ascii="Calibri" w:cs="Calibri" w:eastAsia="Calibri" w:hAnsi="Calibri"/>
+        </w:rPr>
+        <w:t xml:space="preserve"> synthesises all 23 files into </w:t>
+      </w:r>
+      <w:r>
+        <w:rPr>
+          <w:rFonts w:ascii="Courier New" w:cs="Courier New" w:eastAsia="Courier New" w:hAnsi="Courier New"/>
+          <w:sz w:val="20"/>
+          <w:szCs w:val="20"/>
+        </w:rPr>
+        <w:t xml:space="preserve">audio/*.mp3</w:t>
+      </w:r>
+      <w:r>
+        <w:rPr>
+          <w:rFonts w:ascii="Calibri" w:cs="Calibri" w:eastAsia="Calibri" w:hAnsi="Calibri"/>
+        </w:rPr>
+        <w:t xml:space="preserve"> (no copyrighted material). They must be uploaded to Roblox once and their ids pasted into </w:t>
+      </w:r>
+      <w:r>
+        <w:rPr>
+          <w:rFonts w:ascii="Courier New" w:cs="Courier New" w:eastAsia="Courier New" w:hAnsi="Courier New"/>
+          <w:sz w:val="20"/>
+          <w:szCs w:val="20"/>
+        </w:rPr>
+        <w:t xml:space="preserve">Config.Audio</w:t>
+      </w:r>
+      <w:r>
+        <w:rPr>
+          <w:rFonts w:ascii="Calibri" w:cs="Calibri" w:eastAsia="Calibri" w:hAnsi="Calibri"/>
+        </w:rPr>
+        <w:t xml:space="preserve"> (see </w:t>
+      </w:r>
+      <w:r>
+        <w:rPr>
+          <w:rFonts w:ascii="Courier New" w:cs="Courier New" w:eastAsia="Courier New" w:hAnsi="Courier New"/>
+          <w:sz w:val="20"/>
+          <w:szCs w:val="20"/>
+        </w:rPr>
+        <w:t xml:space="preserve">audio/README.md</w:t>
+      </w:r>
+      <w:r>
+        <w:rPr>
+          <w:rFonts w:ascii="Calibri" w:cs="Calibri" w:eastAsia="Calibri" w:hAnsi="Calibri"/>
+        </w:rPr>
+        <w:t xml:space="preserve">). Until then music is silent and a few UI sounds use built-in Roblox sounds.</w:t>
       </w:r>
     </w:p>
     <w:p>

</xml_diff>

<commit_message>
Owners chase several thieves in order and no longer cut thieves off; adopt V5.3 place
Co-Authored-By: Claude Sonnet 5.5 <noreply@anthropic.com>
Claude-Session: https://claude.ai/code/session_013ivEnYiZGofRBeqQFKAVhJ
</commit_message>
<xml_diff>
--- a/docs/Spooky-Steal-Design-and-Plan.docx
+++ b/docs/Spooky-Steal-Design-and-Plan.docx
@@ -110,8 +110,8 @@
         </w:tblBorders>
       </w:tblPr>
       <w:tblGrid>
-        <w:gridCol w:w="3746"/>
-        <w:gridCol w:w="5614"/>
+        <w:gridCol w:w="3840"/>
+        <w:gridCol w:w="5520"/>
       </w:tblGrid>
       <w:tr>
         <w:trPr>
@@ -119,7 +119,7 @@
         </w:trPr>
         <w:tc>
           <w:tcPr>
-            <w:tcW w:type="dxa" w:w="3746"/>
+            <w:tcW w:type="dxa" w:w="3840"/>
             <w:tcBorders>
               <w:top w:val="single" w:color="BFBFBF" w:sz="4"/>
               <w:left w:val="single" w:color="BFBFBF" w:sz="4"/>
@@ -149,7 +149,7 @@
         </w:tc>
         <w:tc>
           <w:tcPr>
-            <w:tcW w:type="dxa" w:w="5614"/>
+            <w:tcW w:type="dxa" w:w="5520"/>
             <w:tcBorders>
               <w:top w:val="single" w:color="BFBFBF" w:sz="4"/>
               <w:left w:val="single" w:color="BFBFBF" w:sz="4"/>
@@ -184,7 +184,7 @@
         </w:trPr>
         <w:tc>
           <w:tcPr>
-            <w:tcW w:type="dxa" w:w="3746"/>
+            <w:tcW w:type="dxa" w:w="3840"/>
             <w:tcBorders>
               <w:top w:val="single" w:color="BFBFBF" w:sz="4"/>
               <w:left w:val="single" w:color="BFBFBF" w:sz="4"/>
@@ -211,7 +211,7 @@
         </w:tc>
         <w:tc>
           <w:tcPr>
-            <w:tcW w:type="dxa" w:w="5614"/>
+            <w:tcW w:type="dxa" w:w="5520"/>
             <w:tcBorders>
               <w:top w:val="single" w:color="BFBFBF" w:sz="4"/>
               <w:left w:val="single" w:color="BFBFBF" w:sz="4"/>
@@ -251,7 +251,7 @@
         </w:trPr>
         <w:tc>
           <w:tcPr>
-            <w:tcW w:type="dxa" w:w="3746"/>
+            <w:tcW w:type="dxa" w:w="3840"/>
             <w:tcBorders>
               <w:top w:val="single" w:color="BFBFBF" w:sz="4"/>
               <w:left w:val="single" w:color="BFBFBF" w:sz="4"/>
@@ -278,7 +278,7 @@
         </w:tc>
         <w:tc>
           <w:tcPr>
-            <w:tcW w:type="dxa" w:w="5614"/>
+            <w:tcW w:type="dxa" w:w="5520"/>
             <w:tcBorders>
               <w:top w:val="single" w:color="BFBFBF" w:sz="4"/>
               <w:left w:val="single" w:color="BFBFBF" w:sz="4"/>
@@ -310,7 +310,7 @@
         </w:trPr>
         <w:tc>
           <w:tcPr>
-            <w:tcW w:type="dxa" w:w="3746"/>
+            <w:tcW w:type="dxa" w:w="3840"/>
             <w:tcBorders>
               <w:top w:val="single" w:color="BFBFBF" w:sz="4"/>
               <w:left w:val="single" w:color="BFBFBF" w:sz="4"/>
@@ -337,7 +337,7 @@
         </w:tc>
         <w:tc>
           <w:tcPr>
-            <w:tcW w:type="dxa" w:w="5614"/>
+            <w:tcW w:type="dxa" w:w="5520"/>
             <w:tcBorders>
               <w:top w:val="single" w:color="BFBFBF" w:sz="4"/>
               <w:left w:val="single" w:color="BFBFBF" w:sz="4"/>
@@ -369,7 +369,7 @@
         </w:trPr>
         <w:tc>
           <w:tcPr>
-            <w:tcW w:type="dxa" w:w="3746"/>
+            <w:tcW w:type="dxa" w:w="3840"/>
             <w:tcBorders>
               <w:top w:val="single" w:color="BFBFBF" w:sz="4"/>
               <w:left w:val="single" w:color="BFBFBF" w:sz="4"/>
@@ -396,7 +396,7 @@
         </w:tc>
         <w:tc>
           <w:tcPr>
-            <w:tcW w:type="dxa" w:w="5614"/>
+            <w:tcW w:type="dxa" w:w="5520"/>
             <w:tcBorders>
               <w:top w:val="single" w:color="BFBFBF" w:sz="4"/>
               <w:left w:val="single" w:color="BFBFBF" w:sz="4"/>
@@ -428,7 +428,7 @@
         </w:trPr>
         <w:tc>
           <w:tcPr>
-            <w:tcW w:type="dxa" w:w="3746"/>
+            <w:tcW w:type="dxa" w:w="3840"/>
             <w:tcBorders>
               <w:top w:val="single" w:color="BFBFBF" w:sz="4"/>
               <w:left w:val="single" w:color="BFBFBF" w:sz="4"/>
@@ -455,7 +455,7 @@
         </w:tc>
         <w:tc>
           <w:tcPr>
-            <w:tcW w:type="dxa" w:w="5614"/>
+            <w:tcW w:type="dxa" w:w="5520"/>
             <w:tcBorders>
               <w:top w:val="single" w:color="BFBFBF" w:sz="4"/>
               <w:left w:val="single" w:color="BFBFBF" w:sz="4"/>
@@ -519,7 +519,7 @@
         </w:trPr>
         <w:tc>
           <w:tcPr>
-            <w:tcW w:type="dxa" w:w="3746"/>
+            <w:tcW w:type="dxa" w:w="3840"/>
             <w:tcBorders>
               <w:top w:val="single" w:color="BFBFBF" w:sz="4"/>
               <w:left w:val="single" w:color="BFBFBF" w:sz="4"/>
@@ -546,7 +546,7 @@
         </w:tc>
         <w:tc>
           <w:tcPr>
-            <w:tcW w:type="dxa" w:w="5614"/>
+            <w:tcW w:type="dxa" w:w="5520"/>
             <w:tcBorders>
               <w:top w:val="single" w:color="BFBFBF" w:sz="4"/>
               <w:left w:val="single" w:color="BFBFBF" w:sz="4"/>
@@ -578,7 +578,7 @@
         </w:trPr>
         <w:tc>
           <w:tcPr>
-            <w:tcW w:type="dxa" w:w="3746"/>
+            <w:tcW w:type="dxa" w:w="3840"/>
             <w:tcBorders>
               <w:top w:val="single" w:color="BFBFBF" w:sz="4"/>
               <w:left w:val="single" w:color="BFBFBF" w:sz="4"/>
@@ -605,7 +605,7 @@
         </w:tc>
         <w:tc>
           <w:tcPr>
-            <w:tcW w:type="dxa" w:w="5614"/>
+            <w:tcW w:type="dxa" w:w="5520"/>
             <w:tcBorders>
               <w:top w:val="single" w:color="BFBFBF" w:sz="4"/>
               <w:left w:val="single" w:color="BFBFBF" w:sz="4"/>
@@ -637,7 +637,7 @@
         </w:trPr>
         <w:tc>
           <w:tcPr>
-            <w:tcW w:type="dxa" w:w="3746"/>
+            <w:tcW w:type="dxa" w:w="3840"/>
             <w:tcBorders>
               <w:top w:val="single" w:color="BFBFBF" w:sz="4"/>
               <w:left w:val="single" w:color="BFBFBF" w:sz="4"/>
@@ -664,7 +664,7 @@
         </w:tc>
         <w:tc>
           <w:tcPr>
-            <w:tcW w:type="dxa" w:w="5614"/>
+            <w:tcW w:type="dxa" w:w="5520"/>
             <w:tcBorders>
               <w:top w:val="single" w:color="BFBFBF" w:sz="4"/>
               <w:left w:val="single" w:color="BFBFBF" w:sz="4"/>
@@ -696,7 +696,7 @@
         </w:trPr>
         <w:tc>
           <w:tcPr>
-            <w:tcW w:type="dxa" w:w="3746"/>
+            <w:tcW w:type="dxa" w:w="3840"/>
             <w:tcBorders>
               <w:top w:val="single" w:color="BFBFBF" w:sz="4"/>
               <w:left w:val="single" w:color="BFBFBF" w:sz="4"/>
@@ -723,7 +723,7 @@
         </w:tc>
         <w:tc>
           <w:tcPr>
-            <w:tcW w:type="dxa" w:w="5614"/>
+            <w:tcW w:type="dxa" w:w="5520"/>
             <w:tcBorders>
               <w:top w:val="single" w:color="BFBFBF" w:sz="4"/>
               <w:left w:val="single" w:color="BFBFBF" w:sz="4"/>
@@ -771,103 +771,55 @@
         </w:trPr>
         <w:tc>
           <w:tcPr>
-            <w:tcW w:type="dxa" w:w="3746"/>
-            <w:tcBorders>
-              <w:top w:val="single" w:color="BFBFBF" w:sz="4"/>
-              <w:left w:val="single" w:color="BFBFBF" w:sz="4"/>
-              <w:bottom w:val="single" w:color="BFBFBF" w:sz="4"/>
-              <w:right w:val="single" w:color="BFBFBF" w:sz="4"/>
-            </w:tcBorders>
-            <w:tcMar>
-              <w:top w:type="dxa" w:w="60"/>
-              <w:left w:type="dxa" w:w="100"/>
-              <w:bottom w:type="dxa" w:w="60"/>
-              <w:right w:type="dxa" w:w="100"/>
-            </w:tcMar>
-          </w:tcPr>
-          <w:p>
-            <w:r>
-              <w:rPr>
-                <w:rFonts w:ascii="Calibri" w:cs="Calibri" w:eastAsia="Calibri" w:hAnsi="Calibri"/>
-                <w:sz w:val="19"/>
-                <w:szCs w:val="19"/>
-              </w:rPr>
-              <w:t xml:space="preserve">Kick (5.0)</w:t>
-            </w:r>
-          </w:p>
-        </w:tc>
-        <w:tc>
-          <w:tcPr>
-            <w:tcW w:type="dxa" w:w="5614"/>
-            <w:tcBorders>
-              <w:top w:val="single" w:color="BFBFBF" w:sz="4"/>
-              <w:left w:val="single" w:color="BFBFBF" w:sz="4"/>
-              <w:bottom w:val="single" w:color="BFBFBF" w:sz="4"/>
-              <w:right w:val="single" w:color="BFBFBF" w:sz="4"/>
-            </w:tcBorders>
-            <w:tcMar>
-              <w:top w:type="dxa" w:w="60"/>
-              <w:left w:type="dxa" w:w="100"/>
-              <w:bottom w:type="dxa" w:w="60"/>
-              <w:right w:type="dxa" w:w="100"/>
-            </w:tcMar>
-          </w:tcPr>
-          <w:p>
-            <w:r>
-              <w:rPr>
-                <w:rFonts w:ascii="Calibri" w:cs="Calibri" w:eastAsia="Calibri" w:hAnsi="Calibri"/>
-                <w:sz w:val="19"/>
-                <w:szCs w:val="19"/>
-              </w:rPr>
-              <w:t xml:space="preserve">A caught thief is kicked about 100 studs away from the owner with a kick sound. </w:t>
-            </w:r>
-            <w:r>
-              <w:rPr>
-                <w:rFonts w:ascii="Courier New" w:cs="Courier New" w:eastAsia="Courier New" w:hAnsi="Courier New"/>
-                <w:sz w:val="19"/>
-                <w:szCs w:val="19"/>
-              </w:rPr>
-              <w:t xml:space="preserve">Config.KickDistance</w:t>
-            </w:r>
-            <w:r>
-              <w:rPr>
-                <w:rFonts w:ascii="Calibri" w:cs="Calibri" w:eastAsia="Calibri" w:hAnsi="Calibri"/>
-                <w:sz w:val="19"/>
-                <w:szCs w:val="19"/>
-              </w:rPr>
-              <w:t xml:space="preserve">, </w:t>
-            </w:r>
-            <w:r>
-              <w:rPr>
-                <w:rFonts w:ascii="Courier New" w:cs="Courier New" w:eastAsia="Courier New" w:hAnsi="Courier New"/>
-                <w:sz w:val="19"/>
-                <w:szCs w:val="19"/>
-              </w:rPr>
-              <w:t xml:space="preserve">KickAngle</w:t>
-            </w:r>
-            <w:r>
-              <w:rPr>
-                <w:rFonts w:ascii="Calibri" w:cs="Calibri" w:eastAsia="Calibri" w:hAnsi="Calibri"/>
-                <w:sz w:val="19"/>
-                <w:szCs w:val="19"/>
-              </w:rPr>
-              <w:t xml:space="preserve"> and </w:t>
-            </w:r>
-            <w:r>
-              <w:rPr>
-                <w:rFonts w:ascii="Courier New" w:cs="Courier New" w:eastAsia="Courier New" w:hAnsi="Courier New"/>
-                <w:sz w:val="19"/>
-                <w:szCs w:val="19"/>
-              </w:rPr>
-              <w:t xml:space="preserve">KickSounds</w:t>
-            </w:r>
-            <w:r>
-              <w:rPr>
-                <w:rFonts w:ascii="Calibri" w:cs="Calibri" w:eastAsia="Calibri" w:hAnsi="Calibri"/>
-                <w:sz w:val="19"/>
-                <w:szCs w:val="19"/>
-              </w:rPr>
-              <w:t xml:space="preserve"> tune it; the movement anti-cheat ignores the flight.</w:t>
+            <w:tcW w:type="dxa" w:w="3840"/>
+            <w:tcBorders>
+              <w:top w:val="single" w:color="BFBFBF" w:sz="4"/>
+              <w:left w:val="single" w:color="BFBFBF" w:sz="4"/>
+              <w:bottom w:val="single" w:color="BFBFBF" w:sz="4"/>
+              <w:right w:val="single" w:color="BFBFBF" w:sz="4"/>
+            </w:tcBorders>
+            <w:tcMar>
+              <w:top w:type="dxa" w:w="60"/>
+              <w:left w:type="dxa" w:w="100"/>
+              <w:bottom w:type="dxa" w:w="60"/>
+              <w:right w:type="dxa" w:w="100"/>
+            </w:tcMar>
+          </w:tcPr>
+          <w:p>
+            <w:r>
+              <w:rPr>
+                <w:rFonts w:ascii="Calibri" w:cs="Calibri" w:eastAsia="Calibri" w:hAnsi="Calibri"/>
+                <w:sz w:val="19"/>
+                <w:szCs w:val="19"/>
+              </w:rPr>
+              <w:t xml:space="preserve">Several thieves and no cut-offs (5.1)</w:t>
+            </w:r>
+          </w:p>
+        </w:tc>
+        <w:tc>
+          <w:tcPr>
+            <w:tcW w:type="dxa" w:w="5520"/>
+            <w:tcBorders>
+              <w:top w:val="single" w:color="BFBFBF" w:sz="4"/>
+              <w:left w:val="single" w:color="BFBFBF" w:sz="4"/>
+              <w:bottom w:val="single" w:color="BFBFBF" w:sz="4"/>
+              <w:right w:val="single" w:color="BFBFBF" w:sz="4"/>
+            </w:tcBorders>
+            <w:tcMar>
+              <w:top w:type="dxa" w:w="60"/>
+              <w:left w:type="dxa" w:w="100"/>
+              <w:bottom w:type="dxa" w:w="60"/>
+              <w:right w:type="dxa" w:w="100"/>
+            </w:tcMar>
+          </w:tcPr>
+          <w:p>
+            <w:r>
+              <w:rPr>
+                <w:rFonts w:ascii="Calibri" w:cs="Calibri" w:eastAsia="Calibri" w:hAnsi="Calibri"/>
+                <w:sz w:val="19"/>
+                <w:szCs w:val="19"/>
+              </w:rPr>
+              <w:t xml:space="preserve">Owners chase thieves one after another in the order they stole, and never run head-on at a thief from the base side: they get behind first.</w:t>
             </w:r>
           </w:p>
         </w:tc>
@@ -878,55 +830,103 @@
         </w:trPr>
         <w:tc>
           <w:tcPr>
-            <w:tcW w:type="dxa" w:w="3746"/>
-            <w:tcBorders>
-              <w:top w:val="single" w:color="BFBFBF" w:sz="4"/>
-              <w:left w:val="single" w:color="BFBFBF" w:sz="4"/>
-              <w:bottom w:val="single" w:color="BFBFBF" w:sz="4"/>
-              <w:right w:val="single" w:color="BFBFBF" w:sz="4"/>
-            </w:tcBorders>
-            <w:tcMar>
-              <w:top w:type="dxa" w:w="60"/>
-              <w:left w:type="dxa" w:w="100"/>
-              <w:bottom w:type="dxa" w:w="60"/>
-              <w:right w:type="dxa" w:w="100"/>
-            </w:tcMar>
-          </w:tcPr>
-          <w:p>
-            <w:r>
-              <w:rPr>
-                <w:rFonts w:ascii="Calibri" w:cs="Calibri" w:eastAsia="Calibri" w:hAnsi="Calibri"/>
-                <w:sz w:val="19"/>
-                <w:szCs w:val="19"/>
-              </w:rPr>
-              <w:t xml:space="preserve">Chase fix (5.0)</w:t>
-            </w:r>
-          </w:p>
-        </w:tc>
-        <w:tc>
-          <w:tcPr>
-            <w:tcW w:type="dxa" w:w="5614"/>
-            <w:tcBorders>
-              <w:top w:val="single" w:color="BFBFBF" w:sz="4"/>
-              <w:left w:val="single" w:color="BFBFBF" w:sz="4"/>
-              <w:bottom w:val="single" w:color="BFBFBF" w:sz="4"/>
-              <w:right w:val="single" w:color="BFBFBF" w:sz="4"/>
-            </w:tcBorders>
-            <w:tcMar>
-              <w:top w:type="dxa" w:w="60"/>
-              <w:left w:type="dxa" w:w="100"/>
-              <w:bottom w:type="dxa" w:w="60"/>
-              <w:right w:type="dxa" w:w="100"/>
-            </w:tcMar>
-          </w:tcPr>
-          <w:p>
-            <w:r>
-              <w:rPr>
-                <w:rFonts w:ascii="Calibri" w:cs="Calibri" w:eastAsia="Calibri" w:hAnsi="Calibri"/>
-                <w:sz w:val="19"/>
-                <w:szCs w:val="19"/>
-              </w:rPr>
-              <w:t xml:space="preserve">The owner now chases the thief's live position every frame and catches on live distance every frame (before, both were sampled ten times a second, so a thief close to the owner's speed was never reached). His speed is enforced every frame, the server keeps control of his movement after the door scene, and new paths no longer make him double back.</w:t>
+            <w:tcW w:type="dxa" w:w="3840"/>
+            <w:tcBorders>
+              <w:top w:val="single" w:color="BFBFBF" w:sz="4"/>
+              <w:left w:val="single" w:color="BFBFBF" w:sz="4"/>
+              <w:bottom w:val="single" w:color="BFBFBF" w:sz="4"/>
+              <w:right w:val="single" w:color="BFBFBF" w:sz="4"/>
+            </w:tcBorders>
+            <w:tcMar>
+              <w:top w:type="dxa" w:w="60"/>
+              <w:left w:type="dxa" w:w="100"/>
+              <w:bottom w:type="dxa" w:w="60"/>
+              <w:right w:type="dxa" w:w="100"/>
+            </w:tcMar>
+          </w:tcPr>
+          <w:p>
+            <w:r>
+              <w:rPr>
+                <w:rFonts w:ascii="Calibri" w:cs="Calibri" w:eastAsia="Calibri" w:hAnsi="Calibri"/>
+                <w:sz w:val="19"/>
+                <w:szCs w:val="19"/>
+              </w:rPr>
+              <w:t xml:space="preserve">Kick (5.0)</w:t>
+            </w:r>
+          </w:p>
+        </w:tc>
+        <w:tc>
+          <w:tcPr>
+            <w:tcW w:type="dxa" w:w="5520"/>
+            <w:tcBorders>
+              <w:top w:val="single" w:color="BFBFBF" w:sz="4"/>
+              <w:left w:val="single" w:color="BFBFBF" w:sz="4"/>
+              <w:bottom w:val="single" w:color="BFBFBF" w:sz="4"/>
+              <w:right w:val="single" w:color="BFBFBF" w:sz="4"/>
+            </w:tcBorders>
+            <w:tcMar>
+              <w:top w:type="dxa" w:w="60"/>
+              <w:left w:type="dxa" w:w="100"/>
+              <w:bottom w:type="dxa" w:w="60"/>
+              <w:right w:type="dxa" w:w="100"/>
+            </w:tcMar>
+          </w:tcPr>
+          <w:p>
+            <w:r>
+              <w:rPr>
+                <w:rFonts w:ascii="Calibri" w:cs="Calibri" w:eastAsia="Calibri" w:hAnsi="Calibri"/>
+                <w:sz w:val="19"/>
+                <w:szCs w:val="19"/>
+              </w:rPr>
+              <w:t xml:space="preserve">A caught thief is kicked about 100 studs away from the owner with a kick sound. </w:t>
+            </w:r>
+            <w:r>
+              <w:rPr>
+                <w:rFonts w:ascii="Courier New" w:cs="Courier New" w:eastAsia="Courier New" w:hAnsi="Courier New"/>
+                <w:sz w:val="19"/>
+                <w:szCs w:val="19"/>
+              </w:rPr>
+              <w:t xml:space="preserve">Config.KickDistance</w:t>
+            </w:r>
+            <w:r>
+              <w:rPr>
+                <w:rFonts w:ascii="Calibri" w:cs="Calibri" w:eastAsia="Calibri" w:hAnsi="Calibri"/>
+                <w:sz w:val="19"/>
+                <w:szCs w:val="19"/>
+              </w:rPr>
+              <w:t xml:space="preserve">, </w:t>
+            </w:r>
+            <w:r>
+              <w:rPr>
+                <w:rFonts w:ascii="Courier New" w:cs="Courier New" w:eastAsia="Courier New" w:hAnsi="Courier New"/>
+                <w:sz w:val="19"/>
+                <w:szCs w:val="19"/>
+              </w:rPr>
+              <w:t xml:space="preserve">KickAngle</w:t>
+            </w:r>
+            <w:r>
+              <w:rPr>
+                <w:rFonts w:ascii="Calibri" w:cs="Calibri" w:eastAsia="Calibri" w:hAnsi="Calibri"/>
+                <w:sz w:val="19"/>
+                <w:szCs w:val="19"/>
+              </w:rPr>
+              <w:t xml:space="preserve"> and </w:t>
+            </w:r>
+            <w:r>
+              <w:rPr>
+                <w:rFonts w:ascii="Courier New" w:cs="Courier New" w:eastAsia="Courier New" w:hAnsi="Courier New"/>
+                <w:sz w:val="19"/>
+                <w:szCs w:val="19"/>
+              </w:rPr>
+              <w:t xml:space="preserve">KickSounds</w:t>
+            </w:r>
+            <w:r>
+              <w:rPr>
+                <w:rFonts w:ascii="Calibri" w:cs="Calibri" w:eastAsia="Calibri" w:hAnsi="Calibri"/>
+                <w:sz w:val="19"/>
+                <w:szCs w:val="19"/>
+              </w:rPr>
+              <w:t xml:space="preserve"> tune it; the movement anti-cheat ignores the flight.</w:t>
             </w:r>
           </w:p>
         </w:tc>
@@ -937,7 +937,66 @@
         </w:trPr>
         <w:tc>
           <w:tcPr>
-            <w:tcW w:type="dxa" w:w="3746"/>
+            <w:tcW w:type="dxa" w:w="3840"/>
+            <w:tcBorders>
+              <w:top w:val="single" w:color="BFBFBF" w:sz="4"/>
+              <w:left w:val="single" w:color="BFBFBF" w:sz="4"/>
+              <w:bottom w:val="single" w:color="BFBFBF" w:sz="4"/>
+              <w:right w:val="single" w:color="BFBFBF" w:sz="4"/>
+            </w:tcBorders>
+            <w:tcMar>
+              <w:top w:type="dxa" w:w="60"/>
+              <w:left w:type="dxa" w:w="100"/>
+              <w:bottom w:type="dxa" w:w="60"/>
+              <w:right w:type="dxa" w:w="100"/>
+            </w:tcMar>
+          </w:tcPr>
+          <w:p>
+            <w:r>
+              <w:rPr>
+                <w:rFonts w:ascii="Calibri" w:cs="Calibri" w:eastAsia="Calibri" w:hAnsi="Calibri"/>
+                <w:sz w:val="19"/>
+                <w:szCs w:val="19"/>
+              </w:rPr>
+              <w:t xml:space="preserve">Chase fix (5.0)</w:t>
+            </w:r>
+          </w:p>
+        </w:tc>
+        <w:tc>
+          <w:tcPr>
+            <w:tcW w:type="dxa" w:w="5520"/>
+            <w:tcBorders>
+              <w:top w:val="single" w:color="BFBFBF" w:sz="4"/>
+              <w:left w:val="single" w:color="BFBFBF" w:sz="4"/>
+              <w:bottom w:val="single" w:color="BFBFBF" w:sz="4"/>
+              <w:right w:val="single" w:color="BFBFBF" w:sz="4"/>
+            </w:tcBorders>
+            <w:tcMar>
+              <w:top w:type="dxa" w:w="60"/>
+              <w:left w:type="dxa" w:w="100"/>
+              <w:bottom w:type="dxa" w:w="60"/>
+              <w:right w:type="dxa" w:w="100"/>
+            </w:tcMar>
+          </w:tcPr>
+          <w:p>
+            <w:r>
+              <w:rPr>
+                <w:rFonts w:ascii="Calibri" w:cs="Calibri" w:eastAsia="Calibri" w:hAnsi="Calibri"/>
+                <w:sz w:val="19"/>
+                <w:szCs w:val="19"/>
+              </w:rPr>
+              <w:t xml:space="preserve">The owner now chases the thief's live position every frame and catches on live distance every frame (before, both were sampled ten times a second, so a thief close to the owner's speed was never reached). His speed is enforced every frame, the server keeps control of his movement after the door scene, and new paths no longer make him double back.</w:t>
+            </w:r>
+          </w:p>
+        </w:tc>
+      </w:tr>
+      <w:tr>
+        <w:trPr>
+          <w:cantSplit/>
+        </w:trPr>
+        <w:tc>
+          <w:tcPr>
+            <w:tcW w:type="dxa" w:w="3840"/>
             <w:tcBorders>
               <w:top w:val="single" w:color="BFBFBF" w:sz="4"/>
               <w:left w:val="single" w:color="BFBFBF" w:sz="4"/>
@@ -964,7 +1023,7 @@
         </w:tc>
         <w:tc>
           <w:tcPr>
-            <w:tcW w:type="dxa" w:w="5614"/>
+            <w:tcW w:type="dxa" w:w="5520"/>
             <w:tcBorders>
               <w:top w:val="single" w:color="BFBFBF" w:sz="4"/>
               <w:left w:val="single" w:color="BFBFBF" w:sz="4"/>
@@ -5943,6 +6002,96 @@
           <w:rFonts w:ascii="Calibri" w:cs="Calibri" w:eastAsia="Calibri" w:hAnsi="Calibri"/>
         </w:rPr>
         <w:t xml:space="preserve"> (House 3 bug fixed in 5.0): he runs at his full speed straight at your live position, so he gains on you whenever he is faster.</w:t>
+      </w:r>
+    </w:p>
+    <w:p>
+      <w:pPr>
+        <w:pStyle w:val="ListParagraph"/>
+        <w:numPr>
+          <w:ilvl w:val="0"/>
+          <w:numId w:val="2"/>
+        </w:numPr>
+        <w:spacing w:after="60"/>
+      </w:pPr>
+      <w:r>
+        <w:rPr>
+          <w:rFonts w:ascii="Calibri" w:cs="Calibri" w:eastAsia="Calibri" w:hAnsi="Calibri"/>
+          <w:b/>
+          <w:bCs/>
+        </w:rPr>
+        <w:t xml:space="preserve">Several thieves (5.1):</w:t>
+      </w:r>
+      <w:r>
+        <w:rPr>
+          <w:rFonts w:ascii="Calibri" w:cs="Calibri" w:eastAsia="Calibri" w:hAnsi="Calibri"/>
+        </w:rPr>
+        <w:t xml:space="preserve"> if a second player steals from the same house while the owner is chasing someone, the owner finishes with the first thief (catch, escape or give-up) and then goes after the next one in the order they stole. The second thief's 30 s and 150-stud give-up only start once the owner is close enough to them, so a late thief is never dropped just because the owner was far away. The "RUN" banner stays on for the waiting thief.</w:t>
+      </w:r>
+    </w:p>
+    <w:p>
+      <w:pPr>
+        <w:pStyle w:val="ListParagraph"/>
+        <w:numPr>
+          <w:ilvl w:val="0"/>
+          <w:numId w:val="2"/>
+        </w:numPr>
+        <w:spacing w:after="60"/>
+      </w:pPr>
+      <w:r>
+        <w:rPr>
+          <w:rFonts w:ascii="Calibri" w:cs="Calibri" w:eastAsia="Calibri" w:hAnsi="Calibri"/>
+          <w:b/>
+          <w:bCs/>
+        </w:rPr>
+        <w:t xml:space="preserve">No cutting off (5.1):</w:t>
+      </w:r>
+      <w:r>
+        <w:rPr>
+          <w:rFonts w:ascii="Calibri" w:cs="Calibri" w:eastAsia="Calibri" w:hAnsi="Calibri"/>
+        </w:rPr>
+        <w:t xml:space="preserve"> if the owner is nearer to the thief's base than the thief is (and more than 18 studs away), he first runs to a spot 22 studs behind and 14 studs to the side of the thief, then chases normally from behind. It lasts at most 8 s. Tuned with </w:t>
+      </w:r>
+      <w:r>
+        <w:rPr>
+          <w:rFonts w:ascii="Courier New" w:cs="Courier New" w:eastAsia="Courier New" w:hAnsi="Courier New"/>
+          <w:sz w:val="20"/>
+          <w:szCs w:val="20"/>
+        </w:rPr>
+        <w:t xml:space="preserve">Config.InterceptMinDistance</w:t>
+      </w:r>
+      <w:r>
+        <w:rPr>
+          <w:rFonts w:ascii="Calibri" w:cs="Calibri" w:eastAsia="Calibri" w:hAnsi="Calibri"/>
+        </w:rPr>
+        <w:t xml:space="preserve">, </w:t>
+      </w:r>
+      <w:r>
+        <w:rPr>
+          <w:rFonts w:ascii="Courier New" w:cs="Courier New" w:eastAsia="Courier New" w:hAnsi="Courier New"/>
+          <w:sz w:val="20"/>
+          <w:szCs w:val="20"/>
+        </w:rPr>
+        <w:t xml:space="preserve">InterceptBehind</w:t>
+      </w:r>
+      <w:r>
+        <w:rPr>
+          <w:rFonts w:ascii="Calibri" w:cs="Calibri" w:eastAsia="Calibri" w:hAnsi="Calibri"/>
+        </w:rPr>
+        <w:t xml:space="preserve">, </w:t>
+      </w:r>
+      <w:r>
+        <w:rPr>
+          <w:rFonts w:ascii="Courier New" w:cs="Courier New" w:eastAsia="Courier New" w:hAnsi="Courier New"/>
+          <w:sz w:val="20"/>
+          <w:szCs w:val="20"/>
+        </w:rPr>
+        <w:t xml:space="preserve">InterceptSide</w:t>
+      </w:r>
+      <w:r>
+        <w:rPr>
+          <w:rFonts w:ascii="Calibri" w:cs="Calibri" w:eastAsia="Calibri" w:hAnsi="Calibri"/>
+        </w:rPr>
+        <w:t xml:space="preserve">.</w:t>
       </w:r>
     </w:p>
     <w:p>

</xml_diff>

<commit_message>
Flicker fix at startup, Tab rebirths, hub leaderboards, admin panel and milestone log
Co-Authored-By: Claude Sonnet 5.5 <noreply@anthropic.com>
Claude-Session: https://claude.ai/code/session_013ivEnYiZGofRBeqQFKAVhJ
</commit_message>
<xml_diff>
--- a/docs/Spooky-Steal-Design-and-Plan.docx
+++ b/docs/Spooky-Steal-Design-and-Plan.docx
@@ -110,8 +110,8 @@
         </w:tblBorders>
       </w:tblPr>
       <w:tblGrid>
-        <w:gridCol w:w="3840"/>
-        <w:gridCol w:w="5520"/>
+        <w:gridCol w:w="4252"/>
+        <w:gridCol w:w="5108"/>
       </w:tblGrid>
       <w:tr>
         <w:trPr>
@@ -119,7 +119,7 @@
         </w:trPr>
         <w:tc>
           <w:tcPr>
-            <w:tcW w:type="dxa" w:w="3840"/>
+            <w:tcW w:type="dxa" w:w="4252"/>
             <w:tcBorders>
               <w:top w:val="single" w:color="BFBFBF" w:sz="4"/>
               <w:left w:val="single" w:color="BFBFBF" w:sz="4"/>
@@ -149,7 +149,7 @@
         </w:tc>
         <w:tc>
           <w:tcPr>
-            <w:tcW w:type="dxa" w:w="5520"/>
+            <w:tcW w:type="dxa" w:w="5108"/>
             <w:tcBorders>
               <w:top w:val="single" w:color="BFBFBF" w:sz="4"/>
               <w:left w:val="single" w:color="BFBFBF" w:sz="4"/>
@@ -184,7 +184,7 @@
         </w:trPr>
         <w:tc>
           <w:tcPr>
-            <w:tcW w:type="dxa" w:w="3840"/>
+            <w:tcW w:type="dxa" w:w="4252"/>
             <w:tcBorders>
               <w:top w:val="single" w:color="BFBFBF" w:sz="4"/>
               <w:left w:val="single" w:color="BFBFBF" w:sz="4"/>
@@ -211,7 +211,7 @@
         </w:tc>
         <w:tc>
           <w:tcPr>
-            <w:tcW w:type="dxa" w:w="5520"/>
+            <w:tcW w:type="dxa" w:w="5108"/>
             <w:tcBorders>
               <w:top w:val="single" w:color="BFBFBF" w:sz="4"/>
               <w:left w:val="single" w:color="BFBFBF" w:sz="4"/>
@@ -251,7 +251,7 @@
         </w:trPr>
         <w:tc>
           <w:tcPr>
-            <w:tcW w:type="dxa" w:w="3840"/>
+            <w:tcW w:type="dxa" w:w="4252"/>
             <w:tcBorders>
               <w:top w:val="single" w:color="BFBFBF" w:sz="4"/>
               <w:left w:val="single" w:color="BFBFBF" w:sz="4"/>
@@ -278,7 +278,7 @@
         </w:tc>
         <w:tc>
           <w:tcPr>
-            <w:tcW w:type="dxa" w:w="5520"/>
+            <w:tcW w:type="dxa" w:w="5108"/>
             <w:tcBorders>
               <w:top w:val="single" w:color="BFBFBF" w:sz="4"/>
               <w:left w:val="single" w:color="BFBFBF" w:sz="4"/>
@@ -310,7 +310,7 @@
         </w:trPr>
         <w:tc>
           <w:tcPr>
-            <w:tcW w:type="dxa" w:w="3840"/>
+            <w:tcW w:type="dxa" w:w="4252"/>
             <w:tcBorders>
               <w:top w:val="single" w:color="BFBFBF" w:sz="4"/>
               <w:left w:val="single" w:color="BFBFBF" w:sz="4"/>
@@ -337,7 +337,7 @@
         </w:tc>
         <w:tc>
           <w:tcPr>
-            <w:tcW w:type="dxa" w:w="5520"/>
+            <w:tcW w:type="dxa" w:w="5108"/>
             <w:tcBorders>
               <w:top w:val="single" w:color="BFBFBF" w:sz="4"/>
               <w:left w:val="single" w:color="BFBFBF" w:sz="4"/>
@@ -369,7 +369,7 @@
         </w:trPr>
         <w:tc>
           <w:tcPr>
-            <w:tcW w:type="dxa" w:w="3840"/>
+            <w:tcW w:type="dxa" w:w="4252"/>
             <w:tcBorders>
               <w:top w:val="single" w:color="BFBFBF" w:sz="4"/>
               <w:left w:val="single" w:color="BFBFBF" w:sz="4"/>
@@ -396,7 +396,7 @@
         </w:tc>
         <w:tc>
           <w:tcPr>
-            <w:tcW w:type="dxa" w:w="5520"/>
+            <w:tcW w:type="dxa" w:w="5108"/>
             <w:tcBorders>
               <w:top w:val="single" w:color="BFBFBF" w:sz="4"/>
               <w:left w:val="single" w:color="BFBFBF" w:sz="4"/>
@@ -428,7 +428,7 @@
         </w:trPr>
         <w:tc>
           <w:tcPr>
-            <w:tcW w:type="dxa" w:w="3840"/>
+            <w:tcW w:type="dxa" w:w="4252"/>
             <w:tcBorders>
               <w:top w:val="single" w:color="BFBFBF" w:sz="4"/>
               <w:left w:val="single" w:color="BFBFBF" w:sz="4"/>
@@ -455,7 +455,7 @@
         </w:tc>
         <w:tc>
           <w:tcPr>
-            <w:tcW w:type="dxa" w:w="5520"/>
+            <w:tcW w:type="dxa" w:w="5108"/>
             <w:tcBorders>
               <w:top w:val="single" w:color="BFBFBF" w:sz="4"/>
               <w:left w:val="single" w:color="BFBFBF" w:sz="4"/>
@@ -519,7 +519,7 @@
         </w:trPr>
         <w:tc>
           <w:tcPr>
-            <w:tcW w:type="dxa" w:w="3840"/>
+            <w:tcW w:type="dxa" w:w="4252"/>
             <w:tcBorders>
               <w:top w:val="single" w:color="BFBFBF" w:sz="4"/>
               <w:left w:val="single" w:color="BFBFBF" w:sz="4"/>
@@ -546,7 +546,7 @@
         </w:tc>
         <w:tc>
           <w:tcPr>
-            <w:tcW w:type="dxa" w:w="5520"/>
+            <w:tcW w:type="dxa" w:w="5108"/>
             <w:tcBorders>
               <w:top w:val="single" w:color="BFBFBF" w:sz="4"/>
               <w:left w:val="single" w:color="BFBFBF" w:sz="4"/>
@@ -578,7 +578,7 @@
         </w:trPr>
         <w:tc>
           <w:tcPr>
-            <w:tcW w:type="dxa" w:w="3840"/>
+            <w:tcW w:type="dxa" w:w="4252"/>
             <w:tcBorders>
               <w:top w:val="single" w:color="BFBFBF" w:sz="4"/>
               <w:left w:val="single" w:color="BFBFBF" w:sz="4"/>
@@ -605,7 +605,7 @@
         </w:tc>
         <w:tc>
           <w:tcPr>
-            <w:tcW w:type="dxa" w:w="5520"/>
+            <w:tcW w:type="dxa" w:w="5108"/>
             <w:tcBorders>
               <w:top w:val="single" w:color="BFBFBF" w:sz="4"/>
               <w:left w:val="single" w:color="BFBFBF" w:sz="4"/>
@@ -637,7 +637,7 @@
         </w:trPr>
         <w:tc>
           <w:tcPr>
-            <w:tcW w:type="dxa" w:w="3840"/>
+            <w:tcW w:type="dxa" w:w="4252"/>
             <w:tcBorders>
               <w:top w:val="single" w:color="BFBFBF" w:sz="4"/>
               <w:left w:val="single" w:color="BFBFBF" w:sz="4"/>
@@ -664,7 +664,7 @@
         </w:tc>
         <w:tc>
           <w:tcPr>
-            <w:tcW w:type="dxa" w:w="5520"/>
+            <w:tcW w:type="dxa" w:w="5108"/>
             <w:tcBorders>
               <w:top w:val="single" w:color="BFBFBF" w:sz="4"/>
               <w:left w:val="single" w:color="BFBFBF" w:sz="4"/>
@@ -696,7 +696,7 @@
         </w:trPr>
         <w:tc>
           <w:tcPr>
-            <w:tcW w:type="dxa" w:w="3840"/>
+            <w:tcW w:type="dxa" w:w="4252"/>
             <w:tcBorders>
               <w:top w:val="single" w:color="BFBFBF" w:sz="4"/>
               <w:left w:val="single" w:color="BFBFBF" w:sz="4"/>
@@ -723,7 +723,7 @@
         </w:tc>
         <w:tc>
           <w:tcPr>
-            <w:tcW w:type="dxa" w:w="5520"/>
+            <w:tcW w:type="dxa" w:w="5108"/>
             <w:tcBorders>
               <w:top w:val="single" w:color="BFBFBF" w:sz="4"/>
               <w:left w:val="single" w:color="BFBFBF" w:sz="4"/>
@@ -771,7 +771,7 @@
         </w:trPr>
         <w:tc>
           <w:tcPr>
-            <w:tcW w:type="dxa" w:w="3840"/>
+            <w:tcW w:type="dxa" w:w="4252"/>
             <w:tcBorders>
               <w:top w:val="single" w:color="BFBFBF" w:sz="4"/>
               <w:left w:val="single" w:color="BFBFBF" w:sz="4"/>
@@ -798,7 +798,7 @@
         </w:tc>
         <w:tc>
           <w:tcPr>
-            <w:tcW w:type="dxa" w:w="5520"/>
+            <w:tcW w:type="dxa" w:w="5108"/>
             <w:tcBorders>
               <w:top w:val="single" w:color="BFBFBF" w:sz="4"/>
               <w:left w:val="single" w:color="BFBFBF" w:sz="4"/>
@@ -830,103 +830,55 @@
         </w:trPr>
         <w:tc>
           <w:tcPr>
-            <w:tcW w:type="dxa" w:w="3840"/>
-            <w:tcBorders>
-              <w:top w:val="single" w:color="BFBFBF" w:sz="4"/>
-              <w:left w:val="single" w:color="BFBFBF" w:sz="4"/>
-              <w:bottom w:val="single" w:color="BFBFBF" w:sz="4"/>
-              <w:right w:val="single" w:color="BFBFBF" w:sz="4"/>
-            </w:tcBorders>
-            <w:tcMar>
-              <w:top w:type="dxa" w:w="60"/>
-              <w:left w:type="dxa" w:w="100"/>
-              <w:bottom w:type="dxa" w:w="60"/>
-              <w:right w:type="dxa" w:w="100"/>
-            </w:tcMar>
-          </w:tcPr>
-          <w:p>
-            <w:r>
-              <w:rPr>
-                <w:rFonts w:ascii="Calibri" w:cs="Calibri" w:eastAsia="Calibri" w:hAnsi="Calibri"/>
-                <w:sz w:val="19"/>
-                <w:szCs w:val="19"/>
-              </w:rPr>
-              <w:t xml:space="preserve">Kick (5.0)</w:t>
-            </w:r>
-          </w:p>
-        </w:tc>
-        <w:tc>
-          <w:tcPr>
-            <w:tcW w:type="dxa" w:w="5520"/>
-            <w:tcBorders>
-              <w:top w:val="single" w:color="BFBFBF" w:sz="4"/>
-              <w:left w:val="single" w:color="BFBFBF" w:sz="4"/>
-              <w:bottom w:val="single" w:color="BFBFBF" w:sz="4"/>
-              <w:right w:val="single" w:color="BFBFBF" w:sz="4"/>
-            </w:tcBorders>
-            <w:tcMar>
-              <w:top w:type="dxa" w:w="60"/>
-              <w:left w:type="dxa" w:w="100"/>
-              <w:bottom w:type="dxa" w:w="60"/>
-              <w:right w:type="dxa" w:w="100"/>
-            </w:tcMar>
-          </w:tcPr>
-          <w:p>
-            <w:r>
-              <w:rPr>
-                <w:rFonts w:ascii="Calibri" w:cs="Calibri" w:eastAsia="Calibri" w:hAnsi="Calibri"/>
-                <w:sz w:val="19"/>
-                <w:szCs w:val="19"/>
-              </w:rPr>
-              <w:t xml:space="preserve">A caught thief is kicked about 100 studs away from the owner with a kick sound. </w:t>
-            </w:r>
-            <w:r>
-              <w:rPr>
-                <w:rFonts w:ascii="Courier New" w:cs="Courier New" w:eastAsia="Courier New" w:hAnsi="Courier New"/>
-                <w:sz w:val="19"/>
-                <w:szCs w:val="19"/>
-              </w:rPr>
-              <w:t xml:space="preserve">Config.KickDistance</w:t>
-            </w:r>
-            <w:r>
-              <w:rPr>
-                <w:rFonts w:ascii="Calibri" w:cs="Calibri" w:eastAsia="Calibri" w:hAnsi="Calibri"/>
-                <w:sz w:val="19"/>
-                <w:szCs w:val="19"/>
-              </w:rPr>
-              <w:t xml:space="preserve">, </w:t>
-            </w:r>
-            <w:r>
-              <w:rPr>
-                <w:rFonts w:ascii="Courier New" w:cs="Courier New" w:eastAsia="Courier New" w:hAnsi="Courier New"/>
-                <w:sz w:val="19"/>
-                <w:szCs w:val="19"/>
-              </w:rPr>
-              <w:t xml:space="preserve">KickAngle</w:t>
-            </w:r>
-            <w:r>
-              <w:rPr>
-                <w:rFonts w:ascii="Calibri" w:cs="Calibri" w:eastAsia="Calibri" w:hAnsi="Calibri"/>
-                <w:sz w:val="19"/>
-                <w:szCs w:val="19"/>
-              </w:rPr>
-              <w:t xml:space="preserve"> and </w:t>
-            </w:r>
-            <w:r>
-              <w:rPr>
-                <w:rFonts w:ascii="Courier New" w:cs="Courier New" w:eastAsia="Courier New" w:hAnsi="Courier New"/>
-                <w:sz w:val="19"/>
-                <w:szCs w:val="19"/>
-              </w:rPr>
-              <w:t xml:space="preserve">KickSounds</w:t>
-            </w:r>
-            <w:r>
-              <w:rPr>
-                <w:rFonts w:ascii="Calibri" w:cs="Calibri" w:eastAsia="Calibri" w:hAnsi="Calibri"/>
-                <w:sz w:val="19"/>
-                <w:szCs w:val="19"/>
-              </w:rPr>
-              <w:t xml:space="preserve"> tune it; the movement anti-cheat ignores the flight.</w:t>
+            <w:tcW w:type="dxa" w:w="4252"/>
+            <w:tcBorders>
+              <w:top w:val="single" w:color="BFBFBF" w:sz="4"/>
+              <w:left w:val="single" w:color="BFBFBF" w:sz="4"/>
+              <w:bottom w:val="single" w:color="BFBFBF" w:sz="4"/>
+              <w:right w:val="single" w:color="BFBFBF" w:sz="4"/>
+            </w:tcBorders>
+            <w:tcMar>
+              <w:top w:type="dxa" w:w="60"/>
+              <w:left w:type="dxa" w:w="100"/>
+              <w:bottom w:type="dxa" w:w="60"/>
+              <w:right w:type="dxa" w:w="100"/>
+            </w:tcMar>
+          </w:tcPr>
+          <w:p>
+            <w:r>
+              <w:rPr>
+                <w:rFonts w:ascii="Calibri" w:cs="Calibri" w:eastAsia="Calibri" w:hAnsi="Calibri"/>
+                <w:sz w:val="19"/>
+                <w:szCs w:val="19"/>
+              </w:rPr>
+              <w:t xml:space="preserve">Leaderboards, playtest tools, flicker fix (5.1)</w:t>
+            </w:r>
+          </w:p>
+        </w:tc>
+        <w:tc>
+          <w:tcPr>
+            <w:tcW w:type="dxa" w:w="5108"/>
+            <w:tcBorders>
+              <w:top w:val="single" w:color="BFBFBF" w:sz="4"/>
+              <w:left w:val="single" w:color="BFBFBF" w:sz="4"/>
+              <w:bottom w:val="single" w:color="BFBFBF" w:sz="4"/>
+              <w:right w:val="single" w:color="BFBFBF" w:sz="4"/>
+            </w:tcBorders>
+            <w:tcMar>
+              <w:top w:type="dxa" w:w="60"/>
+              <w:left w:type="dxa" w:w="100"/>
+              <w:bottom w:type="dxa" w:w="60"/>
+              <w:right w:type="dxa" w:w="100"/>
+            </w:tcMar>
+          </w:tcPr>
+          <w:p>
+            <w:r>
+              <w:rPr>
+                <w:rFonts w:ascii="Calibri" w:cs="Calibri" w:eastAsia="Calibri" w:hAnsi="Calibri"/>
+                <w:sz w:val="19"/>
+                <w:szCs w:val="19"/>
+              </w:rPr>
+              <w:t xml:space="preserve">Rebirth number in the Tab list, two global boards in the hub, an Admin panel with a milestone log, and an automatic fix for flickering overlapping surfaces.</w:t>
             </w:r>
           </w:p>
         </w:tc>
@@ -937,55 +889,103 @@
         </w:trPr>
         <w:tc>
           <w:tcPr>
-            <w:tcW w:type="dxa" w:w="3840"/>
-            <w:tcBorders>
-              <w:top w:val="single" w:color="BFBFBF" w:sz="4"/>
-              <w:left w:val="single" w:color="BFBFBF" w:sz="4"/>
-              <w:bottom w:val="single" w:color="BFBFBF" w:sz="4"/>
-              <w:right w:val="single" w:color="BFBFBF" w:sz="4"/>
-            </w:tcBorders>
-            <w:tcMar>
-              <w:top w:type="dxa" w:w="60"/>
-              <w:left w:type="dxa" w:w="100"/>
-              <w:bottom w:type="dxa" w:w="60"/>
-              <w:right w:type="dxa" w:w="100"/>
-            </w:tcMar>
-          </w:tcPr>
-          <w:p>
-            <w:r>
-              <w:rPr>
-                <w:rFonts w:ascii="Calibri" w:cs="Calibri" w:eastAsia="Calibri" w:hAnsi="Calibri"/>
-                <w:sz w:val="19"/>
-                <w:szCs w:val="19"/>
-              </w:rPr>
-              <w:t xml:space="preserve">Chase fix (5.0)</w:t>
-            </w:r>
-          </w:p>
-        </w:tc>
-        <w:tc>
-          <w:tcPr>
-            <w:tcW w:type="dxa" w:w="5520"/>
-            <w:tcBorders>
-              <w:top w:val="single" w:color="BFBFBF" w:sz="4"/>
-              <w:left w:val="single" w:color="BFBFBF" w:sz="4"/>
-              <w:bottom w:val="single" w:color="BFBFBF" w:sz="4"/>
-              <w:right w:val="single" w:color="BFBFBF" w:sz="4"/>
-            </w:tcBorders>
-            <w:tcMar>
-              <w:top w:type="dxa" w:w="60"/>
-              <w:left w:type="dxa" w:w="100"/>
-              <w:bottom w:type="dxa" w:w="60"/>
-              <w:right w:type="dxa" w:w="100"/>
-            </w:tcMar>
-          </w:tcPr>
-          <w:p>
-            <w:r>
-              <w:rPr>
-                <w:rFonts w:ascii="Calibri" w:cs="Calibri" w:eastAsia="Calibri" w:hAnsi="Calibri"/>
-                <w:sz w:val="19"/>
-                <w:szCs w:val="19"/>
-              </w:rPr>
-              <w:t xml:space="preserve">The owner now chases the thief's live position every frame and catches on live distance every frame (before, both were sampled ten times a second, so a thief close to the owner's speed was never reached). His speed is enforced every frame, the server keeps control of his movement after the door scene, and new paths no longer make him double back.</w:t>
+            <w:tcW w:type="dxa" w:w="4252"/>
+            <w:tcBorders>
+              <w:top w:val="single" w:color="BFBFBF" w:sz="4"/>
+              <w:left w:val="single" w:color="BFBFBF" w:sz="4"/>
+              <w:bottom w:val="single" w:color="BFBFBF" w:sz="4"/>
+              <w:right w:val="single" w:color="BFBFBF" w:sz="4"/>
+            </w:tcBorders>
+            <w:tcMar>
+              <w:top w:type="dxa" w:w="60"/>
+              <w:left w:type="dxa" w:w="100"/>
+              <w:bottom w:type="dxa" w:w="60"/>
+              <w:right w:type="dxa" w:w="100"/>
+            </w:tcMar>
+          </w:tcPr>
+          <w:p>
+            <w:r>
+              <w:rPr>
+                <w:rFonts w:ascii="Calibri" w:cs="Calibri" w:eastAsia="Calibri" w:hAnsi="Calibri"/>
+                <w:sz w:val="19"/>
+                <w:szCs w:val="19"/>
+              </w:rPr>
+              <w:t xml:space="preserve">Kick (5.0)</w:t>
+            </w:r>
+          </w:p>
+        </w:tc>
+        <w:tc>
+          <w:tcPr>
+            <w:tcW w:type="dxa" w:w="5108"/>
+            <w:tcBorders>
+              <w:top w:val="single" w:color="BFBFBF" w:sz="4"/>
+              <w:left w:val="single" w:color="BFBFBF" w:sz="4"/>
+              <w:bottom w:val="single" w:color="BFBFBF" w:sz="4"/>
+              <w:right w:val="single" w:color="BFBFBF" w:sz="4"/>
+            </w:tcBorders>
+            <w:tcMar>
+              <w:top w:type="dxa" w:w="60"/>
+              <w:left w:type="dxa" w:w="100"/>
+              <w:bottom w:type="dxa" w:w="60"/>
+              <w:right w:type="dxa" w:w="100"/>
+            </w:tcMar>
+          </w:tcPr>
+          <w:p>
+            <w:r>
+              <w:rPr>
+                <w:rFonts w:ascii="Calibri" w:cs="Calibri" w:eastAsia="Calibri" w:hAnsi="Calibri"/>
+                <w:sz w:val="19"/>
+                <w:szCs w:val="19"/>
+              </w:rPr>
+              <w:t xml:space="preserve">A caught thief is kicked about 100 studs away from the owner with a kick sound. </w:t>
+            </w:r>
+            <w:r>
+              <w:rPr>
+                <w:rFonts w:ascii="Courier New" w:cs="Courier New" w:eastAsia="Courier New" w:hAnsi="Courier New"/>
+                <w:sz w:val="19"/>
+                <w:szCs w:val="19"/>
+              </w:rPr>
+              <w:t xml:space="preserve">Config.KickDistance</w:t>
+            </w:r>
+            <w:r>
+              <w:rPr>
+                <w:rFonts w:ascii="Calibri" w:cs="Calibri" w:eastAsia="Calibri" w:hAnsi="Calibri"/>
+                <w:sz w:val="19"/>
+                <w:szCs w:val="19"/>
+              </w:rPr>
+              <w:t xml:space="preserve">, </w:t>
+            </w:r>
+            <w:r>
+              <w:rPr>
+                <w:rFonts w:ascii="Courier New" w:cs="Courier New" w:eastAsia="Courier New" w:hAnsi="Courier New"/>
+                <w:sz w:val="19"/>
+                <w:szCs w:val="19"/>
+              </w:rPr>
+              <w:t xml:space="preserve">KickAngle</w:t>
+            </w:r>
+            <w:r>
+              <w:rPr>
+                <w:rFonts w:ascii="Calibri" w:cs="Calibri" w:eastAsia="Calibri" w:hAnsi="Calibri"/>
+                <w:sz w:val="19"/>
+                <w:szCs w:val="19"/>
+              </w:rPr>
+              <w:t xml:space="preserve"> and </w:t>
+            </w:r>
+            <w:r>
+              <w:rPr>
+                <w:rFonts w:ascii="Courier New" w:cs="Courier New" w:eastAsia="Courier New" w:hAnsi="Courier New"/>
+                <w:sz w:val="19"/>
+                <w:szCs w:val="19"/>
+              </w:rPr>
+              <w:t xml:space="preserve">KickSounds</w:t>
+            </w:r>
+            <w:r>
+              <w:rPr>
+                <w:rFonts w:ascii="Calibri" w:cs="Calibri" w:eastAsia="Calibri" w:hAnsi="Calibri"/>
+                <w:sz w:val="19"/>
+                <w:szCs w:val="19"/>
+              </w:rPr>
+              <w:t xml:space="preserve"> tune it; the movement anti-cheat ignores the flight.</w:t>
             </w:r>
           </w:p>
         </w:tc>
@@ -996,7 +996,66 @@
         </w:trPr>
         <w:tc>
           <w:tcPr>
-            <w:tcW w:type="dxa" w:w="3840"/>
+            <w:tcW w:type="dxa" w:w="4252"/>
+            <w:tcBorders>
+              <w:top w:val="single" w:color="BFBFBF" w:sz="4"/>
+              <w:left w:val="single" w:color="BFBFBF" w:sz="4"/>
+              <w:bottom w:val="single" w:color="BFBFBF" w:sz="4"/>
+              <w:right w:val="single" w:color="BFBFBF" w:sz="4"/>
+            </w:tcBorders>
+            <w:tcMar>
+              <w:top w:type="dxa" w:w="60"/>
+              <w:left w:type="dxa" w:w="100"/>
+              <w:bottom w:type="dxa" w:w="60"/>
+              <w:right w:type="dxa" w:w="100"/>
+            </w:tcMar>
+          </w:tcPr>
+          <w:p>
+            <w:r>
+              <w:rPr>
+                <w:rFonts w:ascii="Calibri" w:cs="Calibri" w:eastAsia="Calibri" w:hAnsi="Calibri"/>
+                <w:sz w:val="19"/>
+                <w:szCs w:val="19"/>
+              </w:rPr>
+              <w:t xml:space="preserve">Chase fix (5.0)</w:t>
+            </w:r>
+          </w:p>
+        </w:tc>
+        <w:tc>
+          <w:tcPr>
+            <w:tcW w:type="dxa" w:w="5108"/>
+            <w:tcBorders>
+              <w:top w:val="single" w:color="BFBFBF" w:sz="4"/>
+              <w:left w:val="single" w:color="BFBFBF" w:sz="4"/>
+              <w:bottom w:val="single" w:color="BFBFBF" w:sz="4"/>
+              <w:right w:val="single" w:color="BFBFBF" w:sz="4"/>
+            </w:tcBorders>
+            <w:tcMar>
+              <w:top w:type="dxa" w:w="60"/>
+              <w:left w:type="dxa" w:w="100"/>
+              <w:bottom w:type="dxa" w:w="60"/>
+              <w:right w:type="dxa" w:w="100"/>
+            </w:tcMar>
+          </w:tcPr>
+          <w:p>
+            <w:r>
+              <w:rPr>
+                <w:rFonts w:ascii="Calibri" w:cs="Calibri" w:eastAsia="Calibri" w:hAnsi="Calibri"/>
+                <w:sz w:val="19"/>
+                <w:szCs w:val="19"/>
+              </w:rPr>
+              <w:t xml:space="preserve">The owner now chases the thief's live position every frame and catches on live distance every frame (before, both were sampled ten times a second, so a thief close to the owner's speed was never reached). His speed is enforced every frame, the server keeps control of his movement after the door scene, and new paths no longer make him double back.</w:t>
+            </w:r>
+          </w:p>
+        </w:tc>
+      </w:tr>
+      <w:tr>
+        <w:trPr>
+          <w:cantSplit/>
+        </w:trPr>
+        <w:tc>
+          <w:tcPr>
+            <w:tcW w:type="dxa" w:w="4252"/>
             <w:tcBorders>
               <w:top w:val="single" w:color="BFBFBF" w:sz="4"/>
               <w:left w:val="single" w:color="BFBFBF" w:sz="4"/>
@@ -1023,7 +1082,7 @@
         </w:tc>
         <w:tc>
           <w:tcPr>
-            <w:tcW w:type="dxa" w:w="5520"/>
+            <w:tcW w:type="dxa" w:w="5108"/>
             <w:tcBorders>
               <w:top w:val="single" w:color="BFBFBF" w:sz="4"/>
               <w:left w:val="single" w:color="BFBFBF" w:sz="4"/>
@@ -17782,6 +17841,277 @@
           <w:rFonts w:ascii="Calibri" w:cs="Calibri" w:eastAsia="Calibri" w:hAnsi="Calibri"/>
         </w:rPr>
         <w:t xml:space="preserve">). Until then music is silent and a few UI sounds use built-in Roblox sounds.</w:t>
+      </w:r>
+    </w:p>
+    <w:p>
+      <w:pPr>
+        <w:pStyle w:val="Heading2"/>
+      </w:pPr>
+      <w:r>
+        <w:rPr>
+          <w:rFonts w:ascii="Calibri" w:cs="Calibri" w:eastAsia="Calibri" w:hAnsi="Calibri"/>
+        </w:rPr>
+        <w:t xml:space="preserve">2.15 Leaderboards, Tab list and playtest tools</w:t>
+      </w:r>
+    </w:p>
+    <w:p>
+      <w:pPr>
+        <w:pStyle w:val="ListParagraph"/>
+        <w:numPr>
+          <w:ilvl w:val="0"/>
+          <w:numId w:val="2"/>
+        </w:numPr>
+        <w:spacing w:after="60"/>
+      </w:pPr>
+      <w:r>
+        <w:rPr>
+          <w:rFonts w:ascii="Calibri" w:cs="Calibri" w:eastAsia="Calibri" w:hAnsi="Calibri"/>
+          <w:b/>
+          <w:bCs/>
+        </w:rPr>
+        <w:t xml:space="preserve">Tab list:</w:t>
+      </w:r>
+      <w:r>
+        <w:rPr>
+          <w:rFonts w:ascii="Calibri" w:cs="Calibri" w:eastAsia="Calibri" w:hAnsi="Calibri"/>
+        </w:rPr>
+        <w:t xml:space="preserve"> every player shows Rebirths, Speed, Money and Candy (in that order; the list sorts by Rebirths).</w:t>
+      </w:r>
+    </w:p>
+    <w:p>
+      <w:pPr>
+        <w:pStyle w:val="ListParagraph"/>
+        <w:numPr>
+          <w:ilvl w:val="0"/>
+          <w:numId w:val="2"/>
+        </w:numPr>
+        <w:spacing w:after="60"/>
+      </w:pPr>
+      <w:r>
+        <w:rPr>
+          <w:rFonts w:ascii="Calibri" w:cs="Calibri" w:eastAsia="Calibri" w:hAnsi="Calibri"/>
+          <w:b/>
+          <w:bCs/>
+        </w:rPr>
+        <w:t xml:space="preserve">Hub boards:</w:t>
+      </w:r>
+      <w:r>
+        <w:rPr>
+          <w:rFonts w:ascii="Calibri" w:cs="Calibri" w:eastAsia="Calibri" w:hAnsi="Calibri"/>
+        </w:rPr>
+        <w:t xml:space="preserve"> two boards stand beside the lobby spawn: </w:t>
+      </w:r>
+      <w:r>
+        <w:rPr>
+          <w:rFonts w:ascii="Calibri" w:cs="Calibri" w:eastAsia="Calibri" w:hAnsi="Calibri"/>
+          <w:b/>
+          <w:bCs/>
+        </w:rPr>
+        <w:t xml:space="preserve">Top Runners</w:t>
+      </w:r>
+      <w:r>
+        <w:rPr>
+          <w:rFonts w:ascii="Calibri" w:cs="Calibri" w:eastAsia="Calibri" w:hAnsi="Calibri"/>
+        </w:rPr>
+        <w:t xml:space="preserve"> (rebirths, then Speed Level) and </w:t>
+      </w:r>
+      <w:r>
+        <w:rPr>
+          <w:rFonts w:ascii="Calibri" w:cs="Calibri" w:eastAsia="Calibri" w:hAnsi="Calibri"/>
+          <w:b/>
+          <w:bCs/>
+        </w:rPr>
+        <w:t xml:space="preserve">Top Egg Thieves</w:t>
+      </w:r>
+      <w:r>
+        <w:rPr>
+          <w:rFonts w:ascii="Calibri" w:cs="Calibri" w:eastAsia="Calibri" w:hAnsi="Calibri"/>
+        </w:rPr>
+        <w:t xml:space="preserve"> (eggs brought home in total, a new saved stat </w:t>
+      </w:r>
+      <w:r>
+        <w:rPr>
+          <w:rFonts w:ascii="Courier New" w:cs="Courier New" w:eastAsia="Courier New" w:hAnsi="Courier New"/>
+          <w:sz w:val="20"/>
+          <w:szCs w:val="20"/>
+        </w:rPr>
+        <w:t xml:space="preserve">EggsStolen</w:t>
+      </w:r>
+      <w:r>
+        <w:rPr>
+          <w:rFonts w:ascii="Calibri" w:cs="Calibri" w:eastAsia="Calibri" w:hAnsi="Calibri"/>
+        </w:rPr>
+        <w:t xml:space="preserve">). They use the shared OrderedDataStores </w:t>
+      </w:r>
+      <w:r>
+        <w:rPr>
+          <w:rFonts w:ascii="Courier New" w:cs="Courier New" w:eastAsia="Courier New" w:hAnsi="Courier New"/>
+          <w:sz w:val="20"/>
+          <w:szCs w:val="20"/>
+        </w:rPr>
+        <w:t xml:space="preserve">SpookyTopRunners_v1</w:t>
+      </w:r>
+      <w:r>
+        <w:rPr>
+          <w:rFonts w:ascii="Calibri" w:cs="Calibri" w:eastAsia="Calibri" w:hAnsi="Calibri"/>
+        </w:rPr>
+        <w:t xml:space="preserve"> and </w:t>
+      </w:r>
+      <w:r>
+        <w:rPr>
+          <w:rFonts w:ascii="Courier New" w:cs="Courier New" w:eastAsia="Courier New" w:hAnsi="Courier New"/>
+          <w:sz w:val="20"/>
+          <w:szCs w:val="20"/>
+        </w:rPr>
+        <w:t xml:space="preserve">SpookyTopThieves_v1</w:t>
+      </w:r>
+      <w:r>
+        <w:rPr>
+          <w:rFonts w:ascii="Calibri" w:cs="Calibri" w:eastAsia="Calibri" w:hAnsi="Calibri"/>
+        </w:rPr>
+        <w:t xml:space="preserve">, so all servers share them, and refresh every 90 s (</w:t>
+      </w:r>
+      <w:r>
+        <w:rPr>
+          <w:rFonts w:ascii="Courier New" w:cs="Courier New" w:eastAsia="Courier New" w:hAnsi="Courier New"/>
+          <w:sz w:val="20"/>
+          <w:szCs w:val="20"/>
+        </w:rPr>
+        <w:t xml:space="preserve">Config.BoardRefreshSeconds</w:t>
+      </w:r>
+      <w:r>
+        <w:rPr>
+          <w:rFonts w:ascii="Calibri" w:cs="Calibri" w:eastAsia="Calibri" w:hAnsi="Calibri"/>
+        </w:rPr>
+        <w:t xml:space="preserve">). Without DataStore access (Studio without API access) they show the players in the server. The boards are built by code at fixed spots (-8, -22) and (68, -22), turned toward the lobby spawn; they may need moving or restyling by someone who can see the hub.</w:t>
+      </w:r>
+    </w:p>
+    <w:p>
+      <w:pPr>
+        <w:pStyle w:val="ListParagraph"/>
+        <w:numPr>
+          <w:ilvl w:val="0"/>
+          <w:numId w:val="2"/>
+        </w:numPr>
+        <w:spacing w:after="60"/>
+      </w:pPr>
+      <w:r>
+        <w:rPr>
+          <w:rFonts w:ascii="Calibri" w:cs="Calibri" w:eastAsia="Calibri" w:hAnsi="Calibri"/>
+          <w:b/>
+          <w:bCs/>
+        </w:rPr>
+        <w:t xml:space="preserve">Admin panel (playtest):</w:t>
+      </w:r>
+      <w:r>
+        <w:rPr>
+          <w:rFonts w:ascii="Calibri" w:cs="Calibri" w:eastAsia="Calibri" w:hAnsi="Calibri"/>
+        </w:rPr>
+        <w:t xml:space="preserve"> shown to everyone inside Studio, to the game's creator and to the user ids in </w:t>
+      </w:r>
+      <w:r>
+        <w:rPr>
+          <w:rFonts w:ascii="Courier New" w:cs="Courier New" w:eastAsia="Courier New" w:hAnsi="Courier New"/>
+          <w:sz w:val="20"/>
+          <w:szCs w:val="20"/>
+        </w:rPr>
+        <w:t xml:space="preserve">Config.AdminUserIds</w:t>
+      </w:r>
+      <w:r>
+        <w:rPr>
+          <w:rFonts w:ascii="Calibri" w:cs="Calibri" w:eastAsia="Calibri" w:hAnsi="Calibri"/>
+        </w:rPr>
+        <w:t xml:space="preserve">. Open with F2 or the ADMIN button. Buttons: +$100,000, +10,000 Candy, +10 Speed Levels, Rebirth +1, unlock every shop item, one of every egg, hatch everything now, skip the day/night phase, God mode (owners can not catch you), teleport (hub, base, houses 1 to 9), show my milestone times, reset my progress (press twice). Every command is checked again on the server.</w:t>
+      </w:r>
+    </w:p>
+    <w:p>
+      <w:pPr>
+        <w:pStyle w:val="ListParagraph"/>
+        <w:numPr>
+          <w:ilvl w:val="0"/>
+          <w:numId w:val="2"/>
+        </w:numPr>
+        <w:spacing w:after="60"/>
+      </w:pPr>
+      <w:r>
+        <w:rPr>
+          <w:rFonts w:ascii="Calibri" w:cs="Calibri" w:eastAsia="Calibri" w:hAnsi="Calibri"/>
+          <w:b/>
+          <w:bCs/>
+        </w:rPr>
+        <w:t xml:space="preserve">Milestone log:</w:t>
+      </w:r>
+      <w:r>
+        <w:rPr>
+          <w:rFonts w:ascii="Calibri" w:cs="Calibri" w:eastAsia="Calibri" w:hAnsi="Calibri"/>
+        </w:rPr>
+        <w:t xml:space="preserve"> the server prints a line like </w:t>
+      </w:r>
+      <w:r>
+        <w:rPr>
+          <w:rFonts w:ascii="Courier New" w:cs="Courier New" w:eastAsia="Courier New" w:hAnsi="Courier New"/>
+          <w:sz w:val="20"/>
+          <w:szCs w:val="20"/>
+        </w:rPr>
+        <w:t xml:space="preserve">[Playtest] Name 4:12 costume 1 bought</w:t>
+      </w:r>
+      <w:r>
+        <w:rPr>
+          <w:rFonts w:ascii="Calibri" w:cs="Calibri" w:eastAsia="Calibri" w:hAnsi="Calibri"/>
+        </w:rPr>
+        <w:t xml:space="preserve"> for each stage (costumes, treadmills, trails, base upgrades, rebirths, speed level every 5, pets, index, first steal from each house, eggs delivered). The Admin panel shows your own list. It is kept in memory for the session only.</w:t>
+      </w:r>
+    </w:p>
+    <w:p>
+      <w:pPr>
+        <w:pStyle w:val="ListParagraph"/>
+        <w:numPr>
+          <w:ilvl w:val="0"/>
+          <w:numId w:val="2"/>
+        </w:numPr>
+        <w:spacing w:after="60"/>
+      </w:pPr>
+      <w:r>
+        <w:rPr>
+          <w:rFonts w:ascii="Calibri" w:cs="Calibri" w:eastAsia="Calibri" w:hAnsi="Calibri"/>
+          <w:b/>
+          <w:bCs/>
+        </w:rPr>
+        <w:t xml:space="preserve">Flicker fix:</w:t>
+      </w:r>
+      <w:r>
+        <w:rPr>
+          <w:rFonts w:ascii="Calibri" w:cs="Calibri" w:eastAsia="Calibri" w:hAnsi="Calibri"/>
+        </w:rPr>
+        <w:t xml:space="preserve"> when the server starts, </w:t>
+      </w:r>
+      <w:r>
+        <w:rPr>
+          <w:rFonts w:ascii="Courier New" w:cs="Courier New" w:eastAsia="Courier New" w:hAnsi="Courier New"/>
+          <w:sz w:val="20"/>
+          <w:szCs w:val="20"/>
+        </w:rPr>
+        <w:t xml:space="preserve">MapBuilder.FixFlicker</w:t>
+      </w:r>
+      <w:r>
+        <w:rPr>
+          <w:rFonts w:ascii="Calibri" w:cs="Calibri" w:eastAsia="Calibri" w:hAnsi="Calibri"/>
+        </w:rPr>
+        <w:t xml:space="preserve"> finds parts in the houses and the hub whose faces lie in the same plane (roof shingles, trims, costume art) and lifts one of each pair 0.03 studs (at most 0.06) so they stop flickering. See </w:t>
+      </w:r>
+      <w:r>
+        <w:rPr>
+          <w:rFonts w:ascii="Courier New" w:cs="Courier New" w:eastAsia="Courier New" w:hAnsi="Courier New"/>
+          <w:sz w:val="20"/>
+          <w:szCs w:val="20"/>
+        </w:rPr>
+        <w:t xml:space="preserve">docs/zfighting-report.md</w:t>
+      </w:r>
+      <w:r>
+        <w:rPr>
+          <w:rFonts w:ascii="Calibri" w:cs="Calibri" w:eastAsia="Calibri" w:hAnsi="Calibri"/>
+        </w:rPr>
+        <w:t xml:space="preserve">.</w:t>
       </w:r>
     </w:p>
     <w:p>

</xml_diff>

<commit_message>
Admin panel button labels visible; leaderboards moved onto the hub wall on both sides of the street entrance
Co-Authored-By: Claude Sonnet 5.5 <noreply@anthropic.com>
Claude-Session: https://claude.ai/code/session_013ivEnYiZGofRBeqQFKAVhJ
</commit_message>
<xml_diff>
--- a/docs/Spooky-Steal-Design-and-Plan.docx
+++ b/docs/Spooky-Steal-Design-and-Plan.docx
@@ -17899,7 +17899,7 @@
         <w:rPr>
           <w:rFonts w:ascii="Calibri" w:cs="Calibri" w:eastAsia="Calibri" w:hAnsi="Calibri"/>
         </w:rPr>
-        <w:t xml:space="preserve"> two boards stand beside the lobby spawn: </w:t>
+        <w:t xml:space="preserve"> two boards hang on the hub's front wall, one on each side of the street entrance (between the shops and the Level 1 start): </w:t>
       </w:r>
       <w:r>
         <w:rPr>
@@ -17983,7 +17983,7 @@
         <w:rPr>
           <w:rFonts w:ascii="Calibri" w:cs="Calibri" w:eastAsia="Calibri" w:hAnsi="Calibri"/>
         </w:rPr>
-        <w:t xml:space="preserve">). Without DataStore access (Studio without API access) they show the players in the server. The boards are built by code at fixed spots (-8, -22) and (68, -22), turned toward the lobby spawn; they may need moving or restyling by someone who can see the hub.</w:t>
+        <w:t xml:space="preserve">). Without DataStore access (Studio without API access) they show the players in the server. The boards are built by code on the wall at x = -100 and x = 160 (y = 10, facing into the hub); they may need restyling by someone who can see the hub.</w:t>
       </w:r>
     </w:p>
     <w:p>

</xml_diff>

<commit_message>
Quests: daily and weekly quests, chests, streak, rerolls, achievements, with effort-based rewards and a Quests window
Co-Authored-By: Claude Sonnet 5.5 <noreply@anthropic.com>
Claude-Session: https://claude.ai/code/session_013ivEnYiZGofRBeqQFKAVhJ
</commit_message>
<xml_diff>
--- a/docs/Spooky-Steal-Design-and-Plan.docx
+++ b/docs/Spooky-Steal-Design-and-Plan.docx
@@ -879,6 +879,65 @@
                 <w:szCs w:val="19"/>
               </w:rPr>
               <w:t xml:space="preserve">Rebirth number in the Tab list, two global boards in the hub, an Admin panel with a milestone log, and an automatic fix for flickering overlapping surfaces.</w:t>
+            </w:r>
+          </w:p>
+        </w:tc>
+      </w:tr>
+      <w:tr>
+        <w:trPr>
+          <w:cantSplit/>
+        </w:trPr>
+        <w:tc>
+          <w:tcPr>
+            <w:tcW w:type="dxa" w:w="4252"/>
+            <w:tcBorders>
+              <w:top w:val="single" w:color="BFBFBF" w:sz="4"/>
+              <w:left w:val="single" w:color="BFBFBF" w:sz="4"/>
+              <w:bottom w:val="single" w:color="BFBFBF" w:sz="4"/>
+              <w:right w:val="single" w:color="BFBFBF" w:sz="4"/>
+            </w:tcBorders>
+            <w:tcMar>
+              <w:top w:type="dxa" w:w="60"/>
+              <w:left w:type="dxa" w:w="100"/>
+              <w:bottom w:type="dxa" w:w="60"/>
+              <w:right w:type="dxa" w:w="100"/>
+            </w:tcMar>
+          </w:tcPr>
+          <w:p>
+            <w:r>
+              <w:rPr>
+                <w:rFonts w:ascii="Calibri" w:cs="Calibri" w:eastAsia="Calibri" w:hAnsi="Calibri"/>
+                <w:sz w:val="19"/>
+                <w:szCs w:val="19"/>
+              </w:rPr>
+              <w:t xml:space="preserve">Quests (5.1)</w:t>
+            </w:r>
+          </w:p>
+        </w:tc>
+        <w:tc>
+          <w:tcPr>
+            <w:tcW w:type="dxa" w:w="5108"/>
+            <w:tcBorders>
+              <w:top w:val="single" w:color="BFBFBF" w:sz="4"/>
+              <w:left w:val="single" w:color="BFBFBF" w:sz="4"/>
+              <w:bottom w:val="single" w:color="BFBFBF" w:sz="4"/>
+              <w:right w:val="single" w:color="BFBFBF" w:sz="4"/>
+            </w:tcBorders>
+            <w:tcMar>
+              <w:top w:type="dxa" w:w="60"/>
+              <w:left w:type="dxa" w:w="100"/>
+              <w:bottom w:type="dxa" w:w="60"/>
+              <w:right w:type="dxa" w:w="100"/>
+            </w:tcMar>
+          </w:tcPr>
+          <w:p>
+            <w:r>
+              <w:rPr>
+                <w:rFonts w:ascii="Calibri" w:cs="Calibri" w:eastAsia="Calibri" w:hAnsi="Calibri"/>
+                <w:sz w:val="19"/>
+                <w:szCs w:val="19"/>
+              </w:rPr>
+              <w:t xml:space="preserve">A Quests window with daily and weekly quests, chests, a day streak, rerolls and achievements. Every quest shows its effort in minutes next to its reward, and the reward is computed from that effort and from how much the player normally earns.</w:t>
             </w:r>
           </w:p>
         </w:tc>
@@ -18112,6 +18171,812 @@
           <w:rFonts w:ascii="Calibri" w:cs="Calibri" w:eastAsia="Calibri" w:hAnsi="Calibri"/>
         </w:rPr>
         <w:t xml:space="preserve">.</w:t>
+      </w:r>
+    </w:p>
+    <w:p>
+      <w:pPr>
+        <w:pStyle w:val="Heading2"/>
+      </w:pPr>
+      <w:r>
+        <w:rPr>
+          <w:rFonts w:ascii="Calibri" w:cs="Calibri" w:eastAsia="Calibri" w:hAnsi="Calibri"/>
+        </w:rPr>
+        <w:t xml:space="preserve">2.16 Quests</w:t>
+      </w:r>
+    </w:p>
+    <w:p>
+      <w:pPr>
+        <w:spacing w:after="140"/>
+      </w:pPr>
+      <w:r>
+        <w:rPr>
+          <w:rFonts w:ascii="Calibri" w:cs="Calibri" w:eastAsia="Calibri" w:hAnsi="Calibri"/>
+        </w:rPr>
+        <w:t xml:space="preserve">A </w:t>
+      </w:r>
+      <w:r>
+        <w:rPr>
+          <w:rFonts w:ascii="Calibri" w:cs="Calibri" w:eastAsia="Calibri" w:hAnsi="Calibri"/>
+          <w:b/>
+          <w:bCs/>
+        </w:rPr>
+        <w:t xml:space="preserve">Quests</w:t>
+      </w:r>
+      <w:r>
+        <w:rPr>
+          <w:rFonts w:ascii="Calibri" w:cs="Calibri" w:eastAsia="Calibri" w:hAnsi="Calibri"/>
+        </w:rPr>
+        <w:t xml:space="preserve"> button (scroll icon, red number = rewards waiting) sits on top of the left menu column. The window has three parts.</w:t>
+      </w:r>
+    </w:p>
+    <w:p>
+      <w:pPr>
+        <w:spacing w:after="140"/>
+      </w:pPr>
+      <w:r>
+        <w:rPr>
+          <w:rFonts w:ascii="Calibri" w:cs="Calibri" w:eastAsia="Calibri" w:hAnsi="Calibri"/>
+          <w:b/>
+          <w:bCs/>
+        </w:rPr>
+        <w:t xml:space="preserve">Daily Quests</w:t>
+      </w:r>
+      <w:r>
+        <w:rPr>
+          <w:rFonts w:ascii="Calibri" w:cs="Calibri" w:eastAsia="Calibri" w:hAnsi="Calibri"/>
+        </w:rPr>
+        <w:t xml:space="preserve"> (reset at 00:00 UTC): three quests, Easy, Medium and Hard, each of a different kind. Every card shows the difficulty, an estimate of the effort in minutes ("EASY ~4 min"), a progress bar and the reward (Money, Candy, Speed XP). A quest that has not been started can be </w:t>
+      </w:r>
+      <w:r>
+        <w:rPr>
+          <w:rFonts w:ascii="Calibri" w:cs="Calibri" w:eastAsia="Calibri" w:hAnsi="Calibri"/>
+          <w:b/>
+          <w:bCs/>
+        </w:rPr>
+        <w:t xml:space="preserve">rerolled once</w:t>
+      </w:r>
+      <w:r>
+        <w:rPr>
+          <w:rFonts w:ascii="Calibri" w:cs="Calibri" w:eastAsia="Calibri" w:hAnsi="Calibri"/>
+        </w:rPr>
+        <w:t xml:space="preserve"> for another of the same difficulty. Claim each quest when it is full. When all three are claimed the </w:t>
+      </w:r>
+      <w:r>
+        <w:rPr>
+          <w:rFonts w:ascii="Calibri" w:cs="Calibri" w:eastAsia="Calibri" w:hAnsi="Calibri"/>
+          <w:b/>
+          <w:bCs/>
+        </w:rPr>
+        <w:t xml:space="preserve">Daily Chest</w:t>
+      </w:r>
+      <w:r>
+        <w:rPr>
+          <w:rFonts w:ascii="Calibri" w:cs="Calibri" w:eastAsia="Calibri" w:hAnsi="Calibri"/>
+        </w:rPr>
+        <w:t xml:space="preserve"> opens for a bonus of 50% of what the three paid, plus 10% for every extra day in a row (up to day 5, so +40%). Missing a day resets the streak.</w:t>
+      </w:r>
+    </w:p>
+    <w:p>
+      <w:pPr>
+        <w:spacing w:after="140"/>
+      </w:pPr>
+      <w:r>
+        <w:rPr>
+          <w:rFonts w:ascii="Calibri" w:cs="Calibri" w:eastAsia="Calibri" w:hAnsi="Calibri"/>
+          <w:b/>
+          <w:bCs/>
+        </w:rPr>
+        <w:t xml:space="preserve">Weekly Quests</w:t>
+      </w:r>
+      <w:r>
+        <w:rPr>
+          <w:rFonts w:ascii="Calibri" w:cs="Calibri" w:eastAsia="Calibri" w:hAnsi="Calibri"/>
+        </w:rPr>
+        <w:t xml:space="preserve"> (reset on Monday 00:00 UTC): two bigger quests (about 35 to 50 minutes of effort each) and a </w:t>
+      </w:r>
+      <w:r>
+        <w:rPr>
+          <w:rFonts w:ascii="Calibri" w:cs="Calibri" w:eastAsia="Calibri" w:hAnsi="Calibri"/>
+          <w:b/>
+          <w:bCs/>
+        </w:rPr>
+        <w:t xml:space="preserve">Weekly Chest</w:t>
+      </w:r>
+      <w:r>
+        <w:rPr>
+          <w:rFonts w:ascii="Calibri" w:cs="Calibri" w:eastAsia="Calibri" w:hAnsi="Calibri"/>
+        </w:rPr>
+        <w:t xml:space="preserve"> (+50%).</w:t>
+      </w:r>
+    </w:p>
+    <w:p>
+      <w:pPr>
+        <w:spacing w:after="140"/>
+      </w:pPr>
+      <w:r>
+        <w:rPr>
+          <w:rFonts w:ascii="Calibri" w:cs="Calibri" w:eastAsia="Calibri" w:hAnsi="Calibri"/>
+          <w:b/>
+          <w:bCs/>
+        </w:rPr>
+        <w:t xml:space="preserve">Achievements:</w:t>
+      </w:r>
+      <w:r>
+        <w:rPr>
+          <w:rFonts w:ascii="Calibri" w:cs="Calibri" w:eastAsia="Calibri" w:hAnsi="Calibri"/>
+        </w:rPr>
+        <w:t xml:space="preserve"> lifetime goals with steps that are paid once each, with rewards that grow at every step.</w:t>
+      </w:r>
+    </w:p>
+    <w:tbl>
+      <w:tblPr>
+        <w:tblW w:type="dxa" w:w="9360"/>
+        <w:tblBorders>
+          <w:top w:val="single" w:color="auto" w:sz="4"/>
+          <w:left w:val="single" w:color="auto" w:sz="4"/>
+          <w:bottom w:val="single" w:color="auto" w:sz="4"/>
+          <w:right w:val="single" w:color="auto" w:sz="4"/>
+          <w:insideH w:val="single" w:color="auto" w:sz="4"/>
+          <w:insideV w:val="single" w:color="auto" w:sz="4"/>
+        </w:tblBorders>
+      </w:tblPr>
+      <w:tblGrid>
+        <w:gridCol w:w="5433"/>
+        <w:gridCol w:w="3927"/>
+      </w:tblGrid>
+      <w:tr>
+        <w:trPr>
+          <w:tblHeader/>
+        </w:trPr>
+        <w:tc>
+          <w:tcPr>
+            <w:tcW w:type="dxa" w:w="5433"/>
+            <w:tcBorders>
+              <w:top w:val="single" w:color="BFBFBF" w:sz="4"/>
+              <w:left w:val="single" w:color="BFBFBF" w:sz="4"/>
+              <w:bottom w:val="single" w:color="BFBFBF" w:sz="4"/>
+              <w:right w:val="single" w:color="BFBFBF" w:sz="4"/>
+            </w:tcBorders>
+            <w:shd w:fill="E7E6E6" w:color="auto" w:val="clear"/>
+            <w:tcMar>
+              <w:top w:type="dxa" w:w="60"/>
+              <w:left w:type="dxa" w:w="100"/>
+              <w:bottom w:type="dxa" w:w="60"/>
+              <w:right w:type="dxa" w:w="100"/>
+            </w:tcMar>
+          </w:tcPr>
+          <w:p>
+            <w:r>
+              <w:rPr>
+                <w:rFonts w:ascii="Calibri" w:cs="Calibri" w:eastAsia="Calibri" w:hAnsi="Calibri"/>
+                <w:b/>
+                <w:bCs/>
+                <w:sz w:val="19"/>
+                <w:szCs w:val="19"/>
+              </w:rPr>
+              <w:t xml:space="preserve">Achievement</w:t>
+            </w:r>
+          </w:p>
+        </w:tc>
+        <w:tc>
+          <w:tcPr>
+            <w:tcW w:type="dxa" w:w="3927"/>
+            <w:tcBorders>
+              <w:top w:val="single" w:color="BFBFBF" w:sz="4"/>
+              <w:left w:val="single" w:color="BFBFBF" w:sz="4"/>
+              <w:bottom w:val="single" w:color="BFBFBF" w:sz="4"/>
+              <w:right w:val="single" w:color="BFBFBF" w:sz="4"/>
+            </w:tcBorders>
+            <w:shd w:fill="E7E6E6" w:color="auto" w:val="clear"/>
+            <w:tcMar>
+              <w:top w:type="dxa" w:w="60"/>
+              <w:left w:type="dxa" w:w="100"/>
+              <w:bottom w:type="dxa" w:w="60"/>
+              <w:right w:type="dxa" w:w="100"/>
+            </w:tcMar>
+          </w:tcPr>
+          <w:p>
+            <w:r>
+              <w:rPr>
+                <w:rFonts w:ascii="Calibri" w:cs="Calibri" w:eastAsia="Calibri" w:hAnsi="Calibri"/>
+                <w:b/>
+                <w:bCs/>
+                <w:sz w:val="19"/>
+                <w:szCs w:val="19"/>
+              </w:rPr>
+              <w:t xml:space="preserve">Steps</w:t>
+            </w:r>
+          </w:p>
+        </w:tc>
+      </w:tr>
+      <w:tr>
+        <w:trPr>
+          <w:cantSplit/>
+        </w:trPr>
+        <w:tc>
+          <w:tcPr>
+            <w:tcW w:type="dxa" w:w="5433"/>
+            <w:tcBorders>
+              <w:top w:val="single" w:color="BFBFBF" w:sz="4"/>
+              <w:left w:val="single" w:color="BFBFBF" w:sz="4"/>
+              <w:bottom w:val="single" w:color="BFBFBF" w:sz="4"/>
+              <w:right w:val="single" w:color="BFBFBF" w:sz="4"/>
+            </w:tcBorders>
+            <w:tcMar>
+              <w:top w:type="dxa" w:w="60"/>
+              <w:left w:type="dxa" w:w="100"/>
+              <w:bottom w:type="dxa" w:w="60"/>
+              <w:right w:type="dxa" w:w="100"/>
+            </w:tcMar>
+          </w:tcPr>
+          <w:p>
+            <w:r>
+              <w:rPr>
+                <w:rFonts w:ascii="Calibri" w:cs="Calibri" w:eastAsia="Calibri" w:hAnsi="Calibri"/>
+                <w:sz w:val="19"/>
+                <w:szCs w:val="19"/>
+              </w:rPr>
+              <w:t xml:space="preserve">Egg Thief (eggs brought home)</w:t>
+            </w:r>
+          </w:p>
+        </w:tc>
+        <w:tc>
+          <w:tcPr>
+            <w:tcW w:type="dxa" w:w="3927"/>
+            <w:tcBorders>
+              <w:top w:val="single" w:color="BFBFBF" w:sz="4"/>
+              <w:left w:val="single" w:color="BFBFBF" w:sz="4"/>
+              <w:bottom w:val="single" w:color="BFBFBF" w:sz="4"/>
+              <w:right w:val="single" w:color="BFBFBF" w:sz="4"/>
+            </w:tcBorders>
+            <w:tcMar>
+              <w:top w:type="dxa" w:w="60"/>
+              <w:left w:type="dxa" w:w="100"/>
+              <w:bottom w:type="dxa" w:w="60"/>
+              <w:right w:type="dxa" w:w="100"/>
+            </w:tcMar>
+          </w:tcPr>
+          <w:p>
+            <w:r>
+              <w:rPr>
+                <w:rFonts w:ascii="Calibri" w:cs="Calibri" w:eastAsia="Calibri" w:hAnsi="Calibri"/>
+                <w:sz w:val="19"/>
+                <w:szCs w:val="19"/>
+              </w:rPr>
+              <w:t xml:space="preserve">1, 5, 25, 100, 300, 1000</w:t>
+            </w:r>
+          </w:p>
+        </w:tc>
+      </w:tr>
+      <w:tr>
+        <w:trPr>
+          <w:cantSplit/>
+        </w:trPr>
+        <w:tc>
+          <w:tcPr>
+            <w:tcW w:type="dxa" w:w="5433"/>
+            <w:tcBorders>
+              <w:top w:val="single" w:color="BFBFBF" w:sz="4"/>
+              <w:left w:val="single" w:color="BFBFBF" w:sz="4"/>
+              <w:bottom w:val="single" w:color="BFBFBF" w:sz="4"/>
+              <w:right w:val="single" w:color="BFBFBF" w:sz="4"/>
+            </w:tcBorders>
+            <w:tcMar>
+              <w:top w:type="dxa" w:w="60"/>
+              <w:left w:type="dxa" w:w="100"/>
+              <w:bottom w:type="dxa" w:w="60"/>
+              <w:right w:type="dxa" w:w="100"/>
+            </w:tcMar>
+          </w:tcPr>
+          <w:p>
+            <w:r>
+              <w:rPr>
+                <w:rFonts w:ascii="Calibri" w:cs="Calibri" w:eastAsia="Calibri" w:hAnsi="Calibri"/>
+                <w:sz w:val="19"/>
+                <w:szCs w:val="19"/>
+              </w:rPr>
+              <w:t xml:space="preserve">Trick-or-Treater (knocks)</w:t>
+            </w:r>
+          </w:p>
+        </w:tc>
+        <w:tc>
+          <w:tcPr>
+            <w:tcW w:type="dxa" w:w="3927"/>
+            <w:tcBorders>
+              <w:top w:val="single" w:color="BFBFBF" w:sz="4"/>
+              <w:left w:val="single" w:color="BFBFBF" w:sz="4"/>
+              <w:bottom w:val="single" w:color="BFBFBF" w:sz="4"/>
+              <w:right w:val="single" w:color="BFBFBF" w:sz="4"/>
+            </w:tcBorders>
+            <w:tcMar>
+              <w:top w:type="dxa" w:w="60"/>
+              <w:left w:type="dxa" w:w="100"/>
+              <w:bottom w:type="dxa" w:w="60"/>
+              <w:right w:type="dxa" w:w="100"/>
+            </w:tcMar>
+          </w:tcPr>
+          <w:p>
+            <w:r>
+              <w:rPr>
+                <w:rFonts w:ascii="Calibri" w:cs="Calibri" w:eastAsia="Calibri" w:hAnsi="Calibri"/>
+                <w:sz w:val="19"/>
+                <w:szCs w:val="19"/>
+              </w:rPr>
+              <w:t xml:space="preserve">10, 50, 250, 1000</w:t>
+            </w:r>
+          </w:p>
+        </w:tc>
+      </w:tr>
+      <w:tr>
+        <w:trPr>
+          <w:cantSplit/>
+        </w:trPr>
+        <w:tc>
+          <w:tcPr>
+            <w:tcW w:type="dxa" w:w="5433"/>
+            <w:tcBorders>
+              <w:top w:val="single" w:color="BFBFBF" w:sz="4"/>
+              <w:left w:val="single" w:color="BFBFBF" w:sz="4"/>
+              <w:bottom w:val="single" w:color="BFBFBF" w:sz="4"/>
+              <w:right w:val="single" w:color="BFBFBF" w:sz="4"/>
+            </w:tcBorders>
+            <w:tcMar>
+              <w:top w:type="dxa" w:w="60"/>
+              <w:left w:type="dxa" w:w="100"/>
+              <w:bottom w:type="dxa" w:w="60"/>
+              <w:right w:type="dxa" w:w="100"/>
+            </w:tcMar>
+          </w:tcPr>
+          <w:p>
+            <w:r>
+              <w:rPr>
+                <w:rFonts w:ascii="Calibri" w:cs="Calibri" w:eastAsia="Calibri" w:hAnsi="Calibri"/>
+                <w:sz w:val="19"/>
+                <w:szCs w:val="19"/>
+              </w:rPr>
+              <w:t xml:space="preserve">Hatchery (pets hatched)</w:t>
+            </w:r>
+          </w:p>
+        </w:tc>
+        <w:tc>
+          <w:tcPr>
+            <w:tcW w:type="dxa" w:w="3927"/>
+            <w:tcBorders>
+              <w:top w:val="single" w:color="BFBFBF" w:sz="4"/>
+              <w:left w:val="single" w:color="BFBFBF" w:sz="4"/>
+              <w:bottom w:val="single" w:color="BFBFBF" w:sz="4"/>
+              <w:right w:val="single" w:color="BFBFBF" w:sz="4"/>
+            </w:tcBorders>
+            <w:tcMar>
+              <w:top w:type="dxa" w:w="60"/>
+              <w:left w:type="dxa" w:w="100"/>
+              <w:bottom w:type="dxa" w:w="60"/>
+              <w:right w:type="dxa" w:w="100"/>
+            </w:tcMar>
+          </w:tcPr>
+          <w:p>
+            <w:r>
+              <w:rPr>
+                <w:rFonts w:ascii="Calibri" w:cs="Calibri" w:eastAsia="Calibri" w:hAnsi="Calibri"/>
+                <w:sz w:val="19"/>
+                <w:szCs w:val="19"/>
+              </w:rPr>
+              <w:t xml:space="preserve">5, 25, 100, 400</w:t>
+            </w:r>
+          </w:p>
+        </w:tc>
+      </w:tr>
+      <w:tr>
+        <w:trPr>
+          <w:cantSplit/>
+        </w:trPr>
+        <w:tc>
+          <w:tcPr>
+            <w:tcW w:type="dxa" w:w="5433"/>
+            <w:tcBorders>
+              <w:top w:val="single" w:color="BFBFBF" w:sz="4"/>
+              <w:left w:val="single" w:color="BFBFBF" w:sz="4"/>
+              <w:bottom w:val="single" w:color="BFBFBF" w:sz="4"/>
+              <w:right w:val="single" w:color="BFBFBF" w:sz="4"/>
+            </w:tcBorders>
+            <w:tcMar>
+              <w:top w:type="dxa" w:w="60"/>
+              <w:left w:type="dxa" w:w="100"/>
+              <w:bottom w:type="dxa" w:w="60"/>
+              <w:right w:type="dxa" w:w="100"/>
+            </w:tcMar>
+          </w:tcPr>
+          <w:p>
+            <w:r>
+              <w:rPr>
+                <w:rFonts w:ascii="Calibri" w:cs="Calibri" w:eastAsia="Calibri" w:hAnsi="Calibri"/>
+                <w:sz w:val="19"/>
+                <w:szCs w:val="19"/>
+              </w:rPr>
+              <w:t xml:space="preserve">Collector (different pets discovered)</w:t>
+            </w:r>
+          </w:p>
+        </w:tc>
+        <w:tc>
+          <w:tcPr>
+            <w:tcW w:type="dxa" w:w="3927"/>
+            <w:tcBorders>
+              <w:top w:val="single" w:color="BFBFBF" w:sz="4"/>
+              <w:left w:val="single" w:color="BFBFBF" w:sz="4"/>
+              <w:bottom w:val="single" w:color="BFBFBF" w:sz="4"/>
+              <w:right w:val="single" w:color="BFBFBF" w:sz="4"/>
+            </w:tcBorders>
+            <w:tcMar>
+              <w:top w:type="dxa" w:w="60"/>
+              <w:left w:type="dxa" w:w="100"/>
+              <w:bottom w:type="dxa" w:w="60"/>
+              <w:right w:type="dxa" w:w="100"/>
+            </w:tcMar>
+          </w:tcPr>
+          <w:p>
+            <w:r>
+              <w:rPr>
+                <w:rFonts w:ascii="Calibri" w:cs="Calibri" w:eastAsia="Calibri" w:hAnsi="Calibri"/>
+                <w:sz w:val="19"/>
+                <w:szCs w:val="19"/>
+              </w:rPr>
+              <w:t xml:space="preserve">5, 10, 20, 30</w:t>
+            </w:r>
+          </w:p>
+        </w:tc>
+      </w:tr>
+      <w:tr>
+        <w:trPr>
+          <w:cantSplit/>
+        </w:trPr>
+        <w:tc>
+          <w:tcPr>
+            <w:tcW w:type="dxa" w:w="5433"/>
+            <w:tcBorders>
+              <w:top w:val="single" w:color="BFBFBF" w:sz="4"/>
+              <w:left w:val="single" w:color="BFBFBF" w:sz="4"/>
+              <w:bottom w:val="single" w:color="BFBFBF" w:sz="4"/>
+              <w:right w:val="single" w:color="BFBFBF" w:sz="4"/>
+            </w:tcBorders>
+            <w:tcMar>
+              <w:top w:type="dxa" w:w="60"/>
+              <w:left w:type="dxa" w:w="100"/>
+              <w:bottom w:type="dxa" w:w="60"/>
+              <w:right w:type="dxa" w:w="100"/>
+            </w:tcMar>
+          </w:tcPr>
+          <w:p>
+            <w:r>
+              <w:rPr>
+                <w:rFonts w:ascii="Calibri" w:cs="Calibri" w:eastAsia="Calibri" w:hAnsi="Calibri"/>
+                <w:sz w:val="19"/>
+                <w:szCs w:val="19"/>
+              </w:rPr>
+              <w:t xml:space="preserve">Reborn (rebirths)</w:t>
+            </w:r>
+          </w:p>
+        </w:tc>
+        <w:tc>
+          <w:tcPr>
+            <w:tcW w:type="dxa" w:w="3927"/>
+            <w:tcBorders>
+              <w:top w:val="single" w:color="BFBFBF" w:sz="4"/>
+              <w:left w:val="single" w:color="BFBFBF" w:sz="4"/>
+              <w:bottom w:val="single" w:color="BFBFBF" w:sz="4"/>
+              <w:right w:val="single" w:color="BFBFBF" w:sz="4"/>
+            </w:tcBorders>
+            <w:tcMar>
+              <w:top w:type="dxa" w:w="60"/>
+              <w:left w:type="dxa" w:w="100"/>
+              <w:bottom w:type="dxa" w:w="60"/>
+              <w:right w:type="dxa" w:w="100"/>
+            </w:tcMar>
+          </w:tcPr>
+          <w:p>
+            <w:r>
+              <w:rPr>
+                <w:rFonts w:ascii="Calibri" w:cs="Calibri" w:eastAsia="Calibri" w:hAnsi="Calibri"/>
+                <w:sz w:val="19"/>
+                <w:szCs w:val="19"/>
+              </w:rPr>
+              <w:t xml:space="preserve">1, 2, 4, 8</w:t>
+            </w:r>
+          </w:p>
+        </w:tc>
+      </w:tr>
+      <w:tr>
+        <w:trPr>
+          <w:cantSplit/>
+        </w:trPr>
+        <w:tc>
+          <w:tcPr>
+            <w:tcW w:type="dxa" w:w="5433"/>
+            <w:tcBorders>
+              <w:top w:val="single" w:color="BFBFBF" w:sz="4"/>
+              <w:left w:val="single" w:color="BFBFBF" w:sz="4"/>
+              <w:bottom w:val="single" w:color="BFBFBF" w:sz="4"/>
+              <w:right w:val="single" w:color="BFBFBF" w:sz="4"/>
+            </w:tcBorders>
+            <w:tcMar>
+              <w:top w:type="dxa" w:w="60"/>
+              <w:left w:type="dxa" w:w="100"/>
+              <w:bottom w:type="dxa" w:w="60"/>
+              <w:right w:type="dxa" w:w="100"/>
+            </w:tcMar>
+          </w:tcPr>
+          <w:p>
+            <w:r>
+              <w:rPr>
+                <w:rFonts w:ascii="Calibri" w:cs="Calibri" w:eastAsia="Calibri" w:hAnsi="Calibri"/>
+                <w:sz w:val="19"/>
+                <w:szCs w:val="19"/>
+              </w:rPr>
+              <w:t xml:space="preserve">Punching Bag (times caught)</w:t>
+            </w:r>
+          </w:p>
+        </w:tc>
+        <w:tc>
+          <w:tcPr>
+            <w:tcW w:type="dxa" w:w="3927"/>
+            <w:tcBorders>
+              <w:top w:val="single" w:color="BFBFBF" w:sz="4"/>
+              <w:left w:val="single" w:color="BFBFBF" w:sz="4"/>
+              <w:bottom w:val="single" w:color="BFBFBF" w:sz="4"/>
+              <w:right w:val="single" w:color="BFBFBF" w:sz="4"/>
+            </w:tcBorders>
+            <w:tcMar>
+              <w:top w:type="dxa" w:w="60"/>
+              <w:left w:type="dxa" w:w="100"/>
+              <w:bottom w:type="dxa" w:w="60"/>
+              <w:right w:type="dxa" w:w="100"/>
+            </w:tcMar>
+          </w:tcPr>
+          <w:p>
+            <w:r>
+              <w:rPr>
+                <w:rFonts w:ascii="Calibri" w:cs="Calibri" w:eastAsia="Calibri" w:hAnsi="Calibri"/>
+                <w:sz w:val="19"/>
+                <w:szCs w:val="19"/>
+              </w:rPr>
+              <w:t xml:space="preserve">1, 10, 50</w:t>
+            </w:r>
+          </w:p>
+        </w:tc>
+      </w:tr>
+    </w:tbl>
+    <w:p>
+      <w:pPr>
+        <w:spacing w:after="120"/>
+      </w:pPr>
+    </w:p>
+    <w:p>
+      <w:pPr>
+        <w:spacing w:after="140"/>
+      </w:pPr>
+      <w:r>
+        <w:rPr>
+          <w:rFonts w:ascii="Calibri" w:cs="Calibri" w:eastAsia="Calibri" w:hAnsi="Calibri"/>
+          <w:b/>
+          <w:bCs/>
+        </w:rPr>
+        <w:t xml:space="preserve">Quest types:</w:t>
+      </w:r>
+      <w:r>
+        <w:rPr>
+          <w:rFonts w:ascii="Calibri" w:cs="Calibri" w:eastAsia="Calibri" w:hAnsi="Calibri"/>
+        </w:rPr>
+        <w:t xml:space="preserve"> Trick-or-Treat N times (about 14 s each), Run for N minutes (real running), Hatch N eggs (70 s each, includes getting the egg), Bring N eggs home (60 s), Gain N Speed Levels (the time is worked out from the XP you earn), Get kicked by an owner (a joke quest for Candy), Bring N eggs home from a house of tier T or higher (100 s, Hard only, needs tier 2), Hatch N Big-or-bigger pets (400 s each), Hatch N Golden/Diamond/Rainbow pets (700 s each, Hard only).</w:t>
+      </w:r>
+    </w:p>
+    <w:p>
+      <w:pPr>
+        <w:spacing w:after="140"/>
+      </w:pPr>
+      <w:r>
+        <w:rPr>
+          <w:rFonts w:ascii="Calibri" w:cs="Calibri" w:eastAsia="Calibri" w:hAnsi="Calibri"/>
+          <w:b/>
+          <w:bCs/>
+        </w:rPr>
+        <w:t xml:space="preserve">Effort and reward are linked.</w:t>
+      </w:r>
+      <w:r>
+        <w:rPr>
+          <w:rFonts w:ascii="Calibri" w:cs="Calibri" w:eastAsia="Calibri" w:hAnsi="Calibri"/>
+        </w:rPr>
+        <w:t xml:space="preserve"> Every quest has an effort in minutes = target x seconds per unit. The target is chosen so the effort lands in the slot's band: Easy 3 to 6 min, Medium 8 to 13, Hard 16 to 26, Weekly 35 to 50. The reward is</w:t>
+      </w:r>
+    </w:p>
+    <w:p>
+      <w:pPr>
+        <w:spacing w:after="140"/>
+      </w:pPr>
+      <w:r>
+        <w:rPr>
+          <w:rFonts w:ascii="Calibri" w:cs="Calibri" w:eastAsia="Calibri" w:hAnsi="Calibri"/>
+        </w:rPr>
+        <w:t xml:space="preserve">    effort minutes x what you normally earn per minute x multiplier x the quest's currency share</w:t>
+      </w:r>
+    </w:p>
+    <w:p>
+      <w:pPr>
+        <w:spacing w:after="140"/>
+      </w:pPr>
+      <w:r>
+        <w:rPr>
+          <w:rFonts w:ascii="Calibri" w:cs="Calibri" w:eastAsia="Calibri" w:hAnsi="Calibri"/>
+        </w:rPr>
+        <w:t xml:space="preserve">with the multiplier 0.5 for Daily, 0.6 for Weekly and 1.0 for achievements (achievement steps are worth 6, 13, 29, 64, 140 and 310 minutes of earning). "What you normally earn per minute" is read from your own save: Money = your pets' income per minute (or one eighth of your next Money purchase when you have no pets yet), Candy = about 4 knocks a minute at your best house with your costume's multiplier, Speed XP = half a minute of running at your current rate. So a quest is worth the same share of your progress on day 1 and on rebirth 5, and it never pays less than a small floor ($25, 20 Candy, 8 XP). The rewards are fixed when the quests are generated, so they do not change while you play.</w:t>
+      </w:r>
+    </w:p>
+    <w:p>
+      <w:pPr>
+        <w:spacing w:after="140"/>
+      </w:pPr>
+      <w:r>
+        <w:rPr>
+          <w:rFonts w:ascii="Calibri" w:cs="Calibri" w:eastAsia="Calibri" w:hAnsi="Calibri"/>
+        </w:rPr>
+        <w:t xml:space="preserve">Rewards from a full day (Easy + Medium + Hard + chest) are roughly one extra Treadmill or Costume in the first hour and 10 to 25% of the next big purchase later. Everything is tuned in </w:t>
+      </w:r>
+      <w:r>
+        <w:rPr>
+          <w:rFonts w:ascii="Courier New" w:cs="Courier New" w:eastAsia="Courier New" w:hAnsi="Courier New"/>
+          <w:sz w:val="20"/>
+          <w:szCs w:val="20"/>
+        </w:rPr>
+        <w:t xml:space="preserve">Config.Quests</w:t>
+      </w:r>
+      <w:r>
+        <w:rPr>
+          <w:rFonts w:ascii="Calibri" w:cs="Calibri" w:eastAsia="Calibri" w:hAnsi="Calibri"/>
+        </w:rPr>
+        <w:t xml:space="preserve"> (multipliers, bands, seconds per unit, shares).</w:t>
+      </w:r>
+    </w:p>
+    <w:p>
+      <w:pPr>
+        <w:spacing w:after="140"/>
+      </w:pPr>
+      <w:r>
+        <w:rPr>
+          <w:rFonts w:ascii="Calibri" w:cs="Calibri" w:eastAsia="Calibri" w:hAnsi="Calibri"/>
+          <w:b/>
+          <w:bCs/>
+        </w:rPr>
+        <w:t xml:space="preserve">Where it lives:</w:t>
+      </w:r>
+      <w:r>
+        <w:rPr>
+          <w:rFonts w:ascii="Calibri" w:cs="Calibri" w:eastAsia="Calibri" w:hAnsi="Calibri"/>
+        </w:rPr>
+        <w:t xml:space="preserve"> rules and numbers in </w:t>
+      </w:r>
+      <w:r>
+        <w:rPr>
+          <w:rFonts w:ascii="Courier New" w:cs="Courier New" w:eastAsia="Courier New" w:hAnsi="Courier New"/>
+          <w:sz w:val="20"/>
+          <w:szCs w:val="20"/>
+        </w:rPr>
+        <w:t xml:space="preserve">Config.Quests</w:t>
+      </w:r>
+      <w:r>
+        <w:rPr>
+          <w:rFonts w:ascii="Calibri" w:cs="Calibri" w:eastAsia="Calibri" w:hAnsi="Calibri"/>
+        </w:rPr>
+        <w:t xml:space="preserve"> (shared); the engine (generation, progress, claims, chests, rerolls, achievements, saving) in </w:t>
+      </w:r>
+      <w:r>
+        <w:rPr>
+          <w:rFonts w:ascii="Courier New" w:cs="Courier New" w:eastAsia="Courier New" w:hAnsi="Courier New"/>
+          <w:sz w:val="20"/>
+          <w:szCs w:val="20"/>
+        </w:rPr>
+        <w:t xml:space="preserve">DataService</w:t>
+      </w:r>
+      <w:r>
+        <w:rPr>
+          <w:rFonts w:ascii="Calibri" w:cs="Calibri" w:eastAsia="Calibri" w:hAnsi="Calibri"/>
+        </w:rPr>
+        <w:t xml:space="preserve">; events from </w:t>
+      </w:r>
+      <w:r>
+        <w:rPr>
+          <w:rFonts w:ascii="Courier New" w:cs="Courier New" w:eastAsia="Courier New" w:hAnsi="Courier New"/>
+          <w:sz w:val="20"/>
+          <w:szCs w:val="20"/>
+        </w:rPr>
+        <w:t xml:space="preserve">HouseService</w:t>
+      </w:r>
+      <w:r>
+        <w:rPr>
+          <w:rFonts w:ascii="Calibri" w:cs="Calibri" w:eastAsia="Calibri" w:hAnsi="Calibri"/>
+        </w:rPr>
+        <w:t xml:space="preserve"> (knocks, eggs home, caught), </w:t>
+      </w:r>
+      <w:r>
+        <w:rPr>
+          <w:rFonts w:ascii="Courier New" w:cs="Courier New" w:eastAsia="Courier New" w:hAnsi="Courier New"/>
+          <w:sz w:val="20"/>
+          <w:szCs w:val="20"/>
+        </w:rPr>
+        <w:t xml:space="preserve">PlotService</w:t>
+      </w:r>
+      <w:r>
+        <w:rPr>
+          <w:rFonts w:ascii="Calibri" w:cs="Calibri" w:eastAsia="Calibri" w:hAnsi="Calibri"/>
+        </w:rPr>
+        <w:t xml:space="preserve"> (hatches) and </w:t>
+      </w:r>
+      <w:r>
+        <w:rPr>
+          <w:rFonts w:ascii="Courier New" w:cs="Courier New" w:eastAsia="Courier New" w:hAnsi="Courier New"/>
+          <w:sz w:val="20"/>
+          <w:szCs w:val="20"/>
+        </w:rPr>
+        <w:t xml:space="preserve">SpeedService</w:t>
+      </w:r>
+      <w:r>
+        <w:rPr>
+          <w:rFonts w:ascii="Calibri" w:cs="Calibri" w:eastAsia="Calibri" w:hAnsi="Calibri"/>
+        </w:rPr>
+        <w:t xml:space="preserve"> (running, levels); the window and the button badge in </w:t>
+      </w:r>
+      <w:r>
+        <w:rPr>
+          <w:rFonts w:ascii="Courier New" w:cs="Courier New" w:eastAsia="Courier New" w:hAnsi="Courier New"/>
+          <w:sz w:val="20"/>
+          <w:szCs w:val="20"/>
+        </w:rPr>
+        <w:t xml:space="preserve">Main.client</w:t>
+      </w:r>
+      <w:r>
+        <w:rPr>
+          <w:rFonts w:ascii="Calibri" w:cs="Calibri" w:eastAsia="Calibri" w:hAnsi="Calibri"/>
+        </w:rPr>
+        <w:t xml:space="preserve">. Quests are saved with the player (</w:t>
+      </w:r>
+      <w:r>
+        <w:rPr>
+          <w:rFonts w:ascii="Courier New" w:cs="Courier New" w:eastAsia="Courier New" w:hAnsi="Courier New"/>
+          <w:sz w:val="20"/>
+          <w:szCs w:val="20"/>
+        </w:rPr>
+        <w:t xml:space="preserve">Quests</w:t>
+      </w:r>
+      <w:r>
+        <w:rPr>
+          <w:rFonts w:ascii="Calibri" w:cs="Calibri" w:eastAsia="Calibri" w:hAnsi="Calibri"/>
+        </w:rPr>
+        <w:t xml:space="preserve">, </w:t>
+      </w:r>
+      <w:r>
+        <w:rPr>
+          <w:rFonts w:ascii="Courier New" w:cs="Courier New" w:eastAsia="Courier New" w:hAnsi="Courier New"/>
+          <w:sz w:val="20"/>
+          <w:szCs w:val="20"/>
+        </w:rPr>
+        <w:t xml:space="preserve">Stats</w:t>
+      </w:r>
+      <w:r>
+        <w:rPr>
+          <w:rFonts w:ascii="Calibri" w:cs="Calibri" w:eastAsia="Calibri" w:hAnsi="Calibri"/>
+        </w:rPr>
+        <w:t xml:space="preserve">, </w:t>
+      </w:r>
+      <w:r>
+        <w:rPr>
+          <w:rFonts w:ascii="Courier New" w:cs="Courier New" w:eastAsia="Courier New" w:hAnsi="Courier New"/>
+          <w:sz w:val="20"/>
+          <w:szCs w:val="20"/>
+        </w:rPr>
+        <w:t xml:space="preserve">Achieved</w:t>
+      </w:r>
+      <w:r>
+        <w:rPr>
+          <w:rFonts w:ascii="Calibri" w:cs="Calibri" w:eastAsia="Calibri" w:hAnsi="Calibri"/>
+        </w:rPr>
+        <w:t xml:space="preserve">). The Admin panel can finish all quests or deal a new set.</w:t>
       </w:r>
     </w:p>
     <w:p>

</xml_diff>

<commit_message>
Make furniture inside the houses phantom for players
Co-Authored-By: Claude Sonnet 5.5 <noreply@anthropic.com>
Claude-Session: https://claude.ai/code/session_013ivEnYiZGofRBeqQFKAVhJ
</commit_message>
<xml_diff>
--- a/docs/Spooky-Steal-Design-and-Plan.docx
+++ b/docs/Spooky-Steal-Design-and-Plan.docx
@@ -938,6 +938,65 @@
                 <w:szCs w:val="19"/>
               </w:rPr>
               <w:t xml:space="preserve">A Quests window with daily and weekly quests, chests, a day streak, rerolls and achievements. Every quest shows its effort in minutes next to its reward, and the reward is computed from that effort and from how much the player normally earns.</w:t>
+            </w:r>
+          </w:p>
+        </w:tc>
+      </w:tr>
+      <w:tr>
+        <w:trPr>
+          <w:cantSplit/>
+        </w:trPr>
+        <w:tc>
+          <w:tcPr>
+            <w:tcW w:type="dxa" w:w="4252"/>
+            <w:tcBorders>
+              <w:top w:val="single" w:color="BFBFBF" w:sz="4"/>
+              <w:left w:val="single" w:color="BFBFBF" w:sz="4"/>
+              <w:bottom w:val="single" w:color="BFBFBF" w:sz="4"/>
+              <w:right w:val="single" w:color="BFBFBF" w:sz="4"/>
+            </w:tcBorders>
+            <w:tcMar>
+              <w:top w:type="dxa" w:w="60"/>
+              <w:left w:type="dxa" w:w="100"/>
+              <w:bottom w:type="dxa" w:w="60"/>
+              <w:right w:type="dxa" w:w="100"/>
+            </w:tcMar>
+          </w:tcPr>
+          <w:p>
+            <w:r>
+              <w:rPr>
+                <w:rFonts w:ascii="Calibri" w:cs="Calibri" w:eastAsia="Calibri" w:hAnsi="Calibri"/>
+                <w:sz w:val="19"/>
+                <w:szCs w:val="19"/>
+              </w:rPr>
+              <w:t xml:space="preserve">Phantom furniture (5.1)</w:t>
+            </w:r>
+          </w:p>
+        </w:tc>
+        <w:tc>
+          <w:tcPr>
+            <w:tcW w:type="dxa" w:w="5108"/>
+            <w:tcBorders>
+              <w:top w:val="single" w:color="BFBFBF" w:sz="4"/>
+              <w:left w:val="single" w:color="BFBFBF" w:sz="4"/>
+              <w:bottom w:val="single" w:color="BFBFBF" w:sz="4"/>
+              <w:right w:val="single" w:color="BFBFBF" w:sz="4"/>
+            </w:tcBorders>
+            <w:tcMar>
+              <w:top w:type="dxa" w:w="60"/>
+              <w:left w:type="dxa" w:w="100"/>
+              <w:bottom w:type="dxa" w:w="60"/>
+              <w:right w:type="dxa" w:w="100"/>
+            </w:tcMar>
+          </w:tcPr>
+          <w:p>
+            <w:r>
+              <w:rPr>
+                <w:rFonts w:ascii="Calibri" w:cs="Calibri" w:eastAsia="Calibri" w:hAnsi="Calibri"/>
+                <w:sz w:val="19"/>
+                <w:szCs w:val="19"/>
+              </w:rPr>
+              <w:t xml:space="preserve">Furniture inside the houses no longer blocks players.</w:t>
             </w:r>
           </w:p>
         </w:tc>
@@ -6018,6 +6077,86 @@
           <w:rFonts w:ascii="Calibri" w:cs="Calibri" w:eastAsia="Calibri" w:hAnsi="Calibri"/>
         </w:rPr>
         <w:t xml:space="preserve"> (a red "!" over their head): 0.8 s plus 0.2 s per egg rarity step, so a Common egg gives a 1 s head start and a Secret egg 2.2 s. They can't catch you during that time.</w:t>
+      </w:r>
+    </w:p>
+    <w:p>
+      <w:pPr>
+        <w:pStyle w:val="ListParagraph"/>
+        <w:numPr>
+          <w:ilvl w:val="0"/>
+          <w:numId w:val="2"/>
+        </w:numPr>
+        <w:spacing w:after="60"/>
+      </w:pPr>
+      <w:r>
+        <w:rPr>
+          <w:rFonts w:ascii="Calibri" w:cs="Calibri" w:eastAsia="Calibri" w:hAnsi="Calibri"/>
+          <w:b/>
+          <w:bCs/>
+        </w:rPr>
+        <w:t xml:space="preserve">Furniture is phantom (5.1):</w:t>
+      </w:r>
+      <w:r>
+        <w:rPr>
+          <w:rFonts w:ascii="Calibri" w:cs="Calibri" w:eastAsia="Calibri" w:hAnsi="Calibri"/>
+        </w:rPr>
+        <w:t xml:space="preserve"> players run straight through tables, chairs, shelves, beds and other furniture inside the houses, so nobody gets stuck during a chase. When the server starts, every part in a house's </w:t>
+      </w:r>
+      <w:r>
+        <w:rPr>
+          <w:rFonts w:ascii="Courier New" w:cs="Courier New" w:eastAsia="Courier New" w:hAnsi="Courier New"/>
+          <w:sz w:val="20"/>
+          <w:szCs w:val="20"/>
+        </w:rPr>
+        <w:t xml:space="preserve">Decor</w:t>
+      </w:r>
+      <w:r>
+        <w:rPr>
+          <w:rFonts w:ascii="Calibri" w:cs="Calibri" w:eastAsia="Calibri" w:hAnsi="Calibri"/>
+        </w:rPr>
+        <w:t xml:space="preserve"> folders named Interior, Kitchen, Pantry, Altar or Craftsmanship (about 4,100 parts in houses 1 to 5) is set to </w:t>
+      </w:r>
+      <w:r>
+        <w:rPr>
+          <w:rFonts w:ascii="Courier New" w:cs="Courier New" w:eastAsia="Courier New" w:hAnsi="Courier New"/>
+          <w:sz w:val="20"/>
+          <w:szCs w:val="20"/>
+        </w:rPr>
+        <w:t xml:space="preserve">CanCollide = false</w:t>
+      </w:r>
+      <w:r>
+        <w:rPr>
+          <w:rFonts w:ascii="Calibri" w:cs="Calibri" w:eastAsia="Calibri" w:hAnsi="Calibri"/>
+        </w:rPr>
+        <w:t xml:space="preserve">, except floors, stairs and loft planks (names that mean something to stand on). Walls, floors and roofs (</w:t>
+      </w:r>
+      <w:r>
+        <w:rPr>
+          <w:rFonts w:ascii="Courier New" w:cs="Courier New" w:eastAsia="Courier New" w:hAnsi="Courier New"/>
+          <w:sz w:val="20"/>
+          <w:szCs w:val="20"/>
+        </w:rPr>
+        <w:t xml:space="preserve">Structure</w:t>
+      </w:r>
+      <w:r>
+        <w:rPr>
+          <w:rFonts w:ascii="Calibri" w:cs="Calibri" w:eastAsia="Calibri" w:hAnsi="Calibri"/>
+        </w:rPr>
+        <w:t xml:space="preserve">) and everything outdoors (yard, fence, trees) stay solid. Owners already walked through props. Lists: </w:t>
+      </w:r>
+      <w:r>
+        <w:rPr>
+          <w:rFonts w:ascii="Courier New" w:cs="Courier New" w:eastAsia="Courier New" w:hAnsi="Courier New"/>
+          <w:sz w:val="20"/>
+          <w:szCs w:val="20"/>
+        </w:rPr>
+        <w:t xml:space="preserve">Config.PhantomFurniture</w:t>
+      </w:r>
+      <w:r>
+        <w:rPr>
+          <w:rFonts w:ascii="Calibri" w:cs="Calibri" w:eastAsia="Calibri" w:hAnsi="Calibri"/>
+        </w:rPr>
+        <w:t xml:space="preserve">.</w:t>
       </w:r>
     </w:p>
     <w:p>

</xml_diff>

<commit_message>
Playtime Rewards window with twelve daily gifts, and potions that boost Speed XP, Candy, Money and hatching
Also fixes a declaration-order bug that made leaving the game error in DataService.

Co-Authored-By: Claude Sonnet 5.5 <noreply@anthropic.com>
Claude-Session: https://claude.ai/code/session_013ivEnYiZGofRBeqQFKAVhJ
</commit_message>
<xml_diff>
--- a/docs/Spooky-Steal-Design-and-Plan.docx
+++ b/docs/Spooky-Steal-Design-and-Plan.docx
@@ -997,6 +997,65 @@
                 <w:szCs w:val="19"/>
               </w:rPr>
               <w:t xml:space="preserve">Furniture inside the houses no longer blocks players.</w:t>
+            </w:r>
+          </w:p>
+        </w:tc>
+      </w:tr>
+      <w:tr>
+        <w:trPr>
+          <w:cantSplit/>
+        </w:trPr>
+        <w:tc>
+          <w:tcPr>
+            <w:tcW w:type="dxa" w:w="4252"/>
+            <w:tcBorders>
+              <w:top w:val="single" w:color="BFBFBF" w:sz="4"/>
+              <w:left w:val="single" w:color="BFBFBF" w:sz="4"/>
+              <w:bottom w:val="single" w:color="BFBFBF" w:sz="4"/>
+              <w:right w:val="single" w:color="BFBFBF" w:sz="4"/>
+            </w:tcBorders>
+            <w:tcMar>
+              <w:top w:type="dxa" w:w="60"/>
+              <w:left w:type="dxa" w:w="100"/>
+              <w:bottom w:type="dxa" w:w="60"/>
+              <w:right w:type="dxa" w:w="100"/>
+            </w:tcMar>
+          </w:tcPr>
+          <w:p>
+            <w:r>
+              <w:rPr>
+                <w:rFonts w:ascii="Calibri" w:cs="Calibri" w:eastAsia="Calibri" w:hAnsi="Calibri"/>
+                <w:sz w:val="19"/>
+                <w:szCs w:val="19"/>
+              </w:rPr>
+              <w:t xml:space="preserve">Playtime Rewards and potions (5.1)</w:t>
+            </w:r>
+          </w:p>
+        </w:tc>
+        <w:tc>
+          <w:tcPr>
+            <w:tcW w:type="dxa" w:w="5108"/>
+            <w:tcBorders>
+              <w:top w:val="single" w:color="BFBFBF" w:sz="4"/>
+              <w:left w:val="single" w:color="BFBFBF" w:sz="4"/>
+              <w:bottom w:val="single" w:color="BFBFBF" w:sz="4"/>
+              <w:right w:val="single" w:color="BFBFBF" w:sz="4"/>
+            </w:tcBorders>
+            <w:tcMar>
+              <w:top w:type="dxa" w:w="60"/>
+              <w:left w:type="dxa" w:w="100"/>
+              <w:bottom w:type="dxa" w:w="60"/>
+              <w:right w:type="dxa" w:w="100"/>
+            </w:tcMar>
+          </w:tcPr>
+          <w:p>
+            <w:r>
+              <w:rPr>
+                <w:rFonts w:ascii="Calibri" w:cs="Calibri" w:eastAsia="Calibri" w:hAnsi="Calibri"/>
+                <w:sz w:val="19"/>
+                <w:szCs w:val="19"/>
+              </w:rPr>
+              <w:t xml:space="preserve">Twelve daily gifts for playing time, and timed boost potions (Speed XP, Candy, Money, hatching).</w:t>
             </w:r>
           </w:p>
         </w:tc>
@@ -19116,6 +19175,1350 @@
           <w:rFonts w:ascii="Calibri" w:cs="Calibri" w:eastAsia="Calibri" w:hAnsi="Calibri"/>
         </w:rPr>
         <w:t xml:space="preserve">). The Admin panel can finish all quests or deal a new set.</w:t>
+      </w:r>
+    </w:p>
+    <w:p>
+      <w:pPr>
+        <w:pStyle w:val="Heading2"/>
+      </w:pPr>
+      <w:r>
+        <w:rPr>
+          <w:rFonts w:ascii="Calibri" w:cs="Calibri" w:eastAsia="Calibri" w:hAnsi="Calibri"/>
+        </w:rPr>
+        <w:t xml:space="preserve">2.17 Playtime Rewards and potions</w:t>
+      </w:r>
+    </w:p>
+    <w:p>
+      <w:pPr>
+        <w:spacing w:after="140"/>
+      </w:pPr>
+      <w:r>
+        <w:rPr>
+          <w:rFonts w:ascii="Calibri" w:cs="Calibri" w:eastAsia="Calibri" w:hAnsi="Calibri"/>
+        </w:rPr>
+        <w:t xml:space="preserve">A </w:t>
+      </w:r>
+      <w:r>
+        <w:rPr>
+          <w:rFonts w:ascii="Calibri" w:cs="Calibri" w:eastAsia="Calibri" w:hAnsi="Calibri"/>
+          <w:b/>
+          <w:bCs/>
+        </w:rPr>
+        <w:t xml:space="preserve">Rewards</w:t>
+      </w:r>
+      <w:r>
+        <w:rPr>
+          <w:rFonts w:ascii="Calibri" w:cs="Calibri" w:eastAsia="Calibri" w:hAnsi="Calibri"/>
+        </w:rPr>
+        <w:t xml:space="preserve"> button (gift icon, red number = gifts ready) opens a window with twelve gifts in a grid, like the reference screenshot: each tile shows the gift on top, a picture, and a countdown ("MM:SS") that turns into a green </w:t>
+      </w:r>
+      <w:r>
+        <w:rPr>
+          <w:rFonts w:ascii="Calibri" w:cs="Calibri" w:eastAsia="Calibri" w:hAnsi="Calibri"/>
+          <w:b/>
+          <w:bCs/>
+        </w:rPr>
+        <w:t xml:space="preserve">CLAIM</w:t>
+      </w:r>
+      <w:r>
+        <w:rPr>
+          <w:rFonts w:ascii="Calibri" w:cs="Calibri" w:eastAsia="Calibri" w:hAnsi="Calibri"/>
+        </w:rPr>
+        <w:t xml:space="preserve"> button when today's play time is reached.</w:t>
+      </w:r>
+    </w:p>
+    <w:tbl>
+      <w:tblPr>
+        <w:tblW w:type="dxa" w:w="9360"/>
+        <w:tblBorders>
+          <w:top w:val="single" w:color="auto" w:sz="4"/>
+          <w:left w:val="single" w:color="auto" w:sz="4"/>
+          <w:bottom w:val="single" w:color="auto" w:sz="4"/>
+          <w:right w:val="single" w:color="auto" w:sz="4"/>
+          <w:insideH w:val="single" w:color="auto" w:sz="4"/>
+          <w:insideV w:val="single" w:color="auto" w:sz="4"/>
+        </w:tblBorders>
+      </w:tblPr>
+      <w:tblGrid>
+        <w:gridCol w:w="1309"/>
+        <w:gridCol w:w="3349"/>
+        <w:gridCol w:w="4702"/>
+      </w:tblGrid>
+      <w:tr>
+        <w:trPr>
+          <w:tblHeader/>
+        </w:trPr>
+        <w:tc>
+          <w:tcPr>
+            <w:tcW w:type="dxa" w:w="1309"/>
+            <w:tcBorders>
+              <w:top w:val="single" w:color="BFBFBF" w:sz="4"/>
+              <w:left w:val="single" w:color="BFBFBF" w:sz="4"/>
+              <w:bottom w:val="single" w:color="BFBFBF" w:sz="4"/>
+              <w:right w:val="single" w:color="BFBFBF" w:sz="4"/>
+            </w:tcBorders>
+            <w:shd w:fill="E7E6E6" w:color="auto" w:val="clear"/>
+            <w:tcMar>
+              <w:top w:type="dxa" w:w="60"/>
+              <w:left w:type="dxa" w:w="100"/>
+              <w:bottom w:type="dxa" w:w="60"/>
+              <w:right w:type="dxa" w:w="100"/>
+            </w:tcMar>
+          </w:tcPr>
+          <w:p>
+            <w:r>
+              <w:rPr>
+                <w:rFonts w:ascii="Calibri" w:cs="Calibri" w:eastAsia="Calibri" w:hAnsi="Calibri"/>
+                <w:b/>
+                <w:bCs/>
+                <w:sz w:val="19"/>
+                <w:szCs w:val="19"/>
+              </w:rPr>
+              <w:t xml:space="preserve">Gift</w:t>
+            </w:r>
+          </w:p>
+        </w:tc>
+        <w:tc>
+          <w:tcPr>
+            <w:tcW w:type="dxa" w:w="3349"/>
+            <w:tcBorders>
+              <w:top w:val="single" w:color="BFBFBF" w:sz="4"/>
+              <w:left w:val="single" w:color="BFBFBF" w:sz="4"/>
+              <w:bottom w:val="single" w:color="BFBFBF" w:sz="4"/>
+              <w:right w:val="single" w:color="BFBFBF" w:sz="4"/>
+            </w:tcBorders>
+            <w:shd w:fill="E7E6E6" w:color="auto" w:val="clear"/>
+            <w:tcMar>
+              <w:top w:type="dxa" w:w="60"/>
+              <w:left w:type="dxa" w:w="100"/>
+              <w:bottom w:type="dxa" w:w="60"/>
+              <w:right w:type="dxa" w:w="100"/>
+            </w:tcMar>
+          </w:tcPr>
+          <w:p>
+            <w:r>
+              <w:rPr>
+                <w:rFonts w:ascii="Calibri" w:cs="Calibri" w:eastAsia="Calibri" w:hAnsi="Calibri"/>
+                <w:b/>
+                <w:bCs/>
+                <w:sz w:val="19"/>
+                <w:szCs w:val="19"/>
+              </w:rPr>
+              <w:t xml:space="preserve">At (min played today)</w:t>
+            </w:r>
+          </w:p>
+        </w:tc>
+        <w:tc>
+          <w:tcPr>
+            <w:tcW w:type="dxa" w:w="4702"/>
+            <w:tcBorders>
+              <w:top w:val="single" w:color="BFBFBF" w:sz="4"/>
+              <w:left w:val="single" w:color="BFBFBF" w:sz="4"/>
+              <w:bottom w:val="single" w:color="BFBFBF" w:sz="4"/>
+              <w:right w:val="single" w:color="BFBFBF" w:sz="4"/>
+            </w:tcBorders>
+            <w:shd w:fill="E7E6E6" w:color="auto" w:val="clear"/>
+            <w:tcMar>
+              <w:top w:type="dxa" w:w="60"/>
+              <w:left w:type="dxa" w:w="100"/>
+              <w:bottom w:type="dxa" w:w="60"/>
+              <w:right w:type="dxa" w:w="100"/>
+            </w:tcMar>
+          </w:tcPr>
+          <w:p>
+            <w:r>
+              <w:rPr>
+                <w:rFonts w:ascii="Calibri" w:cs="Calibri" w:eastAsia="Calibri" w:hAnsi="Calibri"/>
+                <w:b/>
+                <w:bCs/>
+                <w:sz w:val="19"/>
+                <w:szCs w:val="19"/>
+              </w:rPr>
+              <w:t xml:space="preserve">What</w:t>
+            </w:r>
+          </w:p>
+        </w:tc>
+      </w:tr>
+      <w:tr>
+        <w:trPr>
+          <w:cantSplit/>
+        </w:trPr>
+        <w:tc>
+          <w:tcPr>
+            <w:tcW w:type="dxa" w:w="1309"/>
+            <w:tcBorders>
+              <w:top w:val="single" w:color="BFBFBF" w:sz="4"/>
+              <w:left w:val="single" w:color="BFBFBF" w:sz="4"/>
+              <w:bottom w:val="single" w:color="BFBFBF" w:sz="4"/>
+              <w:right w:val="single" w:color="BFBFBF" w:sz="4"/>
+            </w:tcBorders>
+            <w:tcMar>
+              <w:top w:type="dxa" w:w="60"/>
+              <w:left w:type="dxa" w:w="100"/>
+              <w:bottom w:type="dxa" w:w="60"/>
+              <w:right w:type="dxa" w:w="100"/>
+            </w:tcMar>
+          </w:tcPr>
+          <w:p>
+            <w:r>
+              <w:rPr>
+                <w:rFonts w:ascii="Calibri" w:cs="Calibri" w:eastAsia="Calibri" w:hAnsi="Calibri"/>
+                <w:sz w:val="19"/>
+                <w:szCs w:val="19"/>
+              </w:rPr>
+              <w:t xml:space="preserve">1</w:t>
+            </w:r>
+          </w:p>
+        </w:tc>
+        <w:tc>
+          <w:tcPr>
+            <w:tcW w:type="dxa" w:w="3349"/>
+            <w:tcBorders>
+              <w:top w:val="single" w:color="BFBFBF" w:sz="4"/>
+              <w:left w:val="single" w:color="BFBFBF" w:sz="4"/>
+              <w:bottom w:val="single" w:color="BFBFBF" w:sz="4"/>
+              <w:right w:val="single" w:color="BFBFBF" w:sz="4"/>
+            </w:tcBorders>
+            <w:tcMar>
+              <w:top w:type="dxa" w:w="60"/>
+              <w:left w:type="dxa" w:w="100"/>
+              <w:bottom w:type="dxa" w:w="60"/>
+              <w:right w:type="dxa" w:w="100"/>
+            </w:tcMar>
+          </w:tcPr>
+          <w:p>
+            <w:r>
+              <w:rPr>
+                <w:rFonts w:ascii="Calibri" w:cs="Calibri" w:eastAsia="Calibri" w:hAnsi="Calibri"/>
+                <w:sz w:val="19"/>
+                <w:szCs w:val="19"/>
+              </w:rPr>
+              <w:t xml:space="preserve">0</w:t>
+            </w:r>
+          </w:p>
+        </w:tc>
+        <w:tc>
+          <w:tcPr>
+            <w:tcW w:type="dxa" w:w="4702"/>
+            <w:tcBorders>
+              <w:top w:val="single" w:color="BFBFBF" w:sz="4"/>
+              <w:left w:val="single" w:color="BFBFBF" w:sz="4"/>
+              <w:bottom w:val="single" w:color="BFBFBF" w:sz="4"/>
+              <w:right w:val="single" w:color="BFBFBF" w:sz="4"/>
+            </w:tcBorders>
+            <w:tcMar>
+              <w:top w:type="dxa" w:w="60"/>
+              <w:left w:type="dxa" w:w="100"/>
+              <w:bottom w:type="dxa" w:w="60"/>
+              <w:right w:type="dxa" w:w="100"/>
+            </w:tcMar>
+          </w:tcPr>
+          <w:p>
+            <w:r>
+              <w:rPr>
+                <w:rFonts w:ascii="Calibri" w:cs="Calibri" w:eastAsia="Calibri" w:hAnsi="Calibri"/>
+                <w:sz w:val="19"/>
+                <w:szCs w:val="19"/>
+              </w:rPr>
+              <w:t xml:space="preserve">Money, 4 minutes of your earnings</w:t>
+            </w:r>
+          </w:p>
+        </w:tc>
+      </w:tr>
+      <w:tr>
+        <w:trPr>
+          <w:cantSplit/>
+        </w:trPr>
+        <w:tc>
+          <w:tcPr>
+            <w:tcW w:type="dxa" w:w="1309"/>
+            <w:tcBorders>
+              <w:top w:val="single" w:color="BFBFBF" w:sz="4"/>
+              <w:left w:val="single" w:color="BFBFBF" w:sz="4"/>
+              <w:bottom w:val="single" w:color="BFBFBF" w:sz="4"/>
+              <w:right w:val="single" w:color="BFBFBF" w:sz="4"/>
+            </w:tcBorders>
+            <w:tcMar>
+              <w:top w:type="dxa" w:w="60"/>
+              <w:left w:type="dxa" w:w="100"/>
+              <w:bottom w:type="dxa" w:w="60"/>
+              <w:right w:type="dxa" w:w="100"/>
+            </w:tcMar>
+          </w:tcPr>
+          <w:p>
+            <w:r>
+              <w:rPr>
+                <w:rFonts w:ascii="Calibri" w:cs="Calibri" w:eastAsia="Calibri" w:hAnsi="Calibri"/>
+                <w:sz w:val="19"/>
+                <w:szCs w:val="19"/>
+              </w:rPr>
+              <w:t xml:space="preserve">2</w:t>
+            </w:r>
+          </w:p>
+        </w:tc>
+        <w:tc>
+          <w:tcPr>
+            <w:tcW w:type="dxa" w:w="3349"/>
+            <w:tcBorders>
+              <w:top w:val="single" w:color="BFBFBF" w:sz="4"/>
+              <w:left w:val="single" w:color="BFBFBF" w:sz="4"/>
+              <w:bottom w:val="single" w:color="BFBFBF" w:sz="4"/>
+              <w:right w:val="single" w:color="BFBFBF" w:sz="4"/>
+            </w:tcBorders>
+            <w:tcMar>
+              <w:top w:type="dxa" w:w="60"/>
+              <w:left w:type="dxa" w:w="100"/>
+              <w:bottom w:type="dxa" w:w="60"/>
+              <w:right w:type="dxa" w:w="100"/>
+            </w:tcMar>
+          </w:tcPr>
+          <w:p>
+            <w:r>
+              <w:rPr>
+                <w:rFonts w:ascii="Calibri" w:cs="Calibri" w:eastAsia="Calibri" w:hAnsi="Calibri"/>
+                <w:sz w:val="19"/>
+                <w:szCs w:val="19"/>
+              </w:rPr>
+              <w:t xml:space="preserve">2</w:t>
+            </w:r>
+          </w:p>
+        </w:tc>
+        <w:tc>
+          <w:tcPr>
+            <w:tcW w:type="dxa" w:w="4702"/>
+            <w:tcBorders>
+              <w:top w:val="single" w:color="BFBFBF" w:sz="4"/>
+              <w:left w:val="single" w:color="BFBFBF" w:sz="4"/>
+              <w:bottom w:val="single" w:color="BFBFBF" w:sz="4"/>
+              <w:right w:val="single" w:color="BFBFBF" w:sz="4"/>
+            </w:tcBorders>
+            <w:tcMar>
+              <w:top w:type="dxa" w:w="60"/>
+              <w:left w:type="dxa" w:w="100"/>
+              <w:bottom w:type="dxa" w:w="60"/>
+              <w:right w:type="dxa" w:w="100"/>
+            </w:tcMar>
+          </w:tcPr>
+          <w:p>
+            <w:r>
+              <w:rPr>
+                <w:rFonts w:ascii="Calibri" w:cs="Calibri" w:eastAsia="Calibri" w:hAnsi="Calibri"/>
+                <w:sz w:val="19"/>
+                <w:szCs w:val="19"/>
+              </w:rPr>
+              <w:t xml:space="preserve">Candy, 5 minutes</w:t>
+            </w:r>
+          </w:p>
+        </w:tc>
+      </w:tr>
+      <w:tr>
+        <w:trPr>
+          <w:cantSplit/>
+        </w:trPr>
+        <w:tc>
+          <w:tcPr>
+            <w:tcW w:type="dxa" w:w="1309"/>
+            <w:tcBorders>
+              <w:top w:val="single" w:color="BFBFBF" w:sz="4"/>
+              <w:left w:val="single" w:color="BFBFBF" w:sz="4"/>
+              <w:bottom w:val="single" w:color="BFBFBF" w:sz="4"/>
+              <w:right w:val="single" w:color="BFBFBF" w:sz="4"/>
+            </w:tcBorders>
+            <w:tcMar>
+              <w:top w:type="dxa" w:w="60"/>
+              <w:left w:type="dxa" w:w="100"/>
+              <w:bottom w:type="dxa" w:w="60"/>
+              <w:right w:type="dxa" w:w="100"/>
+            </w:tcMar>
+          </w:tcPr>
+          <w:p>
+            <w:r>
+              <w:rPr>
+                <w:rFonts w:ascii="Calibri" w:cs="Calibri" w:eastAsia="Calibri" w:hAnsi="Calibri"/>
+                <w:sz w:val="19"/>
+                <w:szCs w:val="19"/>
+              </w:rPr>
+              <w:t xml:space="preserve">3</w:t>
+            </w:r>
+          </w:p>
+        </w:tc>
+        <w:tc>
+          <w:tcPr>
+            <w:tcW w:type="dxa" w:w="3349"/>
+            <w:tcBorders>
+              <w:top w:val="single" w:color="BFBFBF" w:sz="4"/>
+              <w:left w:val="single" w:color="BFBFBF" w:sz="4"/>
+              <w:bottom w:val="single" w:color="BFBFBF" w:sz="4"/>
+              <w:right w:val="single" w:color="BFBFBF" w:sz="4"/>
+            </w:tcBorders>
+            <w:tcMar>
+              <w:top w:type="dxa" w:w="60"/>
+              <w:left w:type="dxa" w:w="100"/>
+              <w:bottom w:type="dxa" w:w="60"/>
+              <w:right w:type="dxa" w:w="100"/>
+            </w:tcMar>
+          </w:tcPr>
+          <w:p>
+            <w:r>
+              <w:rPr>
+                <w:rFonts w:ascii="Calibri" w:cs="Calibri" w:eastAsia="Calibri" w:hAnsi="Calibri"/>
+                <w:sz w:val="19"/>
+                <w:szCs w:val="19"/>
+              </w:rPr>
+              <w:t xml:space="preserve">5</w:t>
+            </w:r>
+          </w:p>
+        </w:tc>
+        <w:tc>
+          <w:tcPr>
+            <w:tcW w:type="dxa" w:w="4702"/>
+            <w:tcBorders>
+              <w:top w:val="single" w:color="BFBFBF" w:sz="4"/>
+              <w:left w:val="single" w:color="BFBFBF" w:sz="4"/>
+              <w:bottom w:val="single" w:color="BFBFBF" w:sz="4"/>
+              <w:right w:val="single" w:color="BFBFBF" w:sz="4"/>
+            </w:tcBorders>
+            <w:tcMar>
+              <w:top w:type="dxa" w:w="60"/>
+              <w:left w:type="dxa" w:w="100"/>
+              <w:bottom w:type="dxa" w:w="60"/>
+              <w:right w:type="dxa" w:w="100"/>
+            </w:tcMar>
+          </w:tcPr>
+          <w:p>
+            <w:r>
+              <w:rPr>
+                <w:rFonts w:ascii="Calibri" w:cs="Calibri" w:eastAsia="Calibri" w:hAnsi="Calibri"/>
+                <w:sz w:val="19"/>
+                <w:szCs w:val="19"/>
+              </w:rPr>
+              <w:t xml:space="preserve">Speed Potion</w:t>
+            </w:r>
+          </w:p>
+        </w:tc>
+      </w:tr>
+      <w:tr>
+        <w:trPr>
+          <w:cantSplit/>
+        </w:trPr>
+        <w:tc>
+          <w:tcPr>
+            <w:tcW w:type="dxa" w:w="1309"/>
+            <w:tcBorders>
+              <w:top w:val="single" w:color="BFBFBF" w:sz="4"/>
+              <w:left w:val="single" w:color="BFBFBF" w:sz="4"/>
+              <w:bottom w:val="single" w:color="BFBFBF" w:sz="4"/>
+              <w:right w:val="single" w:color="BFBFBF" w:sz="4"/>
+            </w:tcBorders>
+            <w:tcMar>
+              <w:top w:type="dxa" w:w="60"/>
+              <w:left w:type="dxa" w:w="100"/>
+              <w:bottom w:type="dxa" w:w="60"/>
+              <w:right w:type="dxa" w:w="100"/>
+            </w:tcMar>
+          </w:tcPr>
+          <w:p>
+            <w:r>
+              <w:rPr>
+                <w:rFonts w:ascii="Calibri" w:cs="Calibri" w:eastAsia="Calibri" w:hAnsi="Calibri"/>
+                <w:sz w:val="19"/>
+                <w:szCs w:val="19"/>
+              </w:rPr>
+              <w:t xml:space="preserve">4</w:t>
+            </w:r>
+          </w:p>
+        </w:tc>
+        <w:tc>
+          <w:tcPr>
+            <w:tcW w:type="dxa" w:w="3349"/>
+            <w:tcBorders>
+              <w:top w:val="single" w:color="BFBFBF" w:sz="4"/>
+              <w:left w:val="single" w:color="BFBFBF" w:sz="4"/>
+              <w:bottom w:val="single" w:color="BFBFBF" w:sz="4"/>
+              <w:right w:val="single" w:color="BFBFBF" w:sz="4"/>
+            </w:tcBorders>
+            <w:tcMar>
+              <w:top w:type="dxa" w:w="60"/>
+              <w:left w:type="dxa" w:w="100"/>
+              <w:bottom w:type="dxa" w:w="60"/>
+              <w:right w:type="dxa" w:w="100"/>
+            </w:tcMar>
+          </w:tcPr>
+          <w:p>
+            <w:r>
+              <w:rPr>
+                <w:rFonts w:ascii="Calibri" w:cs="Calibri" w:eastAsia="Calibri" w:hAnsi="Calibri"/>
+                <w:sz w:val="19"/>
+                <w:szCs w:val="19"/>
+              </w:rPr>
+              <w:t xml:space="preserve">10</w:t>
+            </w:r>
+          </w:p>
+        </w:tc>
+        <w:tc>
+          <w:tcPr>
+            <w:tcW w:type="dxa" w:w="4702"/>
+            <w:tcBorders>
+              <w:top w:val="single" w:color="BFBFBF" w:sz="4"/>
+              <w:left w:val="single" w:color="BFBFBF" w:sz="4"/>
+              <w:bottom w:val="single" w:color="BFBFBF" w:sz="4"/>
+              <w:right w:val="single" w:color="BFBFBF" w:sz="4"/>
+            </w:tcBorders>
+            <w:tcMar>
+              <w:top w:type="dxa" w:w="60"/>
+              <w:left w:type="dxa" w:w="100"/>
+              <w:bottom w:type="dxa" w:w="60"/>
+              <w:right w:type="dxa" w:w="100"/>
+            </w:tcMar>
+          </w:tcPr>
+          <w:p>
+            <w:r>
+              <w:rPr>
+                <w:rFonts w:ascii="Calibri" w:cs="Calibri" w:eastAsia="Calibri" w:hAnsi="Calibri"/>
+                <w:sz w:val="19"/>
+                <w:szCs w:val="19"/>
+              </w:rPr>
+              <w:t xml:space="preserve">Speed XP, 6 minutes</w:t>
+            </w:r>
+          </w:p>
+        </w:tc>
+      </w:tr>
+      <w:tr>
+        <w:trPr>
+          <w:cantSplit/>
+        </w:trPr>
+        <w:tc>
+          <w:tcPr>
+            <w:tcW w:type="dxa" w:w="1309"/>
+            <w:tcBorders>
+              <w:top w:val="single" w:color="BFBFBF" w:sz="4"/>
+              <w:left w:val="single" w:color="BFBFBF" w:sz="4"/>
+              <w:bottom w:val="single" w:color="BFBFBF" w:sz="4"/>
+              <w:right w:val="single" w:color="BFBFBF" w:sz="4"/>
+            </w:tcBorders>
+            <w:tcMar>
+              <w:top w:type="dxa" w:w="60"/>
+              <w:left w:type="dxa" w:w="100"/>
+              <w:bottom w:type="dxa" w:w="60"/>
+              <w:right w:type="dxa" w:w="100"/>
+            </w:tcMar>
+          </w:tcPr>
+          <w:p>
+            <w:r>
+              <w:rPr>
+                <w:rFonts w:ascii="Calibri" w:cs="Calibri" w:eastAsia="Calibri" w:hAnsi="Calibri"/>
+                <w:sz w:val="19"/>
+                <w:szCs w:val="19"/>
+              </w:rPr>
+              <w:t xml:space="preserve">5</w:t>
+            </w:r>
+          </w:p>
+        </w:tc>
+        <w:tc>
+          <w:tcPr>
+            <w:tcW w:type="dxa" w:w="3349"/>
+            <w:tcBorders>
+              <w:top w:val="single" w:color="BFBFBF" w:sz="4"/>
+              <w:left w:val="single" w:color="BFBFBF" w:sz="4"/>
+              <w:bottom w:val="single" w:color="BFBFBF" w:sz="4"/>
+              <w:right w:val="single" w:color="BFBFBF" w:sz="4"/>
+            </w:tcBorders>
+            <w:tcMar>
+              <w:top w:type="dxa" w:w="60"/>
+              <w:left w:type="dxa" w:w="100"/>
+              <w:bottom w:type="dxa" w:w="60"/>
+              <w:right w:type="dxa" w:w="100"/>
+            </w:tcMar>
+          </w:tcPr>
+          <w:p>
+            <w:r>
+              <w:rPr>
+                <w:rFonts w:ascii="Calibri" w:cs="Calibri" w:eastAsia="Calibri" w:hAnsi="Calibri"/>
+                <w:sz w:val="19"/>
+                <w:szCs w:val="19"/>
+              </w:rPr>
+              <w:t xml:space="preserve">15</w:t>
+            </w:r>
+          </w:p>
+        </w:tc>
+        <w:tc>
+          <w:tcPr>
+            <w:tcW w:type="dxa" w:w="4702"/>
+            <w:tcBorders>
+              <w:top w:val="single" w:color="BFBFBF" w:sz="4"/>
+              <w:left w:val="single" w:color="BFBFBF" w:sz="4"/>
+              <w:bottom w:val="single" w:color="BFBFBF" w:sz="4"/>
+              <w:right w:val="single" w:color="BFBFBF" w:sz="4"/>
+            </w:tcBorders>
+            <w:tcMar>
+              <w:top w:type="dxa" w:w="60"/>
+              <w:left w:type="dxa" w:w="100"/>
+              <w:bottom w:type="dxa" w:w="60"/>
+              <w:right w:type="dxa" w:w="100"/>
+            </w:tcMar>
+          </w:tcPr>
+          <w:p>
+            <w:r>
+              <w:rPr>
+                <w:rFonts w:ascii="Calibri" w:cs="Calibri" w:eastAsia="Calibri" w:hAnsi="Calibri"/>
+                <w:sz w:val="19"/>
+                <w:szCs w:val="19"/>
+              </w:rPr>
+              <w:t xml:space="preserve">1 egg</w:t>
+            </w:r>
+          </w:p>
+        </w:tc>
+      </w:tr>
+      <w:tr>
+        <w:trPr>
+          <w:cantSplit/>
+        </w:trPr>
+        <w:tc>
+          <w:tcPr>
+            <w:tcW w:type="dxa" w:w="1309"/>
+            <w:tcBorders>
+              <w:top w:val="single" w:color="BFBFBF" w:sz="4"/>
+              <w:left w:val="single" w:color="BFBFBF" w:sz="4"/>
+              <w:bottom w:val="single" w:color="BFBFBF" w:sz="4"/>
+              <w:right w:val="single" w:color="BFBFBF" w:sz="4"/>
+            </w:tcBorders>
+            <w:tcMar>
+              <w:top w:type="dxa" w:w="60"/>
+              <w:left w:type="dxa" w:w="100"/>
+              <w:bottom w:type="dxa" w:w="60"/>
+              <w:right w:type="dxa" w:w="100"/>
+            </w:tcMar>
+          </w:tcPr>
+          <w:p>
+            <w:r>
+              <w:rPr>
+                <w:rFonts w:ascii="Calibri" w:cs="Calibri" w:eastAsia="Calibri" w:hAnsi="Calibri"/>
+                <w:sz w:val="19"/>
+                <w:szCs w:val="19"/>
+              </w:rPr>
+              <w:t xml:space="preserve">6</w:t>
+            </w:r>
+          </w:p>
+        </w:tc>
+        <w:tc>
+          <w:tcPr>
+            <w:tcW w:type="dxa" w:w="3349"/>
+            <w:tcBorders>
+              <w:top w:val="single" w:color="BFBFBF" w:sz="4"/>
+              <w:left w:val="single" w:color="BFBFBF" w:sz="4"/>
+              <w:bottom w:val="single" w:color="BFBFBF" w:sz="4"/>
+              <w:right w:val="single" w:color="BFBFBF" w:sz="4"/>
+            </w:tcBorders>
+            <w:tcMar>
+              <w:top w:type="dxa" w:w="60"/>
+              <w:left w:type="dxa" w:w="100"/>
+              <w:bottom w:type="dxa" w:w="60"/>
+              <w:right w:type="dxa" w:w="100"/>
+            </w:tcMar>
+          </w:tcPr>
+          <w:p>
+            <w:r>
+              <w:rPr>
+                <w:rFonts w:ascii="Calibri" w:cs="Calibri" w:eastAsia="Calibri" w:hAnsi="Calibri"/>
+                <w:sz w:val="19"/>
+                <w:szCs w:val="19"/>
+              </w:rPr>
+              <w:t xml:space="preserve">20</w:t>
+            </w:r>
+          </w:p>
+        </w:tc>
+        <w:tc>
+          <w:tcPr>
+            <w:tcW w:type="dxa" w:w="4702"/>
+            <w:tcBorders>
+              <w:top w:val="single" w:color="BFBFBF" w:sz="4"/>
+              <w:left w:val="single" w:color="BFBFBF" w:sz="4"/>
+              <w:bottom w:val="single" w:color="BFBFBF" w:sz="4"/>
+              <w:right w:val="single" w:color="BFBFBF" w:sz="4"/>
+            </w:tcBorders>
+            <w:tcMar>
+              <w:top w:type="dxa" w:w="60"/>
+              <w:left w:type="dxa" w:w="100"/>
+              <w:bottom w:type="dxa" w:w="60"/>
+              <w:right w:type="dxa" w:w="100"/>
+            </w:tcMar>
+          </w:tcPr>
+          <w:p>
+            <w:r>
+              <w:rPr>
+                <w:rFonts w:ascii="Calibri" w:cs="Calibri" w:eastAsia="Calibri" w:hAnsi="Calibri"/>
+                <w:sz w:val="19"/>
+                <w:szCs w:val="19"/>
+              </w:rPr>
+              <w:t xml:space="preserve">Candy Potion</w:t>
+            </w:r>
+          </w:p>
+        </w:tc>
+      </w:tr>
+      <w:tr>
+        <w:trPr>
+          <w:cantSplit/>
+        </w:trPr>
+        <w:tc>
+          <w:tcPr>
+            <w:tcW w:type="dxa" w:w="1309"/>
+            <w:tcBorders>
+              <w:top w:val="single" w:color="BFBFBF" w:sz="4"/>
+              <w:left w:val="single" w:color="BFBFBF" w:sz="4"/>
+              <w:bottom w:val="single" w:color="BFBFBF" w:sz="4"/>
+              <w:right w:val="single" w:color="BFBFBF" w:sz="4"/>
+            </w:tcBorders>
+            <w:tcMar>
+              <w:top w:type="dxa" w:w="60"/>
+              <w:left w:type="dxa" w:w="100"/>
+              <w:bottom w:type="dxa" w:w="60"/>
+              <w:right w:type="dxa" w:w="100"/>
+            </w:tcMar>
+          </w:tcPr>
+          <w:p>
+            <w:r>
+              <w:rPr>
+                <w:rFonts w:ascii="Calibri" w:cs="Calibri" w:eastAsia="Calibri" w:hAnsi="Calibri"/>
+                <w:sz w:val="19"/>
+                <w:szCs w:val="19"/>
+              </w:rPr>
+              <w:t xml:space="preserve">7</w:t>
+            </w:r>
+          </w:p>
+        </w:tc>
+        <w:tc>
+          <w:tcPr>
+            <w:tcW w:type="dxa" w:w="3349"/>
+            <w:tcBorders>
+              <w:top w:val="single" w:color="BFBFBF" w:sz="4"/>
+              <w:left w:val="single" w:color="BFBFBF" w:sz="4"/>
+              <w:bottom w:val="single" w:color="BFBFBF" w:sz="4"/>
+              <w:right w:val="single" w:color="BFBFBF" w:sz="4"/>
+            </w:tcBorders>
+            <w:tcMar>
+              <w:top w:type="dxa" w:w="60"/>
+              <w:left w:type="dxa" w:w="100"/>
+              <w:bottom w:type="dxa" w:w="60"/>
+              <w:right w:type="dxa" w:w="100"/>
+            </w:tcMar>
+          </w:tcPr>
+          <w:p>
+            <w:r>
+              <w:rPr>
+                <w:rFonts w:ascii="Calibri" w:cs="Calibri" w:eastAsia="Calibri" w:hAnsi="Calibri"/>
+                <w:sz w:val="19"/>
+                <w:szCs w:val="19"/>
+              </w:rPr>
+              <w:t xml:space="preserve">30</w:t>
+            </w:r>
+          </w:p>
+        </w:tc>
+        <w:tc>
+          <w:tcPr>
+            <w:tcW w:type="dxa" w:w="4702"/>
+            <w:tcBorders>
+              <w:top w:val="single" w:color="BFBFBF" w:sz="4"/>
+              <w:left w:val="single" w:color="BFBFBF" w:sz="4"/>
+              <w:bottom w:val="single" w:color="BFBFBF" w:sz="4"/>
+              <w:right w:val="single" w:color="BFBFBF" w:sz="4"/>
+            </w:tcBorders>
+            <w:tcMar>
+              <w:top w:type="dxa" w:w="60"/>
+              <w:left w:type="dxa" w:w="100"/>
+              <w:bottom w:type="dxa" w:w="60"/>
+              <w:right w:type="dxa" w:w="100"/>
+            </w:tcMar>
+          </w:tcPr>
+          <w:p>
+            <w:r>
+              <w:rPr>
+                <w:rFonts w:ascii="Calibri" w:cs="Calibri" w:eastAsia="Calibri" w:hAnsi="Calibri"/>
+                <w:sz w:val="19"/>
+                <w:szCs w:val="19"/>
+              </w:rPr>
+              <w:t xml:space="preserve">Money, 14 minutes</w:t>
+            </w:r>
+          </w:p>
+        </w:tc>
+      </w:tr>
+      <w:tr>
+        <w:trPr>
+          <w:cantSplit/>
+        </w:trPr>
+        <w:tc>
+          <w:tcPr>
+            <w:tcW w:type="dxa" w:w="1309"/>
+            <w:tcBorders>
+              <w:top w:val="single" w:color="BFBFBF" w:sz="4"/>
+              <w:left w:val="single" w:color="BFBFBF" w:sz="4"/>
+              <w:bottom w:val="single" w:color="BFBFBF" w:sz="4"/>
+              <w:right w:val="single" w:color="BFBFBF" w:sz="4"/>
+            </w:tcBorders>
+            <w:tcMar>
+              <w:top w:type="dxa" w:w="60"/>
+              <w:left w:type="dxa" w:w="100"/>
+              <w:bottom w:type="dxa" w:w="60"/>
+              <w:right w:type="dxa" w:w="100"/>
+            </w:tcMar>
+          </w:tcPr>
+          <w:p>
+            <w:r>
+              <w:rPr>
+                <w:rFonts w:ascii="Calibri" w:cs="Calibri" w:eastAsia="Calibri" w:hAnsi="Calibri"/>
+                <w:sz w:val="19"/>
+                <w:szCs w:val="19"/>
+              </w:rPr>
+              <w:t xml:space="preserve">8</w:t>
+            </w:r>
+          </w:p>
+        </w:tc>
+        <w:tc>
+          <w:tcPr>
+            <w:tcW w:type="dxa" w:w="3349"/>
+            <w:tcBorders>
+              <w:top w:val="single" w:color="BFBFBF" w:sz="4"/>
+              <w:left w:val="single" w:color="BFBFBF" w:sz="4"/>
+              <w:bottom w:val="single" w:color="BFBFBF" w:sz="4"/>
+              <w:right w:val="single" w:color="BFBFBF" w:sz="4"/>
+            </w:tcBorders>
+            <w:tcMar>
+              <w:top w:type="dxa" w:w="60"/>
+              <w:left w:type="dxa" w:w="100"/>
+              <w:bottom w:type="dxa" w:w="60"/>
+              <w:right w:type="dxa" w:w="100"/>
+            </w:tcMar>
+          </w:tcPr>
+          <w:p>
+            <w:r>
+              <w:rPr>
+                <w:rFonts w:ascii="Calibri" w:cs="Calibri" w:eastAsia="Calibri" w:hAnsi="Calibri"/>
+                <w:sz w:val="19"/>
+                <w:szCs w:val="19"/>
+              </w:rPr>
+              <w:t xml:space="preserve">45</w:t>
+            </w:r>
+          </w:p>
+        </w:tc>
+        <w:tc>
+          <w:tcPr>
+            <w:tcW w:type="dxa" w:w="4702"/>
+            <w:tcBorders>
+              <w:top w:val="single" w:color="BFBFBF" w:sz="4"/>
+              <w:left w:val="single" w:color="BFBFBF" w:sz="4"/>
+              <w:bottom w:val="single" w:color="BFBFBF" w:sz="4"/>
+              <w:right w:val="single" w:color="BFBFBF" w:sz="4"/>
+            </w:tcBorders>
+            <w:tcMar>
+              <w:top w:type="dxa" w:w="60"/>
+              <w:left w:type="dxa" w:w="100"/>
+              <w:bottom w:type="dxa" w:w="60"/>
+              <w:right w:type="dxa" w:w="100"/>
+            </w:tcMar>
+          </w:tcPr>
+          <w:p>
+            <w:r>
+              <w:rPr>
+                <w:rFonts w:ascii="Calibri" w:cs="Calibri" w:eastAsia="Calibri" w:hAnsi="Calibri"/>
+                <w:sz w:val="19"/>
+                <w:szCs w:val="19"/>
+              </w:rPr>
+              <w:t xml:space="preserve">Money Potion</w:t>
+            </w:r>
+          </w:p>
+        </w:tc>
+      </w:tr>
+      <w:tr>
+        <w:trPr>
+          <w:cantSplit/>
+        </w:trPr>
+        <w:tc>
+          <w:tcPr>
+            <w:tcW w:type="dxa" w:w="1309"/>
+            <w:tcBorders>
+              <w:top w:val="single" w:color="BFBFBF" w:sz="4"/>
+              <w:left w:val="single" w:color="BFBFBF" w:sz="4"/>
+              <w:bottom w:val="single" w:color="BFBFBF" w:sz="4"/>
+              <w:right w:val="single" w:color="BFBFBF" w:sz="4"/>
+            </w:tcBorders>
+            <w:tcMar>
+              <w:top w:type="dxa" w:w="60"/>
+              <w:left w:type="dxa" w:w="100"/>
+              <w:bottom w:type="dxa" w:w="60"/>
+              <w:right w:type="dxa" w:w="100"/>
+            </w:tcMar>
+          </w:tcPr>
+          <w:p>
+            <w:r>
+              <w:rPr>
+                <w:rFonts w:ascii="Calibri" w:cs="Calibri" w:eastAsia="Calibri" w:hAnsi="Calibri"/>
+                <w:sz w:val="19"/>
+                <w:szCs w:val="19"/>
+              </w:rPr>
+              <w:t xml:space="preserve">9</w:t>
+            </w:r>
+          </w:p>
+        </w:tc>
+        <w:tc>
+          <w:tcPr>
+            <w:tcW w:type="dxa" w:w="3349"/>
+            <w:tcBorders>
+              <w:top w:val="single" w:color="BFBFBF" w:sz="4"/>
+              <w:left w:val="single" w:color="BFBFBF" w:sz="4"/>
+              <w:bottom w:val="single" w:color="BFBFBF" w:sz="4"/>
+              <w:right w:val="single" w:color="BFBFBF" w:sz="4"/>
+            </w:tcBorders>
+            <w:tcMar>
+              <w:top w:type="dxa" w:w="60"/>
+              <w:left w:type="dxa" w:w="100"/>
+              <w:bottom w:type="dxa" w:w="60"/>
+              <w:right w:type="dxa" w:w="100"/>
+            </w:tcMar>
+          </w:tcPr>
+          <w:p>
+            <w:r>
+              <w:rPr>
+                <w:rFonts w:ascii="Calibri" w:cs="Calibri" w:eastAsia="Calibri" w:hAnsi="Calibri"/>
+                <w:sz w:val="19"/>
+                <w:szCs w:val="19"/>
+              </w:rPr>
+              <w:t xml:space="preserve">60</w:t>
+            </w:r>
+          </w:p>
+        </w:tc>
+        <w:tc>
+          <w:tcPr>
+            <w:tcW w:type="dxa" w:w="4702"/>
+            <w:tcBorders>
+              <w:top w:val="single" w:color="BFBFBF" w:sz="4"/>
+              <w:left w:val="single" w:color="BFBFBF" w:sz="4"/>
+              <w:bottom w:val="single" w:color="BFBFBF" w:sz="4"/>
+              <w:right w:val="single" w:color="BFBFBF" w:sz="4"/>
+            </w:tcBorders>
+            <w:tcMar>
+              <w:top w:type="dxa" w:w="60"/>
+              <w:left w:type="dxa" w:w="100"/>
+              <w:bottom w:type="dxa" w:w="60"/>
+              <w:right w:type="dxa" w:w="100"/>
+            </w:tcMar>
+          </w:tcPr>
+          <w:p>
+            <w:r>
+              <w:rPr>
+                <w:rFonts w:ascii="Calibri" w:cs="Calibri" w:eastAsia="Calibri" w:hAnsi="Calibri"/>
+                <w:sz w:val="19"/>
+                <w:szCs w:val="19"/>
+              </w:rPr>
+              <w:t xml:space="preserve">2 eggs</w:t>
+            </w:r>
+          </w:p>
+        </w:tc>
+      </w:tr>
+      <w:tr>
+        <w:trPr>
+          <w:cantSplit/>
+        </w:trPr>
+        <w:tc>
+          <w:tcPr>
+            <w:tcW w:type="dxa" w:w="1309"/>
+            <w:tcBorders>
+              <w:top w:val="single" w:color="BFBFBF" w:sz="4"/>
+              <w:left w:val="single" w:color="BFBFBF" w:sz="4"/>
+              <w:bottom w:val="single" w:color="BFBFBF" w:sz="4"/>
+              <w:right w:val="single" w:color="BFBFBF" w:sz="4"/>
+            </w:tcBorders>
+            <w:tcMar>
+              <w:top w:type="dxa" w:w="60"/>
+              <w:left w:type="dxa" w:w="100"/>
+              <w:bottom w:type="dxa" w:w="60"/>
+              <w:right w:type="dxa" w:w="100"/>
+            </w:tcMar>
+          </w:tcPr>
+          <w:p>
+            <w:r>
+              <w:rPr>
+                <w:rFonts w:ascii="Calibri" w:cs="Calibri" w:eastAsia="Calibri" w:hAnsi="Calibri"/>
+                <w:sz w:val="19"/>
+                <w:szCs w:val="19"/>
+              </w:rPr>
+              <w:t xml:space="preserve">10</w:t>
+            </w:r>
+          </w:p>
+        </w:tc>
+        <w:tc>
+          <w:tcPr>
+            <w:tcW w:type="dxa" w:w="3349"/>
+            <w:tcBorders>
+              <w:top w:val="single" w:color="BFBFBF" w:sz="4"/>
+              <w:left w:val="single" w:color="BFBFBF" w:sz="4"/>
+              <w:bottom w:val="single" w:color="BFBFBF" w:sz="4"/>
+              <w:right w:val="single" w:color="BFBFBF" w:sz="4"/>
+            </w:tcBorders>
+            <w:tcMar>
+              <w:top w:type="dxa" w:w="60"/>
+              <w:left w:type="dxa" w:w="100"/>
+              <w:bottom w:type="dxa" w:w="60"/>
+              <w:right w:type="dxa" w:w="100"/>
+            </w:tcMar>
+          </w:tcPr>
+          <w:p>
+            <w:r>
+              <w:rPr>
+                <w:rFonts w:ascii="Calibri" w:cs="Calibri" w:eastAsia="Calibri" w:hAnsi="Calibri"/>
+                <w:sz w:val="19"/>
+                <w:szCs w:val="19"/>
+              </w:rPr>
+              <w:t xml:space="preserve">80</w:t>
+            </w:r>
+          </w:p>
+        </w:tc>
+        <w:tc>
+          <w:tcPr>
+            <w:tcW w:type="dxa" w:w="4702"/>
+            <w:tcBorders>
+              <w:top w:val="single" w:color="BFBFBF" w:sz="4"/>
+              <w:left w:val="single" w:color="BFBFBF" w:sz="4"/>
+              <w:bottom w:val="single" w:color="BFBFBF" w:sz="4"/>
+              <w:right w:val="single" w:color="BFBFBF" w:sz="4"/>
+            </w:tcBorders>
+            <w:tcMar>
+              <w:top w:type="dxa" w:w="60"/>
+              <w:left w:type="dxa" w:w="100"/>
+              <w:bottom w:type="dxa" w:w="60"/>
+              <w:right w:type="dxa" w:w="100"/>
+            </w:tcMar>
+          </w:tcPr>
+          <w:p>
+            <w:r>
+              <w:rPr>
+                <w:rFonts w:ascii="Calibri" w:cs="Calibri" w:eastAsia="Calibri" w:hAnsi="Calibri"/>
+                <w:sz w:val="19"/>
+                <w:szCs w:val="19"/>
+              </w:rPr>
+              <w:t xml:space="preserve">Candy, 25 minutes</w:t>
+            </w:r>
+          </w:p>
+        </w:tc>
+      </w:tr>
+      <w:tr>
+        <w:trPr>
+          <w:cantSplit/>
+        </w:trPr>
+        <w:tc>
+          <w:tcPr>
+            <w:tcW w:type="dxa" w:w="1309"/>
+            <w:tcBorders>
+              <w:top w:val="single" w:color="BFBFBF" w:sz="4"/>
+              <w:left w:val="single" w:color="BFBFBF" w:sz="4"/>
+              <w:bottom w:val="single" w:color="BFBFBF" w:sz="4"/>
+              <w:right w:val="single" w:color="BFBFBF" w:sz="4"/>
+            </w:tcBorders>
+            <w:tcMar>
+              <w:top w:type="dxa" w:w="60"/>
+              <w:left w:type="dxa" w:w="100"/>
+              <w:bottom w:type="dxa" w:w="60"/>
+              <w:right w:type="dxa" w:w="100"/>
+            </w:tcMar>
+          </w:tcPr>
+          <w:p>
+            <w:r>
+              <w:rPr>
+                <w:rFonts w:ascii="Calibri" w:cs="Calibri" w:eastAsia="Calibri" w:hAnsi="Calibri"/>
+                <w:sz w:val="19"/>
+                <w:szCs w:val="19"/>
+              </w:rPr>
+              <w:t xml:space="preserve">11</w:t>
+            </w:r>
+          </w:p>
+        </w:tc>
+        <w:tc>
+          <w:tcPr>
+            <w:tcW w:type="dxa" w:w="3349"/>
+            <w:tcBorders>
+              <w:top w:val="single" w:color="BFBFBF" w:sz="4"/>
+              <w:left w:val="single" w:color="BFBFBF" w:sz="4"/>
+              <w:bottom w:val="single" w:color="BFBFBF" w:sz="4"/>
+              <w:right w:val="single" w:color="BFBFBF" w:sz="4"/>
+            </w:tcBorders>
+            <w:tcMar>
+              <w:top w:type="dxa" w:w="60"/>
+              <w:left w:type="dxa" w:w="100"/>
+              <w:bottom w:type="dxa" w:w="60"/>
+              <w:right w:type="dxa" w:w="100"/>
+            </w:tcMar>
+          </w:tcPr>
+          <w:p>
+            <w:r>
+              <w:rPr>
+                <w:rFonts w:ascii="Calibri" w:cs="Calibri" w:eastAsia="Calibri" w:hAnsi="Calibri"/>
+                <w:sz w:val="19"/>
+                <w:szCs w:val="19"/>
+              </w:rPr>
+              <w:t xml:space="preserve">100</w:t>
+            </w:r>
+          </w:p>
+        </w:tc>
+        <w:tc>
+          <w:tcPr>
+            <w:tcW w:type="dxa" w:w="4702"/>
+            <w:tcBorders>
+              <w:top w:val="single" w:color="BFBFBF" w:sz="4"/>
+              <w:left w:val="single" w:color="BFBFBF" w:sz="4"/>
+              <w:bottom w:val="single" w:color="BFBFBF" w:sz="4"/>
+              <w:right w:val="single" w:color="BFBFBF" w:sz="4"/>
+            </w:tcBorders>
+            <w:tcMar>
+              <w:top w:type="dxa" w:w="60"/>
+              <w:left w:type="dxa" w:w="100"/>
+              <w:bottom w:type="dxa" w:w="60"/>
+              <w:right w:type="dxa" w:w="100"/>
+            </w:tcMar>
+          </w:tcPr>
+          <w:p>
+            <w:r>
+              <w:rPr>
+                <w:rFonts w:ascii="Calibri" w:cs="Calibri" w:eastAsia="Calibri" w:hAnsi="Calibri"/>
+                <w:sz w:val="19"/>
+                <w:szCs w:val="19"/>
+              </w:rPr>
+              <w:t xml:space="preserve">2 Hatch Potions</w:t>
+            </w:r>
+          </w:p>
+        </w:tc>
+      </w:tr>
+      <w:tr>
+        <w:trPr>
+          <w:cantSplit/>
+        </w:trPr>
+        <w:tc>
+          <w:tcPr>
+            <w:tcW w:type="dxa" w:w="1309"/>
+            <w:tcBorders>
+              <w:top w:val="single" w:color="BFBFBF" w:sz="4"/>
+              <w:left w:val="single" w:color="BFBFBF" w:sz="4"/>
+              <w:bottom w:val="single" w:color="BFBFBF" w:sz="4"/>
+              <w:right w:val="single" w:color="BFBFBF" w:sz="4"/>
+            </w:tcBorders>
+            <w:tcMar>
+              <w:top w:type="dxa" w:w="60"/>
+              <w:left w:type="dxa" w:w="100"/>
+              <w:bottom w:type="dxa" w:w="60"/>
+              <w:right w:type="dxa" w:w="100"/>
+            </w:tcMar>
+          </w:tcPr>
+          <w:p>
+            <w:r>
+              <w:rPr>
+                <w:rFonts w:ascii="Calibri" w:cs="Calibri" w:eastAsia="Calibri" w:hAnsi="Calibri"/>
+                <w:sz w:val="19"/>
+                <w:szCs w:val="19"/>
+              </w:rPr>
+              <w:t xml:space="preserve">12</w:t>
+            </w:r>
+          </w:p>
+        </w:tc>
+        <w:tc>
+          <w:tcPr>
+            <w:tcW w:type="dxa" w:w="3349"/>
+            <w:tcBorders>
+              <w:top w:val="single" w:color="BFBFBF" w:sz="4"/>
+              <w:left w:val="single" w:color="BFBFBF" w:sz="4"/>
+              <w:bottom w:val="single" w:color="BFBFBF" w:sz="4"/>
+              <w:right w:val="single" w:color="BFBFBF" w:sz="4"/>
+            </w:tcBorders>
+            <w:tcMar>
+              <w:top w:type="dxa" w:w="60"/>
+              <w:left w:type="dxa" w:w="100"/>
+              <w:bottom w:type="dxa" w:w="60"/>
+              <w:right w:type="dxa" w:w="100"/>
+            </w:tcMar>
+          </w:tcPr>
+          <w:p>
+            <w:r>
+              <w:rPr>
+                <w:rFonts w:ascii="Calibri" w:cs="Calibri" w:eastAsia="Calibri" w:hAnsi="Calibri"/>
+                <w:sz w:val="19"/>
+                <w:szCs w:val="19"/>
+              </w:rPr>
+              <w:t xml:space="preserve">120</w:t>
+            </w:r>
+          </w:p>
+        </w:tc>
+        <w:tc>
+          <w:tcPr>
+            <w:tcW w:type="dxa" w:w="4702"/>
+            <w:tcBorders>
+              <w:top w:val="single" w:color="BFBFBF" w:sz="4"/>
+              <w:left w:val="single" w:color="BFBFBF" w:sz="4"/>
+              <w:bottom w:val="single" w:color="BFBFBF" w:sz="4"/>
+              <w:right w:val="single" w:color="BFBFBF" w:sz="4"/>
+            </w:tcBorders>
+            <w:tcMar>
+              <w:top w:type="dxa" w:w="60"/>
+              <w:left w:type="dxa" w:w="100"/>
+              <w:bottom w:type="dxa" w:w="60"/>
+              <w:right w:type="dxa" w:w="100"/>
+            </w:tcMar>
+          </w:tcPr>
+          <w:p>
+            <w:r>
+              <w:rPr>
+                <w:rFonts w:ascii="Calibri" w:cs="Calibri" w:eastAsia="Calibri" w:hAnsi="Calibri"/>
+                <w:sz w:val="19"/>
+                <w:szCs w:val="19"/>
+              </w:rPr>
+              <w:t xml:space="preserve">3 eggs</w:t>
+            </w:r>
+          </w:p>
+        </w:tc>
+      </w:tr>
+    </w:tbl>
+    <w:p>
+      <w:pPr>
+        <w:spacing w:after="120"/>
+      </w:pPr>
+    </w:p>
+    <w:p>
+      <w:pPr>
+        <w:pStyle w:val="ListParagraph"/>
+        <w:numPr>
+          <w:ilvl w:val="0"/>
+          <w:numId w:val="2"/>
+        </w:numPr>
+        <w:spacing w:after="60"/>
+      </w:pPr>
+      <w:r>
+        <w:rPr>
+          <w:rFonts w:ascii="Calibri" w:cs="Calibri" w:eastAsia="Calibri" w:hAnsi="Calibri"/>
+          <w:b/>
+          <w:bCs/>
+        </w:rPr>
+        <w:t xml:space="preserve">Only real play counts.</w:t>
+      </w:r>
+      <w:r>
+        <w:rPr>
+          <w:rFonts w:ascii="Calibri" w:cs="Calibri" w:eastAsia="Calibri" w:hAnsi="Calibri"/>
+        </w:rPr>
+        <w:t xml:space="preserve"> The server adds a second for every second the player is moving or using menus; after 60 s of standing still the clock stops. Everything resets at 00:00 UTC (unclaimed gifts are lost), so players come back every day.</w:t>
+      </w:r>
+    </w:p>
+    <w:p>
+      <w:pPr>
+        <w:pStyle w:val="ListParagraph"/>
+        <w:numPr>
+          <w:ilvl w:val="0"/>
+          <w:numId w:val="2"/>
+        </w:numPr>
+        <w:spacing w:after="60"/>
+      </w:pPr>
+      <w:r>
+        <w:rPr>
+          <w:rFonts w:ascii="Calibri" w:cs="Calibri" w:eastAsia="Calibri" w:hAnsi="Calibri"/>
+          <w:b/>
+          <w:bCs/>
+        </w:rPr>
+        <w:t xml:space="preserve">Gifts scale with the player.</w:t>
+      </w:r>
+      <w:r>
+        <w:rPr>
+          <w:rFonts w:ascii="Calibri" w:cs="Calibri" w:eastAsia="Calibri" w:hAnsi="Calibri"/>
+        </w:rPr>
+        <w:t xml:space="preserve"> Currency gifts are worth minutes of what the player normally earns (the same rates as Quests: pet income, Candy per knock, Speed XP per minute). Eggs are the most common egg of the best house the player can rob. A full egg bag blocks an egg gift until there is room.</w:t>
+      </w:r>
+    </w:p>
+    <w:p>
+      <w:pPr>
+        <w:pStyle w:val="ListParagraph"/>
+        <w:numPr>
+          <w:ilvl w:val="0"/>
+          <w:numId w:val="2"/>
+        </w:numPr>
+        <w:spacing w:after="60"/>
+      </w:pPr>
+      <w:r>
+        <w:rPr>
+          <w:rFonts w:ascii="Calibri" w:cs="Calibri" w:eastAsia="Calibri" w:hAnsi="Calibri"/>
+          <w:b/>
+          <w:bCs/>
+        </w:rPr>
+        <w:t xml:space="preserve">Potions</w:t>
+      </w:r>
+      <w:r>
+        <w:rPr>
+          <w:rFonts w:ascii="Calibri" w:cs="Calibri" w:eastAsia="Calibri" w:hAnsi="Calibri"/>
+        </w:rPr>
+        <w:t xml:space="preserve"> (bottom of the window): Speed Potion (x2 Speed XP), Candy Potion (x2 Candy from knocks), Money Potion (x2 Money from pets), Hatch Potion (eggs hatch 2x faster, applied when the egg goes into an incubator). Each lasts 10 minutes. Drinking another of the same kind adds its time (a boost never runs longer than 2 hours from now). Boosts end at a clock time, so they run while the player is away. Active boosts show as small coloured pills under the night/day timer.</w:t>
+      </w:r>
+    </w:p>
+    <w:p>
+      <w:pPr>
+        <w:pStyle w:val="ListParagraph"/>
+        <w:numPr>
+          <w:ilvl w:val="0"/>
+          <w:numId w:val="2"/>
+        </w:numPr>
+        <w:spacing w:after="60"/>
+      </w:pPr>
+      <w:r>
+        <w:rPr>
+          <w:rFonts w:ascii="Calibri" w:cs="Calibri" w:eastAsia="Calibri" w:hAnsi="Calibri"/>
+        </w:rPr>
+        <w:t xml:space="preserve">Settings are in </w:t>
+      </w:r>
+      <w:r>
+        <w:rPr>
+          <w:rFonts w:ascii="Courier New" w:cs="Courier New" w:eastAsia="Courier New" w:hAnsi="Courier New"/>
+          <w:sz w:val="20"/>
+          <w:szCs w:val="20"/>
+        </w:rPr>
+        <w:t xml:space="preserve">Config.Playtime</w:t>
+      </w:r>
+      <w:r>
+        <w:rPr>
+          <w:rFonts w:ascii="Calibri" w:cs="Calibri" w:eastAsia="Calibri" w:hAnsi="Calibri"/>
+        </w:rPr>
+        <w:t xml:space="preserve"> and </w:t>
+      </w:r>
+      <w:r>
+        <w:rPr>
+          <w:rFonts w:ascii="Courier New" w:cs="Courier New" w:eastAsia="Courier New" w:hAnsi="Courier New"/>
+          <w:sz w:val="20"/>
+          <w:szCs w:val="20"/>
+        </w:rPr>
+        <w:t xml:space="preserve">Config.Potions</w:t>
+      </w:r>
+      <w:r>
+        <w:rPr>
+          <w:rFonts w:ascii="Calibri" w:cs="Calibri" w:eastAsia="Calibri" w:hAnsi="Calibri"/>
+        </w:rPr>
+        <w:t xml:space="preserve">; the counting and paying are in </w:t>
+      </w:r>
+      <w:r>
+        <w:rPr>
+          <w:rFonts w:ascii="Courier New" w:cs="Courier New" w:eastAsia="Courier New" w:hAnsi="Courier New"/>
+          <w:sz w:val="20"/>
+          <w:szCs w:val="20"/>
+        </w:rPr>
+        <w:t xml:space="preserve">DataService</w:t>
+      </w:r>
+      <w:r>
+        <w:rPr>
+          <w:rFonts w:ascii="Calibri" w:cs="Calibri" w:eastAsia="Calibri" w:hAnsi="Calibri"/>
+        </w:rPr>
+        <w:t xml:space="preserve">; the window in </w:t>
+      </w:r>
+      <w:r>
+        <w:rPr>
+          <w:rFonts w:ascii="Courier New" w:cs="Courier New" w:eastAsia="Courier New" w:hAnsi="Courier New"/>
+          <w:sz w:val="20"/>
+          <w:szCs w:val="20"/>
+        </w:rPr>
+        <w:t xml:space="preserve">Main.client</w:t>
+      </w:r>
+      <w:r>
+        <w:rPr>
+          <w:rFonts w:ascii="Calibri" w:cs="Calibri" w:eastAsia="Calibri" w:hAnsi="Calibri"/>
+        </w:rPr>
+        <w:t xml:space="preserve">. The Admin panel can add 30 minutes of play time or 3 of every potion.</w:t>
       </w:r>
     </w:p>
     <w:p>

</xml_diff>

<commit_message>
Blood Moon: hourly event with countdown, red sky and moon, ominous music, Blood Moon eggs, doubled variant luck, Blood variant, angrier owners, event quest and participation potion
Co-Authored-By: Claude Sonnet 5.5 <noreply@anthropic.com>
Claude-Session: https://claude.ai/code/session_013ivEnYiZGofRBeqQFKAVhJ
</commit_message>
<xml_diff>
--- a/docs/Spooky-Steal-Design-and-Plan.docx
+++ b/docs/Spooky-Steal-Design-and-Plan.docx
@@ -1056,6 +1056,65 @@
                 <w:szCs w:val="19"/>
               </w:rPr>
               <w:t xml:space="preserve">Twelve daily gifts for playing time, and timed boost potions (Speed XP, Candy, Money, hatching).</w:t>
+            </w:r>
+          </w:p>
+        </w:tc>
+      </w:tr>
+      <w:tr>
+        <w:trPr>
+          <w:cantSplit/>
+        </w:trPr>
+        <w:tc>
+          <w:tcPr>
+            <w:tcW w:type="dxa" w:w="4252"/>
+            <w:tcBorders>
+              <w:top w:val="single" w:color="BFBFBF" w:sz="4"/>
+              <w:left w:val="single" w:color="BFBFBF" w:sz="4"/>
+              <w:bottom w:val="single" w:color="BFBFBF" w:sz="4"/>
+              <w:right w:val="single" w:color="BFBFBF" w:sz="4"/>
+            </w:tcBorders>
+            <w:tcMar>
+              <w:top w:type="dxa" w:w="60"/>
+              <w:left w:type="dxa" w:w="100"/>
+              <w:bottom w:type="dxa" w:w="60"/>
+              <w:right w:type="dxa" w:w="100"/>
+            </w:tcMar>
+          </w:tcPr>
+          <w:p>
+            <w:r>
+              <w:rPr>
+                <w:rFonts w:ascii="Calibri" w:cs="Calibri" w:eastAsia="Calibri" w:hAnsi="Calibri"/>
+                <w:sz w:val="19"/>
+                <w:szCs w:val="19"/>
+              </w:rPr>
+              <w:t xml:space="preserve">Blood Moon event (5.1)</w:t>
+            </w:r>
+          </w:p>
+        </w:tc>
+        <w:tc>
+          <w:tcPr>
+            <w:tcW w:type="dxa" w:w="5108"/>
+            <w:tcBorders>
+              <w:top w:val="single" w:color="BFBFBF" w:sz="4"/>
+              <w:left w:val="single" w:color="BFBFBF" w:sz="4"/>
+              <w:bottom w:val="single" w:color="BFBFBF" w:sz="4"/>
+              <w:right w:val="single" w:color="BFBFBF" w:sz="4"/>
+            </w:tcBorders>
+            <w:tcMar>
+              <w:top w:type="dxa" w:w="60"/>
+              <w:left w:type="dxa" w:w="100"/>
+              <w:bottom w:type="dxa" w:w="60"/>
+              <w:right w:type="dxa" w:w="100"/>
+            </w:tcMar>
+          </w:tcPr>
+          <w:p>
+            <w:r>
+              <w:rPr>
+                <w:rFonts w:ascii="Calibri" w:cs="Calibri" w:eastAsia="Calibri" w:hAnsi="Calibri"/>
+                <w:sz w:val="19"/>
+                <w:szCs w:val="19"/>
+              </w:rPr>
+              <w:t xml:space="preserve">An hourly 5-minute night with a red sky, better eggs, a Blood variant, angrier owners, an event quest and a countdown on screen.</w:t>
             </w:r>
           </w:p>
         </w:tc>
@@ -20519,6 +20578,731 @@
           <w:rFonts w:ascii="Calibri" w:cs="Calibri" w:eastAsia="Calibri" w:hAnsi="Calibri"/>
         </w:rPr>
         <w:t xml:space="preserve">. The Admin panel can add 30 minutes of play time or 3 of every potion.</w:t>
+      </w:r>
+    </w:p>
+    <w:p>
+      <w:pPr>
+        <w:pStyle w:val="Heading2"/>
+      </w:pPr>
+      <w:r>
+        <w:rPr>
+          <w:rFonts w:ascii="Calibri" w:cs="Calibri" w:eastAsia="Calibri" w:hAnsi="Calibri"/>
+        </w:rPr>
+        <w:t xml:space="preserve">2.18 Blood Moon (hourly event)</w:t>
+      </w:r>
+    </w:p>
+    <w:p>
+      <w:pPr>
+        <w:spacing w:after="140"/>
+      </w:pPr>
+      <w:r>
+        <w:rPr>
+          <w:rFonts w:ascii="Calibri" w:cs="Calibri" w:eastAsia="Calibri" w:hAnsi="Calibri"/>
+          <w:b/>
+          <w:bCs/>
+        </w:rPr>
+        <w:t xml:space="preserve">When:</w:t>
+      </w:r>
+      <w:r>
+        <w:rPr>
+          <w:rFonts w:ascii="Calibri" w:cs="Calibri" w:eastAsia="Calibri" w:hAnsi="Calibri"/>
+        </w:rPr>
+        <w:t xml:space="preserve"> every hour at :00 by the real clock (UTC), so every server runs it at the same moment. It lasts 5 minutes (</w:t>
+      </w:r>
+      <w:r>
+        <w:rPr>
+          <w:rFonts w:ascii="Courier New" w:cs="Courier New" w:eastAsia="Courier New" w:hAnsi="Courier New"/>
+          <w:sz w:val="20"/>
+          <w:szCs w:val="20"/>
+        </w:rPr>
+        <w:t xml:space="preserve">Config.BloodMoon.Seconds</w:t>
+      </w:r>
+      <w:r>
+        <w:rPr>
+          <w:rFonts w:ascii="Calibri" w:cs="Calibri" w:eastAsia="Calibri" w:hAnsi="Calibri"/>
+        </w:rPr>
+        <w:t xml:space="preserve">). If a normal night is running it is ended quietly (eggs dropped, nobody sent home) and the Blood Moon starts at once. A </w:t>
+      </w:r>
+      <w:r>
+        <w:rPr>
+          <w:rFonts w:ascii="Calibri" w:cs="Calibri" w:eastAsia="Calibri" w:hAnsi="Calibri"/>
+          <w:b/>
+          <w:bCs/>
+        </w:rPr>
+        <w:t xml:space="preserve">countdown pill</w:t>
+      </w:r>
+      <w:r>
+        <w:rPr>
+          <w:rFonts w:ascii="Calibri" w:cs="Calibri" w:eastAsia="Calibri" w:hAnsi="Calibri"/>
+        </w:rPr>
+        <w:t xml:space="preserve"> ("🩸 BLOOD MOON IN 12:30") sits at the top of the screen under the night/day timer; in the last minute it turns red and pulses, in the last 10 seconds it is big. A red chat warning appears 60 and 10 seconds before.</w:t>
+      </w:r>
+    </w:p>
+    <w:p>
+      <w:pPr>
+        <w:spacing w:after="140"/>
+      </w:pPr>
+      <w:r>
+        <w:rPr>
+          <w:rFonts w:ascii="Calibri" w:cs="Calibri" w:eastAsia="Calibri" w:hAnsi="Calibri"/>
+          <w:b/>
+          <w:bCs/>
+        </w:rPr>
+        <w:t xml:space="preserve">What changes while it lasts</w:t>
+      </w:r>
+    </w:p>
+    <w:tbl>
+      <w:tblPr>
+        <w:tblW w:type="dxa" w:w="9360"/>
+        <w:tblBorders>
+          <w:top w:val="single" w:color="auto" w:sz="4"/>
+          <w:left w:val="single" w:color="auto" w:sz="4"/>
+          <w:bottom w:val="single" w:color="auto" w:sz="4"/>
+          <w:right w:val="single" w:color="auto" w:sz="4"/>
+          <w:insideH w:val="single" w:color="auto" w:sz="4"/>
+          <w:insideV w:val="single" w:color="auto" w:sz="4"/>
+        </w:tblBorders>
+      </w:tblPr>
+      <w:tblGrid>
+        <w:gridCol w:w="2778"/>
+        <w:gridCol w:w="6582"/>
+      </w:tblGrid>
+      <w:tr>
+        <w:trPr>
+          <w:tblHeader/>
+        </w:trPr>
+        <w:tc>
+          <w:tcPr>
+            <w:tcW w:type="dxa" w:w="2778"/>
+            <w:tcBorders>
+              <w:top w:val="single" w:color="BFBFBF" w:sz="4"/>
+              <w:left w:val="single" w:color="BFBFBF" w:sz="4"/>
+              <w:bottom w:val="single" w:color="BFBFBF" w:sz="4"/>
+              <w:right w:val="single" w:color="BFBFBF" w:sz="4"/>
+            </w:tcBorders>
+            <w:shd w:fill="E7E6E6" w:color="auto" w:val="clear"/>
+            <w:tcMar>
+              <w:top w:type="dxa" w:w="60"/>
+              <w:left w:type="dxa" w:w="100"/>
+              <w:bottom w:type="dxa" w:w="60"/>
+              <w:right w:type="dxa" w:w="100"/>
+            </w:tcMar>
+          </w:tcPr>
+          <w:p>
+            <w:r>
+              <w:rPr>
+                <w:rFonts w:ascii="Calibri" w:cs="Calibri" w:eastAsia="Calibri" w:hAnsi="Calibri"/>
+                <w:b/>
+                <w:bCs/>
+                <w:sz w:val="19"/>
+                <w:szCs w:val="19"/>
+              </w:rPr>
+              <w:t xml:space="preserve">Area</w:t>
+            </w:r>
+          </w:p>
+        </w:tc>
+        <w:tc>
+          <w:tcPr>
+            <w:tcW w:type="dxa" w:w="6582"/>
+            <w:tcBorders>
+              <w:top w:val="single" w:color="BFBFBF" w:sz="4"/>
+              <w:left w:val="single" w:color="BFBFBF" w:sz="4"/>
+              <w:bottom w:val="single" w:color="BFBFBF" w:sz="4"/>
+              <w:right w:val="single" w:color="BFBFBF" w:sz="4"/>
+            </w:tcBorders>
+            <w:shd w:fill="E7E6E6" w:color="auto" w:val="clear"/>
+            <w:tcMar>
+              <w:top w:type="dxa" w:w="60"/>
+              <w:left w:type="dxa" w:w="100"/>
+              <w:bottom w:type="dxa" w:w="60"/>
+              <w:right w:type="dxa" w:w="100"/>
+            </w:tcMar>
+          </w:tcPr>
+          <w:p>
+            <w:r>
+              <w:rPr>
+                <w:rFonts w:ascii="Calibri" w:cs="Calibri" w:eastAsia="Calibri" w:hAnsi="Calibri"/>
+                <w:b/>
+                <w:bCs/>
+                <w:sz w:val="19"/>
+                <w:szCs w:val="19"/>
+              </w:rPr>
+              <w:t xml:space="preserve">Change</w:t>
+            </w:r>
+          </w:p>
+        </w:tc>
+      </w:tr>
+      <w:tr>
+        <w:trPr>
+          <w:cantSplit/>
+        </w:trPr>
+        <w:tc>
+          <w:tcPr>
+            <w:tcW w:type="dxa" w:w="2778"/>
+            <w:tcBorders>
+              <w:top w:val="single" w:color="BFBFBF" w:sz="4"/>
+              <w:left w:val="single" w:color="BFBFBF" w:sz="4"/>
+              <w:bottom w:val="single" w:color="BFBFBF" w:sz="4"/>
+              <w:right w:val="single" w:color="BFBFBF" w:sz="4"/>
+            </w:tcBorders>
+            <w:tcMar>
+              <w:top w:type="dxa" w:w="60"/>
+              <w:left w:type="dxa" w:w="100"/>
+              <w:bottom w:type="dxa" w:w="60"/>
+              <w:right w:type="dxa" w:w="100"/>
+            </w:tcMar>
+          </w:tcPr>
+          <w:p>
+            <w:r>
+              <w:rPr>
+                <w:rFonts w:ascii="Calibri" w:cs="Calibri" w:eastAsia="Calibri" w:hAnsi="Calibri"/>
+                <w:sz w:val="19"/>
+                <w:szCs w:val="19"/>
+              </w:rPr>
+              <w:t xml:space="preserve">Sky and mood</w:t>
+            </w:r>
+          </w:p>
+        </w:tc>
+        <w:tc>
+          <w:tcPr>
+            <w:tcW w:type="dxa" w:w="6582"/>
+            <w:tcBorders>
+              <w:top w:val="single" w:color="BFBFBF" w:sz="4"/>
+              <w:left w:val="single" w:color="BFBFBF" w:sz="4"/>
+              <w:bottom w:val="single" w:color="BFBFBF" w:sz="4"/>
+              <w:right w:val="single" w:color="BFBFBF" w:sz="4"/>
+            </w:tcBorders>
+            <w:tcMar>
+              <w:top w:type="dxa" w:w="60"/>
+              <w:left w:type="dxa" w:w="100"/>
+              <w:bottom w:type="dxa" w:w="60"/>
+              <w:right w:type="dxa" w:w="100"/>
+            </w:tcMar>
+          </w:tcPr>
+          <w:p>
+            <w:r>
+              <w:rPr>
+                <w:rFonts w:ascii="Calibri" w:cs="Calibri" w:eastAsia="Calibri" w:hAnsi="Calibri"/>
+                <w:sz w:val="19"/>
+                <w:szCs w:val="19"/>
+              </w:rPr>
+              <w:t xml:space="preserve">Red sky and fog, a huge red moon, lightning flashes with thunder, a red banner, a rising-moon sound</w:t>
+            </w:r>
+          </w:p>
+        </w:tc>
+      </w:tr>
+      <w:tr>
+        <w:trPr>
+          <w:cantSplit/>
+        </w:trPr>
+        <w:tc>
+          <w:tcPr>
+            <w:tcW w:type="dxa" w:w="2778"/>
+            <w:tcBorders>
+              <w:top w:val="single" w:color="BFBFBF" w:sz="4"/>
+              <w:left w:val="single" w:color="BFBFBF" w:sz="4"/>
+              <w:bottom w:val="single" w:color="BFBFBF" w:sz="4"/>
+              <w:right w:val="single" w:color="BFBFBF" w:sz="4"/>
+            </w:tcBorders>
+            <w:tcMar>
+              <w:top w:type="dxa" w:w="60"/>
+              <w:left w:type="dxa" w:w="100"/>
+              <w:bottom w:type="dxa" w:w="60"/>
+              <w:right w:type="dxa" w:w="100"/>
+            </w:tcMar>
+          </w:tcPr>
+          <w:p>
+            <w:r>
+              <w:rPr>
+                <w:rFonts w:ascii="Calibri" w:cs="Calibri" w:eastAsia="Calibri" w:hAnsi="Calibri"/>
+                <w:sz w:val="19"/>
+                <w:szCs w:val="19"/>
+              </w:rPr>
+              <w:t xml:space="preserve">Music</w:t>
+            </w:r>
+          </w:p>
+        </w:tc>
+        <w:tc>
+          <w:tcPr>
+            <w:tcW w:type="dxa" w:w="6582"/>
+            <w:tcBorders>
+              <w:top w:val="single" w:color="BFBFBF" w:sz="4"/>
+              <w:left w:val="single" w:color="BFBFBF" w:sz="4"/>
+              <w:bottom w:val="single" w:color="BFBFBF" w:sz="4"/>
+              <w:right w:val="single" w:color="BFBFBF" w:sz="4"/>
+            </w:tcBorders>
+            <w:tcMar>
+              <w:top w:type="dxa" w:w="60"/>
+              <w:left w:type="dxa" w:w="100"/>
+              <w:bottom w:type="dxa" w:w="60"/>
+              <w:right w:type="dxa" w:w="100"/>
+            </w:tcMar>
+          </w:tcPr>
+          <w:p>
+            <w:r>
+              <w:rPr>
+                <w:rFonts w:ascii="Calibri" w:cs="Calibri" w:eastAsia="Calibri" w:hAnsi="Calibri"/>
+                <w:sz w:val="19"/>
+                <w:szCs w:val="19"/>
+              </w:rPr>
+              <w:t xml:space="preserve">An ominous track (low drone, heartbeat, far bells) replaces the chill theme; the chase music still takes over during chases</w:t>
+            </w:r>
+          </w:p>
+        </w:tc>
+      </w:tr>
+      <w:tr>
+        <w:trPr>
+          <w:cantSplit/>
+        </w:trPr>
+        <w:tc>
+          <w:tcPr>
+            <w:tcW w:type="dxa" w:w="2778"/>
+            <w:tcBorders>
+              <w:top w:val="single" w:color="BFBFBF" w:sz="4"/>
+              <w:left w:val="single" w:color="BFBFBF" w:sz="4"/>
+              <w:bottom w:val="single" w:color="BFBFBF" w:sz="4"/>
+              <w:right w:val="single" w:color="BFBFBF" w:sz="4"/>
+            </w:tcBorders>
+            <w:tcMar>
+              <w:top w:type="dxa" w:w="60"/>
+              <w:left w:type="dxa" w:w="100"/>
+              <w:bottom w:type="dxa" w:w="60"/>
+              <w:right w:type="dxa" w:w="100"/>
+            </w:tcMar>
+          </w:tcPr>
+          <w:p>
+            <w:r>
+              <w:rPr>
+                <w:rFonts w:ascii="Calibri" w:cs="Calibri" w:eastAsia="Calibri" w:hAnsi="Calibri"/>
+                <w:sz w:val="19"/>
+                <w:szCs w:val="19"/>
+              </w:rPr>
+              <w:t xml:space="preserve">Eggs</w:t>
+            </w:r>
+          </w:p>
+        </w:tc>
+        <w:tc>
+          <w:tcPr>
+            <w:tcW w:type="dxa" w:w="6582"/>
+            <w:tcBorders>
+              <w:top w:val="single" w:color="BFBFBF" w:sz="4"/>
+              <w:left w:val="single" w:color="BFBFBF" w:sz="4"/>
+              <w:bottom w:val="single" w:color="BFBFBF" w:sz="4"/>
+              <w:right w:val="single" w:color="BFBFBF" w:sz="4"/>
+            </w:tcBorders>
+            <w:tcMar>
+              <w:top w:type="dxa" w:w="60"/>
+              <w:left w:type="dxa" w:w="100"/>
+              <w:bottom w:type="dxa" w:w="60"/>
+              <w:right w:type="dxa" w:w="100"/>
+            </w:tcMar>
+          </w:tcPr>
+          <w:p>
+            <w:r>
+              <w:rPr>
+                <w:rFonts w:ascii="Calibri" w:cs="Calibri" w:eastAsia="Calibri" w:hAnsi="Calibri"/>
+                <w:sz w:val="19"/>
+                <w:szCs w:val="19"/>
+              </w:rPr>
+              <w:t xml:space="preserve">Each house puts a Blood Moon Egg (the Legendary egg, pets like the Blood Moon Bat) on some spots: 15% / 15% / 20% / 30% / 35% for houses 1 to 5 and 35% for the rest. Spots are fixed, so this replaces eggs instead of adding more</w:t>
+            </w:r>
+          </w:p>
+        </w:tc>
+      </w:tr>
+      <w:tr>
+        <w:trPr>
+          <w:cantSplit/>
+        </w:trPr>
+        <w:tc>
+          <w:tcPr>
+            <w:tcW w:type="dxa" w:w="2778"/>
+            <w:tcBorders>
+              <w:top w:val="single" w:color="BFBFBF" w:sz="4"/>
+              <w:left w:val="single" w:color="BFBFBF" w:sz="4"/>
+              <w:bottom w:val="single" w:color="BFBFBF" w:sz="4"/>
+              <w:right w:val="single" w:color="BFBFBF" w:sz="4"/>
+            </w:tcBorders>
+            <w:tcMar>
+              <w:top w:type="dxa" w:w="60"/>
+              <w:left w:type="dxa" w:w="100"/>
+              <w:bottom w:type="dxa" w:w="60"/>
+              <w:right w:type="dxa" w:w="100"/>
+            </w:tcMar>
+          </w:tcPr>
+          <w:p>
+            <w:r>
+              <w:rPr>
+                <w:rFonts w:ascii="Calibri" w:cs="Calibri" w:eastAsia="Calibri" w:hAnsi="Calibri"/>
+                <w:sz w:val="19"/>
+                <w:szCs w:val="19"/>
+              </w:rPr>
+              <w:t xml:space="preserve">Variant luck</w:t>
+            </w:r>
+          </w:p>
+        </w:tc>
+        <w:tc>
+          <w:tcPr>
+            <w:tcW w:type="dxa" w:w="6582"/>
+            <w:tcBorders>
+              <w:top w:val="single" w:color="BFBFBF" w:sz="4"/>
+              <w:left w:val="single" w:color="BFBFBF" w:sz="4"/>
+              <w:bottom w:val="single" w:color="BFBFBF" w:sz="4"/>
+              <w:right w:val="single" w:color="BFBFBF" w:sz="4"/>
+            </w:tcBorders>
+            <w:tcMar>
+              <w:top w:type="dxa" w:w="60"/>
+              <w:left w:type="dxa" w:w="100"/>
+              <w:bottom w:type="dxa" w:w="60"/>
+              <w:right w:type="dxa" w:w="100"/>
+            </w:tcMar>
+          </w:tcPr>
+          <w:p>
+            <w:r>
+              <w:rPr>
+                <w:rFonts w:ascii="Calibri" w:cs="Calibri" w:eastAsia="Calibri" w:hAnsi="Calibri"/>
+                <w:sz w:val="19"/>
+                <w:szCs w:val="19"/>
+              </w:rPr>
+              <w:t xml:space="preserve">Every Big / Huge / Gigantic and Golden / Diamond / Rainbow chance is doubled for eggs spawned that night</w:t>
+            </w:r>
+          </w:p>
+        </w:tc>
+      </w:tr>
+      <w:tr>
+        <w:trPr>
+          <w:cantSplit/>
+        </w:trPr>
+        <w:tc>
+          <w:tcPr>
+            <w:tcW w:type="dxa" w:w="2778"/>
+            <w:tcBorders>
+              <w:top w:val="single" w:color="BFBFBF" w:sz="4"/>
+              <w:left w:val="single" w:color="BFBFBF" w:sz="4"/>
+              <w:bottom w:val="single" w:color="BFBFBF" w:sz="4"/>
+              <w:right w:val="single" w:color="BFBFBF" w:sz="4"/>
+            </w:tcBorders>
+            <w:tcMar>
+              <w:top w:type="dxa" w:w="60"/>
+              <w:left w:type="dxa" w:w="100"/>
+              <w:bottom w:type="dxa" w:w="60"/>
+              <w:right w:type="dxa" w:w="100"/>
+            </w:tcMar>
+          </w:tcPr>
+          <w:p>
+            <w:r>
+              <w:rPr>
+                <w:rFonts w:ascii="Calibri" w:cs="Calibri" w:eastAsia="Calibri" w:hAnsi="Calibri"/>
+                <w:sz w:val="19"/>
+                <w:szCs w:val="19"/>
+              </w:rPr>
+              <w:t xml:space="preserve">Blood variant</w:t>
+            </w:r>
+          </w:p>
+        </w:tc>
+        <w:tc>
+          <w:tcPr>
+            <w:tcW w:type="dxa" w:w="6582"/>
+            <w:tcBorders>
+              <w:top w:val="single" w:color="BFBFBF" w:sz="4"/>
+              <w:left w:val="single" w:color="BFBFBF" w:sz="4"/>
+              <w:bottom w:val="single" w:color="BFBFBF" w:sz="4"/>
+              <w:right w:val="single" w:color="BFBFBF" w:sz="4"/>
+            </w:tcBorders>
+            <w:tcMar>
+              <w:top w:type="dxa" w:w="60"/>
+              <w:left w:type="dxa" w:w="100"/>
+              <w:bottom w:type="dxa" w:w="60"/>
+              <w:right w:type="dxa" w:w="100"/>
+            </w:tcMar>
+          </w:tcPr>
+          <w:p>
+            <w:r>
+              <w:rPr>
+                <w:rFonts w:ascii="Calibri" w:cs="Calibri" w:eastAsia="Calibri" w:hAnsi="Calibri"/>
+                <w:sz w:val="19"/>
+                <w:szCs w:val="19"/>
+              </w:rPr>
+              <w:t xml:space="preserve">A new material that only drops during the event (3%, 6% with the doubled luck): x15 income, red glow. It stacks with sizes like the others (a "Big Blood Bat")</w:t>
+            </w:r>
+          </w:p>
+        </w:tc>
+      </w:tr>
+      <w:tr>
+        <w:trPr>
+          <w:cantSplit/>
+        </w:trPr>
+        <w:tc>
+          <w:tcPr>
+            <w:tcW w:type="dxa" w:w="2778"/>
+            <w:tcBorders>
+              <w:top w:val="single" w:color="BFBFBF" w:sz="4"/>
+              <w:left w:val="single" w:color="BFBFBF" w:sz="4"/>
+              <w:bottom w:val="single" w:color="BFBFBF" w:sz="4"/>
+              <w:right w:val="single" w:color="BFBFBF" w:sz="4"/>
+            </w:tcBorders>
+            <w:tcMar>
+              <w:top w:type="dxa" w:w="60"/>
+              <w:left w:type="dxa" w:w="100"/>
+              <w:bottom w:type="dxa" w:w="60"/>
+              <w:right w:type="dxa" w:w="100"/>
+            </w:tcMar>
+          </w:tcPr>
+          <w:p>
+            <w:r>
+              <w:rPr>
+                <w:rFonts w:ascii="Calibri" w:cs="Calibri" w:eastAsia="Calibri" w:hAnsi="Calibri"/>
+                <w:sz w:val="19"/>
+                <w:szCs w:val="19"/>
+              </w:rPr>
+              <w:t xml:space="preserve">Angrier owners</w:t>
+            </w:r>
+          </w:p>
+        </w:tc>
+        <w:tc>
+          <w:tcPr>
+            <w:tcW w:type="dxa" w:w="6582"/>
+            <w:tcBorders>
+              <w:top w:val="single" w:color="BFBFBF" w:sz="4"/>
+              <w:left w:val="single" w:color="BFBFBF" w:sz="4"/>
+              <w:bottom w:val="single" w:color="BFBFBF" w:sz="4"/>
+              <w:right w:val="single" w:color="BFBFBF" w:sz="4"/>
+            </w:tcBorders>
+            <w:tcMar>
+              <w:top w:type="dxa" w:w="60"/>
+              <w:left w:type="dxa" w:w="100"/>
+              <w:bottom w:type="dxa" w:w="60"/>
+              <w:right w:type="dxa" w:w="100"/>
+            </w:tcMar>
+          </w:tcPr>
+          <w:p>
+            <w:r>
+              <w:rPr>
+                <w:rFonts w:ascii="Calibri" w:cs="Calibri" w:eastAsia="Calibri" w:hAnsi="Calibri"/>
+                <w:sz w:val="19"/>
+                <w:szCs w:val="19"/>
+              </w:rPr>
+              <w:t xml:space="preserve">18% faster, notice a thief in 60% of the usual time, give up after 1.5x as long</w:t>
+            </w:r>
+          </w:p>
+        </w:tc>
+      </w:tr>
+      <w:tr>
+        <w:trPr>
+          <w:cantSplit/>
+        </w:trPr>
+        <w:tc>
+          <w:tcPr>
+            <w:tcW w:type="dxa" w:w="2778"/>
+            <w:tcBorders>
+              <w:top w:val="single" w:color="BFBFBF" w:sz="4"/>
+              <w:left w:val="single" w:color="BFBFBF" w:sz="4"/>
+              <w:bottom w:val="single" w:color="BFBFBF" w:sz="4"/>
+              <w:right w:val="single" w:color="BFBFBF" w:sz="4"/>
+            </w:tcBorders>
+            <w:tcMar>
+              <w:top w:type="dxa" w:w="60"/>
+              <w:left w:type="dxa" w:w="100"/>
+              <w:bottom w:type="dxa" w:w="60"/>
+              <w:right w:type="dxa" w:w="100"/>
+            </w:tcMar>
+          </w:tcPr>
+          <w:p>
+            <w:r>
+              <w:rPr>
+                <w:rFonts w:ascii="Calibri" w:cs="Calibri" w:eastAsia="Calibri" w:hAnsi="Calibri"/>
+                <w:sz w:val="19"/>
+                <w:szCs w:val="19"/>
+              </w:rPr>
+              <w:t xml:space="preserve">Blood Moon Quest</w:t>
+            </w:r>
+          </w:p>
+        </w:tc>
+        <w:tc>
+          <w:tcPr>
+            <w:tcW w:type="dxa" w:w="6582"/>
+            <w:tcBorders>
+              <w:top w:val="single" w:color="BFBFBF" w:sz="4"/>
+              <w:left w:val="single" w:color="BFBFBF" w:sz="4"/>
+              <w:bottom w:val="single" w:color="BFBFBF" w:sz="4"/>
+              <w:right w:val="single" w:color="BFBFBF" w:sz="4"/>
+            </w:tcBorders>
+            <w:tcMar>
+              <w:top w:type="dxa" w:w="60"/>
+              <w:left w:type="dxa" w:w="100"/>
+              <w:bottom w:type="dxa" w:w="60"/>
+              <w:right w:type="dxa" w:w="100"/>
+            </w:tcMar>
+          </w:tcPr>
+          <w:p>
+            <w:r>
+              <w:rPr>
+                <w:rFonts w:ascii="Calibri" w:cs="Calibri" w:eastAsia="Calibri" w:hAnsi="Calibri"/>
+                <w:sz w:val="19"/>
+                <w:szCs w:val="19"/>
+              </w:rPr>
+              <w:t xml:space="preserve">"Bring 4 eggs home" (about 8 minutes of effort, reward worth 1.2x), shown on top of the Quests window; finishing it opens a chest with an egg and a potion</w:t>
+            </w:r>
+          </w:p>
+        </w:tc>
+      </w:tr>
+      <w:tr>
+        <w:trPr>
+          <w:cantSplit/>
+        </w:trPr>
+        <w:tc>
+          <w:tcPr>
+            <w:tcW w:type="dxa" w:w="2778"/>
+            <w:tcBorders>
+              <w:top w:val="single" w:color="BFBFBF" w:sz="4"/>
+              <w:left w:val="single" w:color="BFBFBF" w:sz="4"/>
+              <w:bottom w:val="single" w:color="BFBFBF" w:sz="4"/>
+              <w:right w:val="single" w:color="BFBFBF" w:sz="4"/>
+            </w:tcBorders>
+            <w:tcMar>
+              <w:top w:type="dxa" w:w="60"/>
+              <w:left w:type="dxa" w:w="100"/>
+              <w:bottom w:type="dxa" w:w="60"/>
+              <w:right w:type="dxa" w:w="100"/>
+            </w:tcMar>
+          </w:tcPr>
+          <w:p>
+            <w:r>
+              <w:rPr>
+                <w:rFonts w:ascii="Calibri" w:cs="Calibri" w:eastAsia="Calibri" w:hAnsi="Calibri"/>
+                <w:sz w:val="19"/>
+                <w:szCs w:val="19"/>
+              </w:rPr>
+              <w:t xml:space="preserve">Reward for everyone</w:t>
+            </w:r>
+          </w:p>
+        </w:tc>
+        <w:tc>
+          <w:tcPr>
+            <w:tcW w:type="dxa" w:w="6582"/>
+            <w:tcBorders>
+              <w:top w:val="single" w:color="BFBFBF" w:sz="4"/>
+              <w:left w:val="single" w:color="BFBFBF" w:sz="4"/>
+              <w:bottom w:val="single" w:color="BFBFBF" w:sz="4"/>
+              <w:right w:val="single" w:color="BFBFBF" w:sz="4"/>
+            </w:tcBorders>
+            <w:tcMar>
+              <w:top w:type="dxa" w:w="60"/>
+              <w:left w:type="dxa" w:w="100"/>
+              <w:bottom w:type="dxa" w:w="60"/>
+              <w:right w:type="dxa" w:w="100"/>
+            </w:tcMar>
+          </w:tcPr>
+          <w:p>
+            <w:r>
+              <w:rPr>
+                <w:rFonts w:ascii="Calibri" w:cs="Calibri" w:eastAsia="Calibri" w:hAnsi="Calibri"/>
+                <w:sz w:val="19"/>
+                <w:szCs w:val="19"/>
+              </w:rPr>
+              <w:t xml:space="preserve">Everyone who brought at least 1 egg home gets a random potion when it ends</w:t>
+            </w:r>
+          </w:p>
+        </w:tc>
+      </w:tr>
+    </w:tbl>
+    <w:p>
+      <w:pPr>
+        <w:spacing w:after="120"/>
+      </w:pPr>
+    </w:p>
+    <w:p>
+      <w:pPr>
+        <w:spacing w:after="140"/>
+      </w:pPr>
+      <w:r>
+        <w:rPr>
+          <w:rFonts w:ascii="Calibri" w:cs="Calibri" w:eastAsia="Calibri" w:hAnsi="Calibri"/>
+        </w:rPr>
+        <w:t xml:space="preserve">New pets and models: none. The Blood variant and the Blood Moon Egg use the existing glow and the existing (block) models. Everything is tuned in </w:t>
+      </w:r>
+      <w:r>
+        <w:rPr>
+          <w:rFonts w:ascii="Courier New" w:cs="Courier New" w:eastAsia="Courier New" w:hAnsi="Courier New"/>
+          <w:sz w:val="20"/>
+          <w:szCs w:val="20"/>
+        </w:rPr>
+        <w:t xml:space="preserve">Config.BloodMoon</w:t>
+      </w:r>
+      <w:r>
+        <w:rPr>
+          <w:rFonts w:ascii="Calibri" w:cs="Calibri" w:eastAsia="Calibri" w:hAnsi="Calibri"/>
+        </w:rPr>
+        <w:t xml:space="preserve"> (and the Blood entry in </w:t>
+      </w:r>
+      <w:r>
+        <w:rPr>
+          <w:rFonts w:ascii="Courier New" w:cs="Courier New" w:eastAsia="Courier New" w:hAnsi="Courier New"/>
+          <w:sz w:val="20"/>
+          <w:szCs w:val="20"/>
+        </w:rPr>
+        <w:t xml:space="preserve">Config.Materials</w:t>
+      </w:r>
+      <w:r>
+        <w:rPr>
+          <w:rFonts w:ascii="Calibri" w:cs="Calibri" w:eastAsia="Calibri" w:hAnsi="Calibri"/>
+        </w:rPr>
+        <w:t xml:space="preserve">). The Admin panel has a "Start the Blood Moon now" button. The new audio files are </w:t>
+      </w:r>
+      <w:r>
+        <w:rPr>
+          <w:rFonts w:ascii="Courier New" w:cs="Courier New" w:eastAsia="Courier New" w:hAnsi="Courier New"/>
+          <w:sz w:val="20"/>
+          <w:szCs w:val="20"/>
+        </w:rPr>
+        <w:t xml:space="preserve">music_blood.mp3</w:t>
+      </w:r>
+      <w:r>
+        <w:rPr>
+          <w:rFonts w:ascii="Calibri" w:cs="Calibri" w:eastAsia="Calibri" w:hAnsi="Calibri"/>
+        </w:rPr>
+        <w:t xml:space="preserve">, </w:t>
+      </w:r>
+      <w:r>
+        <w:rPr>
+          <w:rFonts w:ascii="Courier New" w:cs="Courier New" w:eastAsia="Courier New" w:hAnsi="Courier New"/>
+          <w:sz w:val="20"/>
+          <w:szCs w:val="20"/>
+        </w:rPr>
+        <w:t xml:space="preserve">blood_rise.mp3</w:t>
+      </w:r>
+      <w:r>
+        <w:rPr>
+          <w:rFonts w:ascii="Calibri" w:cs="Calibri" w:eastAsia="Calibri" w:hAnsi="Calibri"/>
+        </w:rPr>
+        <w:t xml:space="preserve"> and </w:t>
+      </w:r>
+      <w:r>
+        <w:rPr>
+          <w:rFonts w:ascii="Courier New" w:cs="Courier New" w:eastAsia="Courier New" w:hAnsi="Courier New"/>
+          <w:sz w:val="20"/>
+          <w:szCs w:val="20"/>
+        </w:rPr>
+        <w:t xml:space="preserve">thunder.mp3</w:t>
+      </w:r>
+      <w:r>
+        <w:rPr>
+          <w:rFonts w:ascii="Calibri" w:cs="Calibri" w:eastAsia="Calibri" w:hAnsi="Calibri"/>
+        </w:rPr>
+        <w:t xml:space="preserve">; paste their ids into </w:t>
+      </w:r>
+      <w:r>
+        <w:rPr>
+          <w:rFonts w:ascii="Courier New" w:cs="Courier New" w:eastAsia="Courier New" w:hAnsi="Courier New"/>
+          <w:sz w:val="20"/>
+          <w:szCs w:val="20"/>
+        </w:rPr>
+        <w:t xml:space="preserve">Config.Audio</w:t>
+      </w:r>
+      <w:r>
+        <w:rPr>
+          <w:rFonts w:ascii="Calibri" w:cs="Calibri" w:eastAsia="Calibri" w:hAnsi="Calibri"/>
+        </w:rPr>
+        <w:t xml:space="preserve">.</w:t>
       </w:r>
     </w:p>
     <w:p>

</xml_diff>

<commit_message>
Adopt V6 as the main place and merge the Blood Moon work into it
Remove the potion timers from the top of the screen, make the signs between levels show the Recommended Level and hang over the road, give Pet Capacity +2, +2, +1, +1 slots, and make better costumes give much higher Candy multipliers (prices refit).

Co-Authored-By: Claude Sonnet 5.5 <noreply@anthropic.com>
Claude-Session: https://claude.ai/code/session_013ivEnYiZGofRBeqQFKAVhJ
</commit_message>
<xml_diff>
--- a/docs/Spooky-Steal-Design-and-Plan.docx
+++ b/docs/Spooky-Steal-Design-and-Plan.docx
@@ -77,7 +77,7 @@
           <w:b/>
           <w:bCs/>
         </w:rPr>
-        <w:t xml:space="preserve">SpookySteal-V5.0</w:t>
+        <w:t xml:space="preserve">SpookySteal-V6</w:t>
       </w:r>
       <w:r>
         <w:rPr>
@@ -492,7 +492,7 @@
                 <w:sz w:val="19"/>
                 <w:szCs w:val="19"/>
               </w:rPr>
-              <w:t xml:space="preserve"> (6 to 18 pets) and </w:t>
+              <w:t xml:space="preserve"> (6 to 12 pets) and </w:t>
             </w:r>
             <w:r>
               <w:rPr>
@@ -1115,6 +1115,65 @@
                 <w:szCs w:val="19"/>
               </w:rPr>
               <w:t xml:space="preserve">An hourly 5-minute night with a red sky, better eggs, a Blood variant, angrier owners, an event quest and a countdown on screen.</w:t>
+            </w:r>
+          </w:p>
+        </w:tc>
+      </w:tr>
+      <w:tr>
+        <w:trPr>
+          <w:cantSplit/>
+        </w:trPr>
+        <w:tc>
+          <w:tcPr>
+            <w:tcW w:type="dxa" w:w="4252"/>
+            <w:tcBorders>
+              <w:top w:val="single" w:color="BFBFBF" w:sz="4"/>
+              <w:left w:val="single" w:color="BFBFBF" w:sz="4"/>
+              <w:bottom w:val="single" w:color="BFBFBF" w:sz="4"/>
+              <w:right w:val="single" w:color="BFBFBF" w:sz="4"/>
+            </w:tcBorders>
+            <w:tcMar>
+              <w:top w:type="dxa" w:w="60"/>
+              <w:left w:type="dxa" w:w="100"/>
+              <w:bottom w:type="dxa" w:w="60"/>
+              <w:right w:type="dxa" w:w="100"/>
+            </w:tcMar>
+          </w:tcPr>
+          <w:p>
+            <w:r>
+              <w:rPr>
+                <w:rFonts w:ascii="Calibri" w:cs="Calibri" w:eastAsia="Calibri" w:hAnsi="Calibri"/>
+                <w:sz w:val="19"/>
+                <w:szCs w:val="19"/>
+              </w:rPr>
+              <w:t xml:space="preserve">V6 changes</w:t>
+            </w:r>
+          </w:p>
+        </w:tc>
+        <w:tc>
+          <w:tcPr>
+            <w:tcW w:type="dxa" w:w="5108"/>
+            <w:tcBorders>
+              <w:top w:val="single" w:color="BFBFBF" w:sz="4"/>
+              <w:left w:val="single" w:color="BFBFBF" w:sz="4"/>
+              <w:bottom w:val="single" w:color="BFBFBF" w:sz="4"/>
+              <w:right w:val="single" w:color="BFBFBF" w:sz="4"/>
+            </w:tcBorders>
+            <w:tcMar>
+              <w:top w:type="dxa" w:w="60"/>
+              <w:left w:type="dxa" w:w="100"/>
+              <w:bottom w:type="dxa" w:w="60"/>
+              <w:right w:type="dxa" w:w="100"/>
+            </w:tcMar>
+          </w:tcPr>
+          <w:p>
+            <w:r>
+              <w:rPr>
+                <w:rFonts w:ascii="Calibri" w:cs="Calibri" w:eastAsia="Calibri" w:hAnsi="Calibri"/>
+                <w:sz w:val="19"/>
+                <w:szCs w:val="19"/>
+              </w:rPr>
+              <w:t xml:space="preserve">Candy multipliers of the costumes now climb much faster (x2, x4, x7, x12, x20, x35, x60, x100, x170, x300) with costume prices raised to keep the same pace; Pet Capacity gives +2, +2, +1, +1 slots (8, 10, 11, 12); the green signs between levels show the Recommended Level (the Speed Level to bring) and hang over the road; the potion timers at the top of the screen are gone (active potions show in the Rewards window).</w:t>
             </w:r>
           </w:p>
         </w:tc>
@@ -12682,7 +12741,7 @@
         <w:rPr>
           <w:rFonts w:ascii="Calibri" w:cs="Calibri" w:eastAsia="Calibri" w:hAnsi="Calibri"/>
         </w:rPr>
-        <w:t xml:space="preserve"> your base starts with 6 pet slots; Pet Capacity upgrades raise it to 9, 12, 15 and 18. Up to 60 more pets wait in the inventory. When the base is full, a hatched pet goes straight to the inventory. The Pets menu shows equipped pets on top and the inventory below, stacked by kind (x2, x3) with a search box. Tap a pet to equip, unequip or sell it; </w:t>
+        <w:t xml:space="preserve"> your base starts with 6 pet slots; Pet Capacity upgrades raise it to 8, 10, 11 and 12 (+2, +2, +1, +1). Up to 60 more pets wait in the inventory. When the base is full, a hatched pet goes straight to the inventory. The Pets menu shows equipped pets on top and the inventory below, stacked by kind (x2, x3) with a search box. Tap a pet to equip, unequip or sell it; </w:t>
       </w:r>
       <w:r>
         <w:rPr>
@@ -12961,7 +13020,7 @@
                 <w:sz w:val="19"/>
                 <w:szCs w:val="19"/>
               </w:rPr>
-              <w:t xml:space="preserve">$2K to 9, $30K to 12, $500K to 15, $8M to 18</w:t>
+              <w:t xml:space="preserve">$2K to 8, $30K to 10, $500K to 11, $8M to 12</w:t>
             </w:r>
           </w:p>
         </w:tc>
@@ -15274,7 +15333,7 @@
                 <w:sz w:val="19"/>
                 <w:szCs w:val="19"/>
               </w:rPr>
-              <w:t xml:space="preserve">x3</w:t>
+              <w:t xml:space="preserve">x4</w:t>
             </w:r>
           </w:p>
         </w:tc>
@@ -15387,7 +15446,7 @@
                 <w:sz w:val="19"/>
                 <w:szCs w:val="19"/>
               </w:rPr>
-              <w:t xml:space="preserve">1,500</w:t>
+              <w:t xml:space="preserve">2,000</w:t>
             </w:r>
           </w:p>
         </w:tc>
@@ -15414,7 +15473,7 @@
                 <w:sz w:val="19"/>
                 <w:szCs w:val="19"/>
               </w:rPr>
-              <w:t xml:space="preserve">x4</w:t>
+              <w:t xml:space="preserve">x7</w:t>
             </w:r>
           </w:p>
         </w:tc>
@@ -15527,7 +15586,7 @@
                 <w:sz w:val="19"/>
                 <w:szCs w:val="19"/>
               </w:rPr>
-              <w:t xml:space="preserve">6,000</w:t>
+              <w:t xml:space="preserve">10,000</w:t>
             </w:r>
           </w:p>
         </w:tc>
@@ -15554,7 +15613,7 @@
                 <w:sz w:val="19"/>
                 <w:szCs w:val="19"/>
               </w:rPr>
-              <w:t xml:space="preserve">x6</w:t>
+              <w:t xml:space="preserve">x12</w:t>
             </w:r>
           </w:p>
         </w:tc>
@@ -15667,7 +15726,7 @@
                 <w:sz w:val="19"/>
                 <w:szCs w:val="19"/>
               </w:rPr>
-              <w:t xml:space="preserve">24,000</w:t>
+              <w:t xml:space="preserve">50,000</w:t>
             </w:r>
           </w:p>
         </w:tc>
@@ -15694,7 +15753,7 @@
                 <w:sz w:val="19"/>
                 <w:szCs w:val="19"/>
               </w:rPr>
-              <w:t xml:space="preserve">x8</w:t>
+              <w:t xml:space="preserve">x20</w:t>
             </w:r>
           </w:p>
         </w:tc>
@@ -15807,7 +15866,7 @@
                 <w:sz w:val="19"/>
                 <w:szCs w:val="19"/>
               </w:rPr>
-              <w:t xml:space="preserve">90,000</w:t>
+              <w:t xml:space="preserve">220,000</w:t>
             </w:r>
           </w:p>
         </w:tc>
@@ -15834,7 +15893,7 @@
                 <w:sz w:val="19"/>
                 <w:szCs w:val="19"/>
               </w:rPr>
-              <w:t xml:space="preserve">x12</w:t>
+              <w:t xml:space="preserve">x35</w:t>
             </w:r>
           </w:p>
         </w:tc>
@@ -15947,7 +16006,7 @@
                 <w:sz w:val="19"/>
                 <w:szCs w:val="19"/>
               </w:rPr>
-              <w:t xml:space="preserve">300,000</w:t>
+              <w:t xml:space="preserve">880,000</w:t>
             </w:r>
           </w:p>
         </w:tc>
@@ -15974,7 +16033,7 @@
                 <w:sz w:val="19"/>
                 <w:szCs w:val="19"/>
               </w:rPr>
-              <w:t xml:space="preserve">x16</w:t>
+              <w:t xml:space="preserve">x60</w:t>
             </w:r>
           </w:p>
         </w:tc>
@@ -16087,7 +16146,7 @@
                 <w:sz w:val="19"/>
                 <w:szCs w:val="19"/>
               </w:rPr>
-              <w:t xml:space="preserve">1,000,000</w:t>
+              <w:t xml:space="preserve">3,700,000</w:t>
             </w:r>
           </w:p>
         </w:tc>
@@ -16114,7 +16173,7 @@
                 <w:sz w:val="19"/>
                 <w:szCs w:val="19"/>
               </w:rPr>
-              <w:t xml:space="preserve">x24</w:t>
+              <w:t xml:space="preserve">x100</w:t>
             </w:r>
           </w:p>
         </w:tc>
@@ -16227,7 +16286,7 @@
                 <w:sz w:val="19"/>
                 <w:szCs w:val="19"/>
               </w:rPr>
-              <w:t xml:space="preserve">2,500,000</w:t>
+              <w:t xml:space="preserve">10,000,000</w:t>
             </w:r>
           </w:p>
         </w:tc>
@@ -16254,7 +16313,7 @@
                 <w:sz w:val="19"/>
                 <w:szCs w:val="19"/>
               </w:rPr>
-              <w:t xml:space="preserve">x32</w:t>
+              <w:t xml:space="preserve">x170</w:t>
             </w:r>
           </w:p>
         </w:tc>
@@ -16367,7 +16426,7 @@
                 <w:sz w:val="19"/>
                 <w:szCs w:val="19"/>
               </w:rPr>
-              <w:t xml:space="preserve">5,000,000</w:t>
+              <w:t xml:space="preserve">26,000,000</w:t>
             </w:r>
           </w:p>
         </w:tc>
@@ -16394,7 +16453,7 @@
                 <w:sz w:val="19"/>
                 <w:szCs w:val="19"/>
               </w:rPr>
-              <w:t xml:space="preserve">x50</w:t>
+              <w:t xml:space="preserve">x300</w:t>
             </w:r>
           </w:p>
         </w:tc>

</xml_diff>

<commit_message>
Random egg sizes: Big 3.5-5x, Huge 7-10x, Gigantic 15x, money multiplier equals the rolled size; drop Blood Moon from the main place
Each egg rolls its tier and then its own size (rounded to 0.1), stored in the pet id
(Bat+Big4.2+Golden). Old ids without a number keep the old fixed x3/x8/x30 values.
Drawn size grows slower than the multiplier (exponents in Config). place/SpookySteal-V6.rbxl
is now the build without the Blood Moon (still in git history); the V6-safe copy is removed.

Co-Authored-By: Claude Sonnet 5.5 <noreply@anthropic.com>
Claude-Session: https://claude.ai/code/session_013ivEnYiZGofRBeqQFKAVhJ
</commit_message>
<xml_diff>
--- a/docs/Spooky-Steal-Design-and-Plan.docx
+++ b/docs/Spooky-Steal-Design-and-Plan.docx
@@ -1087,7 +1087,7 @@
                 <w:sz w:val="19"/>
                 <w:szCs w:val="19"/>
               </w:rPr>
-              <w:t xml:space="preserve">Blood Moon event (5.1)</w:t>
+              <w:t xml:space="preserve">V6 changes</w:t>
             </w:r>
           </w:p>
         </w:tc>
@@ -1114,7 +1114,7 @@
                 <w:sz w:val="19"/>
                 <w:szCs w:val="19"/>
               </w:rPr>
-              <w:t xml:space="preserve">An hourly 5-minute night with a red sky, better eggs, a Blood variant, angrier owners, an event quest and a countdown on screen.</w:t>
+              <w:t xml:space="preserve">Candy multipliers of the costumes now climb much faster (x2, x4, x7, x12, x20, x35, x60, x100, x170, x300) with costume prices raised to keep the same pace; Pet Capacity gives +2, +2, +1, +1 slots (8, 10, 11, 12); the green signs between levels show the Recommended Level (the Speed Level to bring) and hang over the road; the potion timers at the top of the screen are gone (active potions show in the Rewards window).</w:t>
             </w:r>
           </w:p>
         </w:tc>
@@ -1146,7 +1146,7 @@
                 <w:sz w:val="19"/>
                 <w:szCs w:val="19"/>
               </w:rPr>
-              <w:t xml:space="preserve">V6 changes</w:t>
+              <w:t xml:space="preserve">Random egg sizes (6.1)</w:t>
             </w:r>
           </w:p>
         </w:tc>
@@ -1173,7 +1173,7 @@
                 <w:sz w:val="19"/>
                 <w:szCs w:val="19"/>
               </w:rPr>
-              <w:t xml:space="preserve">Candy multipliers of the costumes now climb much faster (x2, x4, x7, x12, x20, x35, x60, x100, x170, x300) with costume prices raised to keep the same pace; Pet Capacity gives +2, +2, +1, +1 slots (8, 10, 11, 12); the green signs between levels show the Recommended Level (the Speed Level to bring) and hang over the road; the potion timers at the top of the screen are gone (active potions show in the Rewards window).</w:t>
+              <w:t xml:space="preserve">Every Big, Huge and Gigantic egg now gets its own random size, and the money multiplier is that size: Big 3.5x to 5x, Huge 7x to 10x, Gigantic 15x (before: fixed x3, x8 and x30). See 2.8. The Blood Moon event is shelved for now; it stays in the git history (commits 346b54e and 4d825cd).</w:t>
             </w:r>
           </w:p>
         </w:tc>
@@ -6644,7 +6644,7 @@
         <w:rPr>
           <w:rFonts w:ascii="Calibri" w:cs="Calibri" w:eastAsia="Calibri" w:hAnsi="Calibri"/>
         </w:rPr>
-        <w:t xml:space="preserve">Rarer eggs are bigger, more detailed and heavier to carry, which is the only built-in rarity hint. On top of that, any egg can be a Big, Huge or Gigantic one and can glow Golden, Diamond or Rainbow (see 2.8).</w:t>
+        <w:t xml:space="preserve">Rarer eggs are bigger, more detailed and heavier to carry, which is the only built-in rarity hint. On top of that, any egg can be a Big, Huge or Gigantic one (each with its own random size) and can glow Golden, Diamond or Rainbow (see 2.8).</w:t>
       </w:r>
     </w:p>
     <w:p>
@@ -9672,11 +9672,11 @@
         </w:tblBorders>
       </w:tblPr>
       <w:tblGrid>
-        <w:gridCol w:w="1986"/>
-        <w:gridCol w:w="1601"/>
-        <w:gridCol w:w="1986"/>
-        <w:gridCol w:w="1986"/>
-        <w:gridCol w:w="1801"/>
+        <w:gridCol w:w="1211"/>
+        <w:gridCol w:w="976"/>
+        <w:gridCol w:w="3585"/>
+        <w:gridCol w:w="1843"/>
+        <w:gridCol w:w="1745"/>
       </w:tblGrid>
       <w:tr>
         <w:trPr>
@@ -9684,7 +9684,7 @@
         </w:trPr>
         <w:tc>
           <w:tcPr>
-            <w:tcW w:type="dxa" w:w="1986"/>
+            <w:tcW w:type="dxa" w:w="1211"/>
             <w:tcBorders>
               <w:top w:val="single" w:color="BFBFBF" w:sz="4"/>
               <w:left w:val="single" w:color="BFBFBF" w:sz="4"/>
@@ -9714,7 +9714,7 @@
         </w:tc>
         <w:tc>
           <w:tcPr>
-            <w:tcW w:type="dxa" w:w="1601"/>
+            <w:tcW w:type="dxa" w:w="976"/>
             <w:tcBorders>
               <w:top w:val="single" w:color="BFBFBF" w:sz="4"/>
               <w:left w:val="single" w:color="BFBFBF" w:sz="4"/>
@@ -9744,7 +9744,7 @@
         </w:tc>
         <w:tc>
           <w:tcPr>
-            <w:tcW w:type="dxa" w:w="1986"/>
+            <w:tcW w:type="dxa" w:w="3585"/>
             <w:tcBorders>
               <w:top w:val="single" w:color="BFBFBF" w:sz="4"/>
               <w:left w:val="single" w:color="BFBFBF" w:sz="4"/>
@@ -9768,13 +9768,13 @@
                 <w:sz w:val="19"/>
                 <w:szCs w:val="19"/>
               </w:rPr>
-              <w:t xml:space="preserve">Egg size</w:t>
-            </w:r>
-          </w:p>
-        </w:tc>
-        <w:tc>
-          <w:tcPr>
-            <w:tcW w:type="dxa" w:w="1986"/>
+              <w:t xml:space="preserve">Random size (= Money/s multiplier)</w:t>
+            </w:r>
+          </w:p>
+        </w:tc>
+        <w:tc>
+          <w:tcPr>
+            <w:tcW w:type="dxa" w:w="1843"/>
             <w:tcBorders>
               <w:top w:val="single" w:color="BFBFBF" w:sz="4"/>
               <w:left w:val="single" w:color="BFBFBF" w:sz="4"/>
@@ -9798,13 +9798,13 @@
                 <w:sz w:val="19"/>
                 <w:szCs w:val="19"/>
               </w:rPr>
-              <w:t xml:space="preserve">Pet size</w:t>
-            </w:r>
-          </w:p>
-        </w:tc>
-        <w:tc>
-          <w:tcPr>
-            <w:tcW w:type="dxa" w:w="1801"/>
+              <w:t xml:space="preserve">Egg drawn at</w:t>
+            </w:r>
+          </w:p>
+        </w:tc>
+        <w:tc>
+          <w:tcPr>
+            <w:tcW w:type="dxa" w:w="1745"/>
             <w:tcBorders>
               <w:top w:val="single" w:color="BFBFBF" w:sz="4"/>
               <w:left w:val="single" w:color="BFBFBF" w:sz="4"/>
@@ -9828,7 +9828,7 @@
                 <w:sz w:val="19"/>
                 <w:szCs w:val="19"/>
               </w:rPr>
-              <w:t xml:space="preserve">Money/s</w:t>
+              <w:t xml:space="preserve">Pet drawn at</w:t>
             </w:r>
           </w:p>
         </w:tc>
@@ -9839,7 +9839,7 @@
         </w:trPr>
         <w:tc>
           <w:tcPr>
-            <w:tcW w:type="dxa" w:w="1986"/>
+            <w:tcW w:type="dxa" w:w="1211"/>
             <w:tcBorders>
               <w:top w:val="single" w:color="BFBFBF" w:sz="4"/>
               <w:left w:val="single" w:color="BFBFBF" w:sz="4"/>
@@ -9866,7 +9866,7 @@
         </w:tc>
         <w:tc>
           <w:tcPr>
-            <w:tcW w:type="dxa" w:w="1601"/>
+            <w:tcW w:type="dxa" w:w="976"/>
             <w:tcBorders>
               <w:top w:val="single" w:color="BFBFBF" w:sz="4"/>
               <w:left w:val="single" w:color="BFBFBF" w:sz="4"/>
@@ -9893,7 +9893,34 @@
         </w:tc>
         <w:tc>
           <w:tcPr>
-            <w:tcW w:type="dxa" w:w="1986"/>
+            <w:tcW w:type="dxa" w:w="3585"/>
+            <w:tcBorders>
+              <w:top w:val="single" w:color="BFBFBF" w:sz="4"/>
+              <w:left w:val="single" w:color="BFBFBF" w:sz="4"/>
+              <w:bottom w:val="single" w:color="BFBFBF" w:sz="4"/>
+              <w:right w:val="single" w:color="BFBFBF" w:sz="4"/>
+            </w:tcBorders>
+            <w:tcMar>
+              <w:top w:type="dxa" w:w="60"/>
+              <w:left w:type="dxa" w:w="100"/>
+              <w:bottom w:type="dxa" w:w="60"/>
+              <w:right w:type="dxa" w:w="100"/>
+            </w:tcMar>
+          </w:tcPr>
+          <w:p>
+            <w:r>
+              <w:rPr>
+                <w:rFonts w:ascii="Calibri" w:cs="Calibri" w:eastAsia="Calibri" w:hAnsi="Calibri"/>
+                <w:sz w:val="19"/>
+                <w:szCs w:val="19"/>
+              </w:rPr>
+              <w:t xml:space="preserve">1x</w:t>
+            </w:r>
+          </w:p>
+        </w:tc>
+        <w:tc>
+          <w:tcPr>
+            <w:tcW w:type="dxa" w:w="1843"/>
             <w:tcBorders>
               <w:top w:val="single" w:color="BFBFBF" w:sz="4"/>
               <w:left w:val="single" w:color="BFBFBF" w:sz="4"/>
@@ -9920,7 +9947,7 @@
         </w:tc>
         <w:tc>
           <w:tcPr>
-            <w:tcW w:type="dxa" w:w="1986"/>
+            <w:tcW w:type="dxa" w:w="1745"/>
             <w:tcBorders>
               <w:top w:val="single" w:color="BFBFBF" w:sz="4"/>
               <w:left w:val="single" w:color="BFBFBF" w:sz="4"/>
@@ -9942,33 +9969,6 @@
                 <w:szCs w:val="19"/>
               </w:rPr>
               <w:t xml:space="preserve">1x</w:t>
-            </w:r>
-          </w:p>
-        </w:tc>
-        <w:tc>
-          <w:tcPr>
-            <w:tcW w:type="dxa" w:w="1801"/>
-            <w:tcBorders>
-              <w:top w:val="single" w:color="BFBFBF" w:sz="4"/>
-              <w:left w:val="single" w:color="BFBFBF" w:sz="4"/>
-              <w:bottom w:val="single" w:color="BFBFBF" w:sz="4"/>
-              <w:right w:val="single" w:color="BFBFBF" w:sz="4"/>
-            </w:tcBorders>
-            <w:tcMar>
-              <w:top w:type="dxa" w:w="60"/>
-              <w:left w:type="dxa" w:w="100"/>
-              <w:bottom w:type="dxa" w:w="60"/>
-              <w:right w:type="dxa" w:w="100"/>
-            </w:tcMar>
-          </w:tcPr>
-          <w:p>
-            <w:r>
-              <w:rPr>
-                <w:rFonts w:ascii="Calibri" w:cs="Calibri" w:eastAsia="Calibri" w:hAnsi="Calibri"/>
-                <w:sz w:val="19"/>
-                <w:szCs w:val="19"/>
-              </w:rPr>
-              <w:t xml:space="preserve">x1</w:t>
             </w:r>
           </w:p>
         </w:tc>
@@ -9979,7 +9979,7 @@
         </w:trPr>
         <w:tc>
           <w:tcPr>
-            <w:tcW w:type="dxa" w:w="1986"/>
+            <w:tcW w:type="dxa" w:w="1211"/>
             <w:tcBorders>
               <w:top w:val="single" w:color="BFBFBF" w:sz="4"/>
               <w:left w:val="single" w:color="BFBFBF" w:sz="4"/>
@@ -10006,7 +10006,7 @@
         </w:tc>
         <w:tc>
           <w:tcPr>
-            <w:tcW w:type="dxa" w:w="1601"/>
+            <w:tcW w:type="dxa" w:w="976"/>
             <w:tcBorders>
               <w:top w:val="single" w:color="BFBFBF" w:sz="4"/>
               <w:left w:val="single" w:color="BFBFBF" w:sz="4"/>
@@ -10033,82 +10033,82 @@
         </w:tc>
         <w:tc>
           <w:tcPr>
-            <w:tcW w:type="dxa" w:w="1986"/>
-            <w:tcBorders>
-              <w:top w:val="single" w:color="BFBFBF" w:sz="4"/>
-              <w:left w:val="single" w:color="BFBFBF" w:sz="4"/>
-              <w:bottom w:val="single" w:color="BFBFBF" w:sz="4"/>
-              <w:right w:val="single" w:color="BFBFBF" w:sz="4"/>
-            </w:tcBorders>
-            <w:tcMar>
-              <w:top w:type="dxa" w:w="60"/>
-              <w:left w:type="dxa" w:w="100"/>
-              <w:bottom w:type="dxa" w:w="60"/>
-              <w:right w:type="dxa" w:w="100"/>
-            </w:tcMar>
-          </w:tcPr>
-          <w:p>
-            <w:r>
-              <w:rPr>
-                <w:rFonts w:ascii="Calibri" w:cs="Calibri" w:eastAsia="Calibri" w:hAnsi="Calibri"/>
-                <w:sz w:val="19"/>
-                <w:szCs w:val="19"/>
-              </w:rPr>
-              <w:t xml:space="preserve">1.56x</w:t>
-            </w:r>
-          </w:p>
-        </w:tc>
-        <w:tc>
-          <w:tcPr>
-            <w:tcW w:type="dxa" w:w="1986"/>
-            <w:tcBorders>
-              <w:top w:val="single" w:color="BFBFBF" w:sz="4"/>
-              <w:left w:val="single" w:color="BFBFBF" w:sz="4"/>
-              <w:bottom w:val="single" w:color="BFBFBF" w:sz="4"/>
-              <w:right w:val="single" w:color="BFBFBF" w:sz="4"/>
-            </w:tcBorders>
-            <w:tcMar>
-              <w:top w:type="dxa" w:w="60"/>
-              <w:left w:type="dxa" w:w="100"/>
-              <w:bottom w:type="dxa" w:w="60"/>
-              <w:right w:type="dxa" w:w="100"/>
-            </w:tcMar>
-          </w:tcPr>
-          <w:p>
-            <w:r>
-              <w:rPr>
-                <w:rFonts w:ascii="Calibri" w:cs="Calibri" w:eastAsia="Calibri" w:hAnsi="Calibri"/>
-                <w:sz w:val="19"/>
-                <w:szCs w:val="19"/>
-              </w:rPr>
-              <w:t xml:space="preserve">1.6x</w:t>
-            </w:r>
-          </w:p>
-        </w:tc>
-        <w:tc>
-          <w:tcPr>
-            <w:tcW w:type="dxa" w:w="1801"/>
-            <w:tcBorders>
-              <w:top w:val="single" w:color="BFBFBF" w:sz="4"/>
-              <w:left w:val="single" w:color="BFBFBF" w:sz="4"/>
-              <w:bottom w:val="single" w:color="BFBFBF" w:sz="4"/>
-              <w:right w:val="single" w:color="BFBFBF" w:sz="4"/>
-            </w:tcBorders>
-            <w:tcMar>
-              <w:top w:type="dxa" w:w="60"/>
-              <w:left w:type="dxa" w:w="100"/>
-              <w:bottom w:type="dxa" w:w="60"/>
-              <w:right w:type="dxa" w:w="100"/>
-            </w:tcMar>
-          </w:tcPr>
-          <w:p>
-            <w:r>
-              <w:rPr>
-                <w:rFonts w:ascii="Calibri" w:cs="Calibri" w:eastAsia="Calibri" w:hAnsi="Calibri"/>
-                <w:sz w:val="19"/>
-                <w:szCs w:val="19"/>
-              </w:rPr>
-              <w:t xml:space="preserve">x3</w:t>
+            <w:tcW w:type="dxa" w:w="3585"/>
+            <w:tcBorders>
+              <w:top w:val="single" w:color="BFBFBF" w:sz="4"/>
+              <w:left w:val="single" w:color="BFBFBF" w:sz="4"/>
+              <w:bottom w:val="single" w:color="BFBFBF" w:sz="4"/>
+              <w:right w:val="single" w:color="BFBFBF" w:sz="4"/>
+            </w:tcBorders>
+            <w:tcMar>
+              <w:top w:type="dxa" w:w="60"/>
+              <w:left w:type="dxa" w:w="100"/>
+              <w:bottom w:type="dxa" w:w="60"/>
+              <w:right w:type="dxa" w:w="100"/>
+            </w:tcMar>
+          </w:tcPr>
+          <w:p>
+            <w:r>
+              <w:rPr>
+                <w:rFonts w:ascii="Calibri" w:cs="Calibri" w:eastAsia="Calibri" w:hAnsi="Calibri"/>
+                <w:sz w:val="19"/>
+                <w:szCs w:val="19"/>
+              </w:rPr>
+              <w:t xml:space="preserve">3.5x to 5x (average 4.25x)</w:t>
+            </w:r>
+          </w:p>
+        </w:tc>
+        <w:tc>
+          <w:tcPr>
+            <w:tcW w:type="dxa" w:w="1843"/>
+            <w:tcBorders>
+              <w:top w:val="single" w:color="BFBFBF" w:sz="4"/>
+              <w:left w:val="single" w:color="BFBFBF" w:sz="4"/>
+              <w:bottom w:val="single" w:color="BFBFBF" w:sz="4"/>
+              <w:right w:val="single" w:color="BFBFBF" w:sz="4"/>
+            </w:tcBorders>
+            <w:tcMar>
+              <w:top w:type="dxa" w:w="60"/>
+              <w:left w:type="dxa" w:w="100"/>
+              <w:bottom w:type="dxa" w:w="60"/>
+              <w:right w:type="dxa" w:w="100"/>
+            </w:tcMar>
+          </w:tcPr>
+          <w:p>
+            <w:r>
+              <w:rPr>
+                <w:rFonts w:ascii="Calibri" w:cs="Calibri" w:eastAsia="Calibri" w:hAnsi="Calibri"/>
+                <w:sz w:val="19"/>
+                <w:szCs w:val="19"/>
+              </w:rPr>
+              <w:t xml:space="preserve">1.23x to 1.44x</w:t>
+            </w:r>
+          </w:p>
+        </w:tc>
+        <w:tc>
+          <w:tcPr>
+            <w:tcW w:type="dxa" w:w="1745"/>
+            <w:tcBorders>
+              <w:top w:val="single" w:color="BFBFBF" w:sz="4"/>
+              <w:left w:val="single" w:color="BFBFBF" w:sz="4"/>
+              <w:bottom w:val="single" w:color="BFBFBF" w:sz="4"/>
+              <w:right w:val="single" w:color="BFBFBF" w:sz="4"/>
+            </w:tcBorders>
+            <w:tcMar>
+              <w:top w:type="dxa" w:w="60"/>
+              <w:left w:type="dxa" w:w="100"/>
+              <w:bottom w:type="dxa" w:w="60"/>
+              <w:right w:type="dxa" w:w="100"/>
+            </w:tcMar>
+          </w:tcPr>
+          <w:p>
+            <w:r>
+              <w:rPr>
+                <w:rFonts w:ascii="Calibri" w:cs="Calibri" w:eastAsia="Calibri" w:hAnsi="Calibri"/>
+                <w:sz w:val="19"/>
+                <w:szCs w:val="19"/>
+              </w:rPr>
+              <w:t xml:space="preserve">1.65x to 1.9x</w:t>
             </w:r>
           </w:p>
         </w:tc>
@@ -10119,7 +10119,7 @@
         </w:trPr>
         <w:tc>
           <w:tcPr>
-            <w:tcW w:type="dxa" w:w="1986"/>
+            <w:tcW w:type="dxa" w:w="1211"/>
             <w:tcBorders>
               <w:top w:val="single" w:color="BFBFBF" w:sz="4"/>
               <w:left w:val="single" w:color="BFBFBF" w:sz="4"/>
@@ -10146,7 +10146,7 @@
         </w:tc>
         <w:tc>
           <w:tcPr>
-            <w:tcW w:type="dxa" w:w="1601"/>
+            <w:tcW w:type="dxa" w:w="976"/>
             <w:tcBorders>
               <w:top w:val="single" w:color="BFBFBF" w:sz="4"/>
               <w:left w:val="single" w:color="BFBFBF" w:sz="4"/>
@@ -10173,82 +10173,82 @@
         </w:tc>
         <w:tc>
           <w:tcPr>
-            <w:tcW w:type="dxa" w:w="1986"/>
-            <w:tcBorders>
-              <w:top w:val="single" w:color="BFBFBF" w:sz="4"/>
-              <w:left w:val="single" w:color="BFBFBF" w:sz="4"/>
-              <w:bottom w:val="single" w:color="BFBFBF" w:sz="4"/>
-              <w:right w:val="single" w:color="BFBFBF" w:sz="4"/>
-            </w:tcBorders>
-            <w:tcMar>
-              <w:top w:type="dxa" w:w="60"/>
-              <w:left w:type="dxa" w:w="100"/>
-              <w:bottom w:type="dxa" w:w="60"/>
-              <w:right w:type="dxa" w:w="100"/>
-            </w:tcMar>
-          </w:tcPr>
-          <w:p>
-            <w:r>
-              <w:rPr>
-                <w:rFonts w:ascii="Calibri" w:cs="Calibri" w:eastAsia="Calibri" w:hAnsi="Calibri"/>
-                <w:sz w:val="19"/>
-                <w:szCs w:val="19"/>
-              </w:rPr>
-              <w:t xml:space="preserve">1.89x</w:t>
-            </w:r>
-          </w:p>
-        </w:tc>
-        <w:tc>
-          <w:tcPr>
-            <w:tcW w:type="dxa" w:w="1986"/>
-            <w:tcBorders>
-              <w:top w:val="single" w:color="BFBFBF" w:sz="4"/>
-              <w:left w:val="single" w:color="BFBFBF" w:sz="4"/>
-              <w:bottom w:val="single" w:color="BFBFBF" w:sz="4"/>
-              <w:right w:val="single" w:color="BFBFBF" w:sz="4"/>
-            </w:tcBorders>
-            <w:tcMar>
-              <w:top w:type="dxa" w:w="60"/>
-              <w:left w:type="dxa" w:w="100"/>
-              <w:bottom w:type="dxa" w:w="60"/>
-              <w:right w:type="dxa" w:w="100"/>
-            </w:tcMar>
-          </w:tcPr>
-          <w:p>
-            <w:r>
-              <w:rPr>
-                <w:rFonts w:ascii="Calibri" w:cs="Calibri" w:eastAsia="Calibri" w:hAnsi="Calibri"/>
-                <w:sz w:val="19"/>
-                <w:szCs w:val="19"/>
-              </w:rPr>
-              <w:t xml:space="preserve">2.1x</w:t>
-            </w:r>
-          </w:p>
-        </w:tc>
-        <w:tc>
-          <w:tcPr>
-            <w:tcW w:type="dxa" w:w="1801"/>
-            <w:tcBorders>
-              <w:top w:val="single" w:color="BFBFBF" w:sz="4"/>
-              <w:left w:val="single" w:color="BFBFBF" w:sz="4"/>
-              <w:bottom w:val="single" w:color="BFBFBF" w:sz="4"/>
-              <w:right w:val="single" w:color="BFBFBF" w:sz="4"/>
-            </w:tcBorders>
-            <w:tcMar>
-              <w:top w:type="dxa" w:w="60"/>
-              <w:left w:type="dxa" w:w="100"/>
-              <w:bottom w:type="dxa" w:w="60"/>
-              <w:right w:type="dxa" w:w="100"/>
-            </w:tcMar>
-          </w:tcPr>
-          <w:p>
-            <w:r>
-              <w:rPr>
-                <w:rFonts w:ascii="Calibri" w:cs="Calibri" w:eastAsia="Calibri" w:hAnsi="Calibri"/>
-                <w:sz w:val="19"/>
-                <w:szCs w:val="19"/>
-              </w:rPr>
-              <w:t xml:space="preserve">x8</w:t>
+            <w:tcW w:type="dxa" w:w="3585"/>
+            <w:tcBorders>
+              <w:top w:val="single" w:color="BFBFBF" w:sz="4"/>
+              <w:left w:val="single" w:color="BFBFBF" w:sz="4"/>
+              <w:bottom w:val="single" w:color="BFBFBF" w:sz="4"/>
+              <w:right w:val="single" w:color="BFBFBF" w:sz="4"/>
+            </w:tcBorders>
+            <w:tcMar>
+              <w:top w:type="dxa" w:w="60"/>
+              <w:left w:type="dxa" w:w="100"/>
+              <w:bottom w:type="dxa" w:w="60"/>
+              <w:right w:type="dxa" w:w="100"/>
+            </w:tcMar>
+          </w:tcPr>
+          <w:p>
+            <w:r>
+              <w:rPr>
+                <w:rFonts w:ascii="Calibri" w:cs="Calibri" w:eastAsia="Calibri" w:hAnsi="Calibri"/>
+                <w:sz w:val="19"/>
+                <w:szCs w:val="19"/>
+              </w:rPr>
+              <w:t xml:space="preserve">7x to 10x (average 8.5x)</w:t>
+            </w:r>
+          </w:p>
+        </w:tc>
+        <w:tc>
+          <w:tcPr>
+            <w:tcW w:type="dxa" w:w="1843"/>
+            <w:tcBorders>
+              <w:top w:val="single" w:color="BFBFBF" w:sz="4"/>
+              <w:left w:val="single" w:color="BFBFBF" w:sz="4"/>
+              <w:bottom w:val="single" w:color="BFBFBF" w:sz="4"/>
+              <w:right w:val="single" w:color="BFBFBF" w:sz="4"/>
+            </w:tcBorders>
+            <w:tcMar>
+              <w:top w:type="dxa" w:w="60"/>
+              <w:left w:type="dxa" w:w="100"/>
+              <w:bottom w:type="dxa" w:w="60"/>
+              <w:right w:type="dxa" w:w="100"/>
+            </w:tcMar>
+          </w:tcPr>
+          <w:p>
+            <w:r>
+              <w:rPr>
+                <w:rFonts w:ascii="Calibri" w:cs="Calibri" w:eastAsia="Calibri" w:hAnsi="Calibri"/>
+                <w:sz w:val="19"/>
+                <w:szCs w:val="19"/>
+              </w:rPr>
+              <w:t xml:space="preserve">1.68x to 1.97x</w:t>
+            </w:r>
+          </w:p>
+        </w:tc>
+        <w:tc>
+          <w:tcPr>
+            <w:tcW w:type="dxa" w:w="1745"/>
+            <w:tcBorders>
+              <w:top w:val="single" w:color="BFBFBF" w:sz="4"/>
+              <w:left w:val="single" w:color="BFBFBF" w:sz="4"/>
+              <w:bottom w:val="single" w:color="BFBFBF" w:sz="4"/>
+              <w:right w:val="single" w:color="BFBFBF" w:sz="4"/>
+            </w:tcBorders>
+            <w:tcMar>
+              <w:top w:type="dxa" w:w="60"/>
+              <w:left w:type="dxa" w:w="100"/>
+              <w:bottom w:type="dxa" w:w="60"/>
+              <w:right w:type="dxa" w:w="100"/>
+            </w:tcMar>
+          </w:tcPr>
+          <w:p>
+            <w:r>
+              <w:rPr>
+                <w:rFonts w:ascii="Calibri" w:cs="Calibri" w:eastAsia="Calibri" w:hAnsi="Calibri"/>
+                <w:sz w:val="19"/>
+                <w:szCs w:val="19"/>
+              </w:rPr>
+              <w:t xml:space="preserve">2.2x to 2.5x</w:t>
             </w:r>
           </w:p>
         </w:tc>
@@ -10259,7 +10259,7 @@
         </w:trPr>
         <w:tc>
           <w:tcPr>
-            <w:tcW w:type="dxa" w:w="1986"/>
+            <w:tcW w:type="dxa" w:w="1211"/>
             <w:tcBorders>
               <w:top w:val="single" w:color="BFBFBF" w:sz="4"/>
               <w:left w:val="single" w:color="BFBFBF" w:sz="4"/>
@@ -10286,7 +10286,7 @@
         </w:tc>
         <w:tc>
           <w:tcPr>
-            <w:tcW w:type="dxa" w:w="1601"/>
+            <w:tcW w:type="dxa" w:w="976"/>
             <w:tcBorders>
               <w:top w:val="single" w:color="BFBFBF" w:sz="4"/>
               <w:left w:val="single" w:color="BFBFBF" w:sz="4"/>
@@ -10313,82 +10313,82 @@
         </w:tc>
         <w:tc>
           <w:tcPr>
-            <w:tcW w:type="dxa" w:w="1986"/>
-            <w:tcBorders>
-              <w:top w:val="single" w:color="BFBFBF" w:sz="4"/>
-              <w:left w:val="single" w:color="BFBFBF" w:sz="4"/>
-              <w:bottom w:val="single" w:color="BFBFBF" w:sz="4"/>
-              <w:right w:val="single" w:color="BFBFBF" w:sz="4"/>
-            </w:tcBorders>
-            <w:tcMar>
-              <w:top w:type="dxa" w:w="60"/>
-              <w:left w:type="dxa" w:w="100"/>
-              <w:bottom w:type="dxa" w:w="60"/>
-              <w:right w:type="dxa" w:w="100"/>
-            </w:tcMar>
-          </w:tcPr>
-          <w:p>
-            <w:r>
-              <w:rPr>
-                <w:rFonts w:ascii="Calibri" w:cs="Calibri" w:eastAsia="Calibri" w:hAnsi="Calibri"/>
-                <w:sz w:val="19"/>
-                <w:szCs w:val="19"/>
-              </w:rPr>
-              <w:t xml:space="preserve">2.34x</w:t>
-            </w:r>
-          </w:p>
-        </w:tc>
-        <w:tc>
-          <w:tcPr>
-            <w:tcW w:type="dxa" w:w="1986"/>
-            <w:tcBorders>
-              <w:top w:val="single" w:color="BFBFBF" w:sz="4"/>
-              <w:left w:val="single" w:color="BFBFBF" w:sz="4"/>
-              <w:bottom w:val="single" w:color="BFBFBF" w:sz="4"/>
-              <w:right w:val="single" w:color="BFBFBF" w:sz="4"/>
-            </w:tcBorders>
-            <w:tcMar>
-              <w:top w:type="dxa" w:w="60"/>
-              <w:left w:type="dxa" w:w="100"/>
-              <w:bottom w:type="dxa" w:w="60"/>
-              <w:right w:type="dxa" w:w="100"/>
-            </w:tcMar>
-          </w:tcPr>
-          <w:p>
-            <w:r>
-              <w:rPr>
-                <w:rFonts w:ascii="Calibri" w:cs="Calibri" w:eastAsia="Calibri" w:hAnsi="Calibri"/>
-                <w:sz w:val="19"/>
-                <w:szCs w:val="19"/>
-              </w:rPr>
-              <w:t xml:space="preserve">2.8x</w:t>
-            </w:r>
-          </w:p>
-        </w:tc>
-        <w:tc>
-          <w:tcPr>
-            <w:tcW w:type="dxa" w:w="1801"/>
-            <w:tcBorders>
-              <w:top w:val="single" w:color="BFBFBF" w:sz="4"/>
-              <w:left w:val="single" w:color="BFBFBF" w:sz="4"/>
-              <w:bottom w:val="single" w:color="BFBFBF" w:sz="4"/>
-              <w:right w:val="single" w:color="BFBFBF" w:sz="4"/>
-            </w:tcBorders>
-            <w:tcMar>
-              <w:top w:type="dxa" w:w="60"/>
-              <w:left w:type="dxa" w:w="100"/>
-              <w:bottom w:type="dxa" w:w="60"/>
-              <w:right w:type="dxa" w:w="100"/>
-            </w:tcMar>
-          </w:tcPr>
-          <w:p>
-            <w:r>
-              <w:rPr>
-                <w:rFonts w:ascii="Calibri" w:cs="Calibri" w:eastAsia="Calibri" w:hAnsi="Calibri"/>
-                <w:sz w:val="19"/>
-                <w:szCs w:val="19"/>
-              </w:rPr>
-              <w:t xml:space="preserve">x30</w:t>
+            <w:tcW w:type="dxa" w:w="3585"/>
+            <w:tcBorders>
+              <w:top w:val="single" w:color="BFBFBF" w:sz="4"/>
+              <w:left w:val="single" w:color="BFBFBF" w:sz="4"/>
+              <w:bottom w:val="single" w:color="BFBFBF" w:sz="4"/>
+              <w:right w:val="single" w:color="BFBFBF" w:sz="4"/>
+            </w:tcBorders>
+            <w:tcMar>
+              <w:top w:type="dxa" w:w="60"/>
+              <w:left w:type="dxa" w:w="100"/>
+              <w:bottom w:type="dxa" w:w="60"/>
+              <w:right w:type="dxa" w:w="100"/>
+            </w:tcMar>
+          </w:tcPr>
+          <w:p>
+            <w:r>
+              <w:rPr>
+                <w:rFonts w:ascii="Calibri" w:cs="Calibri" w:eastAsia="Calibri" w:hAnsi="Calibri"/>
+                <w:sz w:val="19"/>
+                <w:szCs w:val="19"/>
+              </w:rPr>
+              <w:t xml:space="preserve">15x</w:t>
+            </w:r>
+          </w:p>
+        </w:tc>
+        <w:tc>
+          <w:tcPr>
+            <w:tcW w:type="dxa" w:w="1843"/>
+            <w:tcBorders>
+              <w:top w:val="single" w:color="BFBFBF" w:sz="4"/>
+              <w:left w:val="single" w:color="BFBFBF" w:sz="4"/>
+              <w:bottom w:val="single" w:color="BFBFBF" w:sz="4"/>
+              <w:right w:val="single" w:color="BFBFBF" w:sz="4"/>
+            </w:tcBorders>
+            <w:tcMar>
+              <w:top w:type="dxa" w:w="60"/>
+              <w:left w:type="dxa" w:w="100"/>
+              <w:bottom w:type="dxa" w:w="60"/>
+              <w:right w:type="dxa" w:w="100"/>
+            </w:tcMar>
+          </w:tcPr>
+          <w:p>
+            <w:r>
+              <w:rPr>
+                <w:rFonts w:ascii="Calibri" w:cs="Calibri" w:eastAsia="Calibri" w:hAnsi="Calibri"/>
+                <w:sz w:val="19"/>
+                <w:szCs w:val="19"/>
+              </w:rPr>
+              <w:t xml:space="preserve">2.37x</w:t>
+            </w:r>
+          </w:p>
+        </w:tc>
+        <w:tc>
+          <w:tcPr>
+            <w:tcW w:type="dxa" w:w="1745"/>
+            <w:tcBorders>
+              <w:top w:val="single" w:color="BFBFBF" w:sz="4"/>
+              <w:left w:val="single" w:color="BFBFBF" w:sz="4"/>
+              <w:bottom w:val="single" w:color="BFBFBF" w:sz="4"/>
+              <w:right w:val="single" w:color="BFBFBF" w:sz="4"/>
+            </w:tcBorders>
+            <w:tcMar>
+              <w:top w:type="dxa" w:w="60"/>
+              <w:left w:type="dxa" w:w="100"/>
+              <w:bottom w:type="dxa" w:w="60"/>
+              <w:right w:type="dxa" w:w="100"/>
+            </w:tcMar>
+          </w:tcPr>
+          <w:p>
+            <w:r>
+              <w:rPr>
+                <w:rFonts w:ascii="Calibri" w:cs="Calibri" w:eastAsia="Calibri" w:hAnsi="Calibri"/>
+                <w:sz w:val="19"/>
+                <w:szCs w:val="19"/>
+              </w:rPr>
+              <w:t xml:space="preserve">2.95x</w:t>
             </w:r>
           </w:p>
         </w:tc>
@@ -10398,6 +10398,64 @@
       <w:pPr>
         <w:spacing w:after="120"/>
       </w:pPr>
+    </w:p>
+    <w:p>
+      <w:pPr>
+        <w:spacing w:after="140"/>
+      </w:pPr>
+      <w:r>
+        <w:rPr>
+          <w:rFonts w:ascii="Calibri" w:cs="Calibri" w:eastAsia="Calibri" w:hAnsi="Calibri"/>
+          <w:b/>
+          <w:bCs/>
+        </w:rPr>
+        <w:t xml:space="preserve">Random sizes (6.1):</w:t>
+      </w:r>
+      <w:r>
+        <w:rPr>
+          <w:rFonts w:ascii="Calibri" w:cs="Calibri" w:eastAsia="Calibri" w:hAnsi="Calibri"/>
+        </w:rPr>
+        <w:t xml:space="preserve"> when an egg spawns it rolls its tier (Big, Huge, Gigantic or none) and then its own size inside the tier's range, rounded to 0.1 (a Big egg can be 3.5x, 3.6x ... 5x). The size is also the money multiplier, so a 4.2x Big egg pays x4.2 and a 5x Big egg pays x5. Names show it: "Big 4.2x Golden Bat". The picture grows slower than the number, because a 15 times taller egg would be taller than a house: drawn scale = size to the power 0.45 for eggs and 0.4 for pets (</w:t>
+      </w:r>
+      <w:r>
+        <w:rPr>
+          <w:rFonts w:ascii="Courier New" w:cs="Courier New" w:eastAsia="Courier New" w:hAnsi="Courier New"/>
+          <w:sz w:val="20"/>
+          <w:szCs w:val="20"/>
+        </w:rPr>
+        <w:t xml:space="preserve">Config.EggScaleExponent</w:t>
+      </w:r>
+      <w:r>
+        <w:rPr>
+          <w:rFonts w:ascii="Calibri" w:cs="Calibri" w:eastAsia="Calibri" w:hAnsi="Calibri"/>
+        </w:rPr>
+        <w:t xml:space="preserve">, </w:t>
+      </w:r>
+      <w:r>
+        <w:rPr>
+          <w:rFonts w:ascii="Courier New" w:cs="Courier New" w:eastAsia="Courier New" w:hAnsi="Courier New"/>
+          <w:sz w:val="20"/>
+          <w:szCs w:val="20"/>
+        </w:rPr>
+        <w:t xml:space="preserve">Config.PetScaleExponent</w:t>
+      </w:r>
+      <w:r>
+        <w:rPr>
+          <w:rFonts w:ascii="Calibri" w:cs="Calibri" w:eastAsia="Calibri" w:hAnsi="Calibri"/>
+        </w:rPr>
+        <w:t xml:space="preserve">); raise them for a more dramatic look. Eggs still carried in the thief's arms are capped at 1.4x.</w:t>
+      </w:r>
+    </w:p>
+    <w:p>
+      <w:pPr>
+        <w:spacing w:after="140"/>
+      </w:pPr>
+      <w:r>
+        <w:rPr>
+          <w:rFonts w:ascii="Calibri" w:cs="Calibri" w:eastAsia="Calibri" w:hAnsi="Calibri"/>
+        </w:rPr>
+        <w:t xml:space="preserve">Before 6.1 the sizes were fixed (Big x3, Huge x8, Gigantic x30, drawn 1.56x, 1.89x, 2.34x). Old saved pets such as "Bat+Big" keep working with those fixed values. The average size multiplier went from 1.83 to 2.03 (+11%): Big and Huge pay more, Gigantic pays less (x30 became x15).</w:t>
+      </w:r>
     </w:p>
     <w:tbl>
       <w:tblPr>
@@ -10895,7 +10953,7 @@
         <w:rPr>
           <w:rFonts w:ascii="Calibri" w:cs="Calibri" w:eastAsia="Calibri" w:hAnsi="Calibri"/>
         </w:rPr>
-        <w:t xml:space="preserve">Multipliers stack: a Gigantic Rainbow pet earns x750 (a Gigantic Rainbow Pumpkin King would earn $11.25M/s, about 1 egg in 20,000). A variant pet is stored as "Bat+Big+Golden" and counts as its plain pet in the Index. All numbers are in </w:t>
+        <w:t xml:space="preserve">Multipliers stack: a Gigantic Rainbow pet earns x375 (a Gigantic Rainbow Pumpkin King would earn $5.6M/s, about 1 egg in 20,000). A variant pet is stored as "Bat+Big4.2+Golden" (the size token carries the rolled multiplier) and counts as its plain pet in the Index. All numbers are in </w:t>
       </w:r>
       <w:r>
         <w:rPr>
@@ -20641,731 +20699,6 @@
     </w:p>
     <w:p>
       <w:pPr>
-        <w:pStyle w:val="Heading2"/>
-      </w:pPr>
-      <w:r>
-        <w:rPr>
-          <w:rFonts w:ascii="Calibri" w:cs="Calibri" w:eastAsia="Calibri" w:hAnsi="Calibri"/>
-        </w:rPr>
-        <w:t xml:space="preserve">2.18 Blood Moon (hourly event)</w:t>
-      </w:r>
-    </w:p>
-    <w:p>
-      <w:pPr>
-        <w:spacing w:after="140"/>
-      </w:pPr>
-      <w:r>
-        <w:rPr>
-          <w:rFonts w:ascii="Calibri" w:cs="Calibri" w:eastAsia="Calibri" w:hAnsi="Calibri"/>
-          <w:b/>
-          <w:bCs/>
-        </w:rPr>
-        <w:t xml:space="preserve">When:</w:t>
-      </w:r>
-      <w:r>
-        <w:rPr>
-          <w:rFonts w:ascii="Calibri" w:cs="Calibri" w:eastAsia="Calibri" w:hAnsi="Calibri"/>
-        </w:rPr>
-        <w:t xml:space="preserve"> every hour at :00 by the real clock (UTC), so every server runs it at the same moment. It lasts 5 minutes (</w:t>
-      </w:r>
-      <w:r>
-        <w:rPr>
-          <w:rFonts w:ascii="Courier New" w:cs="Courier New" w:eastAsia="Courier New" w:hAnsi="Courier New"/>
-          <w:sz w:val="20"/>
-          <w:szCs w:val="20"/>
-        </w:rPr>
-        <w:t xml:space="preserve">Config.BloodMoon.Seconds</w:t>
-      </w:r>
-      <w:r>
-        <w:rPr>
-          <w:rFonts w:ascii="Calibri" w:cs="Calibri" w:eastAsia="Calibri" w:hAnsi="Calibri"/>
-        </w:rPr>
-        <w:t xml:space="preserve">). If a normal night is running it is ended quietly (eggs dropped, nobody sent home) and the Blood Moon starts at once. A </w:t>
-      </w:r>
-      <w:r>
-        <w:rPr>
-          <w:rFonts w:ascii="Calibri" w:cs="Calibri" w:eastAsia="Calibri" w:hAnsi="Calibri"/>
-          <w:b/>
-          <w:bCs/>
-        </w:rPr>
-        <w:t xml:space="preserve">countdown pill</w:t>
-      </w:r>
-      <w:r>
-        <w:rPr>
-          <w:rFonts w:ascii="Calibri" w:cs="Calibri" w:eastAsia="Calibri" w:hAnsi="Calibri"/>
-        </w:rPr>
-        <w:t xml:space="preserve"> ("🩸 BLOOD MOON IN 12:30") sits at the top of the screen under the night/day timer; in the last minute it turns red and pulses, in the last 10 seconds it is big. A red chat warning appears 60 and 10 seconds before.</w:t>
-      </w:r>
-    </w:p>
-    <w:p>
-      <w:pPr>
-        <w:spacing w:after="140"/>
-      </w:pPr>
-      <w:r>
-        <w:rPr>
-          <w:rFonts w:ascii="Calibri" w:cs="Calibri" w:eastAsia="Calibri" w:hAnsi="Calibri"/>
-          <w:b/>
-          <w:bCs/>
-        </w:rPr>
-        <w:t xml:space="preserve">What changes while it lasts</w:t>
-      </w:r>
-    </w:p>
-    <w:tbl>
-      <w:tblPr>
-        <w:tblW w:type="dxa" w:w="9360"/>
-        <w:tblBorders>
-          <w:top w:val="single" w:color="auto" w:sz="4"/>
-          <w:left w:val="single" w:color="auto" w:sz="4"/>
-          <w:bottom w:val="single" w:color="auto" w:sz="4"/>
-          <w:right w:val="single" w:color="auto" w:sz="4"/>
-          <w:insideH w:val="single" w:color="auto" w:sz="4"/>
-          <w:insideV w:val="single" w:color="auto" w:sz="4"/>
-        </w:tblBorders>
-      </w:tblPr>
-      <w:tblGrid>
-        <w:gridCol w:w="2778"/>
-        <w:gridCol w:w="6582"/>
-      </w:tblGrid>
-      <w:tr>
-        <w:trPr>
-          <w:tblHeader/>
-        </w:trPr>
-        <w:tc>
-          <w:tcPr>
-            <w:tcW w:type="dxa" w:w="2778"/>
-            <w:tcBorders>
-              <w:top w:val="single" w:color="BFBFBF" w:sz="4"/>
-              <w:left w:val="single" w:color="BFBFBF" w:sz="4"/>
-              <w:bottom w:val="single" w:color="BFBFBF" w:sz="4"/>
-              <w:right w:val="single" w:color="BFBFBF" w:sz="4"/>
-            </w:tcBorders>
-            <w:shd w:fill="E7E6E6" w:color="auto" w:val="clear"/>
-            <w:tcMar>
-              <w:top w:type="dxa" w:w="60"/>
-              <w:left w:type="dxa" w:w="100"/>
-              <w:bottom w:type="dxa" w:w="60"/>
-              <w:right w:type="dxa" w:w="100"/>
-            </w:tcMar>
-          </w:tcPr>
-          <w:p>
-            <w:r>
-              <w:rPr>
-                <w:rFonts w:ascii="Calibri" w:cs="Calibri" w:eastAsia="Calibri" w:hAnsi="Calibri"/>
-                <w:b/>
-                <w:bCs/>
-                <w:sz w:val="19"/>
-                <w:szCs w:val="19"/>
-              </w:rPr>
-              <w:t xml:space="preserve">Area</w:t>
-            </w:r>
-          </w:p>
-        </w:tc>
-        <w:tc>
-          <w:tcPr>
-            <w:tcW w:type="dxa" w:w="6582"/>
-            <w:tcBorders>
-              <w:top w:val="single" w:color="BFBFBF" w:sz="4"/>
-              <w:left w:val="single" w:color="BFBFBF" w:sz="4"/>
-              <w:bottom w:val="single" w:color="BFBFBF" w:sz="4"/>
-              <w:right w:val="single" w:color="BFBFBF" w:sz="4"/>
-            </w:tcBorders>
-            <w:shd w:fill="E7E6E6" w:color="auto" w:val="clear"/>
-            <w:tcMar>
-              <w:top w:type="dxa" w:w="60"/>
-              <w:left w:type="dxa" w:w="100"/>
-              <w:bottom w:type="dxa" w:w="60"/>
-              <w:right w:type="dxa" w:w="100"/>
-            </w:tcMar>
-          </w:tcPr>
-          <w:p>
-            <w:r>
-              <w:rPr>
-                <w:rFonts w:ascii="Calibri" w:cs="Calibri" w:eastAsia="Calibri" w:hAnsi="Calibri"/>
-                <w:b/>
-                <w:bCs/>
-                <w:sz w:val="19"/>
-                <w:szCs w:val="19"/>
-              </w:rPr>
-              <w:t xml:space="preserve">Change</w:t>
-            </w:r>
-          </w:p>
-        </w:tc>
-      </w:tr>
-      <w:tr>
-        <w:trPr>
-          <w:cantSplit/>
-        </w:trPr>
-        <w:tc>
-          <w:tcPr>
-            <w:tcW w:type="dxa" w:w="2778"/>
-            <w:tcBorders>
-              <w:top w:val="single" w:color="BFBFBF" w:sz="4"/>
-              <w:left w:val="single" w:color="BFBFBF" w:sz="4"/>
-              <w:bottom w:val="single" w:color="BFBFBF" w:sz="4"/>
-              <w:right w:val="single" w:color="BFBFBF" w:sz="4"/>
-            </w:tcBorders>
-            <w:tcMar>
-              <w:top w:type="dxa" w:w="60"/>
-              <w:left w:type="dxa" w:w="100"/>
-              <w:bottom w:type="dxa" w:w="60"/>
-              <w:right w:type="dxa" w:w="100"/>
-            </w:tcMar>
-          </w:tcPr>
-          <w:p>
-            <w:r>
-              <w:rPr>
-                <w:rFonts w:ascii="Calibri" w:cs="Calibri" w:eastAsia="Calibri" w:hAnsi="Calibri"/>
-                <w:sz w:val="19"/>
-                <w:szCs w:val="19"/>
-              </w:rPr>
-              <w:t xml:space="preserve">Sky and mood</w:t>
-            </w:r>
-          </w:p>
-        </w:tc>
-        <w:tc>
-          <w:tcPr>
-            <w:tcW w:type="dxa" w:w="6582"/>
-            <w:tcBorders>
-              <w:top w:val="single" w:color="BFBFBF" w:sz="4"/>
-              <w:left w:val="single" w:color="BFBFBF" w:sz="4"/>
-              <w:bottom w:val="single" w:color="BFBFBF" w:sz="4"/>
-              <w:right w:val="single" w:color="BFBFBF" w:sz="4"/>
-            </w:tcBorders>
-            <w:tcMar>
-              <w:top w:type="dxa" w:w="60"/>
-              <w:left w:type="dxa" w:w="100"/>
-              <w:bottom w:type="dxa" w:w="60"/>
-              <w:right w:type="dxa" w:w="100"/>
-            </w:tcMar>
-          </w:tcPr>
-          <w:p>
-            <w:r>
-              <w:rPr>
-                <w:rFonts w:ascii="Calibri" w:cs="Calibri" w:eastAsia="Calibri" w:hAnsi="Calibri"/>
-                <w:sz w:val="19"/>
-                <w:szCs w:val="19"/>
-              </w:rPr>
-              <w:t xml:space="preserve">Red sky and fog, a huge red moon, lightning flashes with thunder, a red banner, a rising-moon sound</w:t>
-            </w:r>
-          </w:p>
-        </w:tc>
-      </w:tr>
-      <w:tr>
-        <w:trPr>
-          <w:cantSplit/>
-        </w:trPr>
-        <w:tc>
-          <w:tcPr>
-            <w:tcW w:type="dxa" w:w="2778"/>
-            <w:tcBorders>
-              <w:top w:val="single" w:color="BFBFBF" w:sz="4"/>
-              <w:left w:val="single" w:color="BFBFBF" w:sz="4"/>
-              <w:bottom w:val="single" w:color="BFBFBF" w:sz="4"/>
-              <w:right w:val="single" w:color="BFBFBF" w:sz="4"/>
-            </w:tcBorders>
-            <w:tcMar>
-              <w:top w:type="dxa" w:w="60"/>
-              <w:left w:type="dxa" w:w="100"/>
-              <w:bottom w:type="dxa" w:w="60"/>
-              <w:right w:type="dxa" w:w="100"/>
-            </w:tcMar>
-          </w:tcPr>
-          <w:p>
-            <w:r>
-              <w:rPr>
-                <w:rFonts w:ascii="Calibri" w:cs="Calibri" w:eastAsia="Calibri" w:hAnsi="Calibri"/>
-                <w:sz w:val="19"/>
-                <w:szCs w:val="19"/>
-              </w:rPr>
-              <w:t xml:space="preserve">Music</w:t>
-            </w:r>
-          </w:p>
-        </w:tc>
-        <w:tc>
-          <w:tcPr>
-            <w:tcW w:type="dxa" w:w="6582"/>
-            <w:tcBorders>
-              <w:top w:val="single" w:color="BFBFBF" w:sz="4"/>
-              <w:left w:val="single" w:color="BFBFBF" w:sz="4"/>
-              <w:bottom w:val="single" w:color="BFBFBF" w:sz="4"/>
-              <w:right w:val="single" w:color="BFBFBF" w:sz="4"/>
-            </w:tcBorders>
-            <w:tcMar>
-              <w:top w:type="dxa" w:w="60"/>
-              <w:left w:type="dxa" w:w="100"/>
-              <w:bottom w:type="dxa" w:w="60"/>
-              <w:right w:type="dxa" w:w="100"/>
-            </w:tcMar>
-          </w:tcPr>
-          <w:p>
-            <w:r>
-              <w:rPr>
-                <w:rFonts w:ascii="Calibri" w:cs="Calibri" w:eastAsia="Calibri" w:hAnsi="Calibri"/>
-                <w:sz w:val="19"/>
-                <w:szCs w:val="19"/>
-              </w:rPr>
-              <w:t xml:space="preserve">An ominous track (low drone, heartbeat, far bells) replaces the chill theme; the chase music still takes over during chases</w:t>
-            </w:r>
-          </w:p>
-        </w:tc>
-      </w:tr>
-      <w:tr>
-        <w:trPr>
-          <w:cantSplit/>
-        </w:trPr>
-        <w:tc>
-          <w:tcPr>
-            <w:tcW w:type="dxa" w:w="2778"/>
-            <w:tcBorders>
-              <w:top w:val="single" w:color="BFBFBF" w:sz="4"/>
-              <w:left w:val="single" w:color="BFBFBF" w:sz="4"/>
-              <w:bottom w:val="single" w:color="BFBFBF" w:sz="4"/>
-              <w:right w:val="single" w:color="BFBFBF" w:sz="4"/>
-            </w:tcBorders>
-            <w:tcMar>
-              <w:top w:type="dxa" w:w="60"/>
-              <w:left w:type="dxa" w:w="100"/>
-              <w:bottom w:type="dxa" w:w="60"/>
-              <w:right w:type="dxa" w:w="100"/>
-            </w:tcMar>
-          </w:tcPr>
-          <w:p>
-            <w:r>
-              <w:rPr>
-                <w:rFonts w:ascii="Calibri" w:cs="Calibri" w:eastAsia="Calibri" w:hAnsi="Calibri"/>
-                <w:sz w:val="19"/>
-                <w:szCs w:val="19"/>
-              </w:rPr>
-              <w:t xml:space="preserve">Eggs</w:t>
-            </w:r>
-          </w:p>
-        </w:tc>
-        <w:tc>
-          <w:tcPr>
-            <w:tcW w:type="dxa" w:w="6582"/>
-            <w:tcBorders>
-              <w:top w:val="single" w:color="BFBFBF" w:sz="4"/>
-              <w:left w:val="single" w:color="BFBFBF" w:sz="4"/>
-              <w:bottom w:val="single" w:color="BFBFBF" w:sz="4"/>
-              <w:right w:val="single" w:color="BFBFBF" w:sz="4"/>
-            </w:tcBorders>
-            <w:tcMar>
-              <w:top w:type="dxa" w:w="60"/>
-              <w:left w:type="dxa" w:w="100"/>
-              <w:bottom w:type="dxa" w:w="60"/>
-              <w:right w:type="dxa" w:w="100"/>
-            </w:tcMar>
-          </w:tcPr>
-          <w:p>
-            <w:r>
-              <w:rPr>
-                <w:rFonts w:ascii="Calibri" w:cs="Calibri" w:eastAsia="Calibri" w:hAnsi="Calibri"/>
-                <w:sz w:val="19"/>
-                <w:szCs w:val="19"/>
-              </w:rPr>
-              <w:t xml:space="preserve">Each house puts a Blood Moon Egg (the Legendary egg, pets like the Blood Moon Bat) on some spots: 15% / 15% / 20% / 30% / 35% for houses 1 to 5 and 35% for the rest. Spots are fixed, so this replaces eggs instead of adding more</w:t>
-            </w:r>
-          </w:p>
-        </w:tc>
-      </w:tr>
-      <w:tr>
-        <w:trPr>
-          <w:cantSplit/>
-        </w:trPr>
-        <w:tc>
-          <w:tcPr>
-            <w:tcW w:type="dxa" w:w="2778"/>
-            <w:tcBorders>
-              <w:top w:val="single" w:color="BFBFBF" w:sz="4"/>
-              <w:left w:val="single" w:color="BFBFBF" w:sz="4"/>
-              <w:bottom w:val="single" w:color="BFBFBF" w:sz="4"/>
-              <w:right w:val="single" w:color="BFBFBF" w:sz="4"/>
-            </w:tcBorders>
-            <w:tcMar>
-              <w:top w:type="dxa" w:w="60"/>
-              <w:left w:type="dxa" w:w="100"/>
-              <w:bottom w:type="dxa" w:w="60"/>
-              <w:right w:type="dxa" w:w="100"/>
-            </w:tcMar>
-          </w:tcPr>
-          <w:p>
-            <w:r>
-              <w:rPr>
-                <w:rFonts w:ascii="Calibri" w:cs="Calibri" w:eastAsia="Calibri" w:hAnsi="Calibri"/>
-                <w:sz w:val="19"/>
-                <w:szCs w:val="19"/>
-              </w:rPr>
-              <w:t xml:space="preserve">Variant luck</w:t>
-            </w:r>
-          </w:p>
-        </w:tc>
-        <w:tc>
-          <w:tcPr>
-            <w:tcW w:type="dxa" w:w="6582"/>
-            <w:tcBorders>
-              <w:top w:val="single" w:color="BFBFBF" w:sz="4"/>
-              <w:left w:val="single" w:color="BFBFBF" w:sz="4"/>
-              <w:bottom w:val="single" w:color="BFBFBF" w:sz="4"/>
-              <w:right w:val="single" w:color="BFBFBF" w:sz="4"/>
-            </w:tcBorders>
-            <w:tcMar>
-              <w:top w:type="dxa" w:w="60"/>
-              <w:left w:type="dxa" w:w="100"/>
-              <w:bottom w:type="dxa" w:w="60"/>
-              <w:right w:type="dxa" w:w="100"/>
-            </w:tcMar>
-          </w:tcPr>
-          <w:p>
-            <w:r>
-              <w:rPr>
-                <w:rFonts w:ascii="Calibri" w:cs="Calibri" w:eastAsia="Calibri" w:hAnsi="Calibri"/>
-                <w:sz w:val="19"/>
-                <w:szCs w:val="19"/>
-              </w:rPr>
-              <w:t xml:space="preserve">Every Big / Huge / Gigantic and Golden / Diamond / Rainbow chance is doubled for eggs spawned that night</w:t>
-            </w:r>
-          </w:p>
-        </w:tc>
-      </w:tr>
-      <w:tr>
-        <w:trPr>
-          <w:cantSplit/>
-        </w:trPr>
-        <w:tc>
-          <w:tcPr>
-            <w:tcW w:type="dxa" w:w="2778"/>
-            <w:tcBorders>
-              <w:top w:val="single" w:color="BFBFBF" w:sz="4"/>
-              <w:left w:val="single" w:color="BFBFBF" w:sz="4"/>
-              <w:bottom w:val="single" w:color="BFBFBF" w:sz="4"/>
-              <w:right w:val="single" w:color="BFBFBF" w:sz="4"/>
-            </w:tcBorders>
-            <w:tcMar>
-              <w:top w:type="dxa" w:w="60"/>
-              <w:left w:type="dxa" w:w="100"/>
-              <w:bottom w:type="dxa" w:w="60"/>
-              <w:right w:type="dxa" w:w="100"/>
-            </w:tcMar>
-          </w:tcPr>
-          <w:p>
-            <w:r>
-              <w:rPr>
-                <w:rFonts w:ascii="Calibri" w:cs="Calibri" w:eastAsia="Calibri" w:hAnsi="Calibri"/>
-                <w:sz w:val="19"/>
-                <w:szCs w:val="19"/>
-              </w:rPr>
-              <w:t xml:space="preserve">Blood variant</w:t>
-            </w:r>
-          </w:p>
-        </w:tc>
-        <w:tc>
-          <w:tcPr>
-            <w:tcW w:type="dxa" w:w="6582"/>
-            <w:tcBorders>
-              <w:top w:val="single" w:color="BFBFBF" w:sz="4"/>
-              <w:left w:val="single" w:color="BFBFBF" w:sz="4"/>
-              <w:bottom w:val="single" w:color="BFBFBF" w:sz="4"/>
-              <w:right w:val="single" w:color="BFBFBF" w:sz="4"/>
-            </w:tcBorders>
-            <w:tcMar>
-              <w:top w:type="dxa" w:w="60"/>
-              <w:left w:type="dxa" w:w="100"/>
-              <w:bottom w:type="dxa" w:w="60"/>
-              <w:right w:type="dxa" w:w="100"/>
-            </w:tcMar>
-          </w:tcPr>
-          <w:p>
-            <w:r>
-              <w:rPr>
-                <w:rFonts w:ascii="Calibri" w:cs="Calibri" w:eastAsia="Calibri" w:hAnsi="Calibri"/>
-                <w:sz w:val="19"/>
-                <w:szCs w:val="19"/>
-              </w:rPr>
-              <w:t xml:space="preserve">A new material that only drops during the event (3%, 6% with the doubled luck): x15 income, red glow. It stacks with sizes like the others (a "Big Blood Bat")</w:t>
-            </w:r>
-          </w:p>
-        </w:tc>
-      </w:tr>
-      <w:tr>
-        <w:trPr>
-          <w:cantSplit/>
-        </w:trPr>
-        <w:tc>
-          <w:tcPr>
-            <w:tcW w:type="dxa" w:w="2778"/>
-            <w:tcBorders>
-              <w:top w:val="single" w:color="BFBFBF" w:sz="4"/>
-              <w:left w:val="single" w:color="BFBFBF" w:sz="4"/>
-              <w:bottom w:val="single" w:color="BFBFBF" w:sz="4"/>
-              <w:right w:val="single" w:color="BFBFBF" w:sz="4"/>
-            </w:tcBorders>
-            <w:tcMar>
-              <w:top w:type="dxa" w:w="60"/>
-              <w:left w:type="dxa" w:w="100"/>
-              <w:bottom w:type="dxa" w:w="60"/>
-              <w:right w:type="dxa" w:w="100"/>
-            </w:tcMar>
-          </w:tcPr>
-          <w:p>
-            <w:r>
-              <w:rPr>
-                <w:rFonts w:ascii="Calibri" w:cs="Calibri" w:eastAsia="Calibri" w:hAnsi="Calibri"/>
-                <w:sz w:val="19"/>
-                <w:szCs w:val="19"/>
-              </w:rPr>
-              <w:t xml:space="preserve">Angrier owners</w:t>
-            </w:r>
-          </w:p>
-        </w:tc>
-        <w:tc>
-          <w:tcPr>
-            <w:tcW w:type="dxa" w:w="6582"/>
-            <w:tcBorders>
-              <w:top w:val="single" w:color="BFBFBF" w:sz="4"/>
-              <w:left w:val="single" w:color="BFBFBF" w:sz="4"/>
-              <w:bottom w:val="single" w:color="BFBFBF" w:sz="4"/>
-              <w:right w:val="single" w:color="BFBFBF" w:sz="4"/>
-            </w:tcBorders>
-            <w:tcMar>
-              <w:top w:type="dxa" w:w="60"/>
-              <w:left w:type="dxa" w:w="100"/>
-              <w:bottom w:type="dxa" w:w="60"/>
-              <w:right w:type="dxa" w:w="100"/>
-            </w:tcMar>
-          </w:tcPr>
-          <w:p>
-            <w:r>
-              <w:rPr>
-                <w:rFonts w:ascii="Calibri" w:cs="Calibri" w:eastAsia="Calibri" w:hAnsi="Calibri"/>
-                <w:sz w:val="19"/>
-                <w:szCs w:val="19"/>
-              </w:rPr>
-              <w:t xml:space="preserve">18% faster, notice a thief in 60% of the usual time, give up after 1.5x as long</w:t>
-            </w:r>
-          </w:p>
-        </w:tc>
-      </w:tr>
-      <w:tr>
-        <w:trPr>
-          <w:cantSplit/>
-        </w:trPr>
-        <w:tc>
-          <w:tcPr>
-            <w:tcW w:type="dxa" w:w="2778"/>
-            <w:tcBorders>
-              <w:top w:val="single" w:color="BFBFBF" w:sz="4"/>
-              <w:left w:val="single" w:color="BFBFBF" w:sz="4"/>
-              <w:bottom w:val="single" w:color="BFBFBF" w:sz="4"/>
-              <w:right w:val="single" w:color="BFBFBF" w:sz="4"/>
-            </w:tcBorders>
-            <w:tcMar>
-              <w:top w:type="dxa" w:w="60"/>
-              <w:left w:type="dxa" w:w="100"/>
-              <w:bottom w:type="dxa" w:w="60"/>
-              <w:right w:type="dxa" w:w="100"/>
-            </w:tcMar>
-          </w:tcPr>
-          <w:p>
-            <w:r>
-              <w:rPr>
-                <w:rFonts w:ascii="Calibri" w:cs="Calibri" w:eastAsia="Calibri" w:hAnsi="Calibri"/>
-                <w:sz w:val="19"/>
-                <w:szCs w:val="19"/>
-              </w:rPr>
-              <w:t xml:space="preserve">Blood Moon Quest</w:t>
-            </w:r>
-          </w:p>
-        </w:tc>
-        <w:tc>
-          <w:tcPr>
-            <w:tcW w:type="dxa" w:w="6582"/>
-            <w:tcBorders>
-              <w:top w:val="single" w:color="BFBFBF" w:sz="4"/>
-              <w:left w:val="single" w:color="BFBFBF" w:sz="4"/>
-              <w:bottom w:val="single" w:color="BFBFBF" w:sz="4"/>
-              <w:right w:val="single" w:color="BFBFBF" w:sz="4"/>
-            </w:tcBorders>
-            <w:tcMar>
-              <w:top w:type="dxa" w:w="60"/>
-              <w:left w:type="dxa" w:w="100"/>
-              <w:bottom w:type="dxa" w:w="60"/>
-              <w:right w:type="dxa" w:w="100"/>
-            </w:tcMar>
-          </w:tcPr>
-          <w:p>
-            <w:r>
-              <w:rPr>
-                <w:rFonts w:ascii="Calibri" w:cs="Calibri" w:eastAsia="Calibri" w:hAnsi="Calibri"/>
-                <w:sz w:val="19"/>
-                <w:szCs w:val="19"/>
-              </w:rPr>
-              <w:t xml:space="preserve">"Bring 4 eggs home" (about 8 minutes of effort, reward worth 1.2x), shown on top of the Quests window; finishing it opens a chest with an egg and a potion</w:t>
-            </w:r>
-          </w:p>
-        </w:tc>
-      </w:tr>
-      <w:tr>
-        <w:trPr>
-          <w:cantSplit/>
-        </w:trPr>
-        <w:tc>
-          <w:tcPr>
-            <w:tcW w:type="dxa" w:w="2778"/>
-            <w:tcBorders>
-              <w:top w:val="single" w:color="BFBFBF" w:sz="4"/>
-              <w:left w:val="single" w:color="BFBFBF" w:sz="4"/>
-              <w:bottom w:val="single" w:color="BFBFBF" w:sz="4"/>
-              <w:right w:val="single" w:color="BFBFBF" w:sz="4"/>
-            </w:tcBorders>
-            <w:tcMar>
-              <w:top w:type="dxa" w:w="60"/>
-              <w:left w:type="dxa" w:w="100"/>
-              <w:bottom w:type="dxa" w:w="60"/>
-              <w:right w:type="dxa" w:w="100"/>
-            </w:tcMar>
-          </w:tcPr>
-          <w:p>
-            <w:r>
-              <w:rPr>
-                <w:rFonts w:ascii="Calibri" w:cs="Calibri" w:eastAsia="Calibri" w:hAnsi="Calibri"/>
-                <w:sz w:val="19"/>
-                <w:szCs w:val="19"/>
-              </w:rPr>
-              <w:t xml:space="preserve">Reward for everyone</w:t>
-            </w:r>
-          </w:p>
-        </w:tc>
-        <w:tc>
-          <w:tcPr>
-            <w:tcW w:type="dxa" w:w="6582"/>
-            <w:tcBorders>
-              <w:top w:val="single" w:color="BFBFBF" w:sz="4"/>
-              <w:left w:val="single" w:color="BFBFBF" w:sz="4"/>
-              <w:bottom w:val="single" w:color="BFBFBF" w:sz="4"/>
-              <w:right w:val="single" w:color="BFBFBF" w:sz="4"/>
-            </w:tcBorders>
-            <w:tcMar>
-              <w:top w:type="dxa" w:w="60"/>
-              <w:left w:type="dxa" w:w="100"/>
-              <w:bottom w:type="dxa" w:w="60"/>
-              <w:right w:type="dxa" w:w="100"/>
-            </w:tcMar>
-          </w:tcPr>
-          <w:p>
-            <w:r>
-              <w:rPr>
-                <w:rFonts w:ascii="Calibri" w:cs="Calibri" w:eastAsia="Calibri" w:hAnsi="Calibri"/>
-                <w:sz w:val="19"/>
-                <w:szCs w:val="19"/>
-              </w:rPr>
-              <w:t xml:space="preserve">Everyone who brought at least 1 egg home gets a random potion when it ends</w:t>
-            </w:r>
-          </w:p>
-        </w:tc>
-      </w:tr>
-    </w:tbl>
-    <w:p>
-      <w:pPr>
-        <w:spacing w:after="120"/>
-      </w:pPr>
-    </w:p>
-    <w:p>
-      <w:pPr>
-        <w:spacing w:after="140"/>
-      </w:pPr>
-      <w:r>
-        <w:rPr>
-          <w:rFonts w:ascii="Calibri" w:cs="Calibri" w:eastAsia="Calibri" w:hAnsi="Calibri"/>
-        </w:rPr>
-        <w:t xml:space="preserve">New pets and models: none. The Blood variant and the Blood Moon Egg use the existing glow and the existing (block) models. Everything is tuned in </w:t>
-      </w:r>
-      <w:r>
-        <w:rPr>
-          <w:rFonts w:ascii="Courier New" w:cs="Courier New" w:eastAsia="Courier New" w:hAnsi="Courier New"/>
-          <w:sz w:val="20"/>
-          <w:szCs w:val="20"/>
-        </w:rPr>
-        <w:t xml:space="preserve">Config.BloodMoon</w:t>
-      </w:r>
-      <w:r>
-        <w:rPr>
-          <w:rFonts w:ascii="Calibri" w:cs="Calibri" w:eastAsia="Calibri" w:hAnsi="Calibri"/>
-        </w:rPr>
-        <w:t xml:space="preserve"> (and the Blood entry in </w:t>
-      </w:r>
-      <w:r>
-        <w:rPr>
-          <w:rFonts w:ascii="Courier New" w:cs="Courier New" w:eastAsia="Courier New" w:hAnsi="Courier New"/>
-          <w:sz w:val="20"/>
-          <w:szCs w:val="20"/>
-        </w:rPr>
-        <w:t xml:space="preserve">Config.Materials</w:t>
-      </w:r>
-      <w:r>
-        <w:rPr>
-          <w:rFonts w:ascii="Calibri" w:cs="Calibri" w:eastAsia="Calibri" w:hAnsi="Calibri"/>
-        </w:rPr>
-        <w:t xml:space="preserve">). The Admin panel has a "Start the Blood Moon now" button. The new audio files are </w:t>
-      </w:r>
-      <w:r>
-        <w:rPr>
-          <w:rFonts w:ascii="Courier New" w:cs="Courier New" w:eastAsia="Courier New" w:hAnsi="Courier New"/>
-          <w:sz w:val="20"/>
-          <w:szCs w:val="20"/>
-        </w:rPr>
-        <w:t xml:space="preserve">music_blood.mp3</w:t>
-      </w:r>
-      <w:r>
-        <w:rPr>
-          <w:rFonts w:ascii="Calibri" w:cs="Calibri" w:eastAsia="Calibri" w:hAnsi="Calibri"/>
-        </w:rPr>
-        <w:t xml:space="preserve">, </w:t>
-      </w:r>
-      <w:r>
-        <w:rPr>
-          <w:rFonts w:ascii="Courier New" w:cs="Courier New" w:eastAsia="Courier New" w:hAnsi="Courier New"/>
-          <w:sz w:val="20"/>
-          <w:szCs w:val="20"/>
-        </w:rPr>
-        <w:t xml:space="preserve">blood_rise.mp3</w:t>
-      </w:r>
-      <w:r>
-        <w:rPr>
-          <w:rFonts w:ascii="Calibri" w:cs="Calibri" w:eastAsia="Calibri" w:hAnsi="Calibri"/>
-        </w:rPr>
-        <w:t xml:space="preserve"> and </w:t>
-      </w:r>
-      <w:r>
-        <w:rPr>
-          <w:rFonts w:ascii="Courier New" w:cs="Courier New" w:eastAsia="Courier New" w:hAnsi="Courier New"/>
-          <w:sz w:val="20"/>
-          <w:szCs w:val="20"/>
-        </w:rPr>
-        <w:t xml:space="preserve">thunder.mp3</w:t>
-      </w:r>
-      <w:r>
-        <w:rPr>
-          <w:rFonts w:ascii="Calibri" w:cs="Calibri" w:eastAsia="Calibri" w:hAnsi="Calibri"/>
-        </w:rPr>
-        <w:t xml:space="preserve">; paste their ids into </w:t>
-      </w:r>
-      <w:r>
-        <w:rPr>
-          <w:rFonts w:ascii="Courier New" w:cs="Courier New" w:eastAsia="Courier New" w:hAnsi="Courier New"/>
-          <w:sz w:val="20"/>
-          <w:szCs w:val="20"/>
-        </w:rPr>
-        <w:t xml:space="preserve">Config.Audio</w:t>
-      </w:r>
-      <w:r>
-        <w:rPr>
-          <w:rFonts w:ascii="Calibri" w:cs="Calibri" w:eastAsia="Calibri" w:hAnsi="Calibri"/>
-        </w:rPr>
-        <w:t xml:space="preserve">.</w:t>
-      </w:r>
-    </w:p>
-    <w:p>
-      <w:pPr>
         <w:pStyle w:val="Heading1"/>
       </w:pPr>
       <w:r>
@@ -23895,7 +23228,7 @@
         <w:rPr>
           <w:rFonts w:ascii="Calibri" w:cs="Calibri" w:eastAsia="Calibri" w:hAnsi="Calibri"/>
         </w:rPr>
-        <w:t xml:space="preserve"> Check in play that a Gigantic Rainbow jackpot (x750) feels exciting and does not break the economy, and whether big eggs should also be heavier to carry.</w:t>
+        <w:t xml:space="preserve"> Check in play that a Gigantic Rainbow jackpot (x375) feels exciting and does not break the economy, and whether big eggs should also be heavier to carry.</w:t>
       </w:r>
     </w:p>
     <w:p>

</xml_diff>

<commit_message>
Egg sizes: pets drawn at their rolled size (Big 2.5-4x, Huge 5-7x, Gigantic 10x), eggs half as big, money multiplier Big x3.5-5, Huge x7-10, Gigantic x15
Co-Authored-By: Claude Sonnet 5.5 <noreply@anthropic.com>
Claude-Session: https://claude.ai/code/session_013ivEnYiZGofRBeqQFKAVhJ
</commit_message>
<xml_diff>
--- a/docs/Spooky-Steal-Design-and-Plan.docx
+++ b/docs/Spooky-Steal-Design-and-Plan.docx
@@ -1173,7 +1173,7 @@
                 <w:sz w:val="19"/>
                 <w:szCs w:val="19"/>
               </w:rPr>
-              <w:t xml:space="preserve">Every Big, Huge and Gigantic egg now gets its own random size, and the money multiplier is that size: Big 3.5x to 5x, Huge 7x to 10x, Gigantic 15x (before: fixed x3, x8 and x30). See 2.8. The Blood Moon event is shelved for now; it stays in the git history (commits 346b54e and 4d825cd).</w:t>
+              <w:t xml:space="preserve">Every Big, Huge and Gigantic egg now gets its own random size, and the money multiplier is that size: Big pets are drawn 2.5x to 4x bigger and pay x3.5 to x5, Huge 5x to 7x and x7 to x10, Gigantic 10x and x15 (before: fixed x3, x8 and x30). Eggs are drawn half as big as the pet. See 2.8. The Blood Moon event is shelved for now; it stays in the git history (commits 346b54e and 4d825cd).</w:t>
             </w:r>
           </w:p>
         </w:tc>
@@ -9672,11 +9672,11 @@
         </w:tblBorders>
       </w:tblPr>
       <w:tblGrid>
-        <w:gridCol w:w="1211"/>
-        <w:gridCol w:w="976"/>
-        <w:gridCol w:w="3585"/>
-        <w:gridCol w:w="1843"/>
-        <w:gridCol w:w="1745"/>
+        <w:gridCol w:w="1094"/>
+        <w:gridCol w:w="881"/>
+        <w:gridCol w:w="2648"/>
+        <w:gridCol w:w="2724"/>
+        <w:gridCol w:w="2013"/>
       </w:tblGrid>
       <w:tr>
         <w:trPr>
@@ -9684,7 +9684,7 @@
         </w:trPr>
         <w:tc>
           <w:tcPr>
-            <w:tcW w:type="dxa" w:w="1211"/>
+            <w:tcW w:type="dxa" w:w="1094"/>
             <w:tcBorders>
               <w:top w:val="single" w:color="BFBFBF" w:sz="4"/>
               <w:left w:val="single" w:color="BFBFBF" w:sz="4"/>
@@ -9714,7 +9714,7 @@
         </w:tc>
         <w:tc>
           <w:tcPr>
-            <w:tcW w:type="dxa" w:w="976"/>
+            <w:tcW w:type="dxa" w:w="881"/>
             <w:tcBorders>
               <w:top w:val="single" w:color="BFBFBF" w:sz="4"/>
               <w:left w:val="single" w:color="BFBFBF" w:sz="4"/>
@@ -9744,7 +9744,7 @@
         </w:tc>
         <w:tc>
           <w:tcPr>
-            <w:tcW w:type="dxa" w:w="3585"/>
+            <w:tcW w:type="dxa" w:w="2648"/>
             <w:tcBorders>
               <w:top w:val="single" w:color="BFBFBF" w:sz="4"/>
               <w:left w:val="single" w:color="BFBFBF" w:sz="4"/>
@@ -9768,13 +9768,13 @@
                 <w:sz w:val="19"/>
                 <w:szCs w:val="19"/>
               </w:rPr>
-              <w:t xml:space="preserve">Random size (= Money/s multiplier)</w:t>
-            </w:r>
-          </w:p>
-        </w:tc>
-        <w:tc>
-          <w:tcPr>
-            <w:tcW w:type="dxa" w:w="1843"/>
+              <w:t xml:space="preserve">Pet drawn at (random)</w:t>
+            </w:r>
+          </w:p>
+        </w:tc>
+        <w:tc>
+          <w:tcPr>
+            <w:tcW w:type="dxa" w:w="2724"/>
             <w:tcBorders>
               <w:top w:val="single" w:color="BFBFBF" w:sz="4"/>
               <w:left w:val="single" w:color="BFBFBF" w:sz="4"/>
@@ -9798,13 +9798,13 @@
                 <w:sz w:val="19"/>
                 <w:szCs w:val="19"/>
               </w:rPr>
-              <w:t xml:space="preserve">Egg drawn at</w:t>
-            </w:r>
-          </w:p>
-        </w:tc>
-        <w:tc>
-          <w:tcPr>
-            <w:tcW w:type="dxa" w:w="1745"/>
+              <w:t xml:space="preserve">Egg drawn at (half of that)</w:t>
+            </w:r>
+          </w:p>
+        </w:tc>
+        <w:tc>
+          <w:tcPr>
+            <w:tcW w:type="dxa" w:w="2013"/>
             <w:tcBorders>
               <w:top w:val="single" w:color="BFBFBF" w:sz="4"/>
               <w:left w:val="single" w:color="BFBFBF" w:sz="4"/>
@@ -9828,7 +9828,7 @@
                 <w:sz w:val="19"/>
                 <w:szCs w:val="19"/>
               </w:rPr>
-              <w:t xml:space="preserve">Pet drawn at</w:t>
+              <w:t xml:space="preserve">Money/s multiplier</w:t>
             </w:r>
           </w:p>
         </w:tc>
@@ -9839,7 +9839,7 @@
         </w:trPr>
         <w:tc>
           <w:tcPr>
-            <w:tcW w:type="dxa" w:w="1211"/>
+            <w:tcW w:type="dxa" w:w="1094"/>
             <w:tcBorders>
               <w:top w:val="single" w:color="BFBFBF" w:sz="4"/>
               <w:left w:val="single" w:color="BFBFBF" w:sz="4"/>
@@ -9866,7 +9866,7 @@
         </w:tc>
         <w:tc>
           <w:tcPr>
-            <w:tcW w:type="dxa" w:w="976"/>
+            <w:tcW w:type="dxa" w:w="881"/>
             <w:tcBorders>
               <w:top w:val="single" w:color="BFBFBF" w:sz="4"/>
               <w:left w:val="single" w:color="BFBFBF" w:sz="4"/>
@@ -9893,7 +9893,7 @@
         </w:tc>
         <w:tc>
           <w:tcPr>
-            <w:tcW w:type="dxa" w:w="3585"/>
+            <w:tcW w:type="dxa" w:w="2648"/>
             <w:tcBorders>
               <w:top w:val="single" w:color="BFBFBF" w:sz="4"/>
               <w:left w:val="single" w:color="BFBFBF" w:sz="4"/>
@@ -9920,55 +9920,55 @@
         </w:tc>
         <w:tc>
           <w:tcPr>
-            <w:tcW w:type="dxa" w:w="1843"/>
-            <w:tcBorders>
-              <w:top w:val="single" w:color="BFBFBF" w:sz="4"/>
-              <w:left w:val="single" w:color="BFBFBF" w:sz="4"/>
-              <w:bottom w:val="single" w:color="BFBFBF" w:sz="4"/>
-              <w:right w:val="single" w:color="BFBFBF" w:sz="4"/>
-            </w:tcBorders>
-            <w:tcMar>
-              <w:top w:type="dxa" w:w="60"/>
-              <w:left w:type="dxa" w:w="100"/>
-              <w:bottom w:type="dxa" w:w="60"/>
-              <w:right w:type="dxa" w:w="100"/>
-            </w:tcMar>
-          </w:tcPr>
-          <w:p>
-            <w:r>
-              <w:rPr>
-                <w:rFonts w:ascii="Calibri" w:cs="Calibri" w:eastAsia="Calibri" w:hAnsi="Calibri"/>
-                <w:sz w:val="19"/>
-                <w:szCs w:val="19"/>
-              </w:rPr>
-              <w:t xml:space="preserve">0.7x</w:t>
-            </w:r>
-          </w:p>
-        </w:tc>
-        <w:tc>
-          <w:tcPr>
-            <w:tcW w:type="dxa" w:w="1745"/>
-            <w:tcBorders>
-              <w:top w:val="single" w:color="BFBFBF" w:sz="4"/>
-              <w:left w:val="single" w:color="BFBFBF" w:sz="4"/>
-              <w:bottom w:val="single" w:color="BFBFBF" w:sz="4"/>
-              <w:right w:val="single" w:color="BFBFBF" w:sz="4"/>
-            </w:tcBorders>
-            <w:tcMar>
-              <w:top w:type="dxa" w:w="60"/>
-              <w:left w:type="dxa" w:w="100"/>
-              <w:bottom w:type="dxa" w:w="60"/>
-              <w:right w:type="dxa" w:w="100"/>
-            </w:tcMar>
-          </w:tcPr>
-          <w:p>
-            <w:r>
-              <w:rPr>
-                <w:rFonts w:ascii="Calibri" w:cs="Calibri" w:eastAsia="Calibri" w:hAnsi="Calibri"/>
-                <w:sz w:val="19"/>
-                <w:szCs w:val="19"/>
-              </w:rPr>
-              <w:t xml:space="preserve">1x</w:t>
+            <w:tcW w:type="dxa" w:w="2724"/>
+            <w:tcBorders>
+              <w:top w:val="single" w:color="BFBFBF" w:sz="4"/>
+              <w:left w:val="single" w:color="BFBFBF" w:sz="4"/>
+              <w:bottom w:val="single" w:color="BFBFBF" w:sz="4"/>
+              <w:right w:val="single" w:color="BFBFBF" w:sz="4"/>
+            </w:tcBorders>
+            <w:tcMar>
+              <w:top w:type="dxa" w:w="60"/>
+              <w:left w:type="dxa" w:w="100"/>
+              <w:bottom w:type="dxa" w:w="60"/>
+              <w:right w:type="dxa" w:w="100"/>
+            </w:tcMar>
+          </w:tcPr>
+          <w:p>
+            <w:r>
+              <w:rPr>
+                <w:rFonts w:ascii="Calibri" w:cs="Calibri" w:eastAsia="Calibri" w:hAnsi="Calibri"/>
+                <w:sz w:val="19"/>
+                <w:szCs w:val="19"/>
+              </w:rPr>
+              <w:t xml:space="preserve">1x (0.7 studs scale)</w:t>
+            </w:r>
+          </w:p>
+        </w:tc>
+        <w:tc>
+          <w:tcPr>
+            <w:tcW w:type="dxa" w:w="2013"/>
+            <w:tcBorders>
+              <w:top w:val="single" w:color="BFBFBF" w:sz="4"/>
+              <w:left w:val="single" w:color="BFBFBF" w:sz="4"/>
+              <w:bottom w:val="single" w:color="BFBFBF" w:sz="4"/>
+              <w:right w:val="single" w:color="BFBFBF" w:sz="4"/>
+            </w:tcBorders>
+            <w:tcMar>
+              <w:top w:type="dxa" w:w="60"/>
+              <w:left w:type="dxa" w:w="100"/>
+              <w:bottom w:type="dxa" w:w="60"/>
+              <w:right w:type="dxa" w:w="100"/>
+            </w:tcMar>
+          </w:tcPr>
+          <w:p>
+            <w:r>
+              <w:rPr>
+                <w:rFonts w:ascii="Calibri" w:cs="Calibri" w:eastAsia="Calibri" w:hAnsi="Calibri"/>
+                <w:sz w:val="19"/>
+                <w:szCs w:val="19"/>
+              </w:rPr>
+              <w:t xml:space="preserve">x1</w:t>
             </w:r>
           </w:p>
         </w:tc>
@@ -9979,7 +9979,7 @@
         </w:trPr>
         <w:tc>
           <w:tcPr>
-            <w:tcW w:type="dxa" w:w="1211"/>
+            <w:tcW w:type="dxa" w:w="1094"/>
             <w:tcBorders>
               <w:top w:val="single" w:color="BFBFBF" w:sz="4"/>
               <w:left w:val="single" w:color="BFBFBF" w:sz="4"/>
@@ -10006,7 +10006,7 @@
         </w:tc>
         <w:tc>
           <w:tcPr>
-            <w:tcW w:type="dxa" w:w="976"/>
+            <w:tcW w:type="dxa" w:w="881"/>
             <w:tcBorders>
               <w:top w:val="single" w:color="BFBFBF" w:sz="4"/>
               <w:left w:val="single" w:color="BFBFBF" w:sz="4"/>
@@ -10033,82 +10033,82 @@
         </w:tc>
         <w:tc>
           <w:tcPr>
-            <w:tcW w:type="dxa" w:w="3585"/>
-            <w:tcBorders>
-              <w:top w:val="single" w:color="BFBFBF" w:sz="4"/>
-              <w:left w:val="single" w:color="BFBFBF" w:sz="4"/>
-              <w:bottom w:val="single" w:color="BFBFBF" w:sz="4"/>
-              <w:right w:val="single" w:color="BFBFBF" w:sz="4"/>
-            </w:tcBorders>
-            <w:tcMar>
-              <w:top w:type="dxa" w:w="60"/>
-              <w:left w:type="dxa" w:w="100"/>
-              <w:bottom w:type="dxa" w:w="60"/>
-              <w:right w:type="dxa" w:w="100"/>
-            </w:tcMar>
-          </w:tcPr>
-          <w:p>
-            <w:r>
-              <w:rPr>
-                <w:rFonts w:ascii="Calibri" w:cs="Calibri" w:eastAsia="Calibri" w:hAnsi="Calibri"/>
-                <w:sz w:val="19"/>
-                <w:szCs w:val="19"/>
-              </w:rPr>
-              <w:t xml:space="preserve">3.5x to 5x (average 4.25x)</w:t>
-            </w:r>
-          </w:p>
-        </w:tc>
-        <w:tc>
-          <w:tcPr>
-            <w:tcW w:type="dxa" w:w="1843"/>
-            <w:tcBorders>
-              <w:top w:val="single" w:color="BFBFBF" w:sz="4"/>
-              <w:left w:val="single" w:color="BFBFBF" w:sz="4"/>
-              <w:bottom w:val="single" w:color="BFBFBF" w:sz="4"/>
-              <w:right w:val="single" w:color="BFBFBF" w:sz="4"/>
-            </w:tcBorders>
-            <w:tcMar>
-              <w:top w:type="dxa" w:w="60"/>
-              <w:left w:type="dxa" w:w="100"/>
-              <w:bottom w:type="dxa" w:w="60"/>
-              <w:right w:type="dxa" w:w="100"/>
-            </w:tcMar>
-          </w:tcPr>
-          <w:p>
-            <w:r>
-              <w:rPr>
-                <w:rFonts w:ascii="Calibri" w:cs="Calibri" w:eastAsia="Calibri" w:hAnsi="Calibri"/>
-                <w:sz w:val="19"/>
-                <w:szCs w:val="19"/>
-              </w:rPr>
-              <w:t xml:space="preserve">1.23x to 1.44x</w:t>
-            </w:r>
-          </w:p>
-        </w:tc>
-        <w:tc>
-          <w:tcPr>
-            <w:tcW w:type="dxa" w:w="1745"/>
-            <w:tcBorders>
-              <w:top w:val="single" w:color="BFBFBF" w:sz="4"/>
-              <w:left w:val="single" w:color="BFBFBF" w:sz="4"/>
-              <w:bottom w:val="single" w:color="BFBFBF" w:sz="4"/>
-              <w:right w:val="single" w:color="BFBFBF" w:sz="4"/>
-            </w:tcBorders>
-            <w:tcMar>
-              <w:top w:type="dxa" w:w="60"/>
-              <w:left w:type="dxa" w:w="100"/>
-              <w:bottom w:type="dxa" w:w="60"/>
-              <w:right w:type="dxa" w:w="100"/>
-            </w:tcMar>
-          </w:tcPr>
-          <w:p>
-            <w:r>
-              <w:rPr>
-                <w:rFonts w:ascii="Calibri" w:cs="Calibri" w:eastAsia="Calibri" w:hAnsi="Calibri"/>
-                <w:sz w:val="19"/>
-                <w:szCs w:val="19"/>
-              </w:rPr>
-              <w:t xml:space="preserve">1.65x to 1.9x</w:t>
+            <w:tcW w:type="dxa" w:w="2648"/>
+            <w:tcBorders>
+              <w:top w:val="single" w:color="BFBFBF" w:sz="4"/>
+              <w:left w:val="single" w:color="BFBFBF" w:sz="4"/>
+              <w:bottom w:val="single" w:color="BFBFBF" w:sz="4"/>
+              <w:right w:val="single" w:color="BFBFBF" w:sz="4"/>
+            </w:tcBorders>
+            <w:tcMar>
+              <w:top w:type="dxa" w:w="60"/>
+              <w:left w:type="dxa" w:w="100"/>
+              <w:bottom w:type="dxa" w:w="60"/>
+              <w:right w:type="dxa" w:w="100"/>
+            </w:tcMar>
+          </w:tcPr>
+          <w:p>
+            <w:r>
+              <w:rPr>
+                <w:rFonts w:ascii="Calibri" w:cs="Calibri" w:eastAsia="Calibri" w:hAnsi="Calibri"/>
+                <w:sz w:val="19"/>
+                <w:szCs w:val="19"/>
+              </w:rPr>
+              <w:t xml:space="preserve">2.5x to 4x (average 3.25x)</w:t>
+            </w:r>
+          </w:p>
+        </w:tc>
+        <w:tc>
+          <w:tcPr>
+            <w:tcW w:type="dxa" w:w="2724"/>
+            <w:tcBorders>
+              <w:top w:val="single" w:color="BFBFBF" w:sz="4"/>
+              <w:left w:val="single" w:color="BFBFBF" w:sz="4"/>
+              <w:bottom w:val="single" w:color="BFBFBF" w:sz="4"/>
+              <w:right w:val="single" w:color="BFBFBF" w:sz="4"/>
+            </w:tcBorders>
+            <w:tcMar>
+              <w:top w:type="dxa" w:w="60"/>
+              <w:left w:type="dxa" w:w="100"/>
+              <w:bottom w:type="dxa" w:w="60"/>
+              <w:right w:type="dxa" w:w="100"/>
+            </w:tcMar>
+          </w:tcPr>
+          <w:p>
+            <w:r>
+              <w:rPr>
+                <w:rFonts w:ascii="Calibri" w:cs="Calibri" w:eastAsia="Calibri" w:hAnsi="Calibri"/>
+                <w:sz w:val="19"/>
+                <w:szCs w:val="19"/>
+              </w:rPr>
+              <w:t xml:space="preserve">1.25x to 2x</w:t>
+            </w:r>
+          </w:p>
+        </w:tc>
+        <w:tc>
+          <w:tcPr>
+            <w:tcW w:type="dxa" w:w="2013"/>
+            <w:tcBorders>
+              <w:top w:val="single" w:color="BFBFBF" w:sz="4"/>
+              <w:left w:val="single" w:color="BFBFBF" w:sz="4"/>
+              <w:bottom w:val="single" w:color="BFBFBF" w:sz="4"/>
+              <w:right w:val="single" w:color="BFBFBF" w:sz="4"/>
+            </w:tcBorders>
+            <w:tcMar>
+              <w:top w:type="dxa" w:w="60"/>
+              <w:left w:type="dxa" w:w="100"/>
+              <w:bottom w:type="dxa" w:w="60"/>
+              <w:right w:type="dxa" w:w="100"/>
+            </w:tcMar>
+          </w:tcPr>
+          <w:p>
+            <w:r>
+              <w:rPr>
+                <w:rFonts w:ascii="Calibri" w:cs="Calibri" w:eastAsia="Calibri" w:hAnsi="Calibri"/>
+                <w:sz w:val="19"/>
+                <w:szCs w:val="19"/>
+              </w:rPr>
+              <w:t xml:space="preserve">x3.5 to x5</w:t>
             </w:r>
           </w:p>
         </w:tc>
@@ -10119,7 +10119,7 @@
         </w:trPr>
         <w:tc>
           <w:tcPr>
-            <w:tcW w:type="dxa" w:w="1211"/>
+            <w:tcW w:type="dxa" w:w="1094"/>
             <w:tcBorders>
               <w:top w:val="single" w:color="BFBFBF" w:sz="4"/>
               <w:left w:val="single" w:color="BFBFBF" w:sz="4"/>
@@ -10146,7 +10146,7 @@
         </w:tc>
         <w:tc>
           <w:tcPr>
-            <w:tcW w:type="dxa" w:w="976"/>
+            <w:tcW w:type="dxa" w:w="881"/>
             <w:tcBorders>
               <w:top w:val="single" w:color="BFBFBF" w:sz="4"/>
               <w:left w:val="single" w:color="BFBFBF" w:sz="4"/>
@@ -10173,82 +10173,82 @@
         </w:tc>
         <w:tc>
           <w:tcPr>
-            <w:tcW w:type="dxa" w:w="3585"/>
-            <w:tcBorders>
-              <w:top w:val="single" w:color="BFBFBF" w:sz="4"/>
-              <w:left w:val="single" w:color="BFBFBF" w:sz="4"/>
-              <w:bottom w:val="single" w:color="BFBFBF" w:sz="4"/>
-              <w:right w:val="single" w:color="BFBFBF" w:sz="4"/>
-            </w:tcBorders>
-            <w:tcMar>
-              <w:top w:type="dxa" w:w="60"/>
-              <w:left w:type="dxa" w:w="100"/>
-              <w:bottom w:type="dxa" w:w="60"/>
-              <w:right w:type="dxa" w:w="100"/>
-            </w:tcMar>
-          </w:tcPr>
-          <w:p>
-            <w:r>
-              <w:rPr>
-                <w:rFonts w:ascii="Calibri" w:cs="Calibri" w:eastAsia="Calibri" w:hAnsi="Calibri"/>
-                <w:sz w:val="19"/>
-                <w:szCs w:val="19"/>
-              </w:rPr>
-              <w:t xml:space="preserve">7x to 10x (average 8.5x)</w:t>
-            </w:r>
-          </w:p>
-        </w:tc>
-        <w:tc>
-          <w:tcPr>
-            <w:tcW w:type="dxa" w:w="1843"/>
-            <w:tcBorders>
-              <w:top w:val="single" w:color="BFBFBF" w:sz="4"/>
-              <w:left w:val="single" w:color="BFBFBF" w:sz="4"/>
-              <w:bottom w:val="single" w:color="BFBFBF" w:sz="4"/>
-              <w:right w:val="single" w:color="BFBFBF" w:sz="4"/>
-            </w:tcBorders>
-            <w:tcMar>
-              <w:top w:type="dxa" w:w="60"/>
-              <w:left w:type="dxa" w:w="100"/>
-              <w:bottom w:type="dxa" w:w="60"/>
-              <w:right w:type="dxa" w:w="100"/>
-            </w:tcMar>
-          </w:tcPr>
-          <w:p>
-            <w:r>
-              <w:rPr>
-                <w:rFonts w:ascii="Calibri" w:cs="Calibri" w:eastAsia="Calibri" w:hAnsi="Calibri"/>
-                <w:sz w:val="19"/>
-                <w:szCs w:val="19"/>
-              </w:rPr>
-              <w:t xml:space="preserve">1.68x to 1.97x</w:t>
-            </w:r>
-          </w:p>
-        </w:tc>
-        <w:tc>
-          <w:tcPr>
-            <w:tcW w:type="dxa" w:w="1745"/>
-            <w:tcBorders>
-              <w:top w:val="single" w:color="BFBFBF" w:sz="4"/>
-              <w:left w:val="single" w:color="BFBFBF" w:sz="4"/>
-              <w:bottom w:val="single" w:color="BFBFBF" w:sz="4"/>
-              <w:right w:val="single" w:color="BFBFBF" w:sz="4"/>
-            </w:tcBorders>
-            <w:tcMar>
-              <w:top w:type="dxa" w:w="60"/>
-              <w:left w:type="dxa" w:w="100"/>
-              <w:bottom w:type="dxa" w:w="60"/>
-              <w:right w:type="dxa" w:w="100"/>
-            </w:tcMar>
-          </w:tcPr>
-          <w:p>
-            <w:r>
-              <w:rPr>
-                <w:rFonts w:ascii="Calibri" w:cs="Calibri" w:eastAsia="Calibri" w:hAnsi="Calibri"/>
-                <w:sz w:val="19"/>
-                <w:szCs w:val="19"/>
-              </w:rPr>
-              <w:t xml:space="preserve">2.2x to 2.5x</w:t>
+            <w:tcW w:type="dxa" w:w="2648"/>
+            <w:tcBorders>
+              <w:top w:val="single" w:color="BFBFBF" w:sz="4"/>
+              <w:left w:val="single" w:color="BFBFBF" w:sz="4"/>
+              <w:bottom w:val="single" w:color="BFBFBF" w:sz="4"/>
+              <w:right w:val="single" w:color="BFBFBF" w:sz="4"/>
+            </w:tcBorders>
+            <w:tcMar>
+              <w:top w:type="dxa" w:w="60"/>
+              <w:left w:type="dxa" w:w="100"/>
+              <w:bottom w:type="dxa" w:w="60"/>
+              <w:right w:type="dxa" w:w="100"/>
+            </w:tcMar>
+          </w:tcPr>
+          <w:p>
+            <w:r>
+              <w:rPr>
+                <w:rFonts w:ascii="Calibri" w:cs="Calibri" w:eastAsia="Calibri" w:hAnsi="Calibri"/>
+                <w:sz w:val="19"/>
+                <w:szCs w:val="19"/>
+              </w:rPr>
+              <w:t xml:space="preserve">5x to 7x (average 6x)</w:t>
+            </w:r>
+          </w:p>
+        </w:tc>
+        <w:tc>
+          <w:tcPr>
+            <w:tcW w:type="dxa" w:w="2724"/>
+            <w:tcBorders>
+              <w:top w:val="single" w:color="BFBFBF" w:sz="4"/>
+              <w:left w:val="single" w:color="BFBFBF" w:sz="4"/>
+              <w:bottom w:val="single" w:color="BFBFBF" w:sz="4"/>
+              <w:right w:val="single" w:color="BFBFBF" w:sz="4"/>
+            </w:tcBorders>
+            <w:tcMar>
+              <w:top w:type="dxa" w:w="60"/>
+              <w:left w:type="dxa" w:w="100"/>
+              <w:bottom w:type="dxa" w:w="60"/>
+              <w:right w:type="dxa" w:w="100"/>
+            </w:tcMar>
+          </w:tcPr>
+          <w:p>
+            <w:r>
+              <w:rPr>
+                <w:rFonts w:ascii="Calibri" w:cs="Calibri" w:eastAsia="Calibri" w:hAnsi="Calibri"/>
+                <w:sz w:val="19"/>
+                <w:szCs w:val="19"/>
+              </w:rPr>
+              <w:t xml:space="preserve">2.5x to 3.5x</w:t>
+            </w:r>
+          </w:p>
+        </w:tc>
+        <w:tc>
+          <w:tcPr>
+            <w:tcW w:type="dxa" w:w="2013"/>
+            <w:tcBorders>
+              <w:top w:val="single" w:color="BFBFBF" w:sz="4"/>
+              <w:left w:val="single" w:color="BFBFBF" w:sz="4"/>
+              <w:bottom w:val="single" w:color="BFBFBF" w:sz="4"/>
+              <w:right w:val="single" w:color="BFBFBF" w:sz="4"/>
+            </w:tcBorders>
+            <w:tcMar>
+              <w:top w:type="dxa" w:w="60"/>
+              <w:left w:type="dxa" w:w="100"/>
+              <w:bottom w:type="dxa" w:w="60"/>
+              <w:right w:type="dxa" w:w="100"/>
+            </w:tcMar>
+          </w:tcPr>
+          <w:p>
+            <w:r>
+              <w:rPr>
+                <w:rFonts w:ascii="Calibri" w:cs="Calibri" w:eastAsia="Calibri" w:hAnsi="Calibri"/>
+                <w:sz w:val="19"/>
+                <w:szCs w:val="19"/>
+              </w:rPr>
+              <w:t xml:space="preserve">x7 to x10</w:t>
             </w:r>
           </w:p>
         </w:tc>
@@ -10259,7 +10259,7 @@
         </w:trPr>
         <w:tc>
           <w:tcPr>
-            <w:tcW w:type="dxa" w:w="1211"/>
+            <w:tcW w:type="dxa" w:w="1094"/>
             <w:tcBorders>
               <w:top w:val="single" w:color="BFBFBF" w:sz="4"/>
               <w:left w:val="single" w:color="BFBFBF" w:sz="4"/>
@@ -10286,7 +10286,7 @@
         </w:tc>
         <w:tc>
           <w:tcPr>
-            <w:tcW w:type="dxa" w:w="976"/>
+            <w:tcW w:type="dxa" w:w="881"/>
             <w:tcBorders>
               <w:top w:val="single" w:color="BFBFBF" w:sz="4"/>
               <w:left w:val="single" w:color="BFBFBF" w:sz="4"/>
@@ -10313,82 +10313,82 @@
         </w:tc>
         <w:tc>
           <w:tcPr>
-            <w:tcW w:type="dxa" w:w="3585"/>
-            <w:tcBorders>
-              <w:top w:val="single" w:color="BFBFBF" w:sz="4"/>
-              <w:left w:val="single" w:color="BFBFBF" w:sz="4"/>
-              <w:bottom w:val="single" w:color="BFBFBF" w:sz="4"/>
-              <w:right w:val="single" w:color="BFBFBF" w:sz="4"/>
-            </w:tcBorders>
-            <w:tcMar>
-              <w:top w:type="dxa" w:w="60"/>
-              <w:left w:type="dxa" w:w="100"/>
-              <w:bottom w:type="dxa" w:w="60"/>
-              <w:right w:type="dxa" w:w="100"/>
-            </w:tcMar>
-          </w:tcPr>
-          <w:p>
-            <w:r>
-              <w:rPr>
-                <w:rFonts w:ascii="Calibri" w:cs="Calibri" w:eastAsia="Calibri" w:hAnsi="Calibri"/>
-                <w:sz w:val="19"/>
-                <w:szCs w:val="19"/>
-              </w:rPr>
-              <w:t xml:space="preserve">15x</w:t>
-            </w:r>
-          </w:p>
-        </w:tc>
-        <w:tc>
-          <w:tcPr>
-            <w:tcW w:type="dxa" w:w="1843"/>
-            <w:tcBorders>
-              <w:top w:val="single" w:color="BFBFBF" w:sz="4"/>
-              <w:left w:val="single" w:color="BFBFBF" w:sz="4"/>
-              <w:bottom w:val="single" w:color="BFBFBF" w:sz="4"/>
-              <w:right w:val="single" w:color="BFBFBF" w:sz="4"/>
-            </w:tcBorders>
-            <w:tcMar>
-              <w:top w:type="dxa" w:w="60"/>
-              <w:left w:type="dxa" w:w="100"/>
-              <w:bottom w:type="dxa" w:w="60"/>
-              <w:right w:type="dxa" w:w="100"/>
-            </w:tcMar>
-          </w:tcPr>
-          <w:p>
-            <w:r>
-              <w:rPr>
-                <w:rFonts w:ascii="Calibri" w:cs="Calibri" w:eastAsia="Calibri" w:hAnsi="Calibri"/>
-                <w:sz w:val="19"/>
-                <w:szCs w:val="19"/>
-              </w:rPr>
-              <w:t xml:space="preserve">2.37x</w:t>
-            </w:r>
-          </w:p>
-        </w:tc>
-        <w:tc>
-          <w:tcPr>
-            <w:tcW w:type="dxa" w:w="1745"/>
-            <w:tcBorders>
-              <w:top w:val="single" w:color="BFBFBF" w:sz="4"/>
-              <w:left w:val="single" w:color="BFBFBF" w:sz="4"/>
-              <w:bottom w:val="single" w:color="BFBFBF" w:sz="4"/>
-              <w:right w:val="single" w:color="BFBFBF" w:sz="4"/>
-            </w:tcBorders>
-            <w:tcMar>
-              <w:top w:type="dxa" w:w="60"/>
-              <w:left w:type="dxa" w:w="100"/>
-              <w:bottom w:type="dxa" w:w="60"/>
-              <w:right w:type="dxa" w:w="100"/>
-            </w:tcMar>
-          </w:tcPr>
-          <w:p>
-            <w:r>
-              <w:rPr>
-                <w:rFonts w:ascii="Calibri" w:cs="Calibri" w:eastAsia="Calibri" w:hAnsi="Calibri"/>
-                <w:sz w:val="19"/>
-                <w:szCs w:val="19"/>
-              </w:rPr>
-              <w:t xml:space="preserve">2.95x</w:t>
+            <w:tcW w:type="dxa" w:w="2648"/>
+            <w:tcBorders>
+              <w:top w:val="single" w:color="BFBFBF" w:sz="4"/>
+              <w:left w:val="single" w:color="BFBFBF" w:sz="4"/>
+              <w:bottom w:val="single" w:color="BFBFBF" w:sz="4"/>
+              <w:right w:val="single" w:color="BFBFBF" w:sz="4"/>
+            </w:tcBorders>
+            <w:tcMar>
+              <w:top w:type="dxa" w:w="60"/>
+              <w:left w:type="dxa" w:w="100"/>
+              <w:bottom w:type="dxa" w:w="60"/>
+              <w:right w:type="dxa" w:w="100"/>
+            </w:tcMar>
+          </w:tcPr>
+          <w:p>
+            <w:r>
+              <w:rPr>
+                <w:rFonts w:ascii="Calibri" w:cs="Calibri" w:eastAsia="Calibri" w:hAnsi="Calibri"/>
+                <w:sz w:val="19"/>
+                <w:szCs w:val="19"/>
+              </w:rPr>
+              <w:t xml:space="preserve">10x</w:t>
+            </w:r>
+          </w:p>
+        </w:tc>
+        <w:tc>
+          <w:tcPr>
+            <w:tcW w:type="dxa" w:w="2724"/>
+            <w:tcBorders>
+              <w:top w:val="single" w:color="BFBFBF" w:sz="4"/>
+              <w:left w:val="single" w:color="BFBFBF" w:sz="4"/>
+              <w:bottom w:val="single" w:color="BFBFBF" w:sz="4"/>
+              <w:right w:val="single" w:color="BFBFBF" w:sz="4"/>
+            </w:tcBorders>
+            <w:tcMar>
+              <w:top w:type="dxa" w:w="60"/>
+              <w:left w:type="dxa" w:w="100"/>
+              <w:bottom w:type="dxa" w:w="60"/>
+              <w:right w:type="dxa" w:w="100"/>
+            </w:tcMar>
+          </w:tcPr>
+          <w:p>
+            <w:r>
+              <w:rPr>
+                <w:rFonts w:ascii="Calibri" w:cs="Calibri" w:eastAsia="Calibri" w:hAnsi="Calibri"/>
+                <w:sz w:val="19"/>
+                <w:szCs w:val="19"/>
+              </w:rPr>
+              <w:t xml:space="preserve">5x</w:t>
+            </w:r>
+          </w:p>
+        </w:tc>
+        <w:tc>
+          <w:tcPr>
+            <w:tcW w:type="dxa" w:w="2013"/>
+            <w:tcBorders>
+              <w:top w:val="single" w:color="BFBFBF" w:sz="4"/>
+              <w:left w:val="single" w:color="BFBFBF" w:sz="4"/>
+              <w:bottom w:val="single" w:color="BFBFBF" w:sz="4"/>
+              <w:right w:val="single" w:color="BFBFBF" w:sz="4"/>
+            </w:tcBorders>
+            <w:tcMar>
+              <w:top w:type="dxa" w:w="60"/>
+              <w:left w:type="dxa" w:w="100"/>
+              <w:bottom w:type="dxa" w:w="60"/>
+              <w:right w:type="dxa" w:w="100"/>
+            </w:tcMar>
+          </w:tcPr>
+          <w:p>
+            <w:r>
+              <w:rPr>
+                <w:rFonts w:ascii="Calibri" w:cs="Calibri" w:eastAsia="Calibri" w:hAnsi="Calibri"/>
+                <w:sz w:val="19"/>
+                <w:szCs w:val="19"/>
+              </w:rPr>
+              <w:t xml:space="preserve">x15</w:t>
             </w:r>
           </w:p>
         </w:tc>
@@ -10415,7 +10415,7 @@
         <w:rPr>
           <w:rFonts w:ascii="Calibri" w:cs="Calibri" w:eastAsia="Calibri" w:hAnsi="Calibri"/>
         </w:rPr>
-        <w:t xml:space="preserve"> when an egg spawns it rolls its tier (Big, Huge, Gigantic or none) and then its own size inside the tier's range, rounded to 0.1 (a Big egg can be 3.5x, 3.6x ... 5x). The size is also the money multiplier, so a 4.2x Big egg pays x4.2 and a 5x Big egg pays x5. Names show it: "Big 4.2x Golden Bat". The picture grows slower than the number, because a 15 times taller egg would be taller than a house: drawn scale = size to the power 0.45 for eggs and 0.4 for pets (</w:t>
+        <w:t xml:space="preserve"> when an egg spawns it rolls its tier (Big, Huge, Gigantic or none) and then its own size inside the tier's range, rounded to 0.1 (a Big egg can be 2.5x, 2.6x ... 4x). The pet is drawn exactly that many times bigger than a normal pet, and the egg half as many times bigger than a normal egg (</w:t>
       </w:r>
       <w:r>
         <w:rPr>
@@ -10423,27 +10423,13 @@
           <w:sz w:val="20"/>
           <w:szCs w:val="20"/>
         </w:rPr>
-        <w:t xml:space="preserve">Config.EggScaleExponent</w:t>
-      </w:r>
-      <w:r>
-        <w:rPr>
-          <w:rFonts w:ascii="Calibri" w:cs="Calibri" w:eastAsia="Calibri" w:hAnsi="Calibri"/>
-        </w:rPr>
-        <w:t xml:space="preserve">, </w:t>
-      </w:r>
-      <w:r>
-        <w:rPr>
-          <w:rFonts w:ascii="Courier New" w:cs="Courier New" w:eastAsia="Courier New" w:hAnsi="Courier New"/>
-          <w:sz w:val="20"/>
-          <w:szCs w:val="20"/>
-        </w:rPr>
-        <w:t xml:space="preserve">Config.PetScaleExponent</w:t>
-      </w:r>
-      <w:r>
-        <w:rPr>
-          <w:rFonts w:ascii="Calibri" w:cs="Calibri" w:eastAsia="Calibri" w:hAnsi="Calibri"/>
-        </w:rPr>
-        <w:t xml:space="preserve">); raise them for a more dramatic look. Eggs still carried in the thief's arms are capped at 1.4x.</w:t>
+        <w:t xml:space="preserve">Config.EggSizeFactor</w:t>
+      </w:r>
+      <w:r>
+        <w:rPr>
+          <w:rFonts w:ascii="Calibri" w:cs="Calibri" w:eastAsia="Calibri" w:hAnsi="Calibri"/>
+        </w:rPr>
+        <w:t xml:space="preserve">). The money multiplier follows the size in a straight line between the tier's low and high end: a 2.5x Big pays x3.5, a 3.25x Big pays x4.25 and a 4x Big pays x5. Names show the size: "Big 3.2x Golden Bat". Eggs still carried in the thief's arms are capped at 1.4 (twice a normal egg), and eggs on the incubator pedestals are shrunk to fit under the roof; a 10x pet is about 25 studs tall on a base.</w:t>
       </w:r>
     </w:p>
     <w:p>
@@ -10454,7 +10440,7 @@
         <w:rPr>
           <w:rFonts w:ascii="Calibri" w:cs="Calibri" w:eastAsia="Calibri" w:hAnsi="Calibri"/>
         </w:rPr>
-        <w:t xml:space="preserve">Before 6.1 the sizes were fixed (Big x3, Huge x8, Gigantic x30, drawn 1.56x, 1.89x, 2.34x). Old saved pets such as "Bat+Big" keep working with those fixed values. The average size multiplier went from 1.83 to 2.03 (+11%): Big and Huge pay more, Gigantic pays less (x30 became x15).</w:t>
+        <w:t xml:space="preserve">Before 6.1 the sizes were fixed (Big x3, Huge x8, Gigantic x30, drawn 1.6x, 2.1x, 2.8x). Old saved pets such as "Bat+Big" keep working with those fixed values. The average money multiplier went from 1.83 to 2.03 (+11%): Big and Huge pay more, Gigantic pays less (x30 became x15).</w:t>
       </w:r>
     </w:p>
     <w:tbl>
@@ -10953,7 +10939,7 @@
         <w:rPr>
           <w:rFonts w:ascii="Calibri" w:cs="Calibri" w:eastAsia="Calibri" w:hAnsi="Calibri"/>
         </w:rPr>
-        <w:t xml:space="preserve">Multipliers stack: a Gigantic Rainbow pet earns x375 (a Gigantic Rainbow Pumpkin King would earn $5.6M/s, about 1 egg in 20,000). A variant pet is stored as "Bat+Big4.2+Golden" (the size token carries the rolled multiplier) and counts as its plain pet in the Index. All numbers are in </w:t>
+        <w:t xml:space="preserve">Multipliers stack: a Gigantic Rainbow pet earns x375 (a Gigantic Rainbow Pumpkin King would earn $5.6M/s, about 1 egg in 20,000). A variant pet is stored as "Bat+Big3.2+Golden" (the size token carries the rolled size) and counts as its plain pet in the Index. All numbers are in </w:t>
       </w:r>
       <w:r>
         <w:rPr>

</xml_diff>

<commit_message>
Add a pet size platform in the void to the right of the map (smallest and biggest pet at Normal, Big, Huge, Gigantic)
Co-Authored-By: Claude Sonnet 5.5 <noreply@anthropic.com>
Claude-Session: https://claude.ai/code/session_013ivEnYiZGofRBeqQFKAVhJ
</commit_message>
<xml_diff>
--- a/docs/Spooky-Steal-Design-and-Plan.docx
+++ b/docs/Spooky-Steal-Design-and-Plan.docx
@@ -10430,6 +10430,53 @@
           <w:rFonts w:ascii="Calibri" w:cs="Calibri" w:eastAsia="Calibri" w:hAnsi="Calibri"/>
         </w:rPr>
         <w:t xml:space="preserve">). The money multiplier follows the size in a straight line between the tier's low and high end: a 2.5x Big pays x3.5, a 3.25x Big pays x4.25 and a 4x Big pays x5. Names show the size: "Big 3.2x Golden Bat". Eggs still carried in the thief's arms are capped at 1.4 (twice a normal egg), and eggs on the incubator pedestals are shrunk to fit under the roof; a 10x pet is about 25 studs tall on a base.</w:t>
+      </w:r>
+    </w:p>
+    <w:p>
+      <w:pPr>
+        <w:spacing w:after="140"/>
+      </w:pPr>
+      <w:r>
+        <w:rPr>
+          <w:rFonts w:ascii="Calibri" w:cs="Calibri" w:eastAsia="Calibri" w:hAnsi="Calibri"/>
+          <w:b/>
+          <w:bCs/>
+        </w:rPr>
+        <w:t xml:space="preserve">Size platform (6.1):</w:t>
+      </w:r>
+      <w:r>
+        <w:rPr>
+          <w:rFonts w:ascii="Calibri" w:cs="Calibri" w:eastAsia="Calibri" w:hAnsi="Calibri"/>
+        </w:rPr>
+        <w:t xml:space="preserve"> a platform floats in the void to the right of the map (about 215 to 375 studs from the hub's right edge, at </w:t>
+      </w:r>
+      <w:r>
+        <w:rPr>
+          <w:rFonts w:ascii="Courier New" w:cs="Courier New" w:eastAsia="Courier New" w:hAnsi="Courier New"/>
+          <w:sz w:val="20"/>
+          <w:szCs w:val="20"/>
+        </w:rPr>
+        <w:t xml:space="preserve">Config.SizeStage.Center</w:t>
+      </w:r>
+      <w:r>
+        <w:rPr>
+          <w:rFonts w:ascii="Calibri" w:cs="Calibri" w:eastAsia="Calibri" w:hAnsi="Calibri"/>
+        </w:rPr>
+        <w:t xml:space="preserve">). It shows the smallest pet (Bat) and the biggest pet (Pumpkin King) in four columns, Normal, Big, Huge, Gigantic, at the middle of each size's range, with labels on the floor that give the size range and the money multiplier, and a 5 stud marker for comparing with a player. It is built when the server starts (</w:t>
+      </w:r>
+      <w:r>
+        <w:rPr>
+          <w:rFonts w:ascii="Courier New" w:cs="Courier New" w:eastAsia="Courier New" w:hAnsi="Courier New"/>
+          <w:sz w:val="20"/>
+          <w:szCs w:val="20"/>
+        </w:rPr>
+        <w:t xml:space="preserve">MapBuilder.BuildSizeStage</w:t>
+      </w:r>
+      <w:r>
+        <w:rPr>
+          <w:rFonts w:ascii="Calibri" w:cs="Calibri" w:eastAsia="Calibri" w:hAnsi="Calibri"/>
+        </w:rPr>
+        <w:t xml:space="preserve">), so it only shows in play mode and is not saved in the place. It is not connected to the map by a bridge.</w:t>
       </w:r>
     </w:p>
     <w:p>

</xml_diff>

<commit_message>
Admin panel: Sizes teleport button to the pet size platform
Co-Authored-By: Claude Sonnet 5.5 <noreply@anthropic.com>
Claude-Session: https://claude.ai/code/session_013ivEnYiZGofRBeqQFKAVhJ
</commit_message>
<xml_diff>
--- a/docs/Spooky-Steal-Design-and-Plan.docx
+++ b/docs/Spooky-Steal-Design-and-Plan.docx
@@ -10476,7 +10476,21 @@
         <w:rPr>
           <w:rFonts w:ascii="Calibri" w:cs="Calibri" w:eastAsia="Calibri" w:hAnsi="Calibri"/>
         </w:rPr>
-        <w:t xml:space="preserve">), so it only shows in play mode and is not saved in the place. It is not connected to the map by a bridge.</w:t>
+        <w:t xml:space="preserve">), so it only shows in play mode and is not saved in the place. It is not connected to the map by a bridge; the Admin panel has a </w:t>
+      </w:r>
+      <w:r>
+        <w:rPr>
+          <w:rFonts w:ascii="Calibri" w:cs="Calibri" w:eastAsia="Calibri" w:hAnsi="Calibri"/>
+          <w:b/>
+          <w:bCs/>
+        </w:rPr>
+        <w:t xml:space="preserve">Sizes</w:t>
+      </w:r>
+      <w:r>
+        <w:rPr>
+          <w:rFonts w:ascii="Calibri" w:cs="Calibri" w:eastAsia="Calibri" w:hAnsi="Calibri"/>
+        </w:rPr>
+        <w:t xml:space="preserve"> teleport button (next to Hub and Base) that puts you at its front, looking at the pets.</w:t>
       </w:r>
     </w:p>
     <w:p>

</xml_diff>

<commit_message>
Egg sizes: Big 2.5-3.5x, Huge 4-6x, Gigantic 8x; money equals size except Gigantic pays x16
Co-Authored-By: Claude Sonnet 5.5 <noreply@anthropic.com>
Claude-Session: https://claude.ai/code/session_013ivEnYiZGofRBeqQFKAVhJ
</commit_message>
<xml_diff>
--- a/docs/Spooky-Steal-Design-and-Plan.docx
+++ b/docs/Spooky-Steal-Design-and-Plan.docx
@@ -1173,7 +1173,7 @@
                 <w:sz w:val="19"/>
                 <w:szCs w:val="19"/>
               </w:rPr>
-              <w:t xml:space="preserve">Every Big, Huge and Gigantic egg now gets its own random size, and the money multiplier is that size: Big pets are drawn 2.5x to 4x bigger and pay x3.5 to x5, Huge 5x to 7x and x7 to x10, Gigantic 10x and x15 (before: fixed x3, x8 and x30). Eggs are drawn half as big as the pet. See 2.8. The Blood Moon event is shelved for now; it stays in the git history (commits 346b54e and 4d825cd).</w:t>
+              <w:t xml:space="preserve">Every Big, Huge and Gigantic egg now gets its own random size, and the money multiplier is that size: Big pets are drawn 2.5x to 3.5x bigger and pay the same (x2.5 to x3.5), Huge 4x to 6x and x4 to x6, Gigantic 8x and x16 (before: fixed x3, x8 and x30). Eggs are drawn half as big as the pet. See 2.8. The Blood Moon event is shelved for now; it stays in the git history (commits 346b54e and 4d825cd).</w:t>
             </w:r>
           </w:p>
         </w:tc>
@@ -9672,11 +9672,11 @@
         </w:tblBorders>
       </w:tblPr>
       <w:tblGrid>
-        <w:gridCol w:w="1094"/>
-        <w:gridCol w:w="881"/>
-        <w:gridCol w:w="2648"/>
-        <w:gridCol w:w="2724"/>
-        <w:gridCol w:w="2013"/>
+        <w:gridCol w:w="994"/>
+        <w:gridCol w:w="801"/>
+        <w:gridCol w:w="2338"/>
+        <w:gridCol w:w="2477"/>
+        <w:gridCol w:w="2750"/>
       </w:tblGrid>
       <w:tr>
         <w:trPr>
@@ -9684,7 +9684,7 @@
         </w:trPr>
         <w:tc>
           <w:tcPr>
-            <w:tcW w:type="dxa" w:w="1094"/>
+            <w:tcW w:type="dxa" w:w="994"/>
             <w:tcBorders>
               <w:top w:val="single" w:color="BFBFBF" w:sz="4"/>
               <w:left w:val="single" w:color="BFBFBF" w:sz="4"/>
@@ -9714,7 +9714,7 @@
         </w:tc>
         <w:tc>
           <w:tcPr>
-            <w:tcW w:type="dxa" w:w="881"/>
+            <w:tcW w:type="dxa" w:w="801"/>
             <w:tcBorders>
               <w:top w:val="single" w:color="BFBFBF" w:sz="4"/>
               <w:left w:val="single" w:color="BFBFBF" w:sz="4"/>
@@ -9744,7 +9744,7 @@
         </w:tc>
         <w:tc>
           <w:tcPr>
-            <w:tcW w:type="dxa" w:w="2648"/>
+            <w:tcW w:type="dxa" w:w="2338"/>
             <w:tcBorders>
               <w:top w:val="single" w:color="BFBFBF" w:sz="4"/>
               <w:left w:val="single" w:color="BFBFBF" w:sz="4"/>
@@ -9774,7 +9774,7 @@
         </w:tc>
         <w:tc>
           <w:tcPr>
-            <w:tcW w:type="dxa" w:w="2724"/>
+            <w:tcW w:type="dxa" w:w="2477"/>
             <w:tcBorders>
               <w:top w:val="single" w:color="BFBFBF" w:sz="4"/>
               <w:left w:val="single" w:color="BFBFBF" w:sz="4"/>
@@ -9804,7 +9804,7 @@
         </w:tc>
         <w:tc>
           <w:tcPr>
-            <w:tcW w:type="dxa" w:w="2013"/>
+            <w:tcW w:type="dxa" w:w="2750"/>
             <w:tcBorders>
               <w:top w:val="single" w:color="BFBFBF" w:sz="4"/>
               <w:left w:val="single" w:color="BFBFBF" w:sz="4"/>
@@ -9839,7 +9839,7 @@
         </w:trPr>
         <w:tc>
           <w:tcPr>
-            <w:tcW w:type="dxa" w:w="1094"/>
+            <w:tcW w:type="dxa" w:w="994"/>
             <w:tcBorders>
               <w:top w:val="single" w:color="BFBFBF" w:sz="4"/>
               <w:left w:val="single" w:color="BFBFBF" w:sz="4"/>
@@ -9866,7 +9866,7 @@
         </w:tc>
         <w:tc>
           <w:tcPr>
-            <w:tcW w:type="dxa" w:w="881"/>
+            <w:tcW w:type="dxa" w:w="801"/>
             <w:tcBorders>
               <w:top w:val="single" w:color="BFBFBF" w:sz="4"/>
               <w:left w:val="single" w:color="BFBFBF" w:sz="4"/>
@@ -9893,7 +9893,7 @@
         </w:tc>
         <w:tc>
           <w:tcPr>
-            <w:tcW w:type="dxa" w:w="2648"/>
+            <w:tcW w:type="dxa" w:w="2338"/>
             <w:tcBorders>
               <w:top w:val="single" w:color="BFBFBF" w:sz="4"/>
               <w:left w:val="single" w:color="BFBFBF" w:sz="4"/>
@@ -9920,7 +9920,7 @@
         </w:tc>
         <w:tc>
           <w:tcPr>
-            <w:tcW w:type="dxa" w:w="2724"/>
+            <w:tcW w:type="dxa" w:w="2477"/>
             <w:tcBorders>
               <w:top w:val="single" w:color="BFBFBF" w:sz="4"/>
               <w:left w:val="single" w:color="BFBFBF" w:sz="4"/>
@@ -9947,7 +9947,7 @@
         </w:tc>
         <w:tc>
           <w:tcPr>
-            <w:tcW w:type="dxa" w:w="2013"/>
+            <w:tcW w:type="dxa" w:w="2750"/>
             <w:tcBorders>
               <w:top w:val="single" w:color="BFBFBF" w:sz="4"/>
               <w:left w:val="single" w:color="BFBFBF" w:sz="4"/>
@@ -9979,7 +9979,7 @@
         </w:trPr>
         <w:tc>
           <w:tcPr>
-            <w:tcW w:type="dxa" w:w="1094"/>
+            <w:tcW w:type="dxa" w:w="994"/>
             <w:tcBorders>
               <w:top w:val="single" w:color="BFBFBF" w:sz="4"/>
               <w:left w:val="single" w:color="BFBFBF" w:sz="4"/>
@@ -10006,7 +10006,7 @@
         </w:tc>
         <w:tc>
           <w:tcPr>
-            <w:tcW w:type="dxa" w:w="881"/>
+            <w:tcW w:type="dxa" w:w="801"/>
             <w:tcBorders>
               <w:top w:val="single" w:color="BFBFBF" w:sz="4"/>
               <w:left w:val="single" w:color="BFBFBF" w:sz="4"/>
@@ -10033,82 +10033,82 @@
         </w:tc>
         <w:tc>
           <w:tcPr>
-            <w:tcW w:type="dxa" w:w="2648"/>
-            <w:tcBorders>
-              <w:top w:val="single" w:color="BFBFBF" w:sz="4"/>
-              <w:left w:val="single" w:color="BFBFBF" w:sz="4"/>
-              <w:bottom w:val="single" w:color="BFBFBF" w:sz="4"/>
-              <w:right w:val="single" w:color="BFBFBF" w:sz="4"/>
-            </w:tcBorders>
-            <w:tcMar>
-              <w:top w:type="dxa" w:w="60"/>
-              <w:left w:type="dxa" w:w="100"/>
-              <w:bottom w:type="dxa" w:w="60"/>
-              <w:right w:type="dxa" w:w="100"/>
-            </w:tcMar>
-          </w:tcPr>
-          <w:p>
-            <w:r>
-              <w:rPr>
-                <w:rFonts w:ascii="Calibri" w:cs="Calibri" w:eastAsia="Calibri" w:hAnsi="Calibri"/>
-                <w:sz w:val="19"/>
-                <w:szCs w:val="19"/>
-              </w:rPr>
-              <w:t xml:space="preserve">2.5x to 4x (average 3.25x)</w:t>
-            </w:r>
-          </w:p>
-        </w:tc>
-        <w:tc>
-          <w:tcPr>
-            <w:tcW w:type="dxa" w:w="2724"/>
-            <w:tcBorders>
-              <w:top w:val="single" w:color="BFBFBF" w:sz="4"/>
-              <w:left w:val="single" w:color="BFBFBF" w:sz="4"/>
-              <w:bottom w:val="single" w:color="BFBFBF" w:sz="4"/>
-              <w:right w:val="single" w:color="BFBFBF" w:sz="4"/>
-            </w:tcBorders>
-            <w:tcMar>
-              <w:top w:type="dxa" w:w="60"/>
-              <w:left w:type="dxa" w:w="100"/>
-              <w:bottom w:type="dxa" w:w="60"/>
-              <w:right w:type="dxa" w:w="100"/>
-            </w:tcMar>
-          </w:tcPr>
-          <w:p>
-            <w:r>
-              <w:rPr>
-                <w:rFonts w:ascii="Calibri" w:cs="Calibri" w:eastAsia="Calibri" w:hAnsi="Calibri"/>
-                <w:sz w:val="19"/>
-                <w:szCs w:val="19"/>
-              </w:rPr>
-              <w:t xml:space="preserve">1.25x to 2x</w:t>
-            </w:r>
-          </w:p>
-        </w:tc>
-        <w:tc>
-          <w:tcPr>
-            <w:tcW w:type="dxa" w:w="2013"/>
-            <w:tcBorders>
-              <w:top w:val="single" w:color="BFBFBF" w:sz="4"/>
-              <w:left w:val="single" w:color="BFBFBF" w:sz="4"/>
-              <w:bottom w:val="single" w:color="BFBFBF" w:sz="4"/>
-              <w:right w:val="single" w:color="BFBFBF" w:sz="4"/>
-            </w:tcBorders>
-            <w:tcMar>
-              <w:top w:type="dxa" w:w="60"/>
-              <w:left w:type="dxa" w:w="100"/>
-              <w:bottom w:type="dxa" w:w="60"/>
-              <w:right w:type="dxa" w:w="100"/>
-            </w:tcMar>
-          </w:tcPr>
-          <w:p>
-            <w:r>
-              <w:rPr>
-                <w:rFonts w:ascii="Calibri" w:cs="Calibri" w:eastAsia="Calibri" w:hAnsi="Calibri"/>
-                <w:sz w:val="19"/>
-                <w:szCs w:val="19"/>
-              </w:rPr>
-              <w:t xml:space="preserve">x3.5 to x5</w:t>
+            <w:tcW w:type="dxa" w:w="2338"/>
+            <w:tcBorders>
+              <w:top w:val="single" w:color="BFBFBF" w:sz="4"/>
+              <w:left w:val="single" w:color="BFBFBF" w:sz="4"/>
+              <w:bottom w:val="single" w:color="BFBFBF" w:sz="4"/>
+              <w:right w:val="single" w:color="BFBFBF" w:sz="4"/>
+            </w:tcBorders>
+            <w:tcMar>
+              <w:top w:type="dxa" w:w="60"/>
+              <w:left w:type="dxa" w:w="100"/>
+              <w:bottom w:type="dxa" w:w="60"/>
+              <w:right w:type="dxa" w:w="100"/>
+            </w:tcMar>
+          </w:tcPr>
+          <w:p>
+            <w:r>
+              <w:rPr>
+                <w:rFonts w:ascii="Calibri" w:cs="Calibri" w:eastAsia="Calibri" w:hAnsi="Calibri"/>
+                <w:sz w:val="19"/>
+                <w:szCs w:val="19"/>
+              </w:rPr>
+              <w:t xml:space="preserve">2.5x to 3.5x (average 3x)</w:t>
+            </w:r>
+          </w:p>
+        </w:tc>
+        <w:tc>
+          <w:tcPr>
+            <w:tcW w:type="dxa" w:w="2477"/>
+            <w:tcBorders>
+              <w:top w:val="single" w:color="BFBFBF" w:sz="4"/>
+              <w:left w:val="single" w:color="BFBFBF" w:sz="4"/>
+              <w:bottom w:val="single" w:color="BFBFBF" w:sz="4"/>
+              <w:right w:val="single" w:color="BFBFBF" w:sz="4"/>
+            </w:tcBorders>
+            <w:tcMar>
+              <w:top w:type="dxa" w:w="60"/>
+              <w:left w:type="dxa" w:w="100"/>
+              <w:bottom w:type="dxa" w:w="60"/>
+              <w:right w:type="dxa" w:w="100"/>
+            </w:tcMar>
+          </w:tcPr>
+          <w:p>
+            <w:r>
+              <w:rPr>
+                <w:rFonts w:ascii="Calibri" w:cs="Calibri" w:eastAsia="Calibri" w:hAnsi="Calibri"/>
+                <w:sz w:val="19"/>
+                <w:szCs w:val="19"/>
+              </w:rPr>
+              <w:t xml:space="preserve">1.25x to 1.75x</w:t>
+            </w:r>
+          </w:p>
+        </w:tc>
+        <w:tc>
+          <w:tcPr>
+            <w:tcW w:type="dxa" w:w="2750"/>
+            <w:tcBorders>
+              <w:top w:val="single" w:color="BFBFBF" w:sz="4"/>
+              <w:left w:val="single" w:color="BFBFBF" w:sz="4"/>
+              <w:bottom w:val="single" w:color="BFBFBF" w:sz="4"/>
+              <w:right w:val="single" w:color="BFBFBF" w:sz="4"/>
+            </w:tcBorders>
+            <w:tcMar>
+              <w:top w:type="dxa" w:w="60"/>
+              <w:left w:type="dxa" w:w="100"/>
+              <w:bottom w:type="dxa" w:w="60"/>
+              <w:right w:type="dxa" w:w="100"/>
+            </w:tcMar>
+          </w:tcPr>
+          <w:p>
+            <w:r>
+              <w:rPr>
+                <w:rFonts w:ascii="Calibri" w:cs="Calibri" w:eastAsia="Calibri" w:hAnsi="Calibri"/>
+                <w:sz w:val="19"/>
+                <w:szCs w:val="19"/>
+              </w:rPr>
+              <w:t xml:space="preserve">x2.5 to x3.5 (same as the size)</w:t>
             </w:r>
           </w:p>
         </w:tc>
@@ -10119,7 +10119,7 @@
         </w:trPr>
         <w:tc>
           <w:tcPr>
-            <w:tcW w:type="dxa" w:w="1094"/>
+            <w:tcW w:type="dxa" w:w="994"/>
             <w:tcBorders>
               <w:top w:val="single" w:color="BFBFBF" w:sz="4"/>
               <w:left w:val="single" w:color="BFBFBF" w:sz="4"/>
@@ -10146,7 +10146,7 @@
         </w:tc>
         <w:tc>
           <w:tcPr>
-            <w:tcW w:type="dxa" w:w="881"/>
+            <w:tcW w:type="dxa" w:w="801"/>
             <w:tcBorders>
               <w:top w:val="single" w:color="BFBFBF" w:sz="4"/>
               <w:left w:val="single" w:color="BFBFBF" w:sz="4"/>
@@ -10173,82 +10173,82 @@
         </w:tc>
         <w:tc>
           <w:tcPr>
-            <w:tcW w:type="dxa" w:w="2648"/>
-            <w:tcBorders>
-              <w:top w:val="single" w:color="BFBFBF" w:sz="4"/>
-              <w:left w:val="single" w:color="BFBFBF" w:sz="4"/>
-              <w:bottom w:val="single" w:color="BFBFBF" w:sz="4"/>
-              <w:right w:val="single" w:color="BFBFBF" w:sz="4"/>
-            </w:tcBorders>
-            <w:tcMar>
-              <w:top w:type="dxa" w:w="60"/>
-              <w:left w:type="dxa" w:w="100"/>
-              <w:bottom w:type="dxa" w:w="60"/>
-              <w:right w:type="dxa" w:w="100"/>
-            </w:tcMar>
-          </w:tcPr>
-          <w:p>
-            <w:r>
-              <w:rPr>
-                <w:rFonts w:ascii="Calibri" w:cs="Calibri" w:eastAsia="Calibri" w:hAnsi="Calibri"/>
-                <w:sz w:val="19"/>
-                <w:szCs w:val="19"/>
-              </w:rPr>
-              <w:t xml:space="preserve">5x to 7x (average 6x)</w:t>
-            </w:r>
-          </w:p>
-        </w:tc>
-        <w:tc>
-          <w:tcPr>
-            <w:tcW w:type="dxa" w:w="2724"/>
-            <w:tcBorders>
-              <w:top w:val="single" w:color="BFBFBF" w:sz="4"/>
-              <w:left w:val="single" w:color="BFBFBF" w:sz="4"/>
-              <w:bottom w:val="single" w:color="BFBFBF" w:sz="4"/>
-              <w:right w:val="single" w:color="BFBFBF" w:sz="4"/>
-            </w:tcBorders>
-            <w:tcMar>
-              <w:top w:type="dxa" w:w="60"/>
-              <w:left w:type="dxa" w:w="100"/>
-              <w:bottom w:type="dxa" w:w="60"/>
-              <w:right w:type="dxa" w:w="100"/>
-            </w:tcMar>
-          </w:tcPr>
-          <w:p>
-            <w:r>
-              <w:rPr>
-                <w:rFonts w:ascii="Calibri" w:cs="Calibri" w:eastAsia="Calibri" w:hAnsi="Calibri"/>
-                <w:sz w:val="19"/>
-                <w:szCs w:val="19"/>
-              </w:rPr>
-              <w:t xml:space="preserve">2.5x to 3.5x</w:t>
-            </w:r>
-          </w:p>
-        </w:tc>
-        <w:tc>
-          <w:tcPr>
-            <w:tcW w:type="dxa" w:w="2013"/>
-            <w:tcBorders>
-              <w:top w:val="single" w:color="BFBFBF" w:sz="4"/>
-              <w:left w:val="single" w:color="BFBFBF" w:sz="4"/>
-              <w:bottom w:val="single" w:color="BFBFBF" w:sz="4"/>
-              <w:right w:val="single" w:color="BFBFBF" w:sz="4"/>
-            </w:tcBorders>
-            <w:tcMar>
-              <w:top w:type="dxa" w:w="60"/>
-              <w:left w:type="dxa" w:w="100"/>
-              <w:bottom w:type="dxa" w:w="60"/>
-              <w:right w:type="dxa" w:w="100"/>
-            </w:tcMar>
-          </w:tcPr>
-          <w:p>
-            <w:r>
-              <w:rPr>
-                <w:rFonts w:ascii="Calibri" w:cs="Calibri" w:eastAsia="Calibri" w:hAnsi="Calibri"/>
-                <w:sz w:val="19"/>
-                <w:szCs w:val="19"/>
-              </w:rPr>
-              <w:t xml:space="preserve">x7 to x10</w:t>
+            <w:tcW w:type="dxa" w:w="2338"/>
+            <w:tcBorders>
+              <w:top w:val="single" w:color="BFBFBF" w:sz="4"/>
+              <w:left w:val="single" w:color="BFBFBF" w:sz="4"/>
+              <w:bottom w:val="single" w:color="BFBFBF" w:sz="4"/>
+              <w:right w:val="single" w:color="BFBFBF" w:sz="4"/>
+            </w:tcBorders>
+            <w:tcMar>
+              <w:top w:type="dxa" w:w="60"/>
+              <w:left w:type="dxa" w:w="100"/>
+              <w:bottom w:type="dxa" w:w="60"/>
+              <w:right w:type="dxa" w:w="100"/>
+            </w:tcMar>
+          </w:tcPr>
+          <w:p>
+            <w:r>
+              <w:rPr>
+                <w:rFonts w:ascii="Calibri" w:cs="Calibri" w:eastAsia="Calibri" w:hAnsi="Calibri"/>
+                <w:sz w:val="19"/>
+                <w:szCs w:val="19"/>
+              </w:rPr>
+              <w:t xml:space="preserve">4x to 6x (average 5x)</w:t>
+            </w:r>
+          </w:p>
+        </w:tc>
+        <w:tc>
+          <w:tcPr>
+            <w:tcW w:type="dxa" w:w="2477"/>
+            <w:tcBorders>
+              <w:top w:val="single" w:color="BFBFBF" w:sz="4"/>
+              <w:left w:val="single" w:color="BFBFBF" w:sz="4"/>
+              <w:bottom w:val="single" w:color="BFBFBF" w:sz="4"/>
+              <w:right w:val="single" w:color="BFBFBF" w:sz="4"/>
+            </w:tcBorders>
+            <w:tcMar>
+              <w:top w:type="dxa" w:w="60"/>
+              <w:left w:type="dxa" w:w="100"/>
+              <w:bottom w:type="dxa" w:w="60"/>
+              <w:right w:type="dxa" w:w="100"/>
+            </w:tcMar>
+          </w:tcPr>
+          <w:p>
+            <w:r>
+              <w:rPr>
+                <w:rFonts w:ascii="Calibri" w:cs="Calibri" w:eastAsia="Calibri" w:hAnsi="Calibri"/>
+                <w:sz w:val="19"/>
+                <w:szCs w:val="19"/>
+              </w:rPr>
+              <w:t xml:space="preserve">2x to 3x</w:t>
+            </w:r>
+          </w:p>
+        </w:tc>
+        <w:tc>
+          <w:tcPr>
+            <w:tcW w:type="dxa" w:w="2750"/>
+            <w:tcBorders>
+              <w:top w:val="single" w:color="BFBFBF" w:sz="4"/>
+              <w:left w:val="single" w:color="BFBFBF" w:sz="4"/>
+              <w:bottom w:val="single" w:color="BFBFBF" w:sz="4"/>
+              <w:right w:val="single" w:color="BFBFBF" w:sz="4"/>
+            </w:tcBorders>
+            <w:tcMar>
+              <w:top w:type="dxa" w:w="60"/>
+              <w:left w:type="dxa" w:w="100"/>
+              <w:bottom w:type="dxa" w:w="60"/>
+              <w:right w:type="dxa" w:w="100"/>
+            </w:tcMar>
+          </w:tcPr>
+          <w:p>
+            <w:r>
+              <w:rPr>
+                <w:rFonts w:ascii="Calibri" w:cs="Calibri" w:eastAsia="Calibri" w:hAnsi="Calibri"/>
+                <w:sz w:val="19"/>
+                <w:szCs w:val="19"/>
+              </w:rPr>
+              <w:t xml:space="preserve">x4 to x6 (same as the size)</w:t>
             </w:r>
           </w:p>
         </w:tc>
@@ -10259,7 +10259,7 @@
         </w:trPr>
         <w:tc>
           <w:tcPr>
-            <w:tcW w:type="dxa" w:w="1094"/>
+            <w:tcW w:type="dxa" w:w="994"/>
             <w:tcBorders>
               <w:top w:val="single" w:color="BFBFBF" w:sz="4"/>
               <w:left w:val="single" w:color="BFBFBF" w:sz="4"/>
@@ -10286,7 +10286,7 @@
         </w:tc>
         <w:tc>
           <w:tcPr>
-            <w:tcW w:type="dxa" w:w="881"/>
+            <w:tcW w:type="dxa" w:w="801"/>
             <w:tcBorders>
               <w:top w:val="single" w:color="BFBFBF" w:sz="4"/>
               <w:left w:val="single" w:color="BFBFBF" w:sz="4"/>
@@ -10313,82 +10313,82 @@
         </w:tc>
         <w:tc>
           <w:tcPr>
-            <w:tcW w:type="dxa" w:w="2648"/>
-            <w:tcBorders>
-              <w:top w:val="single" w:color="BFBFBF" w:sz="4"/>
-              <w:left w:val="single" w:color="BFBFBF" w:sz="4"/>
-              <w:bottom w:val="single" w:color="BFBFBF" w:sz="4"/>
-              <w:right w:val="single" w:color="BFBFBF" w:sz="4"/>
-            </w:tcBorders>
-            <w:tcMar>
-              <w:top w:type="dxa" w:w="60"/>
-              <w:left w:type="dxa" w:w="100"/>
-              <w:bottom w:type="dxa" w:w="60"/>
-              <w:right w:type="dxa" w:w="100"/>
-            </w:tcMar>
-          </w:tcPr>
-          <w:p>
-            <w:r>
-              <w:rPr>
-                <w:rFonts w:ascii="Calibri" w:cs="Calibri" w:eastAsia="Calibri" w:hAnsi="Calibri"/>
-                <w:sz w:val="19"/>
-                <w:szCs w:val="19"/>
-              </w:rPr>
-              <w:t xml:space="preserve">10x</w:t>
-            </w:r>
-          </w:p>
-        </w:tc>
-        <w:tc>
-          <w:tcPr>
-            <w:tcW w:type="dxa" w:w="2724"/>
-            <w:tcBorders>
-              <w:top w:val="single" w:color="BFBFBF" w:sz="4"/>
-              <w:left w:val="single" w:color="BFBFBF" w:sz="4"/>
-              <w:bottom w:val="single" w:color="BFBFBF" w:sz="4"/>
-              <w:right w:val="single" w:color="BFBFBF" w:sz="4"/>
-            </w:tcBorders>
-            <w:tcMar>
-              <w:top w:type="dxa" w:w="60"/>
-              <w:left w:type="dxa" w:w="100"/>
-              <w:bottom w:type="dxa" w:w="60"/>
-              <w:right w:type="dxa" w:w="100"/>
-            </w:tcMar>
-          </w:tcPr>
-          <w:p>
-            <w:r>
-              <w:rPr>
-                <w:rFonts w:ascii="Calibri" w:cs="Calibri" w:eastAsia="Calibri" w:hAnsi="Calibri"/>
-                <w:sz w:val="19"/>
-                <w:szCs w:val="19"/>
-              </w:rPr>
-              <w:t xml:space="preserve">5x</w:t>
-            </w:r>
-          </w:p>
-        </w:tc>
-        <w:tc>
-          <w:tcPr>
-            <w:tcW w:type="dxa" w:w="2013"/>
-            <w:tcBorders>
-              <w:top w:val="single" w:color="BFBFBF" w:sz="4"/>
-              <w:left w:val="single" w:color="BFBFBF" w:sz="4"/>
-              <w:bottom w:val="single" w:color="BFBFBF" w:sz="4"/>
-              <w:right w:val="single" w:color="BFBFBF" w:sz="4"/>
-            </w:tcBorders>
-            <w:tcMar>
-              <w:top w:type="dxa" w:w="60"/>
-              <w:left w:type="dxa" w:w="100"/>
-              <w:bottom w:type="dxa" w:w="60"/>
-              <w:right w:type="dxa" w:w="100"/>
-            </w:tcMar>
-          </w:tcPr>
-          <w:p>
-            <w:r>
-              <w:rPr>
-                <w:rFonts w:ascii="Calibri" w:cs="Calibri" w:eastAsia="Calibri" w:hAnsi="Calibri"/>
-                <w:sz w:val="19"/>
-                <w:szCs w:val="19"/>
-              </w:rPr>
-              <w:t xml:space="preserve">x15</w:t>
+            <w:tcW w:type="dxa" w:w="2338"/>
+            <w:tcBorders>
+              <w:top w:val="single" w:color="BFBFBF" w:sz="4"/>
+              <w:left w:val="single" w:color="BFBFBF" w:sz="4"/>
+              <w:bottom w:val="single" w:color="BFBFBF" w:sz="4"/>
+              <w:right w:val="single" w:color="BFBFBF" w:sz="4"/>
+            </w:tcBorders>
+            <w:tcMar>
+              <w:top w:type="dxa" w:w="60"/>
+              <w:left w:type="dxa" w:w="100"/>
+              <w:bottom w:type="dxa" w:w="60"/>
+              <w:right w:type="dxa" w:w="100"/>
+            </w:tcMar>
+          </w:tcPr>
+          <w:p>
+            <w:r>
+              <w:rPr>
+                <w:rFonts w:ascii="Calibri" w:cs="Calibri" w:eastAsia="Calibri" w:hAnsi="Calibri"/>
+                <w:sz w:val="19"/>
+                <w:szCs w:val="19"/>
+              </w:rPr>
+              <w:t xml:space="preserve">8x</w:t>
+            </w:r>
+          </w:p>
+        </w:tc>
+        <w:tc>
+          <w:tcPr>
+            <w:tcW w:type="dxa" w:w="2477"/>
+            <w:tcBorders>
+              <w:top w:val="single" w:color="BFBFBF" w:sz="4"/>
+              <w:left w:val="single" w:color="BFBFBF" w:sz="4"/>
+              <w:bottom w:val="single" w:color="BFBFBF" w:sz="4"/>
+              <w:right w:val="single" w:color="BFBFBF" w:sz="4"/>
+            </w:tcBorders>
+            <w:tcMar>
+              <w:top w:type="dxa" w:w="60"/>
+              <w:left w:type="dxa" w:w="100"/>
+              <w:bottom w:type="dxa" w:w="60"/>
+              <w:right w:type="dxa" w:w="100"/>
+            </w:tcMar>
+          </w:tcPr>
+          <w:p>
+            <w:r>
+              <w:rPr>
+                <w:rFonts w:ascii="Calibri" w:cs="Calibri" w:eastAsia="Calibri" w:hAnsi="Calibri"/>
+                <w:sz w:val="19"/>
+                <w:szCs w:val="19"/>
+              </w:rPr>
+              <w:t xml:space="preserve">4x</w:t>
+            </w:r>
+          </w:p>
+        </w:tc>
+        <w:tc>
+          <w:tcPr>
+            <w:tcW w:type="dxa" w:w="2750"/>
+            <w:tcBorders>
+              <w:top w:val="single" w:color="BFBFBF" w:sz="4"/>
+              <w:left w:val="single" w:color="BFBFBF" w:sz="4"/>
+              <w:bottom w:val="single" w:color="BFBFBF" w:sz="4"/>
+              <w:right w:val="single" w:color="BFBFBF" w:sz="4"/>
+            </w:tcBorders>
+            <w:tcMar>
+              <w:top w:type="dxa" w:w="60"/>
+              <w:left w:type="dxa" w:w="100"/>
+              <w:bottom w:type="dxa" w:w="60"/>
+              <w:right w:type="dxa" w:w="100"/>
+            </w:tcMar>
+          </w:tcPr>
+          <w:p>
+            <w:r>
+              <w:rPr>
+                <w:rFonts w:ascii="Calibri" w:cs="Calibri" w:eastAsia="Calibri" w:hAnsi="Calibri"/>
+                <w:sz w:val="19"/>
+                <w:szCs w:val="19"/>
+              </w:rPr>
+              <w:t xml:space="preserve">x16 (twice its size)</w:t>
             </w:r>
           </w:p>
         </w:tc>
@@ -10429,26 +10429,7 @@
         <w:rPr>
           <w:rFonts w:ascii="Calibri" w:cs="Calibri" w:eastAsia="Calibri" w:hAnsi="Calibri"/>
         </w:rPr>
-        <w:t xml:space="preserve">). The money multiplier follows the size in a straight line between the tier's low and high end: a 2.5x Big pays x3.5, a 3.25x Big pays x4.25 and a 4x Big pays x5. Names show the size: "Big 3.2x Golden Bat". Eggs still carried in the thief's arms are capped at 1.4 (twice a normal egg), and eggs on the incubator pedestals are shrunk to fit under the roof; a 10x pet is about 25 studs tall on a base.</w:t>
-      </w:r>
-    </w:p>
-    <w:p>
-      <w:pPr>
-        <w:spacing w:after="140"/>
-      </w:pPr>
-      <w:r>
-        <w:rPr>
-          <w:rFonts w:ascii="Calibri" w:cs="Calibri" w:eastAsia="Calibri" w:hAnsi="Calibri"/>
-          <w:b/>
-          <w:bCs/>
-        </w:rPr>
-        <w:t xml:space="preserve">Size platform (6.1):</w:t>
-      </w:r>
-      <w:r>
-        <w:rPr>
-          <w:rFonts w:ascii="Calibri" w:cs="Calibri" w:eastAsia="Calibri" w:hAnsi="Calibri"/>
-        </w:rPr>
-        <w:t xml:space="preserve"> a platform floats in the void to the right of the map (about 215 to 375 studs from the hub's right edge, at </w:t>
+        <w:t xml:space="preserve">). The money multiplier equals the size for Big and Huge: a 2.5x Big pays x2.5, a 3.2x Big pays x3.2 and a 6x Huge pays x6. Gigantic is the exception: it is always 8x big and pays x16. (</w:t>
       </w:r>
       <w:r>
         <w:rPr>
@@ -10456,13 +10437,13 @@
           <w:sz w:val="20"/>
           <w:szCs w:val="20"/>
         </w:rPr>
-        <w:t xml:space="preserve">Config.SizeStage.Center</w:t>
-      </w:r>
-      <w:r>
-        <w:rPr>
-          <w:rFonts w:ascii="Calibri" w:cs="Calibri" w:eastAsia="Calibri" w:hAnsi="Calibri"/>
-        </w:rPr>
-        <w:t xml:space="preserve">). It shows the smallest pet (Bat) and the biggest pet (Pumpkin King) in four columns, Normal, Big, Huge, Gigantic, at the middle of each size's range, with labels on the floor that give the size range and the money multiplier, and a 5 stud marker for comparing with a player. It is built when the server starts (</w:t>
+        <w:t xml:space="preserve">MoneyMin</w:t>
+      </w:r>
+      <w:r>
+        <w:rPr>
+          <w:rFonts w:ascii="Calibri" w:cs="Calibri" w:eastAsia="Calibri" w:hAnsi="Calibri"/>
+        </w:rPr>
+        <w:t xml:space="preserve"> and </w:t>
       </w:r>
       <w:r>
         <w:rPr>
@@ -10470,20 +10451,81 @@
           <w:sz w:val="20"/>
           <w:szCs w:val="20"/>
         </w:rPr>
-        <w:t xml:space="preserve">MapBuilder.BuildSizeStage</w:t>
-      </w:r>
-      <w:r>
-        <w:rPr>
-          <w:rFonts w:ascii="Calibri" w:cs="Calibri" w:eastAsia="Calibri" w:hAnsi="Calibri"/>
-        </w:rPr>
-        <w:t xml:space="preserve">), so it only shows in play mode and is not saved in the place. It is not connected to the map by a bridge; the Admin panel has a </w:t>
-      </w:r>
+        <w:t xml:space="preserve">MoneyMax</w:t>
+      </w:r>
+      <w:r>
+        <w:rPr>
+          <w:rFonts w:ascii="Calibri" w:cs="Calibri" w:eastAsia="Calibri" w:hAnsi="Calibri"/>
+        </w:rPr>
+        <w:t xml:space="preserve"> in </w:t>
+      </w:r>
+      <w:r>
+        <w:rPr>
+          <w:rFonts w:ascii="Courier New" w:cs="Courier New" w:eastAsia="Courier New" w:hAnsi="Courier New"/>
+          <w:sz w:val="20"/>
+          <w:szCs w:val="20"/>
+        </w:rPr>
+        <w:t xml:space="preserve">Config.Sizes</w:t>
+      </w:r>
+      <w:r>
+        <w:rPr>
+          <w:rFonts w:ascii="Calibri" w:cs="Calibri" w:eastAsia="Calibri" w:hAnsi="Calibri"/>
+        </w:rPr>
+        <w:t xml:space="preserve"> set the multiplier at the low and high end of each range.) Names show the size: "Big 3.2x Golden Bat". Eggs still carried in the thief's arms are capped at 1.4 (twice a normal egg), and eggs on the incubator pedestals are shrunk to fit under the roof; an 8x pet is about 20 to 50 studs tall on a base.</w:t>
+      </w:r>
+    </w:p>
+    <w:p>
+      <w:pPr>
+        <w:spacing w:after="140"/>
+      </w:pPr>
       <w:r>
         <w:rPr>
           <w:rFonts w:ascii="Calibri" w:cs="Calibri" w:eastAsia="Calibri" w:hAnsi="Calibri"/>
           <w:b/>
           <w:bCs/>
         </w:rPr>
+        <w:t xml:space="preserve">Size platform (6.1):</w:t>
+      </w:r>
+      <w:r>
+        <w:rPr>
+          <w:rFonts w:ascii="Calibri" w:cs="Calibri" w:eastAsia="Calibri" w:hAnsi="Calibri"/>
+        </w:rPr>
+        <w:t xml:space="preserve"> a platform floats in the void to the right of the map (about 40 to 210 studs from the hub's right edge, at </w:t>
+      </w:r>
+      <w:r>
+        <w:rPr>
+          <w:rFonts w:ascii="Courier New" w:cs="Courier New" w:eastAsia="Courier New" w:hAnsi="Courier New"/>
+          <w:sz w:val="20"/>
+          <w:szCs w:val="20"/>
+        </w:rPr>
+        <w:t xml:space="preserve">Config.SizeStage.Center</w:t>
+      </w:r>
+      <w:r>
+        <w:rPr>
+          <w:rFonts w:ascii="Calibri" w:cs="Calibri" w:eastAsia="Calibri" w:hAnsi="Calibri"/>
+        </w:rPr>
+        <w:t xml:space="preserve">). It shows the smallest pet (Bat) and the biggest pet (Pumpkin King) in four columns, Normal, Big, Huge, Gigantic, at the middle of each size's range, with labels on the floor that give the size range and the money multiplier, and a 5 stud marker for comparing with a player. It is built when the server starts (</w:t>
+      </w:r>
+      <w:r>
+        <w:rPr>
+          <w:rFonts w:ascii="Courier New" w:cs="Courier New" w:eastAsia="Courier New" w:hAnsi="Courier New"/>
+          <w:sz w:val="20"/>
+          <w:szCs w:val="20"/>
+        </w:rPr>
+        <w:t xml:space="preserve">MapBuilder.BuildSizeStage</w:t>
+      </w:r>
+      <w:r>
+        <w:rPr>
+          <w:rFonts w:ascii="Calibri" w:cs="Calibri" w:eastAsia="Calibri" w:hAnsi="Calibri"/>
+        </w:rPr>
+        <w:t xml:space="preserve">), so it only shows in play mode and is not saved in the place. It is not connected to the map by a bridge; the Admin panel has a </w:t>
+      </w:r>
+      <w:r>
+        <w:rPr>
+          <w:rFonts w:ascii="Calibri" w:cs="Calibri" w:eastAsia="Calibri" w:hAnsi="Calibri"/>
+          <w:b/>
+          <w:bCs/>
+        </w:rPr>
         <w:t xml:space="preserve">Sizes</w:t>
       </w:r>
       <w:r>
@@ -10501,7 +10543,7 @@
         <w:rPr>
           <w:rFonts w:ascii="Calibri" w:cs="Calibri" w:eastAsia="Calibri" w:hAnsi="Calibri"/>
         </w:rPr>
-        <w:t xml:space="preserve">Before 6.1 the sizes were fixed (Big x3, Huge x8, Gigantic x30, drawn 1.6x, 2.1x, 2.8x). Old saved pets such as "Bat+Big" keep working with those fixed values. The average money multiplier went from 1.83 to 2.03 (+11%): Big and Huge pay more, Gigantic pays less (x30 became x15).</w:t>
+        <w:t xml:space="preserve">Before 6.1 the sizes were fixed (Big x3, Huge x8, Gigantic x30, drawn 1.6x, 2.1x, 2.8x). Old saved pets such as "Bat+Big" keep working with those fixed values. The average money multiplier went from 1.83 to 1.64 (-10%): Big, Huge and Gigantic all pay a bit less than the old fixed x3, x8 and x30 (Gigantic x30 became x16). Prices were not changed, so progress is about 10% slower for an average-luck player.</w:t>
       </w:r>
     </w:p>
     <w:tbl>
@@ -11000,7 +11042,7 @@
         <w:rPr>
           <w:rFonts w:ascii="Calibri" w:cs="Calibri" w:eastAsia="Calibri" w:hAnsi="Calibri"/>
         </w:rPr>
-        <w:t xml:space="preserve">Multipliers stack: a Gigantic Rainbow pet earns x375 (a Gigantic Rainbow Pumpkin King would earn $5.6M/s, about 1 egg in 20,000). A variant pet is stored as "Bat+Big3.2+Golden" (the size token carries the rolled size) and counts as its plain pet in the Index. All numbers are in </w:t>
+        <w:t xml:space="preserve">Multipliers stack: a Gigantic Rainbow pet earns x400 (a Gigantic Rainbow Pumpkin King would earn $6M/s, about 1 egg in 20,000). A variant pet is stored as "Bat+Big3.2+Golden" (the size token carries the rolled size) and counts as its plain pet in the Index. All numbers are in </w:t>
       </w:r>
       <w:r>
         <w:rPr>
@@ -23275,7 +23317,7 @@
         <w:rPr>
           <w:rFonts w:ascii="Calibri" w:cs="Calibri" w:eastAsia="Calibri" w:hAnsi="Calibri"/>
         </w:rPr>
-        <w:t xml:space="preserve"> Check in play that a Gigantic Rainbow jackpot (x375) feels exciting and does not break the economy, and whether big eggs should also be heavier to carry.</w:t>
+        <w:t xml:space="preserve"> Check in play that a Gigantic Rainbow jackpot (x400) feels exciting and does not break the economy, and whether big eggs should also be heavier to carry.</w:t>
       </w:r>
     </w:p>
     <w:p>

</xml_diff>

<commit_message>
Big 2-3x, Huge 3-5x, Gigantic 7x (money unchanged); costume requirements one step higher per house with more Candy per knock and cheaper costumes
Houses 1-2 need the 1st costume, house 3 the 2nd ... house 9 the 8th. Candy per knock
12/24/48/100/200/400/800/1600/3200; costume prices about 15% lower. Simulated: costume 2-10 are
bought at 7m/15m/25m/37m/54m/1.2h/1.6h/1.9h/2.3h, houses 3 and 4 open at 18m and 33m.

Co-Authored-By: Claude Sonnet 5.5 <noreply@anthropic.com>
Claude-Session: https://claude.ai/code/session_013ivEnYiZGofRBeqQFKAVhJ
</commit_message>
<xml_diff>
--- a/docs/Spooky-Steal-Design-and-Plan.docx
+++ b/docs/Spooky-Steal-Design-and-Plan.docx
@@ -1173,7 +1173,125 @@
                 <w:sz w:val="19"/>
                 <w:szCs w:val="19"/>
               </w:rPr>
-              <w:t xml:space="preserve">Every Big, Huge and Gigantic egg now gets its own random size, and the money multiplier is that size: Big pets are drawn 2.5x to 3.5x bigger and pay the same (x2.5 to x3.5), Huge 4x to 6x and x4 to x6, Gigantic 8x and x16 (before: fixed x3, x8 and x30). Eggs are drawn half as big as the pet. See 2.8. The Blood Moon event is shelved for now; it stays in the git history (commits 346b54e and 4d825cd).</w:t>
+              <w:t xml:space="preserve">Every Big, Huge and Gigantic egg now gets its own random size, and the money multiplier is that size: Big pets are drawn 2x to 3x bigger and pay x2.5 to x3.5, Huge 3x to 5x and x4 to x6, Gigantic 7x and x16 (before: fixed x3, x8 and x30). Eggs are drawn half as big as the pet. See 2.8. The Blood Moon event is shelved for now; it stays in the git history (commits 346b54e and 4d825cd).</w:t>
+            </w:r>
+          </w:p>
+        </w:tc>
+      </w:tr>
+      <w:tr>
+        <w:trPr>
+          <w:cantSplit/>
+        </w:trPr>
+        <w:tc>
+          <w:tcPr>
+            <w:tcW w:type="dxa" w:w="4252"/>
+            <w:tcBorders>
+              <w:top w:val="single" w:color="BFBFBF" w:sz="4"/>
+              <w:left w:val="single" w:color="BFBFBF" w:sz="4"/>
+              <w:bottom w:val="single" w:color="BFBFBF" w:sz="4"/>
+              <w:right w:val="single" w:color="BFBFBF" w:sz="4"/>
+            </w:tcBorders>
+            <w:tcMar>
+              <w:top w:type="dxa" w:w="60"/>
+              <w:left w:type="dxa" w:w="100"/>
+              <w:bottom w:type="dxa" w:w="60"/>
+              <w:right w:type="dxa" w:w="100"/>
+            </w:tcMar>
+          </w:tcPr>
+          <w:p>
+            <w:r>
+              <w:rPr>
+                <w:rFonts w:ascii="Calibri" w:cs="Calibri" w:eastAsia="Calibri" w:hAnsi="Calibri"/>
+                <w:sz w:val="19"/>
+                <w:szCs w:val="19"/>
+              </w:rPr>
+              <w:t xml:space="preserve">V6.5 adopted</w:t>
+            </w:r>
+          </w:p>
+        </w:tc>
+        <w:tc>
+          <w:tcPr>
+            <w:tcW w:type="dxa" w:w="5108"/>
+            <w:tcBorders>
+              <w:top w:val="single" w:color="BFBFBF" w:sz="4"/>
+              <w:left w:val="single" w:color="BFBFBF" w:sz="4"/>
+              <w:bottom w:val="single" w:color="BFBFBF" w:sz="4"/>
+              <w:right w:val="single" w:color="BFBFBF" w:sz="4"/>
+            </w:tcBorders>
+            <w:tcMar>
+              <w:top w:type="dxa" w:w="60"/>
+              <w:left w:type="dxa" w:w="100"/>
+              <w:bottom w:type="dxa" w:w="60"/>
+              <w:right w:type="dxa" w:w="100"/>
+            </w:tcMar>
+          </w:tcPr>
+          <w:p>
+            <w:r>
+              <w:rPr>
+                <w:rFonts w:ascii="Calibri" w:cs="Calibri" w:eastAsia="Calibri" w:hAnsi="Calibri"/>
+                <w:sz w:val="19"/>
+                <w:szCs w:val="19"/>
+              </w:rPr>
+              <w:t xml:space="preserve">Your uploaded V6.5 is now the main place: the Blood Moon event with bloody eggs, houses 5 and 6 with their own pets, the Settings window, login rewards and the lighter quest rewards come from it.</w:t>
+            </w:r>
+          </w:p>
+        </w:tc>
+      </w:tr>
+      <w:tr>
+        <w:trPr>
+          <w:cantSplit/>
+        </w:trPr>
+        <w:tc>
+          <w:tcPr>
+            <w:tcW w:type="dxa" w:w="4252"/>
+            <w:tcBorders>
+              <w:top w:val="single" w:color="BFBFBF" w:sz="4"/>
+              <w:left w:val="single" w:color="BFBFBF" w:sz="4"/>
+              <w:bottom w:val="single" w:color="BFBFBF" w:sz="4"/>
+              <w:right w:val="single" w:color="BFBFBF" w:sz="4"/>
+            </w:tcBorders>
+            <w:tcMar>
+              <w:top w:type="dxa" w:w="60"/>
+              <w:left w:type="dxa" w:w="100"/>
+              <w:bottom w:type="dxa" w:w="60"/>
+              <w:right w:type="dxa" w:w="100"/>
+            </w:tcMar>
+          </w:tcPr>
+          <w:p>
+            <w:r>
+              <w:rPr>
+                <w:rFonts w:ascii="Calibri" w:cs="Calibri" w:eastAsia="Calibri" w:hAnsi="Calibri"/>
+                <w:sz w:val="19"/>
+                <w:szCs w:val="19"/>
+              </w:rPr>
+              <w:t xml:space="preserve">Costume requirements and Candy (6.5)</w:t>
+            </w:r>
+          </w:p>
+        </w:tc>
+        <w:tc>
+          <w:tcPr>
+            <w:tcW w:type="dxa" w:w="5108"/>
+            <w:tcBorders>
+              <w:top w:val="single" w:color="BFBFBF" w:sz="4"/>
+              <w:left w:val="single" w:color="BFBFBF" w:sz="4"/>
+              <w:bottom w:val="single" w:color="BFBFBF" w:sz="4"/>
+              <w:right w:val="single" w:color="BFBFBF" w:sz="4"/>
+            </w:tcBorders>
+            <w:tcMar>
+              <w:top w:type="dxa" w:w="60"/>
+              <w:left w:type="dxa" w:w="100"/>
+              <w:bottom w:type="dxa" w:w="60"/>
+              <w:right w:type="dxa" w:w="100"/>
+            </w:tcMar>
+          </w:tcPr>
+          <w:p>
+            <w:r>
+              <w:rPr>
+                <w:rFonts w:ascii="Calibri" w:cs="Calibri" w:eastAsia="Calibri" w:hAnsi="Calibri"/>
+                <w:sz w:val="19"/>
+                <w:szCs w:val="19"/>
+              </w:rPr>
+              <w:t xml:space="preserve">Houses 1 and 2 now need the 1st costume (Bedsheet Ghost), house 3 the 2nd, house 4 the 3rd and so on up to the Mummy for house 9. To make up for it, Candy per knock is about 1.2x what it would have been and costume prices are about 15% lower: you can afford the next costume after 8 to 40 knocks (before: 10 to 118).</w:t>
             </w:r>
           </w:p>
         </w:tc>
@@ -3876,7 +3994,7 @@
                 <w:sz w:val="19"/>
                 <w:szCs w:val="19"/>
               </w:rPr>
-              <w:t xml:space="preserve">5</w:t>
+              <w:t xml:space="preserve">12</w:t>
             </w:r>
           </w:p>
         </w:tc>
@@ -3903,7 +4021,7 @@
                 <w:sz w:val="19"/>
                 <w:szCs w:val="19"/>
               </w:rPr>
-              <w:t xml:space="preserve">None</w:t>
+              <w:t xml:space="preserve">Bedsheet Ghost</w:t>
             </w:r>
           </w:p>
         </w:tc>
@@ -4124,7 +4242,7 @@
                 <w:sz w:val="19"/>
                 <w:szCs w:val="19"/>
               </w:rPr>
-              <w:t xml:space="preserve">10</w:t>
+              <w:t xml:space="preserve">24</w:t>
             </w:r>
           </w:p>
         </w:tc>
@@ -4151,7 +4269,7 @@
                 <w:sz w:val="19"/>
                 <w:szCs w:val="19"/>
               </w:rPr>
-              <w:t xml:space="preserve">None</w:t>
+              <w:t xml:space="preserve">Bedsheet Ghost</w:t>
             </w:r>
           </w:p>
         </w:tc>
@@ -4372,7 +4490,7 @@
                 <w:sz w:val="19"/>
                 <w:szCs w:val="19"/>
               </w:rPr>
-              <w:t xml:space="preserve">20</w:t>
+              <w:t xml:space="preserve">48</w:t>
             </w:r>
           </w:p>
         </w:tc>
@@ -4399,7 +4517,7 @@
                 <w:sz w:val="19"/>
                 <w:szCs w:val="19"/>
               </w:rPr>
-              <w:t xml:space="preserve">Bedsheet Ghost</w:t>
+              <w:t xml:space="preserve">Pumpkin Head</w:t>
             </w:r>
           </w:p>
         </w:tc>
@@ -4620,7 +4738,7 @@
                 <w:sz w:val="19"/>
                 <w:szCs w:val="19"/>
               </w:rPr>
-              <w:t xml:space="preserve">40</w:t>
+              <w:t xml:space="preserve">100</w:t>
             </w:r>
           </w:p>
         </w:tc>
@@ -4647,7 +4765,7 @@
                 <w:sz w:val="19"/>
                 <w:szCs w:val="19"/>
               </w:rPr>
-              <w:t xml:space="preserve">Pumpkin Head</w:t>
+              <w:t xml:space="preserve">Witch</w:t>
             </w:r>
           </w:p>
         </w:tc>
@@ -4868,7 +4986,7 @@
                 <w:sz w:val="19"/>
                 <w:szCs w:val="19"/>
               </w:rPr>
-              <w:t xml:space="preserve">80</w:t>
+              <w:t xml:space="preserve">200</w:t>
             </w:r>
           </w:p>
         </w:tc>
@@ -4895,7 +5013,7 @@
                 <w:sz w:val="19"/>
                 <w:szCs w:val="19"/>
               </w:rPr>
-              <w:t xml:space="preserve">Witch</w:t>
+              <w:t xml:space="preserve">Vampire</w:t>
             </w:r>
           </w:p>
         </w:tc>
@@ -5116,7 +5234,7 @@
                 <w:sz w:val="19"/>
                 <w:szCs w:val="19"/>
               </w:rPr>
-              <w:t xml:space="preserve">160</w:t>
+              <w:t xml:space="preserve">400</w:t>
             </w:r>
           </w:p>
         </w:tc>
@@ -5143,7 +5261,7 @@
                 <w:sz w:val="19"/>
                 <w:szCs w:val="19"/>
               </w:rPr>
-              <w:t xml:space="preserve">Vampire</w:t>
+              <w:t xml:space="preserve">Glowing Skeleton</w:t>
             </w:r>
           </w:p>
         </w:tc>
@@ -5364,7 +5482,7 @@
                 <w:sz w:val="19"/>
                 <w:szCs w:val="19"/>
               </w:rPr>
-              <w:t xml:space="preserve">320</w:t>
+              <w:t xml:space="preserve">800</w:t>
             </w:r>
           </w:p>
         </w:tc>
@@ -5391,7 +5509,7 @@
                 <w:sz w:val="19"/>
                 <w:szCs w:val="19"/>
               </w:rPr>
-              <w:t xml:space="preserve">Glowing Skeleton</w:t>
+              <w:t xml:space="preserve">Werewolf</w:t>
             </w:r>
           </w:p>
         </w:tc>
@@ -5612,7 +5730,7 @@
                 <w:sz w:val="19"/>
                 <w:szCs w:val="19"/>
               </w:rPr>
-              <w:t xml:space="preserve">650</w:t>
+              <w:t xml:space="preserve">1,600</w:t>
             </w:r>
           </w:p>
         </w:tc>
@@ -5639,7 +5757,7 @@
                 <w:sz w:val="19"/>
                 <w:szCs w:val="19"/>
               </w:rPr>
-              <w:t xml:space="preserve">Werewolf</w:t>
+              <w:t xml:space="preserve">Grim Reaper</w:t>
             </w:r>
           </w:p>
         </w:tc>
@@ -5860,7 +5978,7 @@
                 <w:sz w:val="19"/>
                 <w:szCs w:val="19"/>
               </w:rPr>
-              <w:t xml:space="preserve">1,300</w:t>
+              <w:t xml:space="preserve">3,200</w:t>
             </w:r>
           </w:p>
         </w:tc>
@@ -5887,7 +6005,7 @@
                 <w:sz w:val="19"/>
                 <w:szCs w:val="19"/>
               </w:rPr>
-              <w:t xml:space="preserve">Grim Reaper</w:t>
+              <w:t xml:space="preserve">Mummy</w:t>
             </w:r>
           </w:p>
         </w:tc>
@@ -9672,11 +9790,11 @@
         </w:tblBorders>
       </w:tblPr>
       <w:tblGrid>
-        <w:gridCol w:w="994"/>
-        <w:gridCol w:w="801"/>
-        <w:gridCol w:w="2338"/>
+        <w:gridCol w:w="1122"/>
+        <w:gridCol w:w="904"/>
         <w:gridCol w:w="2477"/>
-        <w:gridCol w:w="2750"/>
+        <w:gridCol w:w="2794"/>
+        <w:gridCol w:w="2063"/>
       </w:tblGrid>
       <w:tr>
         <w:trPr>
@@ -9684,7 +9802,7 @@
         </w:trPr>
         <w:tc>
           <w:tcPr>
-            <w:tcW w:type="dxa" w:w="994"/>
+            <w:tcW w:type="dxa" w:w="1122"/>
             <w:tcBorders>
               <w:top w:val="single" w:color="BFBFBF" w:sz="4"/>
               <w:left w:val="single" w:color="BFBFBF" w:sz="4"/>
@@ -9714,7 +9832,7 @@
         </w:tc>
         <w:tc>
           <w:tcPr>
-            <w:tcW w:type="dxa" w:w="801"/>
+            <w:tcW w:type="dxa" w:w="904"/>
             <w:tcBorders>
               <w:top w:val="single" w:color="BFBFBF" w:sz="4"/>
               <w:left w:val="single" w:color="BFBFBF" w:sz="4"/>
@@ -9744,7 +9862,7 @@
         </w:tc>
         <w:tc>
           <w:tcPr>
-            <w:tcW w:type="dxa" w:w="2338"/>
+            <w:tcW w:type="dxa" w:w="2477"/>
             <w:tcBorders>
               <w:top w:val="single" w:color="BFBFBF" w:sz="4"/>
               <w:left w:val="single" w:color="BFBFBF" w:sz="4"/>
@@ -9774,7 +9892,7 @@
         </w:tc>
         <w:tc>
           <w:tcPr>
-            <w:tcW w:type="dxa" w:w="2477"/>
+            <w:tcW w:type="dxa" w:w="2794"/>
             <w:tcBorders>
               <w:top w:val="single" w:color="BFBFBF" w:sz="4"/>
               <w:left w:val="single" w:color="BFBFBF" w:sz="4"/>
@@ -9804,7 +9922,7 @@
         </w:tc>
         <w:tc>
           <w:tcPr>
-            <w:tcW w:type="dxa" w:w="2750"/>
+            <w:tcW w:type="dxa" w:w="2063"/>
             <w:tcBorders>
               <w:top w:val="single" w:color="BFBFBF" w:sz="4"/>
               <w:left w:val="single" w:color="BFBFBF" w:sz="4"/>
@@ -9839,7 +9957,7 @@
         </w:trPr>
         <w:tc>
           <w:tcPr>
-            <w:tcW w:type="dxa" w:w="994"/>
+            <w:tcW w:type="dxa" w:w="1122"/>
             <w:tcBorders>
               <w:top w:val="single" w:color="BFBFBF" w:sz="4"/>
               <w:left w:val="single" w:color="BFBFBF" w:sz="4"/>
@@ -9866,7 +9984,7 @@
         </w:tc>
         <w:tc>
           <w:tcPr>
-            <w:tcW w:type="dxa" w:w="801"/>
+            <w:tcW w:type="dxa" w:w="904"/>
             <w:tcBorders>
               <w:top w:val="single" w:color="BFBFBF" w:sz="4"/>
               <w:left w:val="single" w:color="BFBFBF" w:sz="4"/>
@@ -9893,7 +10011,7 @@
         </w:tc>
         <w:tc>
           <w:tcPr>
-            <w:tcW w:type="dxa" w:w="2338"/>
+            <w:tcW w:type="dxa" w:w="2477"/>
             <w:tcBorders>
               <w:top w:val="single" w:color="BFBFBF" w:sz="4"/>
               <w:left w:val="single" w:color="BFBFBF" w:sz="4"/>
@@ -9920,7 +10038,7 @@
         </w:tc>
         <w:tc>
           <w:tcPr>
-            <w:tcW w:type="dxa" w:w="2477"/>
+            <w:tcW w:type="dxa" w:w="2794"/>
             <w:tcBorders>
               <w:top w:val="single" w:color="BFBFBF" w:sz="4"/>
               <w:left w:val="single" w:color="BFBFBF" w:sz="4"/>
@@ -9947,7 +10065,7 @@
         </w:tc>
         <w:tc>
           <w:tcPr>
-            <w:tcW w:type="dxa" w:w="2750"/>
+            <w:tcW w:type="dxa" w:w="2063"/>
             <w:tcBorders>
               <w:top w:val="single" w:color="BFBFBF" w:sz="4"/>
               <w:left w:val="single" w:color="BFBFBF" w:sz="4"/>
@@ -9979,7 +10097,7 @@
         </w:trPr>
         <w:tc>
           <w:tcPr>
-            <w:tcW w:type="dxa" w:w="994"/>
+            <w:tcW w:type="dxa" w:w="1122"/>
             <w:tcBorders>
               <w:top w:val="single" w:color="BFBFBF" w:sz="4"/>
               <w:left w:val="single" w:color="BFBFBF" w:sz="4"/>
@@ -10006,7 +10124,7 @@
         </w:tc>
         <w:tc>
           <w:tcPr>
-            <w:tcW w:type="dxa" w:w="801"/>
+            <w:tcW w:type="dxa" w:w="904"/>
             <w:tcBorders>
               <w:top w:val="single" w:color="BFBFBF" w:sz="4"/>
               <w:left w:val="single" w:color="BFBFBF" w:sz="4"/>
@@ -10033,33 +10151,6 @@
         </w:tc>
         <w:tc>
           <w:tcPr>
-            <w:tcW w:type="dxa" w:w="2338"/>
-            <w:tcBorders>
-              <w:top w:val="single" w:color="BFBFBF" w:sz="4"/>
-              <w:left w:val="single" w:color="BFBFBF" w:sz="4"/>
-              <w:bottom w:val="single" w:color="BFBFBF" w:sz="4"/>
-              <w:right w:val="single" w:color="BFBFBF" w:sz="4"/>
-            </w:tcBorders>
-            <w:tcMar>
-              <w:top w:type="dxa" w:w="60"/>
-              <w:left w:type="dxa" w:w="100"/>
-              <w:bottom w:type="dxa" w:w="60"/>
-              <w:right w:type="dxa" w:w="100"/>
-            </w:tcMar>
-          </w:tcPr>
-          <w:p>
-            <w:r>
-              <w:rPr>
-                <w:rFonts w:ascii="Calibri" w:cs="Calibri" w:eastAsia="Calibri" w:hAnsi="Calibri"/>
-                <w:sz w:val="19"/>
-                <w:szCs w:val="19"/>
-              </w:rPr>
-              <w:t xml:space="preserve">2.5x to 3.5x (average 3x)</w:t>
-            </w:r>
-          </w:p>
-        </w:tc>
-        <w:tc>
-          <w:tcPr>
             <w:tcW w:type="dxa" w:w="2477"/>
             <w:tcBorders>
               <w:top w:val="single" w:color="BFBFBF" w:sz="4"/>
@@ -10081,34 +10172,61 @@
                 <w:sz w:val="19"/>
                 <w:szCs w:val="19"/>
               </w:rPr>
-              <w:t xml:space="preserve">1.25x to 1.75x</w:t>
-            </w:r>
-          </w:p>
-        </w:tc>
-        <w:tc>
-          <w:tcPr>
-            <w:tcW w:type="dxa" w:w="2750"/>
-            <w:tcBorders>
-              <w:top w:val="single" w:color="BFBFBF" w:sz="4"/>
-              <w:left w:val="single" w:color="BFBFBF" w:sz="4"/>
-              <w:bottom w:val="single" w:color="BFBFBF" w:sz="4"/>
-              <w:right w:val="single" w:color="BFBFBF" w:sz="4"/>
-            </w:tcBorders>
-            <w:tcMar>
-              <w:top w:type="dxa" w:w="60"/>
-              <w:left w:type="dxa" w:w="100"/>
-              <w:bottom w:type="dxa" w:w="60"/>
-              <w:right w:type="dxa" w:w="100"/>
-            </w:tcMar>
-          </w:tcPr>
-          <w:p>
-            <w:r>
-              <w:rPr>
-                <w:rFonts w:ascii="Calibri" w:cs="Calibri" w:eastAsia="Calibri" w:hAnsi="Calibri"/>
-                <w:sz w:val="19"/>
-                <w:szCs w:val="19"/>
-              </w:rPr>
-              <w:t xml:space="preserve">x2.5 to x3.5 (same as the size)</w:t>
+              <w:t xml:space="preserve">2x to 3x (average 2.5x)</w:t>
+            </w:r>
+          </w:p>
+        </w:tc>
+        <w:tc>
+          <w:tcPr>
+            <w:tcW w:type="dxa" w:w="2794"/>
+            <w:tcBorders>
+              <w:top w:val="single" w:color="BFBFBF" w:sz="4"/>
+              <w:left w:val="single" w:color="BFBFBF" w:sz="4"/>
+              <w:bottom w:val="single" w:color="BFBFBF" w:sz="4"/>
+              <w:right w:val="single" w:color="BFBFBF" w:sz="4"/>
+            </w:tcBorders>
+            <w:tcMar>
+              <w:top w:type="dxa" w:w="60"/>
+              <w:left w:type="dxa" w:w="100"/>
+              <w:bottom w:type="dxa" w:w="60"/>
+              <w:right w:type="dxa" w:w="100"/>
+            </w:tcMar>
+          </w:tcPr>
+          <w:p>
+            <w:r>
+              <w:rPr>
+                <w:rFonts w:ascii="Calibri" w:cs="Calibri" w:eastAsia="Calibri" w:hAnsi="Calibri"/>
+                <w:sz w:val="19"/>
+                <w:szCs w:val="19"/>
+              </w:rPr>
+              <w:t xml:space="preserve">1x to 1.5x</w:t>
+            </w:r>
+          </w:p>
+        </w:tc>
+        <w:tc>
+          <w:tcPr>
+            <w:tcW w:type="dxa" w:w="2063"/>
+            <w:tcBorders>
+              <w:top w:val="single" w:color="BFBFBF" w:sz="4"/>
+              <w:left w:val="single" w:color="BFBFBF" w:sz="4"/>
+              <w:bottom w:val="single" w:color="BFBFBF" w:sz="4"/>
+              <w:right w:val="single" w:color="BFBFBF" w:sz="4"/>
+            </w:tcBorders>
+            <w:tcMar>
+              <w:top w:type="dxa" w:w="60"/>
+              <w:left w:type="dxa" w:w="100"/>
+              <w:bottom w:type="dxa" w:w="60"/>
+              <w:right w:type="dxa" w:w="100"/>
+            </w:tcMar>
+          </w:tcPr>
+          <w:p>
+            <w:r>
+              <w:rPr>
+                <w:rFonts w:ascii="Calibri" w:cs="Calibri" w:eastAsia="Calibri" w:hAnsi="Calibri"/>
+                <w:sz w:val="19"/>
+                <w:szCs w:val="19"/>
+              </w:rPr>
+              <w:t xml:space="preserve">x2.5 to x3.5</w:t>
             </w:r>
           </w:p>
         </w:tc>
@@ -10119,7 +10237,7 @@
         </w:trPr>
         <w:tc>
           <w:tcPr>
-            <w:tcW w:type="dxa" w:w="994"/>
+            <w:tcW w:type="dxa" w:w="1122"/>
             <w:tcBorders>
               <w:top w:val="single" w:color="BFBFBF" w:sz="4"/>
               <w:left w:val="single" w:color="BFBFBF" w:sz="4"/>
@@ -10146,7 +10264,7 @@
         </w:tc>
         <w:tc>
           <w:tcPr>
-            <w:tcW w:type="dxa" w:w="801"/>
+            <w:tcW w:type="dxa" w:w="904"/>
             <w:tcBorders>
               <w:top w:val="single" w:color="BFBFBF" w:sz="4"/>
               <w:left w:val="single" w:color="BFBFBF" w:sz="4"/>
@@ -10173,33 +10291,6 @@
         </w:tc>
         <w:tc>
           <w:tcPr>
-            <w:tcW w:type="dxa" w:w="2338"/>
-            <w:tcBorders>
-              <w:top w:val="single" w:color="BFBFBF" w:sz="4"/>
-              <w:left w:val="single" w:color="BFBFBF" w:sz="4"/>
-              <w:bottom w:val="single" w:color="BFBFBF" w:sz="4"/>
-              <w:right w:val="single" w:color="BFBFBF" w:sz="4"/>
-            </w:tcBorders>
-            <w:tcMar>
-              <w:top w:type="dxa" w:w="60"/>
-              <w:left w:type="dxa" w:w="100"/>
-              <w:bottom w:type="dxa" w:w="60"/>
-              <w:right w:type="dxa" w:w="100"/>
-            </w:tcMar>
-          </w:tcPr>
-          <w:p>
-            <w:r>
-              <w:rPr>
-                <w:rFonts w:ascii="Calibri" w:cs="Calibri" w:eastAsia="Calibri" w:hAnsi="Calibri"/>
-                <w:sz w:val="19"/>
-                <w:szCs w:val="19"/>
-              </w:rPr>
-              <w:t xml:space="preserve">4x to 6x (average 5x)</w:t>
-            </w:r>
-          </w:p>
-        </w:tc>
-        <w:tc>
-          <w:tcPr>
             <w:tcW w:type="dxa" w:w="2477"/>
             <w:tcBorders>
               <w:top w:val="single" w:color="BFBFBF" w:sz="4"/>
@@ -10221,34 +10312,61 @@
                 <w:sz w:val="19"/>
                 <w:szCs w:val="19"/>
               </w:rPr>
-              <w:t xml:space="preserve">2x to 3x</w:t>
-            </w:r>
-          </w:p>
-        </w:tc>
-        <w:tc>
-          <w:tcPr>
-            <w:tcW w:type="dxa" w:w="2750"/>
-            <w:tcBorders>
-              <w:top w:val="single" w:color="BFBFBF" w:sz="4"/>
-              <w:left w:val="single" w:color="BFBFBF" w:sz="4"/>
-              <w:bottom w:val="single" w:color="BFBFBF" w:sz="4"/>
-              <w:right w:val="single" w:color="BFBFBF" w:sz="4"/>
-            </w:tcBorders>
-            <w:tcMar>
-              <w:top w:type="dxa" w:w="60"/>
-              <w:left w:type="dxa" w:w="100"/>
-              <w:bottom w:type="dxa" w:w="60"/>
-              <w:right w:type="dxa" w:w="100"/>
-            </w:tcMar>
-          </w:tcPr>
-          <w:p>
-            <w:r>
-              <w:rPr>
-                <w:rFonts w:ascii="Calibri" w:cs="Calibri" w:eastAsia="Calibri" w:hAnsi="Calibri"/>
-                <w:sz w:val="19"/>
-                <w:szCs w:val="19"/>
-              </w:rPr>
-              <w:t xml:space="preserve">x4 to x6 (same as the size)</w:t>
+              <w:t xml:space="preserve">3x to 5x (average 4x)</w:t>
+            </w:r>
+          </w:p>
+        </w:tc>
+        <w:tc>
+          <w:tcPr>
+            <w:tcW w:type="dxa" w:w="2794"/>
+            <w:tcBorders>
+              <w:top w:val="single" w:color="BFBFBF" w:sz="4"/>
+              <w:left w:val="single" w:color="BFBFBF" w:sz="4"/>
+              <w:bottom w:val="single" w:color="BFBFBF" w:sz="4"/>
+              <w:right w:val="single" w:color="BFBFBF" w:sz="4"/>
+            </w:tcBorders>
+            <w:tcMar>
+              <w:top w:type="dxa" w:w="60"/>
+              <w:left w:type="dxa" w:w="100"/>
+              <w:bottom w:type="dxa" w:w="60"/>
+              <w:right w:type="dxa" w:w="100"/>
+            </w:tcMar>
+          </w:tcPr>
+          <w:p>
+            <w:r>
+              <w:rPr>
+                <w:rFonts w:ascii="Calibri" w:cs="Calibri" w:eastAsia="Calibri" w:hAnsi="Calibri"/>
+                <w:sz w:val="19"/>
+                <w:szCs w:val="19"/>
+              </w:rPr>
+              <w:t xml:space="preserve">1.5x to 2.5x</w:t>
+            </w:r>
+          </w:p>
+        </w:tc>
+        <w:tc>
+          <w:tcPr>
+            <w:tcW w:type="dxa" w:w="2063"/>
+            <w:tcBorders>
+              <w:top w:val="single" w:color="BFBFBF" w:sz="4"/>
+              <w:left w:val="single" w:color="BFBFBF" w:sz="4"/>
+              <w:bottom w:val="single" w:color="BFBFBF" w:sz="4"/>
+              <w:right w:val="single" w:color="BFBFBF" w:sz="4"/>
+            </w:tcBorders>
+            <w:tcMar>
+              <w:top w:type="dxa" w:w="60"/>
+              <w:left w:type="dxa" w:w="100"/>
+              <w:bottom w:type="dxa" w:w="60"/>
+              <w:right w:type="dxa" w:w="100"/>
+            </w:tcMar>
+          </w:tcPr>
+          <w:p>
+            <w:r>
+              <w:rPr>
+                <w:rFonts w:ascii="Calibri" w:cs="Calibri" w:eastAsia="Calibri" w:hAnsi="Calibri"/>
+                <w:sz w:val="19"/>
+                <w:szCs w:val="19"/>
+              </w:rPr>
+              <w:t xml:space="preserve">x4 to x6</w:t>
             </w:r>
           </w:p>
         </w:tc>
@@ -10259,7 +10377,7 @@
         </w:trPr>
         <w:tc>
           <w:tcPr>
-            <w:tcW w:type="dxa" w:w="994"/>
+            <w:tcW w:type="dxa" w:w="1122"/>
             <w:tcBorders>
               <w:top w:val="single" w:color="BFBFBF" w:sz="4"/>
               <w:left w:val="single" w:color="BFBFBF" w:sz="4"/>
@@ -10286,7 +10404,7 @@
         </w:tc>
         <w:tc>
           <w:tcPr>
-            <w:tcW w:type="dxa" w:w="801"/>
+            <w:tcW w:type="dxa" w:w="904"/>
             <w:tcBorders>
               <w:top w:val="single" w:color="BFBFBF" w:sz="4"/>
               <w:left w:val="single" w:color="BFBFBF" w:sz="4"/>
@@ -10313,33 +10431,6 @@
         </w:tc>
         <w:tc>
           <w:tcPr>
-            <w:tcW w:type="dxa" w:w="2338"/>
-            <w:tcBorders>
-              <w:top w:val="single" w:color="BFBFBF" w:sz="4"/>
-              <w:left w:val="single" w:color="BFBFBF" w:sz="4"/>
-              <w:bottom w:val="single" w:color="BFBFBF" w:sz="4"/>
-              <w:right w:val="single" w:color="BFBFBF" w:sz="4"/>
-            </w:tcBorders>
-            <w:tcMar>
-              <w:top w:type="dxa" w:w="60"/>
-              <w:left w:type="dxa" w:w="100"/>
-              <w:bottom w:type="dxa" w:w="60"/>
-              <w:right w:type="dxa" w:w="100"/>
-            </w:tcMar>
-          </w:tcPr>
-          <w:p>
-            <w:r>
-              <w:rPr>
-                <w:rFonts w:ascii="Calibri" w:cs="Calibri" w:eastAsia="Calibri" w:hAnsi="Calibri"/>
-                <w:sz w:val="19"/>
-                <w:szCs w:val="19"/>
-              </w:rPr>
-              <w:t xml:space="preserve">8x</w:t>
-            </w:r>
-          </w:p>
-        </w:tc>
-        <w:tc>
-          <w:tcPr>
             <w:tcW w:type="dxa" w:w="2477"/>
             <w:tcBorders>
               <w:top w:val="single" w:color="BFBFBF" w:sz="4"/>
@@ -10361,34 +10452,61 @@
                 <w:sz w:val="19"/>
                 <w:szCs w:val="19"/>
               </w:rPr>
-              <w:t xml:space="preserve">4x</w:t>
-            </w:r>
-          </w:p>
-        </w:tc>
-        <w:tc>
-          <w:tcPr>
-            <w:tcW w:type="dxa" w:w="2750"/>
-            <w:tcBorders>
-              <w:top w:val="single" w:color="BFBFBF" w:sz="4"/>
-              <w:left w:val="single" w:color="BFBFBF" w:sz="4"/>
-              <w:bottom w:val="single" w:color="BFBFBF" w:sz="4"/>
-              <w:right w:val="single" w:color="BFBFBF" w:sz="4"/>
-            </w:tcBorders>
-            <w:tcMar>
-              <w:top w:type="dxa" w:w="60"/>
-              <w:left w:type="dxa" w:w="100"/>
-              <w:bottom w:type="dxa" w:w="60"/>
-              <w:right w:type="dxa" w:w="100"/>
-            </w:tcMar>
-          </w:tcPr>
-          <w:p>
-            <w:r>
-              <w:rPr>
-                <w:rFonts w:ascii="Calibri" w:cs="Calibri" w:eastAsia="Calibri" w:hAnsi="Calibri"/>
-                <w:sz w:val="19"/>
-                <w:szCs w:val="19"/>
-              </w:rPr>
-              <w:t xml:space="preserve">x16 (twice its size)</w:t>
+              <w:t xml:space="preserve">7x</w:t>
+            </w:r>
+          </w:p>
+        </w:tc>
+        <w:tc>
+          <w:tcPr>
+            <w:tcW w:type="dxa" w:w="2794"/>
+            <w:tcBorders>
+              <w:top w:val="single" w:color="BFBFBF" w:sz="4"/>
+              <w:left w:val="single" w:color="BFBFBF" w:sz="4"/>
+              <w:bottom w:val="single" w:color="BFBFBF" w:sz="4"/>
+              <w:right w:val="single" w:color="BFBFBF" w:sz="4"/>
+            </w:tcBorders>
+            <w:tcMar>
+              <w:top w:type="dxa" w:w="60"/>
+              <w:left w:type="dxa" w:w="100"/>
+              <w:bottom w:type="dxa" w:w="60"/>
+              <w:right w:type="dxa" w:w="100"/>
+            </w:tcMar>
+          </w:tcPr>
+          <w:p>
+            <w:r>
+              <w:rPr>
+                <w:rFonts w:ascii="Calibri" w:cs="Calibri" w:eastAsia="Calibri" w:hAnsi="Calibri"/>
+                <w:sz w:val="19"/>
+                <w:szCs w:val="19"/>
+              </w:rPr>
+              <w:t xml:space="preserve">3.5x</w:t>
+            </w:r>
+          </w:p>
+        </w:tc>
+        <w:tc>
+          <w:tcPr>
+            <w:tcW w:type="dxa" w:w="2063"/>
+            <w:tcBorders>
+              <w:top w:val="single" w:color="BFBFBF" w:sz="4"/>
+              <w:left w:val="single" w:color="BFBFBF" w:sz="4"/>
+              <w:bottom w:val="single" w:color="BFBFBF" w:sz="4"/>
+              <w:right w:val="single" w:color="BFBFBF" w:sz="4"/>
+            </w:tcBorders>
+            <w:tcMar>
+              <w:top w:type="dxa" w:w="60"/>
+              <w:left w:type="dxa" w:w="100"/>
+              <w:bottom w:type="dxa" w:w="60"/>
+              <w:right w:type="dxa" w:w="100"/>
+            </w:tcMar>
+          </w:tcPr>
+          <w:p>
+            <w:r>
+              <w:rPr>
+                <w:rFonts w:ascii="Calibri" w:cs="Calibri" w:eastAsia="Calibri" w:hAnsi="Calibri"/>
+                <w:sz w:val="19"/>
+                <w:szCs w:val="19"/>
+              </w:rPr>
+              <w:t xml:space="preserve">x16</w:t>
             </w:r>
           </w:p>
         </w:tc>
@@ -10429,7 +10547,7 @@
         <w:rPr>
           <w:rFonts w:ascii="Calibri" w:cs="Calibri" w:eastAsia="Calibri" w:hAnsi="Calibri"/>
         </w:rPr>
-        <w:t xml:space="preserve">). The money multiplier equals the size for Big and Huge: a 2.5x Big pays x2.5, a 3.2x Big pays x3.2 and a 6x Huge pays x6. Gigantic is the exception: it is always 8x big and pays x16. (</w:t>
+        <w:t xml:space="preserve">). The money multiplier follows the size in a straight line between the tier's two ends (</w:t>
       </w:r>
       <w:r>
         <w:rPr>
@@ -10471,7 +10589,7 @@
         <w:rPr>
           <w:rFonts w:ascii="Calibri" w:cs="Calibri" w:eastAsia="Calibri" w:hAnsi="Calibri"/>
         </w:rPr>
-        <w:t xml:space="preserve"> set the multiplier at the low and high end of each range.) Names show the size: "Big 3.2x Golden Bat". Eggs still carried in the thief's arms are capped at 1.4 (twice a normal egg), and eggs on the incubator pedestals are shrunk to fit under the roof; an 8x pet is about 20 to 50 studs tall on a base.</w:t>
+        <w:t xml:space="preserve">, which did not change in 6.5): a 2x Big pays x2.5, a 2.5x Big pays x3 and a 3x Big pays x3.5; a 3x Huge pays x4 and a 5x Huge pays x6. Gigantic is always 7x big and pays x16. Names show the size: "Big 3.2x Golden Bat". Eggs still carried in the thief's arms are capped at 1.4 (twice a normal egg), and eggs on the incubator pedestals are shrunk to fit under the roof; a 7x pet is about 18 to 45 studs tall on a base.</w:t>
       </w:r>
     </w:p>
     <w:p>
@@ -15453,7 +15571,7 @@
                 <w:sz w:val="19"/>
                 <w:szCs w:val="19"/>
               </w:rPr>
-              <w:t xml:space="preserve">400</w:t>
+              <w:t xml:space="preserve">350</w:t>
             </w:r>
           </w:p>
         </w:tc>
@@ -15593,7 +15711,7 @@
                 <w:sz w:val="19"/>
                 <w:szCs w:val="19"/>
               </w:rPr>
-              <w:t xml:space="preserve">2,000</w:t>
+              <w:t xml:space="preserve">1,700</w:t>
             </w:r>
           </w:p>
         </w:tc>
@@ -15733,7 +15851,7 @@
                 <w:sz w:val="19"/>
                 <w:szCs w:val="19"/>
               </w:rPr>
-              <w:t xml:space="preserve">10,000</w:t>
+              <w:t xml:space="preserve">8,500</w:t>
             </w:r>
           </w:p>
         </w:tc>
@@ -15873,7 +15991,7 @@
                 <w:sz w:val="19"/>
                 <w:szCs w:val="19"/>
               </w:rPr>
-              <w:t xml:space="preserve">50,000</w:t>
+              <w:t xml:space="preserve">42,000</w:t>
             </w:r>
           </w:p>
         </w:tc>
@@ -16013,7 +16131,7 @@
                 <w:sz w:val="19"/>
                 <w:szCs w:val="19"/>
               </w:rPr>
-              <w:t xml:space="preserve">220,000</w:t>
+              <w:t xml:space="preserve">190,000</w:t>
             </w:r>
           </w:p>
         </w:tc>
@@ -16153,7 +16271,7 @@
                 <w:sz w:val="19"/>
                 <w:szCs w:val="19"/>
               </w:rPr>
-              <w:t xml:space="preserve">880,000</w:t>
+              <w:t xml:space="preserve">750,000</w:t>
             </w:r>
           </w:p>
         </w:tc>
@@ -16293,7 +16411,7 @@
                 <w:sz w:val="19"/>
                 <w:szCs w:val="19"/>
               </w:rPr>
-              <w:t xml:space="preserve">3,700,000</w:t>
+              <w:t xml:space="preserve">3,100,000</w:t>
             </w:r>
           </w:p>
         </w:tc>
@@ -16433,7 +16551,7 @@
                 <w:sz w:val="19"/>
                 <w:szCs w:val="19"/>
               </w:rPr>
-              <w:t xml:space="preserve">10,000,000</w:t>
+              <w:t xml:space="preserve">8,500,000</w:t>
             </w:r>
           </w:p>
         </w:tc>
@@ -16573,7 +16691,7 @@
                 <w:sz w:val="19"/>
                 <w:szCs w:val="19"/>
               </w:rPr>
-              <w:t xml:space="preserve">26,000,000</w:t>
+              <w:t xml:space="preserve">22,000,000</w:t>
             </w:r>
           </w:p>
         </w:tc>
@@ -16910,7 +17028,7 @@
                 <w:sz w:val="19"/>
                 <w:szCs w:val="19"/>
               </w:rPr>
-              <w:t xml:space="preserve">Second costume (Pumpkin Head, 400 Candy)</w:t>
+              <w:t xml:space="preserve">Second costume (Pumpkin Head, 350 Candy)</w:t>
             </w:r>
           </w:p>
         </w:tc>
@@ -16937,7 +17055,7 @@
                 <w:sz w:val="19"/>
                 <w:szCs w:val="19"/>
               </w:rPr>
-              <w:t xml:space="preserve">11 min</w:t>
+              <w:t xml:space="preserve">7 min</w:t>
             </w:r>
           </w:p>
         </w:tc>
@@ -16964,7 +17082,7 @@
                 <w:sz w:val="19"/>
                 <w:szCs w:val="19"/>
               </w:rPr>
-              <w:t xml:space="preserve">18 min</w:t>
+              <w:t xml:space="preserve">12 min</w:t>
             </w:r>
           </w:p>
         </w:tc>
@@ -17023,7 +17141,7 @@
                 <w:sz w:val="19"/>
                 <w:szCs w:val="19"/>
               </w:rPr>
-              <w:t xml:space="preserve">8 min</w:t>
+              <w:t xml:space="preserve">10 min</w:t>
             </w:r>
           </w:p>
         </w:tc>
@@ -17050,7 +17168,7 @@
                 <w:sz w:val="19"/>
                 <w:szCs w:val="19"/>
               </w:rPr>
-              <w:t xml:space="preserve">13 min</w:t>
+              <w:t xml:space="preserve">16 min</w:t>
             </w:r>
           </w:p>
         </w:tc>
@@ -17195,7 +17313,7 @@
                 <w:sz w:val="19"/>
                 <w:szCs w:val="19"/>
               </w:rPr>
-              <w:t xml:space="preserve">36 min (target about 35)</w:t>
+              <w:t xml:space="preserve">33 min (target about 35)</w:t>
             </w:r>
           </w:p>
         </w:tc>
@@ -17222,7 +17340,7 @@
                 <w:sz w:val="19"/>
                 <w:szCs w:val="19"/>
               </w:rPr>
-              <w:t xml:space="preserve">58 min</w:t>
+              <w:t xml:space="preserve">53 min</w:t>
             </w:r>
           </w:p>
         </w:tc>
@@ -17281,7 +17399,7 @@
                 <w:sz w:val="19"/>
                 <w:szCs w:val="19"/>
               </w:rPr>
-              <w:t xml:space="preserve">52 min</w:t>
+              <w:t xml:space="preserve">37 min</w:t>
             </w:r>
           </w:p>
         </w:tc>
@@ -17308,7 +17426,7 @@
                 <w:sz w:val="19"/>
                 <w:szCs w:val="19"/>
               </w:rPr>
-              <w:t xml:space="preserve">1.4 h</w:t>
+              <w:t xml:space="preserve">1 h</w:t>
             </w:r>
           </w:p>
         </w:tc>
@@ -17367,7 +17485,7 @@
                 <w:sz w:val="19"/>
                 <w:szCs w:val="19"/>
               </w:rPr>
-              <w:t xml:space="preserve">41 min</w:t>
+              <w:t xml:space="preserve">42 min</w:t>
             </w:r>
           </w:p>
         </w:tc>
@@ -17453,7 +17571,7 @@
                 <w:sz w:val="19"/>
                 <w:szCs w:val="19"/>
               </w:rPr>
-              <w:t xml:space="preserve">about 1.5 h</w:t>
+              <w:t xml:space="preserve">about 1.3 h</w:t>
             </w:r>
           </w:p>
         </w:tc>
@@ -17480,7 +17598,7 @@
                 <w:sz w:val="19"/>
                 <w:szCs w:val="19"/>
               </w:rPr>
-              <w:t xml:space="preserve">2.4 h</w:t>
+              <w:t xml:space="preserve">2.1 h</w:t>
             </w:r>
           </w:p>
         </w:tc>
@@ -17797,7 +17915,7 @@
                 <w:sz w:val="19"/>
                 <w:szCs w:val="19"/>
               </w:rPr>
-              <w:t xml:space="preserve">4.6 h</w:t>
+              <w:t xml:space="preserve">2.3 h</w:t>
             </w:r>
           </w:p>
         </w:tc>
@@ -17824,7 +17942,7 @@
                 <w:sz w:val="19"/>
                 <w:szCs w:val="19"/>
               </w:rPr>
-              <w:t xml:space="preserve">7.4 h</w:t>
+              <w:t xml:space="preserve">3.7 h</w:t>
             </w:r>
           </w:p>
         </w:tc>

</xml_diff>

<commit_message>
Carried eggs are held in both arms: client-side arm IK on the R15 shoulders and elbows, egg closer and chest high
Co-Authored-By: Claude Sonnet 5.5 <noreply@anthropic.com>
Claude-Session: https://claude.ai/code/session_013ivEnYiZGofRBeqQFKAVhJ
</commit_message>
<xml_diff>
--- a/docs/Spooky-Steal-Design-and-Plan.docx
+++ b/docs/Spooky-Steal-Design-and-Plan.docx
@@ -1233,6 +1233,65 @@
                 <w:szCs w:val="19"/>
               </w:rPr>
               <w:t xml:space="preserve">Your uploaded V6.5 is now the main place: the Blood Moon event with bloody eggs, houses 5 and 6 with their own pets, the Settings window, login rewards and the lighter quest rewards come from it.</w:t>
+            </w:r>
+          </w:p>
+        </w:tc>
+      </w:tr>
+      <w:tr>
+        <w:trPr>
+          <w:cantSplit/>
+        </w:trPr>
+        <w:tc>
+          <w:tcPr>
+            <w:tcW w:type="dxa" w:w="4252"/>
+            <w:tcBorders>
+              <w:top w:val="single" w:color="BFBFBF" w:sz="4"/>
+              <w:left w:val="single" w:color="BFBFBF" w:sz="4"/>
+              <w:bottom w:val="single" w:color="BFBFBF" w:sz="4"/>
+              <w:right w:val="single" w:color="BFBFBF" w:sz="4"/>
+            </w:tcBorders>
+            <w:tcMar>
+              <w:top w:type="dxa" w:w="60"/>
+              <w:left w:type="dxa" w:w="100"/>
+              <w:bottom w:type="dxa" w:w="60"/>
+              <w:right w:type="dxa" w:w="100"/>
+            </w:tcMar>
+          </w:tcPr>
+          <w:p>
+            <w:r>
+              <w:rPr>
+                <w:rFonts w:ascii="Calibri" w:cs="Calibri" w:eastAsia="Calibri" w:hAnsi="Calibri"/>
+                <w:sz w:val="19"/>
+                <w:szCs w:val="19"/>
+              </w:rPr>
+              <w:t xml:space="preserve">Eggs carried in the arms (6.5)</w:t>
+            </w:r>
+          </w:p>
+        </w:tc>
+        <w:tc>
+          <w:tcPr>
+            <w:tcW w:type="dxa" w:w="5108"/>
+            <w:tcBorders>
+              <w:top w:val="single" w:color="BFBFBF" w:sz="4"/>
+              <w:left w:val="single" w:color="BFBFBF" w:sz="4"/>
+              <w:bottom w:val="single" w:color="BFBFBF" w:sz="4"/>
+              <w:right w:val="single" w:color="BFBFBF" w:sz="4"/>
+            </w:tcBorders>
+            <w:tcMar>
+              <w:top w:type="dxa" w:w="60"/>
+              <w:left w:type="dxa" w:w="100"/>
+              <w:bottom w:type="dxa" w:w="60"/>
+              <w:right w:type="dxa" w:w="100"/>
+            </w:tcMar>
+          </w:tcPr>
+          <w:p>
+            <w:r>
+              <w:rPr>
+                <w:rFonts w:ascii="Calibri" w:cs="Calibri" w:eastAsia="Calibri" w:hAnsi="Calibri"/>
+                <w:sz w:val="19"/>
+                <w:szCs w:val="19"/>
+              </w:rPr>
+              <w:t xml:space="preserve">A thief now holds the egg with both arms: every player's client bends the carrier's shoulders and elbows so the hands rest on the sides of the egg (two-bone arm IK on the R15 joints, applied over the run animation), and the egg sits closer and chest high. It is only a pose, so there is no new animation asset.</w:t>
             </w:r>
           </w:p>
         </w:tc>

</xml_diff>

<commit_message>
Carry pose written into the joints' C0 so animations cannot undo it; Old Witch 20 / Mummy 45 Candy; costumes 2-5 cost 300 / 1,500 / 7,000 / 35,000
Co-Authored-By: Claude Sonnet 5.5 <noreply@anthropic.com>
Claude-Session: https://claude.ai/code/session_013ivEnYiZGofRBeqQFKAVhJ
</commit_message>
<xml_diff>
--- a/docs/Spooky-Steal-Design-and-Plan.docx
+++ b/docs/Spooky-Steal-Design-and-Plan.docx
@@ -1291,7 +1291,7 @@
                 <w:sz w:val="19"/>
                 <w:szCs w:val="19"/>
               </w:rPr>
-              <w:t xml:space="preserve">A thief now holds the egg with both arms: every player's client bends the carrier's shoulders and elbows so the hands rest on the sides of the egg (two-bone arm IK on the R15 joints, applied over the run animation), and the egg sits closer and chest high. It is only a pose, so there is no new animation asset.</w:t>
+              <w:t xml:space="preserve">A thief now holds the egg with both arms: every player's client bends the carrier's shoulders and elbows so the hands rest on the sides of the egg (two-bone arm IK on the R15 joints, written into the joints' C0 so the run animation can not overwrite it), and the egg sits closer and chest high. It is only a pose, so there is no new animation asset.</w:t>
             </w:r>
           </w:p>
         </w:tc>
@@ -1350,7 +1350,7 @@
                 <w:sz w:val="19"/>
                 <w:szCs w:val="19"/>
               </w:rPr>
-              <w:t xml:space="preserve">Houses 1 and 2 now need the 1st costume (Bedsheet Ghost), house 3 the 2nd, house 4 the 3rd and so on up to the Mummy for house 9. To make up for it, Candy per knock is about 1.2x what it would have been and costume prices are about 15% lower: you can afford the next costume after 8 to 40 knocks (before: 10 to 118).</w:t>
+              <w:t xml:space="preserve">Houses 1 and 2 now need the 1st costume (Bedsheet Ghost), house 3 the 2nd, house 4 the 3rd and so on up to the Mummy for house 9. To make up for it, Candy per knock is higher (the Old Witch gives 20 and the Friendly Mummy 45) and costume prices are lower (Pumpkin 300, Witch 1,500, Vampire 7,000, Skeleton 35,000): you can afford the next costume after 3 to 40 knocks (before: 10 to 118).</w:t>
             </w:r>
           </w:p>
         </w:tc>
@@ -4053,7 +4053,7 @@
                 <w:sz w:val="19"/>
                 <w:szCs w:val="19"/>
               </w:rPr>
-              <w:t xml:space="preserve">12</w:t>
+              <w:t xml:space="preserve">20</w:t>
             </w:r>
           </w:p>
         </w:tc>
@@ -4301,7 +4301,7 @@
                 <w:sz w:val="19"/>
                 <w:szCs w:val="19"/>
               </w:rPr>
-              <w:t xml:space="preserve">24</w:t>
+              <w:t xml:space="preserve">45</w:t>
             </w:r>
           </w:p>
         </w:tc>
@@ -15630,7 +15630,7 @@
                 <w:sz w:val="19"/>
                 <w:szCs w:val="19"/>
               </w:rPr>
-              <w:t xml:space="preserve">350</w:t>
+              <w:t xml:space="preserve">300</w:t>
             </w:r>
           </w:p>
         </w:tc>
@@ -15770,7 +15770,7 @@
                 <w:sz w:val="19"/>
                 <w:szCs w:val="19"/>
               </w:rPr>
-              <w:t xml:space="preserve">1,700</w:t>
+              <w:t xml:space="preserve">1,500</w:t>
             </w:r>
           </w:p>
         </w:tc>
@@ -15910,7 +15910,7 @@
                 <w:sz w:val="19"/>
                 <w:szCs w:val="19"/>
               </w:rPr>
-              <w:t xml:space="preserve">8,500</w:t>
+              <w:t xml:space="preserve">7,000</w:t>
             </w:r>
           </w:p>
         </w:tc>
@@ -16050,7 +16050,7 @@
                 <w:sz w:val="19"/>
                 <w:szCs w:val="19"/>
               </w:rPr>
-              <w:t xml:space="preserve">42,000</w:t>
+              <w:t xml:space="preserve">35,000</w:t>
             </w:r>
           </w:p>
         </w:tc>
@@ -17087,7 +17087,7 @@
                 <w:sz w:val="19"/>
                 <w:szCs w:val="19"/>
               </w:rPr>
-              <w:t xml:space="preserve">Second costume (Pumpkin Head, 350 Candy)</w:t>
+              <w:t xml:space="preserve">Second costume (Pumpkin Head, 300 Candy)</w:t>
             </w:r>
           </w:p>
         </w:tc>
@@ -17114,34 +17114,34 @@
                 <w:sz w:val="19"/>
                 <w:szCs w:val="19"/>
               </w:rPr>
+              <w:t xml:space="preserve">4 min</w:t>
+            </w:r>
+          </w:p>
+        </w:tc>
+        <w:tc>
+          <w:tcPr>
+            <w:tcW w:type="dxa" w:w="2077"/>
+            <w:tcBorders>
+              <w:top w:val="single" w:color="BFBFBF" w:sz="4"/>
+              <w:left w:val="single" w:color="BFBFBF" w:sz="4"/>
+              <w:bottom w:val="single" w:color="BFBFBF" w:sz="4"/>
+              <w:right w:val="single" w:color="BFBFBF" w:sz="4"/>
+            </w:tcBorders>
+            <w:tcMar>
+              <w:top w:type="dxa" w:w="60"/>
+              <w:left w:type="dxa" w:w="100"/>
+              <w:bottom w:type="dxa" w:w="60"/>
+              <w:right w:type="dxa" w:w="100"/>
+            </w:tcMar>
+          </w:tcPr>
+          <w:p>
+            <w:r>
+              <w:rPr>
+                <w:rFonts w:ascii="Calibri" w:cs="Calibri" w:eastAsia="Calibri" w:hAnsi="Calibri"/>
+                <w:sz w:val="19"/>
+                <w:szCs w:val="19"/>
+              </w:rPr>
               <w:t xml:space="preserve">7 min</w:t>
-            </w:r>
-          </w:p>
-        </w:tc>
-        <w:tc>
-          <w:tcPr>
-            <w:tcW w:type="dxa" w:w="2077"/>
-            <w:tcBorders>
-              <w:top w:val="single" w:color="BFBFBF" w:sz="4"/>
-              <w:left w:val="single" w:color="BFBFBF" w:sz="4"/>
-              <w:bottom w:val="single" w:color="BFBFBF" w:sz="4"/>
-              <w:right w:val="single" w:color="BFBFBF" w:sz="4"/>
-            </w:tcBorders>
-            <w:tcMar>
-              <w:top w:type="dxa" w:w="60"/>
-              <w:left w:type="dxa" w:w="100"/>
-              <w:bottom w:type="dxa" w:w="60"/>
-              <w:right w:type="dxa" w:w="100"/>
-            </w:tcMar>
-          </w:tcPr>
-          <w:p>
-            <w:r>
-              <w:rPr>
-                <w:rFonts w:ascii="Calibri" w:cs="Calibri" w:eastAsia="Calibri" w:hAnsi="Calibri"/>
-                <w:sz w:val="19"/>
-                <w:szCs w:val="19"/>
-              </w:rPr>
-              <w:t xml:space="preserve">12 min</w:t>
             </w:r>
           </w:p>
         </w:tc>
@@ -17200,7 +17200,7 @@
                 <w:sz w:val="19"/>
                 <w:szCs w:val="19"/>
               </w:rPr>
-              <w:t xml:space="preserve">10 min</w:t>
+              <w:t xml:space="preserve">8 min</w:t>
             </w:r>
           </w:p>
         </w:tc>
@@ -17227,7 +17227,7 @@
                 <w:sz w:val="19"/>
                 <w:szCs w:val="19"/>
               </w:rPr>
-              <w:t xml:space="preserve">16 min</w:t>
+              <w:t xml:space="preserve">13 min</w:t>
             </w:r>
           </w:p>
         </w:tc>
@@ -17286,7 +17286,7 @@
                 <w:sz w:val="19"/>
                 <w:szCs w:val="19"/>
               </w:rPr>
-              <w:t xml:space="preserve">18 min (target about 20)</w:t>
+              <w:t xml:space="preserve">16 min (target about 20)</w:t>
             </w:r>
           </w:p>
         </w:tc>
@@ -17313,7 +17313,7 @@
                 <w:sz w:val="19"/>
                 <w:szCs w:val="19"/>
               </w:rPr>
-              <w:t xml:space="preserve">29 min</w:t>
+              <w:t xml:space="preserve">26 min</w:t>
             </w:r>
           </w:p>
         </w:tc>
@@ -17372,7 +17372,7 @@
                 <w:sz w:val="19"/>
                 <w:szCs w:val="19"/>
               </w:rPr>
-              <w:t xml:space="preserve">33 min (target about 35)</w:t>
+              <w:t xml:space="preserve">29 min (target about 35)</w:t>
             </w:r>
           </w:p>
         </w:tc>
@@ -17399,7 +17399,7 @@
                 <w:sz w:val="19"/>
                 <w:szCs w:val="19"/>
               </w:rPr>
-              <w:t xml:space="preserve">53 min</w:t>
+              <w:t xml:space="preserve">47 min</w:t>
             </w:r>
           </w:p>
         </w:tc>
@@ -17458,7 +17458,7 @@
                 <w:sz w:val="19"/>
                 <w:szCs w:val="19"/>
               </w:rPr>
-              <w:t xml:space="preserve">37 min</w:t>
+              <w:t xml:space="preserve">28 min</w:t>
             </w:r>
           </w:p>
         </w:tc>
@@ -17485,7 +17485,7 @@
                 <w:sz w:val="19"/>
                 <w:szCs w:val="19"/>
               </w:rPr>
-              <w:t xml:space="preserve">1 h</w:t>
+              <w:t xml:space="preserve">45 min</w:t>
             </w:r>
           </w:p>
         </w:tc>
@@ -17544,7 +17544,7 @@
                 <w:sz w:val="19"/>
                 <w:szCs w:val="19"/>
               </w:rPr>
-              <w:t xml:space="preserve">42 min</w:t>
+              <w:t xml:space="preserve">38 min</w:t>
             </w:r>
           </w:p>
         </w:tc>
@@ -17571,7 +17571,7 @@
                 <w:sz w:val="19"/>
                 <w:szCs w:val="19"/>
               </w:rPr>
-              <w:t xml:space="preserve">1.1 h</w:t>
+              <w:t xml:space="preserve">1 h</w:t>
             </w:r>
           </w:p>
         </w:tc>
@@ -17630,7 +17630,7 @@
                 <w:sz w:val="19"/>
                 <w:szCs w:val="19"/>
               </w:rPr>
-              <w:t xml:space="preserve">about 1.3 h</w:t>
+              <w:t xml:space="preserve">about 1.2 h</w:t>
             </w:r>
           </w:p>
         </w:tc>
@@ -17657,7 +17657,7 @@
                 <w:sz w:val="19"/>
                 <w:szCs w:val="19"/>
               </w:rPr>
-              <w:t xml:space="preserve">2.1 h</w:t>
+              <w:t xml:space="preserve">1.9 h</w:t>
             </w:r>
           </w:p>
         </w:tc>
@@ -17974,7 +17974,7 @@
                 <w:sz w:val="19"/>
                 <w:szCs w:val="19"/>
               </w:rPr>
-              <w:t xml:space="preserve">2.3 h</w:t>
+              <w:t xml:space="preserve">2.2 h</w:t>
             </w:r>
           </w:p>
         </w:tc>
@@ -18001,7 +18001,7 @@
                 <w:sz w:val="19"/>
                 <w:szCs w:val="19"/>
               </w:rPr>
-              <w:t xml:space="preserve">3.7 h</w:t>
+              <w:t xml:space="preserve">3.5 h</w:t>
             </w:r>
           </w:p>
         </w:tc>

</xml_diff>

<commit_message>
Road candy respawns in its own stretch of the road so the first levels do not empty out
Co-Authored-By: Claude Sonnet 5.5 <noreply@anthropic.com>
Claude-Session: https://claude.ai/code/session_013ivEnYiZGofRBeqQFKAVhJ
</commit_message>
<xml_diff>
--- a/docs/Spooky-Steal-Design-and-Plan.docx
+++ b/docs/Spooky-Steal-Design-and-Plan.docx
@@ -1292,6 +1292,65 @@
                 <w:szCs w:val="19"/>
               </w:rPr>
               <w:t xml:space="preserve">A thief now holds the egg with both arms: every player's client bends the carrier's shoulders and elbows so the hands rest on the sides of the egg (two-bone arm IK on the R15 joints, written into the joints' C0 so the run animation can not overwrite it), and the egg sits closer and chest high. It is only a pose, so there is no new animation asset.</w:t>
+            </w:r>
+          </w:p>
+        </w:tc>
+      </w:tr>
+      <w:tr>
+        <w:trPr>
+          <w:cantSplit/>
+        </w:trPr>
+        <w:tc>
+          <w:tcPr>
+            <w:tcW w:type="dxa" w:w="4252"/>
+            <w:tcBorders>
+              <w:top w:val="single" w:color="BFBFBF" w:sz="4"/>
+              <w:left w:val="single" w:color="BFBFBF" w:sz="4"/>
+              <w:bottom w:val="single" w:color="BFBFBF" w:sz="4"/>
+              <w:right w:val="single" w:color="BFBFBF" w:sz="4"/>
+            </w:tcBorders>
+            <w:tcMar>
+              <w:top w:type="dxa" w:w="60"/>
+              <w:left w:type="dxa" w:w="100"/>
+              <w:bottom w:type="dxa" w:w="60"/>
+              <w:right w:type="dxa" w:w="100"/>
+            </w:tcMar>
+          </w:tcPr>
+          <w:p>
+            <w:r>
+              <w:rPr>
+                <w:rFonts w:ascii="Calibri" w:cs="Calibri" w:eastAsia="Calibri" w:hAnsi="Calibri"/>
+                <w:sz w:val="19"/>
+                <w:szCs w:val="19"/>
+              </w:rPr>
+              <w:t xml:space="preserve">Road candy stays spread out (6.5)</w:t>
+            </w:r>
+          </w:p>
+        </w:tc>
+        <w:tc>
+          <w:tcPr>
+            <w:tcW w:type="dxa" w:w="5108"/>
+            <w:tcBorders>
+              <w:top w:val="single" w:color="BFBFBF" w:sz="4"/>
+              <w:left w:val="single" w:color="BFBFBF" w:sz="4"/>
+              <w:bottom w:val="single" w:color="BFBFBF" w:sz="4"/>
+              <w:right w:val="single" w:color="BFBFBF" w:sz="4"/>
+            </w:tcBorders>
+            <w:tcMar>
+              <w:top w:type="dxa" w:w="60"/>
+              <w:left w:type="dxa" w:w="100"/>
+              <w:bottom w:type="dxa" w:w="60"/>
+              <w:right w:type="dxa" w:w="100"/>
+            </w:tcMar>
+          </w:tcPr>
+          <w:p>
+            <w:r>
+              <w:rPr>
+                <w:rFonts w:ascii="Calibri" w:cs="Calibri" w:eastAsia="Calibri" w:hAnsi="Calibri"/>
+                <w:sz w:val="19"/>
+                <w:szCs w:val="19"/>
+              </w:rPr>
+              <w:t xml:space="preserve">Each road candy now belongs to one stretch of the road (the road is cut into 160 equal slices) and respawns inside that slice, so candies taken near the start come back near the start. Before, they respawned anywhere on the whole road, which emptied the first levels when players stayed near the start.</w:t>
             </w:r>
           </w:p>
         </w:tc>

</xml_diff>

<commit_message>
Fix the missing HUD: Main.client went over Roblox's 200-local limit (201) with the carry-pose block; move that block to CostumeLabels.client and add tools/check_locals.py
Co-Authored-By: Claude Sonnet 5.5 <noreply@anthropic.com>
Claude-Session: https://claude.ai/code/session_013ivEnYiZGofRBeqQFKAVhJ
</commit_message>
<xml_diff>
--- a/docs/Spooky-Steal-Design-and-Plan.docx
+++ b/docs/Spooky-Steal-Design-and-Plan.docx
@@ -1291,7 +1291,39 @@
                 <w:sz w:val="19"/>
                 <w:szCs w:val="19"/>
               </w:rPr>
-              <w:t xml:space="preserve">A thief now holds the egg with both arms: every player's client bends the carrier's shoulders and elbows so the hands rest on the sides of the egg (two-bone arm IK on the R15 joints, written into the joints' C0 so the run animation can not overwrite it), and the egg sits closer and chest high. It is only a pose, so there is no new animation asset.</w:t>
+              <w:t xml:space="preserve">A thief now holds the egg with both arms: every player's client bends the carrier's shoulders and elbows so the hands rest on the sides of the egg (two-bone arm IK on the R15 joints, written into the joints' C0 so the run animation can not overwrite it; the code lives in </w:t>
+            </w:r>
+            <w:r>
+              <w:rPr>
+                <w:rFonts w:ascii="Courier New" w:cs="Courier New" w:eastAsia="Courier New" w:hAnsi="Courier New"/>
+                <w:sz w:val="19"/>
+                <w:szCs w:val="19"/>
+              </w:rPr>
+              <w:t xml:space="preserve">CostumeLabels.client</w:t>
+            </w:r>
+            <w:r>
+              <w:rPr>
+                <w:rFonts w:ascii="Calibri" w:cs="Calibri" w:eastAsia="Calibri" w:hAnsi="Calibri"/>
+                <w:sz w:val="19"/>
+                <w:szCs w:val="19"/>
+              </w:rPr>
+              <w:t xml:space="preserve"> because </w:t>
+            </w:r>
+            <w:r>
+              <w:rPr>
+                <w:rFonts w:ascii="Courier New" w:cs="Courier New" w:eastAsia="Courier New" w:hAnsi="Courier New"/>
+                <w:sz w:val="19"/>
+                <w:szCs w:val="19"/>
+              </w:rPr>
+              <w:t xml:space="preserve">Main.client</w:t>
+            </w:r>
+            <w:r>
+              <w:rPr>
+                <w:rFonts w:ascii="Calibri" w:cs="Calibri" w:eastAsia="Calibri" w:hAnsi="Calibri"/>
+                <w:sz w:val="19"/>
+                <w:szCs w:val="19"/>
+              </w:rPr>
+              <w:t xml:space="preserve"> is at the 200-local limit), and the egg sits closer and chest high. It is only a pose, so there is no new animation asset.</w:t>
             </w:r>
           </w:p>
         </w:tc>

</xml_diff>

<commit_message>
Speed Levels give +1 speed (+1.5 every 5th level); owner speeds set from each house's Recommended Level (90% of that level's speed + 1); levelling up costs 10% more from level 10 and 10% more every 20 levels
Co-Authored-By: Claude Sonnet 5.5 <noreply@anthropic.com>
Claude-Session: https://claude.ai/code/session_013ivEnYiZGofRBeqQFKAVhJ
</commit_message>
<xml_diff>
--- a/docs/Spooky-Steal-Design-and-Plan.docx
+++ b/docs/Spooky-Steal-Design-and-Plan.docx
@@ -1174,6 +1174,65 @@
                 <w:szCs w:val="19"/>
               </w:rPr>
               <w:t xml:space="preserve">Every Big, Huge and Gigantic egg now gets its own random size, and the money multiplier is that size: Big pets are drawn 2x to 3x bigger and pay x2.5 to x3.5, Huge 3x to 5x and x4 to x6, Gigantic 7x and x16 (before: fixed x3, x8 and x30). Eggs are drawn half as big as the pet. See 2.8. The Blood Moon event is shelved for now; it stays in the git history (commits 346b54e and 4d825cd).</w:t>
+            </w:r>
+          </w:p>
+        </w:tc>
+      </w:tr>
+      <w:tr>
+        <w:trPr>
+          <w:cantSplit/>
+        </w:trPr>
+        <w:tc>
+          <w:tcPr>
+            <w:tcW w:type="dxa" w:w="4252"/>
+            <w:tcBorders>
+              <w:top w:val="single" w:color="BFBFBF" w:sz="4"/>
+              <w:left w:val="single" w:color="BFBFBF" w:sz="4"/>
+              <w:bottom w:val="single" w:color="BFBFBF" w:sz="4"/>
+              <w:right w:val="single" w:color="BFBFBF" w:sz="4"/>
+            </w:tcBorders>
+            <w:tcMar>
+              <w:top w:type="dxa" w:w="60"/>
+              <w:left w:type="dxa" w:w="100"/>
+              <w:bottom w:type="dxa" w:w="60"/>
+              <w:right w:type="dxa" w:w="100"/>
+            </w:tcMar>
+          </w:tcPr>
+          <w:p>
+            <w:r>
+              <w:rPr>
+                <w:rFonts w:ascii="Calibri" w:cs="Calibri" w:eastAsia="Calibri" w:hAnsi="Calibri"/>
+                <w:sz w:val="19"/>
+                <w:szCs w:val="19"/>
+              </w:rPr>
+              <w:t xml:space="preserve">Speed and level changes (6.7)</w:t>
+            </w:r>
+          </w:p>
+        </w:tc>
+        <w:tc>
+          <w:tcPr>
+            <w:tcW w:type="dxa" w:w="5108"/>
+            <w:tcBorders>
+              <w:top w:val="single" w:color="BFBFBF" w:sz="4"/>
+              <w:left w:val="single" w:color="BFBFBF" w:sz="4"/>
+              <w:bottom w:val="single" w:color="BFBFBF" w:sz="4"/>
+              <w:right w:val="single" w:color="BFBFBF" w:sz="4"/>
+            </w:tcBorders>
+            <w:tcMar>
+              <w:top w:type="dxa" w:w="60"/>
+              <w:left w:type="dxa" w:w="100"/>
+              <w:bottom w:type="dxa" w:w="60"/>
+              <w:right w:type="dxa" w:w="100"/>
+            </w:tcMar>
+          </w:tcPr>
+          <w:p>
+            <w:r>
+              <w:rPr>
+                <w:rFonts w:ascii="Calibri" w:cs="Calibri" w:eastAsia="Calibri" w:hAnsi="Calibri"/>
+                <w:sz w:val="19"/>
+                <w:szCs w:val="19"/>
+              </w:rPr>
+              <w:t xml:space="preserve">Each Speed Level gives +1 speed and every 5th level +1.5 (max speed 130, was 170). Owner speeds are now set from the Recommended Level of their house (owner = 90% of the level's speed + 1). Levelling up costs 10% more from level 10 and another 10% more every 20 levels. V6.7 itself (Index window, Robux treadmills, bloody pets for houses 1 to 3, new music and the Playtime changes) was adopted as the main place.</w:t>
             </w:r>
           </w:p>
         </w:tc>
@@ -3751,15 +3810,15 @@
         </w:tblBorders>
       </w:tblPr>
       <w:tblGrid>
-        <w:gridCol w:w="447"/>
-        <w:gridCol w:w="977"/>
-        <w:gridCol w:w="705"/>
-        <w:gridCol w:w="889"/>
-        <w:gridCol w:w="933"/>
-        <w:gridCol w:w="447"/>
-        <w:gridCol w:w="447"/>
-        <w:gridCol w:w="1994"/>
-        <w:gridCol w:w="2521"/>
+        <w:gridCol w:w="436"/>
+        <w:gridCol w:w="954"/>
+        <w:gridCol w:w="911"/>
+        <w:gridCol w:w="868"/>
+        <w:gridCol w:w="911"/>
+        <w:gridCol w:w="436"/>
+        <w:gridCol w:w="436"/>
+        <w:gridCol w:w="1946"/>
+        <w:gridCol w:w="2462"/>
       </w:tblGrid>
       <w:tr>
         <w:trPr>
@@ -3767,7 +3826,7 @@
         </w:trPr>
         <w:tc>
           <w:tcPr>
-            <w:tcW w:type="dxa" w:w="447"/>
+            <w:tcW w:type="dxa" w:w="436"/>
             <w:tcBorders>
               <w:top w:val="single" w:color="BFBFBF" w:sz="4"/>
               <w:left w:val="single" w:color="BFBFBF" w:sz="4"/>
@@ -3797,7 +3856,7 @@
         </w:tc>
         <w:tc>
           <w:tcPr>
-            <w:tcW w:type="dxa" w:w="977"/>
+            <w:tcW w:type="dxa" w:w="954"/>
             <w:tcBorders>
               <w:top w:val="single" w:color="BFBFBF" w:sz="4"/>
               <w:left w:val="single" w:color="BFBFBF" w:sz="4"/>
@@ -3827,7 +3886,7 @@
         </w:tc>
         <w:tc>
           <w:tcPr>
-            <w:tcW w:type="dxa" w:w="705"/>
+            <w:tcW w:type="dxa" w:w="911"/>
             <w:tcBorders>
               <w:top w:val="single" w:color="BFBFBF" w:sz="4"/>
               <w:left w:val="single" w:color="BFBFBF" w:sz="4"/>
@@ -3857,7 +3916,7 @@
         </w:tc>
         <w:tc>
           <w:tcPr>
-            <w:tcW w:type="dxa" w:w="889"/>
+            <w:tcW w:type="dxa" w:w="868"/>
             <w:tcBorders>
               <w:top w:val="single" w:color="BFBFBF" w:sz="4"/>
               <w:left w:val="single" w:color="BFBFBF" w:sz="4"/>
@@ -3887,7 +3946,7 @@
         </w:tc>
         <w:tc>
           <w:tcPr>
-            <w:tcW w:type="dxa" w:w="933"/>
+            <w:tcW w:type="dxa" w:w="911"/>
             <w:tcBorders>
               <w:top w:val="single" w:color="BFBFBF" w:sz="4"/>
               <w:left w:val="single" w:color="BFBFBF" w:sz="4"/>
@@ -3917,7 +3976,7 @@
         </w:tc>
         <w:tc>
           <w:tcPr>
-            <w:tcW w:type="dxa" w:w="447"/>
+            <w:tcW w:type="dxa" w:w="436"/>
             <w:tcBorders>
               <w:top w:val="single" w:color="BFBFBF" w:sz="4"/>
               <w:left w:val="single" w:color="BFBFBF" w:sz="4"/>
@@ -3947,7 +4006,7 @@
         </w:tc>
         <w:tc>
           <w:tcPr>
-            <w:tcW w:type="dxa" w:w="447"/>
+            <w:tcW w:type="dxa" w:w="436"/>
             <w:tcBorders>
               <w:top w:val="single" w:color="BFBFBF" w:sz="4"/>
               <w:left w:val="single" w:color="BFBFBF" w:sz="4"/>
@@ -3977,7 +4036,7 @@
         </w:tc>
         <w:tc>
           <w:tcPr>
-            <w:tcW w:type="dxa" w:w="1994"/>
+            <w:tcW w:type="dxa" w:w="1946"/>
             <w:tcBorders>
               <w:top w:val="single" w:color="BFBFBF" w:sz="4"/>
               <w:left w:val="single" w:color="BFBFBF" w:sz="4"/>
@@ -4007,7 +4066,7 @@
         </w:tc>
         <w:tc>
           <w:tcPr>
-            <w:tcW w:type="dxa" w:w="2521"/>
+            <w:tcW w:type="dxa" w:w="2462"/>
             <w:tcBorders>
               <w:top w:val="single" w:color="BFBFBF" w:sz="4"/>
               <w:left w:val="single" w:color="BFBFBF" w:sz="4"/>
@@ -4042,7 +4101,7 @@
         </w:trPr>
         <w:tc>
           <w:tcPr>
-            <w:tcW w:type="dxa" w:w="447"/>
+            <w:tcW w:type="dxa" w:w="436"/>
             <w:tcBorders>
               <w:top w:val="single" w:color="BFBFBF" w:sz="4"/>
               <w:left w:val="single" w:color="BFBFBF" w:sz="4"/>
@@ -4069,7 +4128,7 @@
         </w:tc>
         <w:tc>
           <w:tcPr>
-            <w:tcW w:type="dxa" w:w="977"/>
+            <w:tcW w:type="dxa" w:w="954"/>
             <w:tcBorders>
               <w:top w:val="single" w:color="BFBFBF" w:sz="4"/>
               <w:left w:val="single" w:color="BFBFBF" w:sz="4"/>
@@ -4096,34 +4155,34 @@
         </w:tc>
         <w:tc>
           <w:tcPr>
-            <w:tcW w:type="dxa" w:w="705"/>
-            <w:tcBorders>
-              <w:top w:val="single" w:color="BFBFBF" w:sz="4"/>
-              <w:left w:val="single" w:color="BFBFBF" w:sz="4"/>
-              <w:bottom w:val="single" w:color="BFBFBF" w:sz="4"/>
-              <w:right w:val="single" w:color="BFBFBF" w:sz="4"/>
-            </w:tcBorders>
-            <w:tcMar>
-              <w:top w:type="dxa" w:w="60"/>
-              <w:left w:type="dxa" w:w="100"/>
-              <w:bottom w:type="dxa" w:w="60"/>
-              <w:right w:type="dxa" w:w="100"/>
-            </w:tcMar>
-          </w:tcPr>
-          <w:p>
-            <w:r>
-              <w:rPr>
-                <w:rFonts w:ascii="Calibri" w:cs="Calibri" w:eastAsia="Calibri" w:hAnsi="Calibri"/>
-                <w:sz w:val="19"/>
-                <w:szCs w:val="19"/>
-              </w:rPr>
-              <w:t xml:space="preserve">17</w:t>
-            </w:r>
-          </w:p>
-        </w:tc>
-        <w:tc>
-          <w:tcPr>
-            <w:tcW w:type="dxa" w:w="889"/>
+            <w:tcW w:type="dxa" w:w="911"/>
+            <w:tcBorders>
+              <w:top w:val="single" w:color="BFBFBF" w:sz="4"/>
+              <w:left w:val="single" w:color="BFBFBF" w:sz="4"/>
+              <w:bottom w:val="single" w:color="BFBFBF" w:sz="4"/>
+              <w:right w:val="single" w:color="BFBFBF" w:sz="4"/>
+            </w:tcBorders>
+            <w:tcMar>
+              <w:top w:type="dxa" w:w="60"/>
+              <w:left w:type="dxa" w:w="100"/>
+              <w:bottom w:type="dxa" w:w="60"/>
+              <w:right w:type="dxa" w:w="100"/>
+            </w:tcMar>
+          </w:tcPr>
+          <w:p>
+            <w:r>
+              <w:rPr>
+                <w:rFonts w:ascii="Calibri" w:cs="Calibri" w:eastAsia="Calibri" w:hAnsi="Calibri"/>
+                <w:sz w:val="19"/>
+                <w:szCs w:val="19"/>
+              </w:rPr>
+              <w:t xml:space="preserve">19.9 (level 1)</w:t>
+            </w:r>
+          </w:p>
+        </w:tc>
+        <w:tc>
+          <w:tcPr>
+            <w:tcW w:type="dxa" w:w="868"/>
             <w:tcBorders>
               <w:top w:val="single" w:color="BFBFBF" w:sz="4"/>
               <w:left w:val="single" w:color="BFBFBF" w:sz="4"/>
@@ -4150,7 +4209,7 @@
         </w:tc>
         <w:tc>
           <w:tcPr>
-            <w:tcW w:type="dxa" w:w="933"/>
+            <w:tcW w:type="dxa" w:w="911"/>
             <w:tcBorders>
               <w:top w:val="single" w:color="BFBFBF" w:sz="4"/>
               <w:left w:val="single" w:color="BFBFBF" w:sz="4"/>
@@ -4177,7 +4236,7 @@
         </w:tc>
         <w:tc>
           <w:tcPr>
-            <w:tcW w:type="dxa" w:w="447"/>
+            <w:tcW w:type="dxa" w:w="436"/>
             <w:tcBorders>
               <w:top w:val="single" w:color="BFBFBF" w:sz="4"/>
               <w:left w:val="single" w:color="BFBFBF" w:sz="4"/>
@@ -4204,7 +4263,7 @@
         </w:tc>
         <w:tc>
           <w:tcPr>
-            <w:tcW w:type="dxa" w:w="447"/>
+            <w:tcW w:type="dxa" w:w="436"/>
             <w:tcBorders>
               <w:top w:val="single" w:color="BFBFBF" w:sz="4"/>
               <w:left w:val="single" w:color="BFBFBF" w:sz="4"/>
@@ -4231,7 +4290,7 @@
         </w:tc>
         <w:tc>
           <w:tcPr>
-            <w:tcW w:type="dxa" w:w="1994"/>
+            <w:tcW w:type="dxa" w:w="1946"/>
             <w:tcBorders>
               <w:top w:val="single" w:color="BFBFBF" w:sz="4"/>
               <w:left w:val="single" w:color="BFBFBF" w:sz="4"/>
@@ -4258,7 +4317,7 @@
         </w:tc>
         <w:tc>
           <w:tcPr>
-            <w:tcW w:type="dxa" w:w="2521"/>
+            <w:tcW w:type="dxa" w:w="2462"/>
             <w:tcBorders>
               <w:top w:val="single" w:color="BFBFBF" w:sz="4"/>
               <w:left w:val="single" w:color="BFBFBF" w:sz="4"/>
@@ -4290,7 +4349,7 @@
         </w:trPr>
         <w:tc>
           <w:tcPr>
-            <w:tcW w:type="dxa" w:w="447"/>
+            <w:tcW w:type="dxa" w:w="436"/>
             <w:tcBorders>
               <w:top w:val="single" w:color="BFBFBF" w:sz="4"/>
               <w:left w:val="single" w:color="BFBFBF" w:sz="4"/>
@@ -4317,7 +4376,7 @@
         </w:tc>
         <w:tc>
           <w:tcPr>
-            <w:tcW w:type="dxa" w:w="977"/>
+            <w:tcW w:type="dxa" w:w="954"/>
             <w:tcBorders>
               <w:top w:val="single" w:color="BFBFBF" w:sz="4"/>
               <w:left w:val="single" w:color="BFBFBF" w:sz="4"/>
@@ -4344,34 +4403,34 @@
         </w:tc>
         <w:tc>
           <w:tcPr>
-            <w:tcW w:type="dxa" w:w="705"/>
-            <w:tcBorders>
-              <w:top w:val="single" w:color="BFBFBF" w:sz="4"/>
-              <w:left w:val="single" w:color="BFBFBF" w:sz="4"/>
-              <w:bottom w:val="single" w:color="BFBFBF" w:sz="4"/>
-              <w:right w:val="single" w:color="BFBFBF" w:sz="4"/>
-            </w:tcBorders>
-            <w:tcMar>
-              <w:top w:type="dxa" w:w="60"/>
-              <w:left w:type="dxa" w:w="100"/>
-              <w:bottom w:type="dxa" w:w="60"/>
-              <w:right w:type="dxa" w:w="100"/>
-            </w:tcMar>
-          </w:tcPr>
-          <w:p>
-            <w:r>
-              <w:rPr>
-                <w:rFonts w:ascii="Calibri" w:cs="Calibri" w:eastAsia="Calibri" w:hAnsi="Calibri"/>
-                <w:sz w:val="19"/>
-                <w:szCs w:val="19"/>
-              </w:rPr>
-              <w:t xml:space="preserve">38</w:t>
-            </w:r>
-          </w:p>
-        </w:tc>
-        <w:tc>
-          <w:tcPr>
-            <w:tcW w:type="dxa" w:w="889"/>
+            <w:tcW w:type="dxa" w:w="911"/>
+            <w:tcBorders>
+              <w:top w:val="single" w:color="BFBFBF" w:sz="4"/>
+              <w:left w:val="single" w:color="BFBFBF" w:sz="4"/>
+              <w:bottom w:val="single" w:color="BFBFBF" w:sz="4"/>
+              <w:right w:val="single" w:color="BFBFBF" w:sz="4"/>
+            </w:tcBorders>
+            <w:tcMar>
+              <w:top w:type="dxa" w:w="60"/>
+              <w:left w:type="dxa" w:w="100"/>
+              <w:bottom w:type="dxa" w:w="60"/>
+              <w:right w:type="dxa" w:w="100"/>
+            </w:tcMar>
+          </w:tcPr>
+          <w:p>
+            <w:r>
+              <w:rPr>
+                <w:rFonts w:ascii="Calibri" w:cs="Calibri" w:eastAsia="Calibri" w:hAnsi="Calibri"/>
+                <w:sz w:val="19"/>
+                <w:szCs w:val="19"/>
+              </w:rPr>
+              <w:t xml:space="preserve">35.6 (level 17)</w:t>
+            </w:r>
+          </w:p>
+        </w:tc>
+        <w:tc>
+          <w:tcPr>
+            <w:tcW w:type="dxa" w:w="868"/>
             <w:tcBorders>
               <w:top w:val="single" w:color="BFBFBF" w:sz="4"/>
               <w:left w:val="single" w:color="BFBFBF" w:sz="4"/>
@@ -4398,7 +4457,7 @@
         </w:tc>
         <w:tc>
           <w:tcPr>
-            <w:tcW w:type="dxa" w:w="933"/>
+            <w:tcW w:type="dxa" w:w="911"/>
             <w:tcBorders>
               <w:top w:val="single" w:color="BFBFBF" w:sz="4"/>
               <w:left w:val="single" w:color="BFBFBF" w:sz="4"/>
@@ -4425,7 +4484,7 @@
         </w:tc>
         <w:tc>
           <w:tcPr>
-            <w:tcW w:type="dxa" w:w="447"/>
+            <w:tcW w:type="dxa" w:w="436"/>
             <w:tcBorders>
               <w:top w:val="single" w:color="BFBFBF" w:sz="4"/>
               <w:left w:val="single" w:color="BFBFBF" w:sz="4"/>
@@ -4452,7 +4511,7 @@
         </w:tc>
         <w:tc>
           <w:tcPr>
-            <w:tcW w:type="dxa" w:w="447"/>
+            <w:tcW w:type="dxa" w:w="436"/>
             <w:tcBorders>
               <w:top w:val="single" w:color="BFBFBF" w:sz="4"/>
               <w:left w:val="single" w:color="BFBFBF" w:sz="4"/>
@@ -4479,7 +4538,7 @@
         </w:tc>
         <w:tc>
           <w:tcPr>
-            <w:tcW w:type="dxa" w:w="1994"/>
+            <w:tcW w:type="dxa" w:w="1946"/>
             <w:tcBorders>
               <w:top w:val="single" w:color="BFBFBF" w:sz="4"/>
               <w:left w:val="single" w:color="BFBFBF" w:sz="4"/>
@@ -4506,7 +4565,7 @@
         </w:tc>
         <w:tc>
           <w:tcPr>
-            <w:tcW w:type="dxa" w:w="2521"/>
+            <w:tcW w:type="dxa" w:w="2462"/>
             <w:tcBorders>
               <w:top w:val="single" w:color="BFBFBF" w:sz="4"/>
               <w:left w:val="single" w:color="BFBFBF" w:sz="4"/>
@@ -4538,7 +4597,7 @@
         </w:trPr>
         <w:tc>
           <w:tcPr>
-            <w:tcW w:type="dxa" w:w="447"/>
+            <w:tcW w:type="dxa" w:w="436"/>
             <w:tcBorders>
               <w:top w:val="single" w:color="BFBFBF" w:sz="4"/>
               <w:left w:val="single" w:color="BFBFBF" w:sz="4"/>
@@ -4565,7 +4624,7 @@
         </w:tc>
         <w:tc>
           <w:tcPr>
-            <w:tcW w:type="dxa" w:w="977"/>
+            <w:tcW w:type="dxa" w:w="954"/>
             <w:tcBorders>
               <w:top w:val="single" w:color="BFBFBF" w:sz="4"/>
               <w:left w:val="single" w:color="BFBFBF" w:sz="4"/>
@@ -4592,34 +4651,34 @@
         </w:tc>
         <w:tc>
           <w:tcPr>
-            <w:tcW w:type="dxa" w:w="705"/>
-            <w:tcBorders>
-              <w:top w:val="single" w:color="BFBFBF" w:sz="4"/>
-              <w:left w:val="single" w:color="BFBFBF" w:sz="4"/>
-              <w:bottom w:val="single" w:color="BFBFBF" w:sz="4"/>
-              <w:right w:val="single" w:color="BFBFBF" w:sz="4"/>
-            </w:tcBorders>
-            <w:tcMar>
-              <w:top w:type="dxa" w:w="60"/>
-              <w:left w:type="dxa" w:w="100"/>
-              <w:bottom w:type="dxa" w:w="60"/>
-              <w:right w:type="dxa" w:w="100"/>
-            </w:tcMar>
-          </w:tcPr>
-          <w:p>
-            <w:r>
-              <w:rPr>
-                <w:rFonts w:ascii="Calibri" w:cs="Calibri" w:eastAsia="Calibri" w:hAnsi="Calibri"/>
-                <w:sz w:val="19"/>
-                <w:szCs w:val="19"/>
-              </w:rPr>
-              <w:t xml:space="preserve">53</w:t>
-            </w:r>
-          </w:p>
-        </w:tc>
-        <w:tc>
-          <w:tcPr>
-            <w:tcW w:type="dxa" w:w="889"/>
+            <w:tcW w:type="dxa" w:w="911"/>
+            <w:tcBorders>
+              <w:top w:val="single" w:color="BFBFBF" w:sz="4"/>
+              <w:left w:val="single" w:color="BFBFBF" w:sz="4"/>
+              <w:bottom w:val="single" w:color="BFBFBF" w:sz="4"/>
+              <w:right w:val="single" w:color="BFBFBF" w:sz="4"/>
+            </w:tcBorders>
+            <w:tcMar>
+              <w:top w:type="dxa" w:w="60"/>
+              <w:left w:type="dxa" w:w="100"/>
+              <w:bottom w:type="dxa" w:w="60"/>
+              <w:right w:type="dxa" w:w="100"/>
+            </w:tcMar>
+          </w:tcPr>
+          <w:p>
+            <w:r>
+              <w:rPr>
+                <w:rFonts w:ascii="Calibri" w:cs="Calibri" w:eastAsia="Calibri" w:hAnsi="Calibri"/>
+                <w:sz w:val="19"/>
+                <w:szCs w:val="19"/>
+              </w:rPr>
+              <w:t xml:space="preserve">46.4 (level 28)</w:t>
+            </w:r>
+          </w:p>
+        </w:tc>
+        <w:tc>
+          <w:tcPr>
+            <w:tcW w:type="dxa" w:w="868"/>
             <w:tcBorders>
               <w:top w:val="single" w:color="BFBFBF" w:sz="4"/>
               <w:left w:val="single" w:color="BFBFBF" w:sz="4"/>
@@ -4646,7 +4705,7 @@
         </w:tc>
         <w:tc>
           <w:tcPr>
-            <w:tcW w:type="dxa" w:w="933"/>
+            <w:tcW w:type="dxa" w:w="911"/>
             <w:tcBorders>
               <w:top w:val="single" w:color="BFBFBF" w:sz="4"/>
               <w:left w:val="single" w:color="BFBFBF" w:sz="4"/>
@@ -4673,7 +4732,7 @@
         </w:tc>
         <w:tc>
           <w:tcPr>
-            <w:tcW w:type="dxa" w:w="447"/>
+            <w:tcW w:type="dxa" w:w="436"/>
             <w:tcBorders>
               <w:top w:val="single" w:color="BFBFBF" w:sz="4"/>
               <w:left w:val="single" w:color="BFBFBF" w:sz="4"/>
@@ -4700,7 +4759,7 @@
         </w:tc>
         <w:tc>
           <w:tcPr>
-            <w:tcW w:type="dxa" w:w="447"/>
+            <w:tcW w:type="dxa" w:w="436"/>
             <w:tcBorders>
               <w:top w:val="single" w:color="BFBFBF" w:sz="4"/>
               <w:left w:val="single" w:color="BFBFBF" w:sz="4"/>
@@ -4727,7 +4786,7 @@
         </w:tc>
         <w:tc>
           <w:tcPr>
-            <w:tcW w:type="dxa" w:w="1994"/>
+            <w:tcW w:type="dxa" w:w="1946"/>
             <w:tcBorders>
               <w:top w:val="single" w:color="BFBFBF" w:sz="4"/>
               <w:left w:val="single" w:color="BFBFBF" w:sz="4"/>
@@ -4754,7 +4813,7 @@
         </w:tc>
         <w:tc>
           <w:tcPr>
-            <w:tcW w:type="dxa" w:w="2521"/>
+            <w:tcW w:type="dxa" w:w="2462"/>
             <w:tcBorders>
               <w:top w:val="single" w:color="BFBFBF" w:sz="4"/>
               <w:left w:val="single" w:color="BFBFBF" w:sz="4"/>
@@ -4786,7 +4845,7 @@
         </w:trPr>
         <w:tc>
           <w:tcPr>
-            <w:tcW w:type="dxa" w:w="447"/>
+            <w:tcW w:type="dxa" w:w="436"/>
             <w:tcBorders>
               <w:top w:val="single" w:color="BFBFBF" w:sz="4"/>
               <w:left w:val="single" w:color="BFBFBF" w:sz="4"/>
@@ -4813,7 +4872,7 @@
         </w:tc>
         <w:tc>
           <w:tcPr>
-            <w:tcW w:type="dxa" w:w="977"/>
+            <w:tcW w:type="dxa" w:w="954"/>
             <w:tcBorders>
               <w:top w:val="single" w:color="BFBFBF" w:sz="4"/>
               <w:left w:val="single" w:color="BFBFBF" w:sz="4"/>
@@ -4840,34 +4899,34 @@
         </w:tc>
         <w:tc>
           <w:tcPr>
-            <w:tcW w:type="dxa" w:w="705"/>
-            <w:tcBorders>
-              <w:top w:val="single" w:color="BFBFBF" w:sz="4"/>
-              <w:left w:val="single" w:color="BFBFBF" w:sz="4"/>
-              <w:bottom w:val="single" w:color="BFBFBF" w:sz="4"/>
-              <w:right w:val="single" w:color="BFBFBF" w:sz="4"/>
-            </w:tcBorders>
-            <w:tcMar>
-              <w:top w:type="dxa" w:w="60"/>
-              <w:left w:type="dxa" w:w="100"/>
-              <w:bottom w:type="dxa" w:w="60"/>
-              <w:right w:type="dxa" w:w="100"/>
-            </w:tcMar>
-          </w:tcPr>
-          <w:p>
-            <w:r>
-              <w:rPr>
-                <w:rFonts w:ascii="Calibri" w:cs="Calibri" w:eastAsia="Calibri" w:hAnsi="Calibri"/>
-                <w:sz w:val="19"/>
-                <w:szCs w:val="19"/>
-              </w:rPr>
-              <w:t xml:space="preserve">72</w:t>
-            </w:r>
-          </w:p>
-        </w:tc>
-        <w:tc>
-          <w:tcPr>
-            <w:tcW w:type="dxa" w:w="889"/>
+            <w:tcW w:type="dxa" w:w="911"/>
+            <w:tcBorders>
+              <w:top w:val="single" w:color="BFBFBF" w:sz="4"/>
+              <w:left w:val="single" w:color="BFBFBF" w:sz="4"/>
+              <w:bottom w:val="single" w:color="BFBFBF" w:sz="4"/>
+              <w:right w:val="single" w:color="BFBFBF" w:sz="4"/>
+            </w:tcBorders>
+            <w:tcMar>
+              <w:top w:type="dxa" w:w="60"/>
+              <w:left w:type="dxa" w:w="100"/>
+              <w:bottom w:type="dxa" w:w="60"/>
+              <w:right w:type="dxa" w:w="100"/>
+            </w:tcMar>
+          </w:tcPr>
+          <w:p>
+            <w:r>
+              <w:rPr>
+                <w:rFonts w:ascii="Calibri" w:cs="Calibri" w:eastAsia="Calibri" w:hAnsi="Calibri"/>
+                <w:sz w:val="19"/>
+                <w:szCs w:val="19"/>
+              </w:rPr>
+              <w:t xml:space="preserve">60.4 (level 42)</w:t>
+            </w:r>
+          </w:p>
+        </w:tc>
+        <w:tc>
+          <w:tcPr>
+            <w:tcW w:type="dxa" w:w="868"/>
             <w:tcBorders>
               <w:top w:val="single" w:color="BFBFBF" w:sz="4"/>
               <w:left w:val="single" w:color="BFBFBF" w:sz="4"/>
@@ -4894,7 +4953,7 @@
         </w:tc>
         <w:tc>
           <w:tcPr>
-            <w:tcW w:type="dxa" w:w="933"/>
+            <w:tcW w:type="dxa" w:w="911"/>
             <w:tcBorders>
               <w:top w:val="single" w:color="BFBFBF" w:sz="4"/>
               <w:left w:val="single" w:color="BFBFBF" w:sz="4"/>
@@ -4921,7 +4980,7 @@
         </w:tc>
         <w:tc>
           <w:tcPr>
-            <w:tcW w:type="dxa" w:w="447"/>
+            <w:tcW w:type="dxa" w:w="436"/>
             <w:tcBorders>
               <w:top w:val="single" w:color="BFBFBF" w:sz="4"/>
               <w:left w:val="single" w:color="BFBFBF" w:sz="4"/>
@@ -4948,7 +5007,7 @@
         </w:tc>
         <w:tc>
           <w:tcPr>
-            <w:tcW w:type="dxa" w:w="447"/>
+            <w:tcW w:type="dxa" w:w="436"/>
             <w:tcBorders>
               <w:top w:val="single" w:color="BFBFBF" w:sz="4"/>
               <w:left w:val="single" w:color="BFBFBF" w:sz="4"/>
@@ -4975,7 +5034,7 @@
         </w:tc>
         <w:tc>
           <w:tcPr>
-            <w:tcW w:type="dxa" w:w="1994"/>
+            <w:tcW w:type="dxa" w:w="1946"/>
             <w:tcBorders>
               <w:top w:val="single" w:color="BFBFBF" w:sz="4"/>
               <w:left w:val="single" w:color="BFBFBF" w:sz="4"/>
@@ -5002,7 +5061,7 @@
         </w:tc>
         <w:tc>
           <w:tcPr>
-            <w:tcW w:type="dxa" w:w="2521"/>
+            <w:tcW w:type="dxa" w:w="2462"/>
             <w:tcBorders>
               <w:top w:val="single" w:color="BFBFBF" w:sz="4"/>
               <w:left w:val="single" w:color="BFBFBF" w:sz="4"/>
@@ -5034,7 +5093,7 @@
         </w:trPr>
         <w:tc>
           <w:tcPr>
-            <w:tcW w:type="dxa" w:w="447"/>
+            <w:tcW w:type="dxa" w:w="436"/>
             <w:tcBorders>
               <w:top w:val="single" w:color="BFBFBF" w:sz="4"/>
               <w:left w:val="single" w:color="BFBFBF" w:sz="4"/>
@@ -5061,7 +5120,7 @@
         </w:tc>
         <w:tc>
           <w:tcPr>
-            <w:tcW w:type="dxa" w:w="977"/>
+            <w:tcW w:type="dxa" w:w="954"/>
             <w:tcBorders>
               <w:top w:val="single" w:color="BFBFBF" w:sz="4"/>
               <w:left w:val="single" w:color="BFBFBF" w:sz="4"/>
@@ -5088,34 +5147,34 @@
         </w:tc>
         <w:tc>
           <w:tcPr>
-            <w:tcW w:type="dxa" w:w="705"/>
-            <w:tcBorders>
-              <w:top w:val="single" w:color="BFBFBF" w:sz="4"/>
-              <w:left w:val="single" w:color="BFBFBF" w:sz="4"/>
-              <w:bottom w:val="single" w:color="BFBFBF" w:sz="4"/>
-              <w:right w:val="single" w:color="BFBFBF" w:sz="4"/>
-            </w:tcBorders>
-            <w:tcMar>
-              <w:top w:type="dxa" w:w="60"/>
-              <w:left w:type="dxa" w:w="100"/>
-              <w:bottom w:type="dxa" w:w="60"/>
-              <w:right w:type="dxa" w:w="100"/>
-            </w:tcMar>
-          </w:tcPr>
-          <w:p>
-            <w:r>
-              <w:rPr>
-                <w:rFonts w:ascii="Calibri" w:cs="Calibri" w:eastAsia="Calibri" w:hAnsi="Calibri"/>
-                <w:sz w:val="19"/>
-                <w:szCs w:val="19"/>
-              </w:rPr>
-              <w:t xml:space="preserve">84</w:t>
-            </w:r>
-          </w:p>
-        </w:tc>
-        <w:tc>
-          <w:tcPr>
-            <w:tcW w:type="dxa" w:w="889"/>
+            <w:tcW w:type="dxa" w:w="911"/>
+            <w:tcBorders>
+              <w:top w:val="single" w:color="BFBFBF" w:sz="4"/>
+              <w:left w:val="single" w:color="BFBFBF" w:sz="4"/>
+              <w:bottom w:val="single" w:color="BFBFBF" w:sz="4"/>
+              <w:right w:val="single" w:color="BFBFBF" w:sz="4"/>
+            </w:tcBorders>
+            <w:tcMar>
+              <w:top w:type="dxa" w:w="60"/>
+              <w:left w:type="dxa" w:w="100"/>
+              <w:bottom w:type="dxa" w:w="60"/>
+              <w:right w:type="dxa" w:w="100"/>
+            </w:tcMar>
+          </w:tcPr>
+          <w:p>
+            <w:r>
+              <w:rPr>
+                <w:rFonts w:ascii="Calibri" w:cs="Calibri" w:eastAsia="Calibri" w:hAnsi="Calibri"/>
+                <w:sz w:val="19"/>
+                <w:szCs w:val="19"/>
+              </w:rPr>
+              <w:t xml:space="preserve">69.4 (level 51)</w:t>
+            </w:r>
+          </w:p>
+        </w:tc>
+        <w:tc>
+          <w:tcPr>
+            <w:tcW w:type="dxa" w:w="868"/>
             <w:tcBorders>
               <w:top w:val="single" w:color="BFBFBF" w:sz="4"/>
               <w:left w:val="single" w:color="BFBFBF" w:sz="4"/>
@@ -5142,7 +5201,7 @@
         </w:tc>
         <w:tc>
           <w:tcPr>
-            <w:tcW w:type="dxa" w:w="933"/>
+            <w:tcW w:type="dxa" w:w="911"/>
             <w:tcBorders>
               <w:top w:val="single" w:color="BFBFBF" w:sz="4"/>
               <w:left w:val="single" w:color="BFBFBF" w:sz="4"/>
@@ -5169,7 +5228,7 @@
         </w:tc>
         <w:tc>
           <w:tcPr>
-            <w:tcW w:type="dxa" w:w="447"/>
+            <w:tcW w:type="dxa" w:w="436"/>
             <w:tcBorders>
               <w:top w:val="single" w:color="BFBFBF" w:sz="4"/>
               <w:left w:val="single" w:color="BFBFBF" w:sz="4"/>
@@ -5196,7 +5255,7 @@
         </w:tc>
         <w:tc>
           <w:tcPr>
-            <w:tcW w:type="dxa" w:w="447"/>
+            <w:tcW w:type="dxa" w:w="436"/>
             <w:tcBorders>
               <w:top w:val="single" w:color="BFBFBF" w:sz="4"/>
               <w:left w:val="single" w:color="BFBFBF" w:sz="4"/>
@@ -5223,7 +5282,7 @@
         </w:tc>
         <w:tc>
           <w:tcPr>
-            <w:tcW w:type="dxa" w:w="1994"/>
+            <w:tcW w:type="dxa" w:w="1946"/>
             <w:tcBorders>
               <w:top w:val="single" w:color="BFBFBF" w:sz="4"/>
               <w:left w:val="single" w:color="BFBFBF" w:sz="4"/>
@@ -5250,7 +5309,7 @@
         </w:tc>
         <w:tc>
           <w:tcPr>
-            <w:tcW w:type="dxa" w:w="2521"/>
+            <w:tcW w:type="dxa" w:w="2462"/>
             <w:tcBorders>
               <w:top w:val="single" w:color="BFBFBF" w:sz="4"/>
               <w:left w:val="single" w:color="BFBFBF" w:sz="4"/>
@@ -5282,7 +5341,7 @@
         </w:trPr>
         <w:tc>
           <w:tcPr>
-            <w:tcW w:type="dxa" w:w="447"/>
+            <w:tcW w:type="dxa" w:w="436"/>
             <w:tcBorders>
               <w:top w:val="single" w:color="BFBFBF" w:sz="4"/>
               <w:left w:val="single" w:color="BFBFBF" w:sz="4"/>
@@ -5309,7 +5368,7 @@
         </w:tc>
         <w:tc>
           <w:tcPr>
-            <w:tcW w:type="dxa" w:w="977"/>
+            <w:tcW w:type="dxa" w:w="954"/>
             <w:tcBorders>
               <w:top w:val="single" w:color="BFBFBF" w:sz="4"/>
               <w:left w:val="single" w:color="BFBFBF" w:sz="4"/>
@@ -5336,34 +5395,34 @@
         </w:tc>
         <w:tc>
           <w:tcPr>
-            <w:tcW w:type="dxa" w:w="705"/>
-            <w:tcBorders>
-              <w:top w:val="single" w:color="BFBFBF" w:sz="4"/>
-              <w:left w:val="single" w:color="BFBFBF" w:sz="4"/>
-              <w:bottom w:val="single" w:color="BFBFBF" w:sz="4"/>
-              <w:right w:val="single" w:color="BFBFBF" w:sz="4"/>
-            </w:tcBorders>
-            <w:tcMar>
-              <w:top w:type="dxa" w:w="60"/>
-              <w:left w:type="dxa" w:w="100"/>
-              <w:bottom w:type="dxa" w:w="60"/>
-              <w:right w:type="dxa" w:w="100"/>
-            </w:tcMar>
-          </w:tcPr>
-          <w:p>
-            <w:r>
-              <w:rPr>
-                <w:rFonts w:ascii="Calibri" w:cs="Calibri" w:eastAsia="Calibri" w:hAnsi="Calibri"/>
-                <w:sz w:val="19"/>
-                <w:szCs w:val="19"/>
-              </w:rPr>
-              <w:t xml:space="preserve">88</w:t>
-            </w:r>
-          </w:p>
-        </w:tc>
-        <w:tc>
-          <w:tcPr>
-            <w:tcW w:type="dxa" w:w="889"/>
+            <w:tcW w:type="dxa" w:w="911"/>
+            <w:tcBorders>
+              <w:top w:val="single" w:color="BFBFBF" w:sz="4"/>
+              <w:left w:val="single" w:color="BFBFBF" w:sz="4"/>
+              <w:bottom w:val="single" w:color="BFBFBF" w:sz="4"/>
+              <w:right w:val="single" w:color="BFBFBF" w:sz="4"/>
+            </w:tcBorders>
+            <w:tcMar>
+              <w:top w:type="dxa" w:w="60"/>
+              <w:left w:type="dxa" w:w="100"/>
+              <w:bottom w:type="dxa" w:w="60"/>
+              <w:right w:type="dxa" w:w="100"/>
+            </w:tcMar>
+          </w:tcPr>
+          <w:p>
+            <w:r>
+              <w:rPr>
+                <w:rFonts w:ascii="Calibri" w:cs="Calibri" w:eastAsia="Calibri" w:hAnsi="Calibri"/>
+                <w:sz w:val="19"/>
+                <w:szCs w:val="19"/>
+              </w:rPr>
+              <w:t xml:space="preserve">72.1 (level 54)</w:t>
+            </w:r>
+          </w:p>
+        </w:tc>
+        <w:tc>
+          <w:tcPr>
+            <w:tcW w:type="dxa" w:w="868"/>
             <w:tcBorders>
               <w:top w:val="single" w:color="BFBFBF" w:sz="4"/>
               <w:left w:val="single" w:color="BFBFBF" w:sz="4"/>
@@ -5390,7 +5449,7 @@
         </w:tc>
         <w:tc>
           <w:tcPr>
-            <w:tcW w:type="dxa" w:w="933"/>
+            <w:tcW w:type="dxa" w:w="911"/>
             <w:tcBorders>
               <w:top w:val="single" w:color="BFBFBF" w:sz="4"/>
               <w:left w:val="single" w:color="BFBFBF" w:sz="4"/>
@@ -5417,7 +5476,7 @@
         </w:tc>
         <w:tc>
           <w:tcPr>
-            <w:tcW w:type="dxa" w:w="447"/>
+            <w:tcW w:type="dxa" w:w="436"/>
             <w:tcBorders>
               <w:top w:val="single" w:color="BFBFBF" w:sz="4"/>
               <w:left w:val="single" w:color="BFBFBF" w:sz="4"/>
@@ -5444,7 +5503,7 @@
         </w:tc>
         <w:tc>
           <w:tcPr>
-            <w:tcW w:type="dxa" w:w="447"/>
+            <w:tcW w:type="dxa" w:w="436"/>
             <w:tcBorders>
               <w:top w:val="single" w:color="BFBFBF" w:sz="4"/>
               <w:left w:val="single" w:color="BFBFBF" w:sz="4"/>
@@ -5471,7 +5530,7 @@
         </w:tc>
         <w:tc>
           <w:tcPr>
-            <w:tcW w:type="dxa" w:w="1994"/>
+            <w:tcW w:type="dxa" w:w="1946"/>
             <w:tcBorders>
               <w:top w:val="single" w:color="BFBFBF" w:sz="4"/>
               <w:left w:val="single" w:color="BFBFBF" w:sz="4"/>
@@ -5498,7 +5557,7 @@
         </w:tc>
         <w:tc>
           <w:tcPr>
-            <w:tcW w:type="dxa" w:w="2521"/>
+            <w:tcW w:type="dxa" w:w="2462"/>
             <w:tcBorders>
               <w:top w:val="single" w:color="BFBFBF" w:sz="4"/>
               <w:left w:val="single" w:color="BFBFBF" w:sz="4"/>
@@ -5530,7 +5589,7 @@
         </w:trPr>
         <w:tc>
           <w:tcPr>
-            <w:tcW w:type="dxa" w:w="447"/>
+            <w:tcW w:type="dxa" w:w="436"/>
             <w:tcBorders>
               <w:top w:val="single" w:color="BFBFBF" w:sz="4"/>
               <w:left w:val="single" w:color="BFBFBF" w:sz="4"/>
@@ -5557,7 +5616,7 @@
         </w:tc>
         <w:tc>
           <w:tcPr>
-            <w:tcW w:type="dxa" w:w="977"/>
+            <w:tcW w:type="dxa" w:w="954"/>
             <w:tcBorders>
               <w:top w:val="single" w:color="BFBFBF" w:sz="4"/>
               <w:left w:val="single" w:color="BFBFBF" w:sz="4"/>
@@ -5584,34 +5643,34 @@
         </w:tc>
         <w:tc>
           <w:tcPr>
-            <w:tcW w:type="dxa" w:w="705"/>
-            <w:tcBorders>
-              <w:top w:val="single" w:color="BFBFBF" w:sz="4"/>
-              <w:left w:val="single" w:color="BFBFBF" w:sz="4"/>
-              <w:bottom w:val="single" w:color="BFBFBF" w:sz="4"/>
-              <w:right w:val="single" w:color="BFBFBF" w:sz="4"/>
-            </w:tcBorders>
-            <w:tcMar>
-              <w:top w:type="dxa" w:w="60"/>
-              <w:left w:type="dxa" w:w="100"/>
-              <w:bottom w:type="dxa" w:w="60"/>
-              <w:right w:type="dxa" w:w="100"/>
-            </w:tcMar>
-          </w:tcPr>
-          <w:p>
-            <w:r>
-              <w:rPr>
-                <w:rFonts w:ascii="Calibri" w:cs="Calibri" w:eastAsia="Calibri" w:hAnsi="Calibri"/>
-                <w:sz w:val="19"/>
-                <w:szCs w:val="19"/>
-              </w:rPr>
-              <w:t xml:space="preserve">105</w:t>
-            </w:r>
-          </w:p>
-        </w:tc>
-        <w:tc>
-          <w:tcPr>
-            <w:tcW w:type="dxa" w:w="889"/>
+            <w:tcW w:type="dxa" w:w="911"/>
+            <w:tcBorders>
+              <w:top w:val="single" w:color="BFBFBF" w:sz="4"/>
+              <w:left w:val="single" w:color="BFBFBF" w:sz="4"/>
+              <w:bottom w:val="single" w:color="BFBFBF" w:sz="4"/>
+              <w:right w:val="single" w:color="BFBFBF" w:sz="4"/>
+            </w:tcBorders>
+            <w:tcMar>
+              <w:top w:type="dxa" w:w="60"/>
+              <w:left w:type="dxa" w:w="100"/>
+              <w:bottom w:type="dxa" w:w="60"/>
+              <w:right w:type="dxa" w:w="100"/>
+            </w:tcMar>
+          </w:tcPr>
+          <w:p>
+            <w:r>
+              <w:rPr>
+                <w:rFonts w:ascii="Calibri" w:cs="Calibri" w:eastAsia="Calibri" w:hAnsi="Calibri"/>
+                <w:sz w:val="19"/>
+                <w:szCs w:val="19"/>
+              </w:rPr>
+              <w:t xml:space="preserve">84.2 (level 66)</w:t>
+            </w:r>
+          </w:p>
+        </w:tc>
+        <w:tc>
+          <w:tcPr>
+            <w:tcW w:type="dxa" w:w="868"/>
             <w:tcBorders>
               <w:top w:val="single" w:color="BFBFBF" w:sz="4"/>
               <w:left w:val="single" w:color="BFBFBF" w:sz="4"/>
@@ -5638,7 +5697,7 @@
         </w:tc>
         <w:tc>
           <w:tcPr>
-            <w:tcW w:type="dxa" w:w="933"/>
+            <w:tcW w:type="dxa" w:w="911"/>
             <w:tcBorders>
               <w:top w:val="single" w:color="BFBFBF" w:sz="4"/>
               <w:left w:val="single" w:color="BFBFBF" w:sz="4"/>
@@ -5665,7 +5724,7 @@
         </w:tc>
         <w:tc>
           <w:tcPr>
-            <w:tcW w:type="dxa" w:w="447"/>
+            <w:tcW w:type="dxa" w:w="436"/>
             <w:tcBorders>
               <w:top w:val="single" w:color="BFBFBF" w:sz="4"/>
               <w:left w:val="single" w:color="BFBFBF" w:sz="4"/>
@@ -5692,7 +5751,7 @@
         </w:tc>
         <w:tc>
           <w:tcPr>
-            <w:tcW w:type="dxa" w:w="447"/>
+            <w:tcW w:type="dxa" w:w="436"/>
             <w:tcBorders>
               <w:top w:val="single" w:color="BFBFBF" w:sz="4"/>
               <w:left w:val="single" w:color="BFBFBF" w:sz="4"/>
@@ -5719,7 +5778,7 @@
         </w:tc>
         <w:tc>
           <w:tcPr>
-            <w:tcW w:type="dxa" w:w="1994"/>
+            <w:tcW w:type="dxa" w:w="1946"/>
             <w:tcBorders>
               <w:top w:val="single" w:color="BFBFBF" w:sz="4"/>
               <w:left w:val="single" w:color="BFBFBF" w:sz="4"/>
@@ -5746,7 +5805,7 @@
         </w:tc>
         <w:tc>
           <w:tcPr>
-            <w:tcW w:type="dxa" w:w="2521"/>
+            <w:tcW w:type="dxa" w:w="2462"/>
             <w:tcBorders>
               <w:top w:val="single" w:color="BFBFBF" w:sz="4"/>
               <w:left w:val="single" w:color="BFBFBF" w:sz="4"/>
@@ -5778,7 +5837,7 @@
         </w:trPr>
         <w:tc>
           <w:tcPr>
-            <w:tcW w:type="dxa" w:w="447"/>
+            <w:tcW w:type="dxa" w:w="436"/>
             <w:tcBorders>
               <w:top w:val="single" w:color="BFBFBF" w:sz="4"/>
               <w:left w:val="single" w:color="BFBFBF" w:sz="4"/>
@@ -5805,7 +5864,7 @@
         </w:tc>
         <w:tc>
           <w:tcPr>
-            <w:tcW w:type="dxa" w:w="977"/>
+            <w:tcW w:type="dxa" w:w="954"/>
             <w:tcBorders>
               <w:top w:val="single" w:color="BFBFBF" w:sz="4"/>
               <w:left w:val="single" w:color="BFBFBF" w:sz="4"/>
@@ -5832,34 +5891,34 @@
         </w:tc>
         <w:tc>
           <w:tcPr>
-            <w:tcW w:type="dxa" w:w="705"/>
-            <w:tcBorders>
-              <w:top w:val="single" w:color="BFBFBF" w:sz="4"/>
-              <w:left w:val="single" w:color="BFBFBF" w:sz="4"/>
-              <w:bottom w:val="single" w:color="BFBFBF" w:sz="4"/>
-              <w:right w:val="single" w:color="BFBFBF" w:sz="4"/>
-            </w:tcBorders>
-            <w:tcMar>
-              <w:top w:type="dxa" w:w="60"/>
-              <w:left w:type="dxa" w:w="100"/>
-              <w:bottom w:type="dxa" w:w="60"/>
-              <w:right w:type="dxa" w:w="100"/>
-            </w:tcMar>
-          </w:tcPr>
-          <w:p>
-            <w:r>
-              <w:rPr>
-                <w:rFonts w:ascii="Calibri" w:cs="Calibri" w:eastAsia="Calibri" w:hAnsi="Calibri"/>
-                <w:sz w:val="19"/>
-                <w:szCs w:val="19"/>
-              </w:rPr>
-              <w:t xml:space="preserve">125</w:t>
-            </w:r>
-          </w:p>
-        </w:tc>
-        <w:tc>
-          <w:tcPr>
-            <w:tcW w:type="dxa" w:w="889"/>
+            <w:tcW w:type="dxa" w:w="911"/>
+            <w:tcBorders>
+              <w:top w:val="single" w:color="BFBFBF" w:sz="4"/>
+              <w:left w:val="single" w:color="BFBFBF" w:sz="4"/>
+              <w:bottom w:val="single" w:color="BFBFBF" w:sz="4"/>
+              <w:right w:val="single" w:color="BFBFBF" w:sz="4"/>
+            </w:tcBorders>
+            <w:tcMar>
+              <w:top w:type="dxa" w:w="60"/>
+              <w:left w:type="dxa" w:w="100"/>
+              <w:bottom w:type="dxa" w:w="60"/>
+              <w:right w:type="dxa" w:w="100"/>
+            </w:tcMar>
+          </w:tcPr>
+          <w:p>
+            <w:r>
+              <w:rPr>
+                <w:rFonts w:ascii="Calibri" w:cs="Calibri" w:eastAsia="Calibri" w:hAnsi="Calibri"/>
+                <w:sz w:val="19"/>
+                <w:szCs w:val="19"/>
+              </w:rPr>
+              <w:t xml:space="preserve">99.1 (level 81)</w:t>
+            </w:r>
+          </w:p>
+        </w:tc>
+        <w:tc>
+          <w:tcPr>
+            <w:tcW w:type="dxa" w:w="868"/>
             <w:tcBorders>
               <w:top w:val="single" w:color="BFBFBF" w:sz="4"/>
               <w:left w:val="single" w:color="BFBFBF" w:sz="4"/>
@@ -5886,7 +5945,7 @@
         </w:tc>
         <w:tc>
           <w:tcPr>
-            <w:tcW w:type="dxa" w:w="933"/>
+            <w:tcW w:type="dxa" w:w="911"/>
             <w:tcBorders>
               <w:top w:val="single" w:color="BFBFBF" w:sz="4"/>
               <w:left w:val="single" w:color="BFBFBF" w:sz="4"/>
@@ -5913,7 +5972,7 @@
         </w:tc>
         <w:tc>
           <w:tcPr>
-            <w:tcW w:type="dxa" w:w="447"/>
+            <w:tcW w:type="dxa" w:w="436"/>
             <w:tcBorders>
               <w:top w:val="single" w:color="BFBFBF" w:sz="4"/>
               <w:left w:val="single" w:color="BFBFBF" w:sz="4"/>
@@ -5940,7 +5999,7 @@
         </w:tc>
         <w:tc>
           <w:tcPr>
-            <w:tcW w:type="dxa" w:w="447"/>
+            <w:tcW w:type="dxa" w:w="436"/>
             <w:tcBorders>
               <w:top w:val="single" w:color="BFBFBF" w:sz="4"/>
               <w:left w:val="single" w:color="BFBFBF" w:sz="4"/>
@@ -5967,7 +6026,7 @@
         </w:tc>
         <w:tc>
           <w:tcPr>
-            <w:tcW w:type="dxa" w:w="1994"/>
+            <w:tcW w:type="dxa" w:w="1946"/>
             <w:tcBorders>
               <w:top w:val="single" w:color="BFBFBF" w:sz="4"/>
               <w:left w:val="single" w:color="BFBFBF" w:sz="4"/>
@@ -5994,7 +6053,7 @@
         </w:tc>
         <w:tc>
           <w:tcPr>
-            <w:tcW w:type="dxa" w:w="2521"/>
+            <w:tcW w:type="dxa" w:w="2462"/>
             <w:tcBorders>
               <w:top w:val="single" w:color="BFBFBF" w:sz="4"/>
               <w:left w:val="single" w:color="BFBFBF" w:sz="4"/>
@@ -6026,7 +6085,7 @@
         </w:trPr>
         <w:tc>
           <w:tcPr>
-            <w:tcW w:type="dxa" w:w="447"/>
+            <w:tcW w:type="dxa" w:w="436"/>
             <w:tcBorders>
               <w:top w:val="single" w:color="BFBFBF" w:sz="4"/>
               <w:left w:val="single" w:color="BFBFBF" w:sz="4"/>
@@ -6053,7 +6112,7 @@
         </w:tc>
         <w:tc>
           <w:tcPr>
-            <w:tcW w:type="dxa" w:w="977"/>
+            <w:tcW w:type="dxa" w:w="954"/>
             <w:tcBorders>
               <w:top w:val="single" w:color="BFBFBF" w:sz="4"/>
               <w:left w:val="single" w:color="BFBFBF" w:sz="4"/>
@@ -6080,34 +6139,34 @@
         </w:tc>
         <w:tc>
           <w:tcPr>
-            <w:tcW w:type="dxa" w:w="705"/>
-            <w:tcBorders>
-              <w:top w:val="single" w:color="BFBFBF" w:sz="4"/>
-              <w:left w:val="single" w:color="BFBFBF" w:sz="4"/>
-              <w:bottom w:val="single" w:color="BFBFBF" w:sz="4"/>
-              <w:right w:val="single" w:color="BFBFBF" w:sz="4"/>
-            </w:tcBorders>
-            <w:tcMar>
-              <w:top w:type="dxa" w:w="60"/>
-              <w:left w:type="dxa" w:w="100"/>
-              <w:bottom w:type="dxa" w:w="60"/>
-              <w:right w:type="dxa" w:w="100"/>
-            </w:tcMar>
-          </w:tcPr>
-          <w:p>
-            <w:r>
-              <w:rPr>
-                <w:rFonts w:ascii="Calibri" w:cs="Calibri" w:eastAsia="Calibri" w:hAnsi="Calibri"/>
-                <w:sz w:val="19"/>
-                <w:szCs w:val="19"/>
-              </w:rPr>
-              <w:t xml:space="preserve">145</w:t>
-            </w:r>
-          </w:p>
-        </w:tc>
-        <w:tc>
-          <w:tcPr>
-            <w:tcW w:type="dxa" w:w="889"/>
+            <w:tcW w:type="dxa" w:w="911"/>
+            <w:tcBorders>
+              <w:top w:val="single" w:color="BFBFBF" w:sz="4"/>
+              <w:left w:val="single" w:color="BFBFBF" w:sz="4"/>
+              <w:bottom w:val="single" w:color="BFBFBF" w:sz="4"/>
+              <w:right w:val="single" w:color="BFBFBF" w:sz="4"/>
+            </w:tcBorders>
+            <w:tcMar>
+              <w:top w:type="dxa" w:w="60"/>
+              <w:left w:type="dxa" w:w="100"/>
+              <w:bottom w:type="dxa" w:w="60"/>
+              <w:right w:type="dxa" w:w="100"/>
+            </w:tcMar>
+          </w:tcPr>
+          <w:p>
+            <w:r>
+              <w:rPr>
+                <w:rFonts w:ascii="Calibri" w:cs="Calibri" w:eastAsia="Calibri" w:hAnsi="Calibri"/>
+                <w:sz w:val="19"/>
+                <w:szCs w:val="19"/>
+              </w:rPr>
+              <w:t xml:space="preserve">113.9 (level 96)</w:t>
+            </w:r>
+          </w:p>
+        </w:tc>
+        <w:tc>
+          <w:tcPr>
+            <w:tcW w:type="dxa" w:w="868"/>
             <w:tcBorders>
               <w:top w:val="single" w:color="BFBFBF" w:sz="4"/>
               <w:left w:val="single" w:color="BFBFBF" w:sz="4"/>
@@ -6134,7 +6193,7 @@
         </w:tc>
         <w:tc>
           <w:tcPr>
-            <w:tcW w:type="dxa" w:w="933"/>
+            <w:tcW w:type="dxa" w:w="911"/>
             <w:tcBorders>
               <w:top w:val="single" w:color="BFBFBF" w:sz="4"/>
               <w:left w:val="single" w:color="BFBFBF" w:sz="4"/>
@@ -6161,7 +6220,7 @@
         </w:tc>
         <w:tc>
           <w:tcPr>
-            <w:tcW w:type="dxa" w:w="447"/>
+            <w:tcW w:type="dxa" w:w="436"/>
             <w:tcBorders>
               <w:top w:val="single" w:color="BFBFBF" w:sz="4"/>
               <w:left w:val="single" w:color="BFBFBF" w:sz="4"/>
@@ -6188,7 +6247,7 @@
         </w:tc>
         <w:tc>
           <w:tcPr>
-            <w:tcW w:type="dxa" w:w="447"/>
+            <w:tcW w:type="dxa" w:w="436"/>
             <w:tcBorders>
               <w:top w:val="single" w:color="BFBFBF" w:sz="4"/>
               <w:left w:val="single" w:color="BFBFBF" w:sz="4"/>
@@ -6215,7 +6274,7 @@
         </w:tc>
         <w:tc>
           <w:tcPr>
-            <w:tcW w:type="dxa" w:w="1994"/>
+            <w:tcW w:type="dxa" w:w="1946"/>
             <w:tcBorders>
               <w:top w:val="single" w:color="BFBFBF" w:sz="4"/>
               <w:left w:val="single" w:color="BFBFBF" w:sz="4"/>
@@ -6242,7 +6301,7 @@
         </w:tc>
         <w:tc>
           <w:tcPr>
-            <w:tcW w:type="dxa" w:w="2521"/>
+            <w:tcW w:type="dxa" w:w="2462"/>
             <w:tcBorders>
               <w:top w:val="single" w:color="BFBFBF" w:sz="4"/>
               <w:left w:val="single" w:color="BFBFBF" w:sz="4"/>
@@ -6282,7 +6341,35 @@
         <w:rPr>
           <w:rFonts w:ascii="Calibri" w:cs="Calibri" w:eastAsia="Calibri" w:hAnsi="Calibri"/>
         </w:rPr>
-        <w:t xml:space="preserve">Owner speed rises with every house so the last houses need a well-trained runner. House 1's owner (17) is slower than a brand-new player (20), so a first-timer can always get away from it. The Candy you get from a knock is the number above times your costume's Candy multiplier. Owner names, speeds, Candy and egg odds live in </w:t>
+        <w:t xml:space="preserve">Owner speed rises with every house so the last houses need a well-trained runner. The number in brackets is the Recommended Level on the green signs (</w:t>
+      </w:r>
+      <w:r>
+        <w:rPr>
+          <w:rFonts w:ascii="Courier New" w:cs="Courier New" w:eastAsia="Courier New" w:hAnsi="Courier New"/>
+          <w:sz w:val="20"/>
+          <w:szCs w:val="20"/>
+        </w:rPr>
+        <w:t xml:space="preserve">RecommendedLevel</w:t>
+      </w:r>
+      <w:r>
+        <w:rPr>
+          <w:rFonts w:ascii="Calibri" w:cs="Calibri" w:eastAsia="Calibri" w:hAnsi="Calibri"/>
+        </w:rPr>
+        <w:t xml:space="preserve"> in </w:t>
+      </w:r>
+      <w:r>
+        <w:rPr>
+          <w:rFonts w:ascii="Courier New" w:cs="Courier New" w:eastAsia="Courier New" w:hAnsi="Courier New"/>
+          <w:sz w:val="20"/>
+          <w:szCs w:val="20"/>
+        </w:rPr>
+        <w:t xml:space="preserve">Config.Houses</w:t>
+      </w:r>
+      <w:r>
+        <w:rPr>
+          <w:rFonts w:ascii="Calibri" w:cs="Calibri" w:eastAsia="Calibri" w:hAnsi="Calibri"/>
+        </w:rPr>
+        <w:t xml:space="preserve">); the owner's speed is set from it: the speed you run at with an egg at that level (90% of your max speed) plus 1, so a player who brings the recommended level only just loses ground. House 1's owner (19.9) is slower than a brand-new player (20), so a first-timer can always get away from it. The Candy you get from a knock is the number above times your costume's Candy multiplier. Owner names, speeds, Candy and egg odds live in </w:t>
       </w:r>
       <w:r>
         <w:rPr>
@@ -14447,13 +14534,97 @@
           <w:b/>
           <w:bCs/>
         </w:rPr>
-        <w:t xml:space="preserve">Speed Levels:</w:t>
-      </w:r>
-      <w:r>
-        <w:rPr>
-          <w:rFonts w:ascii="Calibri" w:cs="Calibri" w:eastAsia="Calibri" w:hAnsi="Calibri"/>
-        </w:rPr>
-        <w:t xml:space="preserve"> speed grows by the same amount every level: 20 at level 0, +1.5 per level, 170 at level 100. Each level costs 20% more XP than the last up to level 30 (20 XP for level 1, about 3,956 for level 30), then 8% more up to level 70 (about 85,948), then 4% more (about 278,764 for level 100). The steep start is what puts houses 3 and 4 at about 20 and 35 minutes; the big multipliers keep the later levels moving.</w:t>
+        <w:t xml:space="preserve">Speed Levels (6.7):</w:t>
+      </w:r>
+      <w:r>
+        <w:rPr>
+          <w:rFonts w:ascii="Calibri" w:cs="Calibri" w:eastAsia="Calibri" w:hAnsi="Calibri"/>
+        </w:rPr>
+        <w:t xml:space="preserve"> every level gives +1 speed and every 5th level (5, 10, 15 ...) gives +1.5, so you run 20 at level 0, 25.5 at level 5, 31 at level 10, 53 at level 30, 75 at level 50 and 130 at level 100. Levels cost 20% more XP than the last up to level 30 (20 XP for level 1), then 8% more up to level 70, then 4% more. From level 10 on, levelling up costs 10% extra, and another 10% extra every 20 levels after that (levels 10 to 29: x1.1, 30 to 49: x1.2, 50 to 69: x1.3, 70 to 89: x1.4, 90 to 99: x1.5). For example the step from level 10 to 11 costs 136 XP (was 124), level 30 to 31 costs 5,127 (was 4,273) and level 99 to 100 costs 418,146 (was 278,764). Knobs: </w:t>
+      </w:r>
+      <w:r>
+        <w:rPr>
+          <w:rFonts w:ascii="Courier New" w:cs="Courier New" w:eastAsia="Courier New" w:hAnsi="Courier New"/>
+          <w:sz w:val="20"/>
+          <w:szCs w:val="20"/>
+        </w:rPr>
+        <w:t xml:space="preserve">Config.SpeedPerLevel</w:t>
+      </w:r>
+      <w:r>
+        <w:rPr>
+          <w:rFonts w:ascii="Calibri" w:cs="Calibri" w:eastAsia="Calibri" w:hAnsi="Calibri"/>
+        </w:rPr>
+        <w:t xml:space="preserve">, </w:t>
+      </w:r>
+      <w:r>
+        <w:rPr>
+          <w:rFonts w:ascii="Courier New" w:cs="Courier New" w:eastAsia="Courier New" w:hAnsi="Courier New"/>
+          <w:sz w:val="20"/>
+          <w:szCs w:val="20"/>
+        </w:rPr>
+        <w:t xml:space="preserve">SpeedBonusEvery</w:t>
+      </w:r>
+      <w:r>
+        <w:rPr>
+          <w:rFonts w:ascii="Calibri" w:cs="Calibri" w:eastAsia="Calibri" w:hAnsi="Calibri"/>
+        </w:rPr>
+        <w:t xml:space="preserve">, </w:t>
+      </w:r>
+      <w:r>
+        <w:rPr>
+          <w:rFonts w:ascii="Courier New" w:cs="Courier New" w:eastAsia="Courier New" w:hAnsi="Courier New"/>
+          <w:sz w:val="20"/>
+          <w:szCs w:val="20"/>
+        </w:rPr>
+        <w:t xml:space="preserve">SpeedBonusExtra</w:t>
+      </w:r>
+      <w:r>
+        <w:rPr>
+          <w:rFonts w:ascii="Calibri" w:cs="Calibri" w:eastAsia="Calibri" w:hAnsi="Calibri"/>
+        </w:rPr>
+        <w:t xml:space="preserve">, </w:t>
+      </w:r>
+      <w:r>
+        <w:rPr>
+          <w:rFonts w:ascii="Courier New" w:cs="Courier New" w:eastAsia="Courier New" w:hAnsi="Courier New"/>
+          <w:sz w:val="20"/>
+          <w:szCs w:val="20"/>
+        </w:rPr>
+        <w:t xml:space="preserve">XpHardFrom</w:t>
+      </w:r>
+      <w:r>
+        <w:rPr>
+          <w:rFonts w:ascii="Calibri" w:cs="Calibri" w:eastAsia="Calibri" w:hAnsi="Calibri"/>
+        </w:rPr>
+        <w:t xml:space="preserve">, </w:t>
+      </w:r>
+      <w:r>
+        <w:rPr>
+          <w:rFonts w:ascii="Courier New" w:cs="Courier New" w:eastAsia="Courier New" w:hAnsi="Courier New"/>
+          <w:sz w:val="20"/>
+          <w:szCs w:val="20"/>
+        </w:rPr>
+        <w:t xml:space="preserve">XpHardStep</w:t>
+      </w:r>
+      <w:r>
+        <w:rPr>
+          <w:rFonts w:ascii="Calibri" w:cs="Calibri" w:eastAsia="Calibri" w:hAnsi="Calibri"/>
+        </w:rPr>
+        <w:t xml:space="preserve">, </w:t>
+      </w:r>
+      <w:r>
+        <w:rPr>
+          <w:rFonts w:ascii="Courier New" w:cs="Courier New" w:eastAsia="Courier New" w:hAnsi="Courier New"/>
+          <w:sz w:val="20"/>
+          <w:szCs w:val="20"/>
+        </w:rPr>
+        <w:t xml:space="preserve">XpHardEvery</w:t>
+      </w:r>
+      <w:r>
+        <w:rPr>
+          <w:rFonts w:ascii="Calibri" w:cs="Calibri" w:eastAsia="Calibri" w:hAnsi="Calibri"/>
+        </w:rPr>
+        <w:t xml:space="preserve">.</w:t>
       </w:r>
     </w:p>
     <w:p>
@@ -17377,7 +17548,7 @@
                 <w:sz w:val="19"/>
                 <w:szCs w:val="19"/>
               </w:rPr>
-              <w:t xml:space="preserve">16 min (target about 20)</w:t>
+              <w:t xml:space="preserve">18 min (target about 20)</w:t>
             </w:r>
           </w:p>
         </w:tc>
@@ -17404,7 +17575,7 @@
                 <w:sz w:val="19"/>
                 <w:szCs w:val="19"/>
               </w:rPr>
-              <w:t xml:space="preserve">26 min</w:t>
+              <w:t xml:space="preserve">29 min</w:t>
             </w:r>
           </w:p>
         </w:tc>
@@ -17463,7 +17634,7 @@
                 <w:sz w:val="19"/>
                 <w:szCs w:val="19"/>
               </w:rPr>
-              <w:t xml:space="preserve">29 min (target about 35)</w:t>
+              <w:t xml:space="preserve">31 min (target about 35)</w:t>
             </w:r>
           </w:p>
         </w:tc>
@@ -17490,7 +17661,7 @@
                 <w:sz w:val="19"/>
                 <w:szCs w:val="19"/>
               </w:rPr>
-              <w:t xml:space="preserve">47 min</w:t>
+              <w:t xml:space="preserve">50 min</w:t>
             </w:r>
           </w:p>
         </w:tc>
@@ -23521,7 +23692,7 @@
         <w:rPr>
           <w:rFonts w:ascii="Calibri" w:cs="Calibri" w:eastAsia="Calibri" w:hAnsi="Calibri"/>
         </w:rPr>
-        <w:t xml:space="preserve"> With the V4.2 speed scale (max 170) the Lich King runs at 145. Carrying a Ghost egg (x0.89) you need speed 163 (level 96), a Blood Moon egg (x0.87) speed 167 (level 98); a Cursed egg (x0.85) needs 171 and a Nightmare egg (x0.82) 177, more than the maximum, so those can only be taken by outlasting the 30 s chase. Decide whether that is intended, or lower the last owners' speed or raise the max speed. Also decide what comes after house 9: more streets, a boss house, prestige worlds, limited events.</w:t>
+        <w:t xml:space="preserve"> With the 6.7 speed scale (max 130) the Lich King runs at 113.9. Carrying a Ghost egg (x0.89) you need speed 128 (level 98), a Blood Moon egg (x0.87) speed 131, a Cursed egg (x0.85) 134 and a Nightmare egg (x0.82) 139, more than the maximum, so those can only be taken by outlasting the 30 s chase. Decide whether that is intended, or lower the last owners' speed or raise the max speed. Also decide what comes after house 9: more streets, a boss house, prestige worlds, limited events.</w:t>
       </w:r>
     </w:p>
     <w:p>

</xml_diff>